<commit_message>
feat(routing): automatically replan accepted inspection tasks
</commit_message>
<xml_diff>
--- a/ProjectReport/IRS-PM-2026-08-17-AIS08FT-GRP-Group37-RoadGuard-Group-Report.docx
+++ b/ProjectReport/IRS-PM-2026-08-17-AIS08FT-GRP-Group37-RoadGuard-Group-Report.docx
@@ -1282,7 +1282,7 @@
         <w:rPr>
           <w:color w:val="000000"/>
         </w:rPr>
-        <w:t>The workflow covers primary detection, confidence review, rule-based tasks, explicit replanning, comparative schedules and crew completion, plus grounded answers and confirmed adjustments. Table 1 compares the delivered scope with the submitted proposal in Appendix B. Jurong restriction and four crews follow presentation feedback; other changes reflect implementation decisions or evaluation gaps.</w:t>
+        <w:t>The workflow covers primary detection, confidence review, rule-based tasks, automatic planning for accepted inspections and explicit replanning for other changes, comparative schedules and crew completion, plus grounded answers and confirmed adjustments. Table 1 compares the delivered scope with the submitted proposal in Appendix B. Jurong restriction and four crews follow presentation feedback; other changes reflect implementation decisions or evaluation gaps.</w:t>
       </w:r>
     </w:p>
     <w:p>
@@ -1759,7 +1759,7 @@
                 <w:color w:val="000000"/>
                 <w:sz w:val="21"/>
               </w:rPr>
-              <w:t>Changes mark plans stale; dispatcher explicitly recalculates</w:t>
+              <w:t>Accepted uploads and review confirmation/correction trigger a planning attempt after task commit; other changes require explicit recalculation</w:t>
             </w:r>
           </w:p>
         </w:tc>
@@ -3015,7 +3015,7 @@
         <w:rPr>
           <w:color w:val="000000"/>
         </w:rPr>
-        <w:t>Versioned business rules encode severity, priority, service minutes and explanations. The source-hashed a-knowledge-v18 package records reviewed scope, label meanings, rules and workflows; it is indexed locally in ChromaDB with multilingual-e5-small embeddings. It was checked against repository content, not approved by engineering experts. Only reviewed static documents are indexed; authorized saved-plan facts are obtained separately. The visual qualifiers “wide”, “sunken” and “deep” are categorical labels, not measurements of width, depth or structural condition.</w:t>
+        <w:t>Versioned business rules encode severity, priority, service minutes and explanations. The source-hashed a-knowledge-v19 package records reviewed scope, label meanings, rules and workflows; it is indexed locally in ChromaDB with multilingual-e5-small embeddings. It was checked against repository content, not approved by engineering experts. Only reviewed static documents are indexed; authorized saved-plan facts are obtained separately. The visual qualifiers “wide”, “sunken” and “deep” are categorical labels, not measurements of width, depth or structural condition.</w:t>
       </w:r>
     </w:p>
     <w:p>
@@ -4471,7 +4471,7 @@
         <w:rPr>
           <w:color w:val="000000"/>
         </w:rPr>
-        <w:t>Note. Evidence questions do not mutate business records. Confirmed adjustments persist separately; planning still requires an explicit dispatcher request. Source validation and bounded answer checks do not guarantee every semantic judgement.</w:t>
+        <w:t>Note. Evidence questions do not mutate business records. Confirmed adjustments persist separately; replanning these adjustments still requires an explicit dispatcher request. Source validation and bounded answer checks do not guarantee every semantic judgement.</w:t>
       </w:r>
     </w:p>
     <w:p>
@@ -4511,7 +4511,7 @@
         <w:rPr>
           <w:color w:val="000000"/>
         </w:rPr>
-        <w:t>Task or crew changes mark old plans stale. The dispatcher explicitly recalculates, and a superseded input revision is rejected before a new plan is saved. A move preview retains all other assigned tasks and checks travel, service and configured return against the shift. Confirmation stores a durable crew constraint; cancellation retains history and removes active work. Stale or expired proposals, version conflicts, repeated confirmation and role/CSRF checks are handled explicitly. Reassignment immediately removes the previous crew’s task, inspection and completion access; the target crew receives access after a fresh saved GA plan. Completion also checks task version in the same transaction. The database schema is version 6.</w:t>
+        <w:t>Accepted uploads and review confirmation/correction automatically attempt paired GA/Greedy planning after task commit, using the same snapshot and matrix. Pending review, no detection and dismissal trigger none. Completion, cancellation, crew changes and assistant confirmations still require explicit replanning. A superseded input revision is rejected before paired plans are saved. A move preview retains all other assigned tasks and checks travel, service and configured return against the shift. Confirmation stores a durable crew constraint; cancellation retains history and removes active work. Stale or expired proposals, version conflicts, repeated confirmation and role/CSRF checks are handled explicitly. Reassignment immediately removes the previous crew’s task, inspection and completion access; the target crew receives access after a fresh saved GA plan. Completion also checks task version in the same transaction. The database schema is version 6.</w:t>
       </w:r>
     </w:p>
     <w:p>
@@ -12410,7 +12410,7 @@
                 <w:color w:val="000000"/>
                 <w:sz w:val="21"/>
               </w:rPr>
-              <w:t>Four-crew 10/15/20-task experiments and explicit replanning; no deadline-based lateness evaluation.</w:t>
+              <w:t>Four-crew 10/15/20-task experiments; accepted inspections now attempt automatic paired planning, while other changes retain explicit replanning. No deadline-based lateness evaluation.</w:t>
             </w:r>
           </w:p>
         </w:tc>
@@ -12860,7 +12860,7 @@
         <w:rPr>
           <w:color w:val="000000"/>
         </w:rPr>
-        <w:t>First setup downloads approximately 487 MB of pinned multilingual-e5-small model/tokenizer files and verifies their hashes. The encoder uses ONNX Runtime on CPU; it does not call an embedding API or change the YOLO model. Subsequent setup reuses verified files. After pulling a reviewed knowledge update, rebuild the current index with .\.venv\Scripts\python.exe -m roadguard.assistant.index_knowledge and restart the backend. HTTP requests never download models or rebuild indexes. The current package is a-knowledge-v18; Chroma collections are versioned against the manifest, encoder and chunking policy.</w:t>
+        <w:t>First setup downloads approximately 487 MB of pinned multilingual-e5-small model/tokenizer files and verifies their hashes. The encoder uses ONNX Runtime on CPU; it does not call an embedding API or change the YOLO model. Subsequent setup reuses verified files. After pulling a reviewed knowledge update, rebuild the current index with .\.venv\Scripts\python.exe -m roadguard.assistant.index_knowledge and restart the backend. HTTP requests never download models or rebuild indexes. The current package is a-knowledge-v19; Chroma collections are versioned against the manifest, encoder and chunking policy.</w:t>
       </w:r>
     </w:p>
     <w:p>
@@ -13211,7 +13211,7 @@
         <w:rPr>
           <w:color w:val="000000"/>
         </w:rPr>
-        <w:t>4. Check crew availability and explicitly recalculate. Both planners use the same snapshot and matrix. Inspect unassigned reasons and the same-round comparison. Changes make existing plans stale; they do not trigger automatic recalculation.</w:t>
+        <w:t>4. Accepted uploads and review confirmation/correction automatically attempt paired planning after task commit. Both planners share the same snapshot and matrix and honor crew constraints. Inspect unassigned reasons and same-round comparison. Use the manual recalculation button to obtain same-round comparison evidence when no matching response is retained in the browser. Use manual recalculation after other input changes or a failed automatic attempt. The response waits for the attempt; X-RoadGuard-Replanning reports completed, failed or not_needed without changing the four upload JSON fields. A failure preserves the task and old stale plans and shows a warning. Accepted replay repairs missing/stale plans and skips a current pair. Automatic attempts are serialized per process with at most three attempts, retrying only stale conflicts; no durable worker retries after restart. A crash after task commit requires accepted replay or manual retry.</w:t>
       </w:r>
     </w:p>
     <w:p>
@@ -15599,7 +15599,7 @@
                 <w:color w:val="000000"/>
                 <w:sz w:val="21"/>
               </w:rPr>
-              <w:t>Versioned policies, stored rule snapshots and decision traces; preview validation, durable crew constraints and explicit replanning.</w:t>
+              <w:t>Versioned policies, stored rule snapshots and decision traces; preview validation, durable crew constraints and automatic planning for accepted inspections and explicit replanning for other changes.</w:t>
             </w:r>
           </w:p>
         </w:tc>

</xml_diff>

<commit_message>
docs(report): improve prose and clarify experiment comparisons
</commit_message>
<xml_diff>
--- a/ProjectReport/IRS-PM-2026-08-17-AIS08FT-GRP-Group37-RoadGuard-Group-Report.docx
+++ b/ProjectReport/IRS-PM-2026-08-17-AIS08FT-GRP-Group37-RoadGuard-Group-Report.docx
@@ -246,7 +246,7 @@
         <w:rPr>
           <w:color w:val="000000"/>
         </w:rPr>
-        <w:t>RoadGuard integrates road-damage detection, rule-based decisions and maintenance scheduling for four crews in Jurong East and Jurong West. Inspectors upload geolocated images, a local YOLO11s model selects one primary damage observation, and a confidence policy either creates a repair task or requests human review. A genetic algorithm and a Greedy baseline then allocate accepted work from a common NUS-ISS dispatch origin. A shared web application supports inspectors, dispatchers and crew accounts, with persistent task history and revision checks. A dispatcher assistant retrieves reviewed project knowledge and saved-plan evidence, while separate preview and confirmation workflows support persistent crew assignment and task cancellation.</w:t>
+        <w:t xml:space="preserve">RoadGuard combines road-damage detection, rule-based decisions and maintenance scheduling for four crews in Jurong East and Jurong West. Inspectors upload geolocated images, and a local YOLO11s model selects one primary damage observation. A confidence policy then determines whether to create a repair task or request human review. A genetic algorithm and a Greedy baseline allocate accepted work from a common NUS-ISS dispatch origin. Inspectors, dispatchers and crews use a shared web application that retains task history and checks record revisions. A dispatcher assistant retrieves reviewed project knowledge and evidence from saved plans. Separate preview and confirmation workflows allow dispatchers to save crew assignments and cancel tasks.</w:t>
       </w:r>
     </w:p>
     <w:p>
@@ -254,14 +254,14 @@
         <w:rPr>
           <w:color w:val="000000"/>
         </w:rPr>
-        <w:t xml:space="preserve">Evaluation combines visual-recognition experiments, twelve routing scenarios and integrated workflow tests. Recognition reliability and independent local validation remain unresolved. Greedy-seeded search improved the scheduling result in all 120 default-budget runs, with scenario-mean objective reductions of 0.73–3.62%. </w:t>
+        <w:t xml:space="preserve">Our evaluation combines visual-recognition experiments, twelve routing scenarios and tests of the integrated workflow. The detector still needs improvement and independent local validation. The GA initialised with a Greedy solution improved on Greedy in all 120 runs under the default search settings. Mean objective reductions across scenarios ranged from 0.73–3.62%. </w:t>
       </w:r>
       <w:r>
         <w:rPr>
           <w:rFonts w:hint="eastAsia"/>
           <w:color w:val="000000"/>
         </w:rPr>
-        <w:t>The assistant was evaluated using actual GPT-generated responses and local retrieval tests. Separately, targeted acceptance tests verified user-confirmed task changes.</w:t>
+        <w:t xml:space="preserve">We evaluated the assistant using actual GPT-generated responses and local retrieval tests, and separately verified user-confirmed task changes.</w:t>
       </w:r>
       <w:r>
         <w:rPr>
@@ -277,7 +277,7 @@
         <w:rPr>
           <w:color w:val="000000"/>
         </w:rPr>
-        <w:t>The contribution is an integrated decision process with retained evidence, human correction and constrained crew planning. Operational deployment requires calibrated rules, measured service assumptions and further field evaluation.</w:t>
+        <w:t xml:space="preserve">The project connects inspection evidence to crew planning while allowing human correction and retaining a record of decisions. Operational deployment requires validated rules, measured service assumptions and further field evaluation.</w:t>
       </w:r>
     </w:p>
     <w:p>
@@ -465,7 +465,7 @@
         <w:tab/>
       </w:r>
       <w:r>
-        <w:t>3</w:t>
+        <w:t>4</w:t>
       </w:r>
     </w:p>
     <w:p>
@@ -492,7 +492,7 @@
         <w:tab/>
       </w:r>
       <w:r>
-        <w:t>5</w:t>
+        <w:t>6</w:t>
       </w:r>
     </w:p>
     <w:p>
@@ -519,7 +519,7 @@
         <w:tab/>
       </w:r>
       <w:r>
-        <w:t>5</w:t>
+        <w:t>6</w:t>
       </w:r>
     </w:p>
     <w:p>
@@ -537,7 +537,7 @@
         <w:fldChar w:fldCharType="separate"/>
       </w:r>
       <w:r>
-        <w:t>3.2 Decision and Scheduling Semantics</w:t>
+        <w:t>3.2 Detection Decisions and Route Scheduling</w:t>
       </w:r>
       <w:r>
         <w:fldChar w:fldCharType="end"/>
@@ -546,7 +546,7 @@
         <w:tab/>
       </w:r>
       <w:r>
-        <w:t>5</w:t>
+        <w:t>6</w:t>
       </w:r>
     </w:p>
     <w:p>
@@ -573,7 +573,7 @@
         <w:tab/>
       </w:r>
       <w:r>
-        <w:t>6</w:t>
+        <w:t>8</w:t>
       </w:r>
     </w:p>
     <w:p>
@@ -600,7 +600,7 @@
         <w:tab/>
       </w:r>
       <w:r>
-        <w:t>10</w:t>
+        <w:t>11</w:t>
       </w:r>
     </w:p>
     <w:p>
@@ -627,7 +627,7 @@
         <w:tab/>
       </w:r>
       <w:r>
-        <w:t>10</w:t>
+        <w:t>11</w:t>
       </w:r>
     </w:p>
     <w:p>
@@ -654,7 +654,7 @@
         <w:tab/>
       </w:r>
       <w:r>
-        <w:t>11</w:t>
+        <w:t>12</w:t>
       </w:r>
     </w:p>
     <w:p>
@@ -681,7 +681,7 @@
         <w:tab/>
       </w:r>
       <w:r>
-        <w:t>12</w:t>
+        <w:t>14</w:t>
       </w:r>
     </w:p>
     <w:p>
@@ -708,7 +708,7 @@
         <w:tab/>
       </w:r>
       <w:r>
-        <w:t>12</w:t>
+        <w:t>14</w:t>
       </w:r>
     </w:p>
     <w:p>
@@ -735,7 +735,7 @@
         <w:tab/>
       </w:r>
       <w:r>
-        <w:t>14</w:t>
+        <w:t>17</w:t>
       </w:r>
     </w:p>
     <w:p>
@@ -762,7 +762,7 @@
         <w:tab/>
       </w:r>
       <w:r>
-        <w:t>15</w:t>
+        <w:t>19</w:t>
       </w:r>
     </w:p>
     <w:p>
@@ -789,7 +789,7 @@
         <w:tab/>
       </w:r>
       <w:r>
-        <w:t>18</w:t>
+        <w:t>21</w:t>
       </w:r>
     </w:p>
     <w:p>
@@ -816,7 +816,7 @@
         <w:tab/>
       </w:r>
       <w:r>
-        <w:t>18</w:t>
+        <w:t>21</w:t>
       </w:r>
     </w:p>
     <w:p>
@@ -843,7 +843,7 @@
         <w:tab/>
       </w:r>
       <w:r>
-        <w:t>18</w:t>
+        <w:t>22</w:t>
       </w:r>
     </w:p>
     <w:p>
@@ -870,7 +870,7 @@
         <w:tab/>
       </w:r>
       <w:r>
-        <w:t>19</w:t>
+        <w:t>23</w:t>
       </w:r>
     </w:p>
     <w:p>
@@ -897,7 +897,7 @@
         <w:tab/>
       </w:r>
       <w:r>
-        <w:t>19</w:t>
+        <w:t>23</w:t>
       </w:r>
     </w:p>
     <w:p>
@@ -924,7 +924,7 @@
         <w:tab/>
       </w:r>
       <w:r>
-        <w:t>19</w:t>
+        <w:t>23</w:t>
       </w:r>
     </w:p>
     <w:p>
@@ -951,7 +951,7 @@
         <w:tab/>
       </w:r>
       <w:r>
-        <w:t>20</w:t>
+        <w:t>25</w:t>
       </w:r>
     </w:p>
     <w:p>
@@ -978,7 +978,7 @@
         <w:tab/>
       </w:r>
       <w:r>
-        <w:t>21</w:t>
+        <w:t>25</w:t>
       </w:r>
     </w:p>
     <w:p>
@@ -1005,7 +1005,7 @@
         <w:tab/>
       </w:r>
       <w:r>
-        <w:t>21</w:t>
+        <w:t>25</w:t>
       </w:r>
     </w:p>
     <w:p>
@@ -1032,7 +1032,7 @@
         <w:tab/>
       </w:r>
       <w:r>
-        <w:t>22</w:t>
+        <w:t>27</w:t>
       </w:r>
     </w:p>
     <w:p>
@@ -1059,7 +1059,7 @@
         <w:tab/>
       </w:r>
       <w:r>
-        <w:t>23</w:t>
+        <w:t>27</w:t>
       </w:r>
     </w:p>
     <w:p>
@@ -1086,7 +1086,7 @@
         <w:tab/>
       </w:r>
       <w:r>
-        <w:t>23</w:t>
+        <w:t>29</w:t>
       </w:r>
     </w:p>
     <w:p>
@@ -1113,7 +1113,7 @@
         <w:tab/>
       </w:r>
       <w:r>
-        <w:t>24</w:t>
+        <w:t>30</w:t>
       </w:r>
     </w:p>
     <w:p>
@@ -1140,7 +1140,7 @@
         <w:tab/>
       </w:r>
       <w:r>
-        <w:t>26</w:t>
+        <w:t>31</w:t>
       </w:r>
     </w:p>
     <w:p>
@@ -1167,7 +1167,7 @@
         <w:tab/>
       </w:r>
       <w:r>
-        <w:t>39</w:t>
+        <w:t>44</w:t>
       </w:r>
     </w:p>
     <w:p>
@@ -1217,13 +1217,13 @@
     </w:p>
     <w:p>
       <w:r>
-        <w:t xml:space="preserve">Singapore’s Land Transport Authority describes manual inspection and reporting as labour-intensive and affected by inspectors’ judgement. Its published account of AI-assisted inspection and GeoFormSG also identifies the effort of transferring location coordinates between applications. </w:t>
+        <w:t xml:space="preserve">Singapore’s Land Transport Authority describes manual inspection and reporting as labour-intensive and dependent on inspectors’ judgement. Its published account of AI-assisted inspection and GeoFormSG also identifies the effort required to transfer location coordinates between applications. </w:t>
       </w:r>
       <w:r>
         <w:rPr>
           <w:rFonts w:hint="eastAsia"/>
         </w:rPr>
-        <w:t>This highlights a practical challenge in Singapore's existing road inspection process. However, RoadGuard is developed as an independent prototype and is not integrated with LTA systems.</w:t>
+        <w:t xml:space="preserve">These observations highlight a practical challenge in Singapore's existing road inspection process. We developed RoadGuard as an independent prototype; it is not integrated with LTA systems.</w:t>
       </w:r>
     </w:p>
     <w:p>
@@ -1247,12 +1247,12 @@
     </w:p>
     <w:p>
       <w:r>
-        <w:t>Arya et al.’s RDD2022 benchmark contains 47,420 images from six countries and four damage families. RoadGuard uses the separately published eight-class RDD2022ES derivative, which offers training material but no evidence of Singapore performance or repair priorities. Redmon et al.’s YOLO work provides the methodological basis for joint box and class prediction; the implemented detector is the later Ultralytics YOLO11, selected through project experiments.</w:t>
+        <w:t xml:space="preserve">Arya et al.’s RDD2022 benchmark contains 47,420 images from six countries and covers four damage families. RoadGuard uses the separately published eight-class RDD2022ES derivative. This dataset provides training material but does not establish performance in Singapore or determine repair priorities. Redmon et al.’s YOLO work provides the methodological basis for predicting bounding boxes and classes jointly. Our implemented detector uses the later Ultralytics YOLO11, which we selected through project experiments.</w:t>
       </w:r>
     </w:p>
     <w:p>
       <w:r>
-        <w:t>For scheduling, Vidal’s hybrid genetic-search research illustrates the value of evolutionary search and local improvement in capacitated routing. RoadGuard uses a smaller custom GA, not Vidal’s HGS or SWAP* method. A deterministic Greedy baseline supports transparent comparison. The contribution is the combination of learned perception, editable rules, human correction and evaluated crew planning, rather than a new detector architecture or search algorithm. Compared with an inspection-only tool, this connects accepted evidence to repair allocation and completion.</w:t>
+        <w:t xml:space="preserve">For scheduling, Vidal’s research on hybrid genetic search illustrates the value of combining evolutionary search with local improvement in capacitated routing. RoadGuard uses a smaller custom GA rather than Vidal’s HGS or SWAP* method. A deterministic Greedy baseline provides a transparent basis for comparison. Our contribution is the combination of learned perception, editable rules, human correction and evaluated crew planning, rather than a new detector architecture or search algorithm. Compared with an inspection-only tool, RoadGuard extends the workflow from accepted evidence to repair allocation and completion.</w:t>
       </w:r>
     </w:p>
     <w:p>
@@ -1274,7 +1274,7 @@
         <w:rPr>
           <w:color w:val="000000"/>
         </w:rPr>
-        <w:t>Four crews serve eligible public motor roads in Jurong East and West within frozen URA Master Plan 2025 boundaries, using a simulated NUS-ISS origin. Expressway mainlines and ramps, and private or restricted roads, are excluded. The backend checks geography; road type is user-declared. This is not an actual NUS-ISS maintenance operation.</w:t>
+        <w:t xml:space="preserve">Four crews serve eligible public motor roads in Jurong East and Jurong West within the frozen URA Master Plan 2025 boundaries, using a simulated NUS-ISS origin. Expressway mainlines and ramps, as well as private or restricted roads, are excluded. The backend checks whether a location falls within the permitted area, while users declare the road type. This is not an actual NUS-ISS maintenance operation.</w:t>
       </w:r>
     </w:p>
     <w:p>
@@ -1282,13 +1282,14 @@
         <w:rPr>
           <w:color w:val="000000"/>
         </w:rPr>
-        <w:t>The workflow covers primary detection, confidence review, rule-based tasks, automatic planning for accepted inspections and explicit replanning for other changes, comparative schedules and crew completion, plus grounded answers and confirmed adjustments. Table 1 compares the delivered scope with the submitted proposal in Appendix B. Jurong restriction and four crews follow presentation feedback; other changes reflect implementation decisions or evaluation gaps.</w:t>
+        <w:t xml:space="preserve">The workflow covers primary damage detection, confidence-based review, rule-based task creation, comparative scheduling and crew completion. Accepted inspections trigger automatic planning attempts, while other changes require explicit replanning. The dispatcher assistant also provides answers grounded in evidence and supports confirmed adjustments. Table 1 compares the delivered scope with the submitted proposal in Appendix B. The restriction to Jurong and the use of four crews follow presentation feedback; the other changes reflect implementation decisions or gaps in evaluation.</w:t>
       </w:r>
     </w:p>
     <w:p>
       <w:pPr>
         <w:pStyle w:val="164"/>
         <w:keepNext/>
+        <w:pageBreakBefore w:val="1"/>
       </w:pPr>
       <w:r>
         <w:t>Table 1. Changes from the original project plan</w:t>
@@ -1759,7 +1760,7 @@
                 <w:color w:val="000000"/>
                 <w:sz w:val="21"/>
               </w:rPr>
-              <w:t>Accepted uploads and review confirmation/correction trigger a planning attempt after task commit; other changes require explicit recalculation</w:t>
+              <w:t xml:space="preserve">Accepted uploads and review confirmations or corrections trigger a planning attempt after the task is committed; other changes require explicit recalculation</w:t>
             </w:r>
           </w:p>
         </w:tc>
@@ -1871,7 +1872,7 @@
                 <w:color w:val="000000"/>
                 <w:sz w:val="21"/>
               </w:rPr>
-              <w:t>Optional Google matrix; default simulation; schematic SVG map</w:t>
+              <w:t xml:space="preserve">Optional Google travel matrix; simulated travel by default; schematic SVG map</w:t>
             </w:r>
           </w:p>
         </w:tc>
@@ -2207,7 +2208,7 @@
                 <w:color w:val="000000"/>
                 <w:sz w:val="21"/>
               </w:rPr>
-              <w:t>Authenticated roles, own-inspection and fixed-crew enforcement</w:t>
+              <w:t xml:space="preserve">Authenticated roles; inspectors restricted to their own inspections and crew accounts to their fixed crew</w:t>
             </w:r>
           </w:p>
         </w:tc>
@@ -2221,7 +2222,7 @@
         <w:rPr>
           <w:color w:val="000000"/>
         </w:rPr>
-        <w:t>The configurable 480-minute shift and depot return remain unapproved operational assumptions. GPT/RAG and preview–confirm–replan are implemented; targeted acceptance does not establish the full question-and-change evaluation proposed in Appendix B.</w:t>
+        <w:t xml:space="preserve">The configurable 480-minute shift and the requirement to return to the depot remain unapproved operational assumptions. GPT/RAG and the preview–confirm–replan workflow are implemented, but targeted acceptance tests do not establish completion of the full question-and-change evaluation proposed in Appendix B.</w:t>
       </w:r>
     </w:p>
     <w:p>
@@ -2243,15 +2244,15 @@
         <w:rPr>
           <w:rFonts w:hint="eastAsia"/>
         </w:rPr>
-        <w:t>We used version 1 of RDD2022ES dataset and retained its original eight damage classes throughout model development.</w:t>
-      </w:r>
-      <w:r>
-        <w:t xml:space="preserve"> Images are decoded and annotation coordinates and class IDs checked; missing-label and uncertain orientation groups are quarantined. File hashes and exclusion manifests preserve preparation decisions. The publisher’s conflicting licence statements remain unresolved for prospective commercial reuse.</w:t>
+        <w:t xml:space="preserve">We used version 1 of the RDD2022ES dataset and retained its eight damage classes throughout model development.</w:t>
+      </w:r>
+      <w:r>
+        <w:t xml:space="preserve"> Our preparation pipeline decodes images and checks annotation coordinates and class IDs. It sets aside groups with missing labels or uncertain orientation, and records these decisions in exclusion manifests and file hashes. The publisher’s conflicting licence statements remain unresolved for prospective commercial reuse.</w:t>
       </w:r>
     </w:p>
     <w:p>
       <w:r>
-        <w:t>Originals and mirrors are grouped before splitting, with exact and conservative perceptual similarity checks linking additional related images. Country-stratified allocation uses seed 42 and approximately 70/15/15 proportions. Training includes mirrors; validation and test use originals only. This limits known duplicate leakage but cannot establish independence of adjacent scenes without sequence or location metadata.</w:t>
+        <w:t xml:space="preserve">We group original images with their mirrors before splitting the data, and use exact and conservative perceptual similarity checks to link other related images. We then allocate groups by country using seed 42 and approximate proportions of 70/15/15. Training includes mirrors, while validation and test use only original images. This procedure limits known duplicate leakage, but without sequence or location metadata it cannot establish that adjacent scenes are independent.</w:t>
       </w:r>
     </w:p>
     <w:p>
@@ -3007,7 +3008,7 @@
         <w:spacing w:before="120"/>
       </w:pPr>
       <w:r>
-        <w:t>Only the historical YOLO11n 10-epoch baseline has a recorded test-set evaluation. Subsequent model and policy selection reused validation data. These are foreign-source research photographs; synthetic Jurong task coordinates are separate scheduling inputs and do not establish where a photograph was captured.</w:t>
+        <w:t xml:space="preserve">Only the historical YOLO11n 10-epoch baseline has a recorded test-set evaluation. We reused validation data for subsequent model and policy selection. The research photographs come from foreign sources. The synthetic Jurong task coordinates are separate scheduling inputs and do not establish where any photograph was captured.</w:t>
       </w:r>
     </w:p>
     <w:p>
@@ -3015,7 +3016,7 @@
         <w:rPr>
           <w:color w:val="000000"/>
         </w:rPr>
-        <w:t>Versioned business rules encode severity, priority, service minutes and explanations. The source-hashed a-knowledge-v19 package records reviewed scope, label meanings, rules and workflows; it is indexed locally in ChromaDB with multilingual-e5-small embeddings. It was checked against repository content, not approved by engineering experts. Only reviewed static documents are indexed; authorized saved-plan facts are obtained separately. The visual qualifiers “wide”, “sunken” and “deep” are categorical labels, not measurements of width, depth or structural condition.</w:t>
+        <w:t xml:space="preserve">Versioned business rules specify severity, priority, service time in minutes and explanations. The a-knowledge-v19 package records the reviewed scope, label meanings, rules and workflows, together with hashes of its sources. We index it locally in ChromaDB using multilingual-e5-small embeddings. The package was checked against repository content but has not been approved by engineering experts. Only reviewed static documents enter the index; facts from saved plans are obtained separately with authorization checks. The visual qualifiers “wide”, “sunken” and “deep” are categorical labels rather than measurements of width, depth or structural condition.</w:t>
       </w:r>
     </w:p>
     <w:p>
@@ -4362,7 +4363,7 @@
         <w:spacing w:before="120"/>
       </w:pPr>
       <w:r>
-        <w:t>Confidence governs acceptance, while the selected label determines the rule outcome. A confident incorrect label can therefore create an incorrect task. Service times are project assumptions, not measured construction standards.</w:t>
+        <w:t xml:space="preserve">Confidence determines whether an observation is accepted, while the selected label determines the rule outcome. An incorrect label with high confidence can therefore create an incorrect task. Service times are project assumptions rather than measured construction standards.</w:t>
       </w:r>
     </w:p>
     <w:p>
@@ -4398,7 +4399,15 @@
         <w:rPr>
           <w:color w:val="000000"/>
         </w:rPr>
-        <w:t>A React client uses one FastAPI backend and shared SQLite database. Separate services handle vision, rules, inspections, tasks, crews and planning. YOLO supplies both class and location evidence for review; explicit rules keep policy changes separate from model training. GA addresses the discrete combination of task assignment and visit order, while Greedy provides an interpretable baseline and a dependable initial solution. A dispatcher-only assistant combines local Chroma/E5 retrieval with authorized saved-plan facts. Optional GPT generation selects server-owned evidence IDs; the server restores exact quotations for a guarded answer and derives canonical repair-rule answers from rule evidence. A separate adjustment service validates, confirms and persists changes without letting a generated answer authorize a business action.</w:t>
+        <w:t xml:space="preserve">The React frontend connects to one FastAPI backend and a shared SQLite database. Separate services handle vision, rules, inspections, tasks, crews and planning. YOLO predicts the damage class and its location within the image for review. Repair policy is held in explicit rules, so it can change without retraining the model. The GA searches for suitable task assignments and visit orders, while Greedy provides a baseline and an initial solution.</w:t>
+      </w:r>
+    </w:p>
+    <w:p>
+      <w:r>
+        <w:rPr>
+          <w:color w:val="000000"/>
+        </w:rPr>
+        <w:t>The dispatcher assistant retrieves project documents from a local ChromaDB index using E5 embeddings and obtains authorised facts from saved plans separately. When GPT generation is enabled, the model selects supporting evidence IDs supplied by the server. The server attaches exact quotations and checks the answer. For repair-rule questions, it constructs the answer from the matching rule rows. Changes to tasks and crews follow a separate service that validates the request and saves it only after confirmation; an answer alone cannot authorise an action.</w:t>
       </w:r>
     </w:p>
     <w:p>
@@ -4471,7 +4480,7 @@
         <w:rPr>
           <w:color w:val="000000"/>
         </w:rPr>
-        <w:t>Note. Evidence questions do not mutate business records. Confirmed adjustments persist separately; replanning these adjustments still requires an explicit dispatcher request. Source validation and bounded answer checks do not guarantee every semantic judgement.</w:t>
+        <w:t xml:space="preserve">Note. Questions do not change business records. Dispatchers must confirm proposed adjustments and explicitly recalculate the affected routes. Source checks and validation of specific answer fields reduce unsupported output but cannot guarantee that every answer is semantically correct.</w:t>
       </w:r>
     </w:p>
     <w:p>
@@ -4483,14 +4492,14 @@
       <w:bookmarkStart w:id="16" w:name="RGCurrentHeading8"/>
       <w:bookmarkStart w:id="17" w:name="_RGI_9"/>
       <w:r>
-        <w:t>3.2 Decision and Scheduling Semantics</w:t>
+        <w:t xml:space="preserve">3.2 Detection Decisions and Route Scheduling</w:t>
       </w:r>
       <w:bookmarkEnd w:id="16"/>
       <w:bookmarkEnd w:id="17"/>
     </w:p>
     <w:p>
       <w:r>
-        <w:t>The backend checks the local model manifest, weight hash and eight-class schema. Inference filters candidates at confidence 0.20. The primary box is ranked by confidence multiplied by the fourth root of its image-area fraction; this score does not replace raw confidence. A primary confidence of at least 0.60 automatically creates one task, lower confidence requires review, and no detection creates no task. Raw evidence, the rule snapshot and review history are retained. Corrections use the frozen rules, and idempotent requests prevent duplicate tasks.</w:t>
+        <w:t xml:space="preserve">The backend checks the local model manifest, weight hash and eight-class schema. Inference filters candidates at confidence 0.20. It ranks primary-box candidates by confidence multiplied by the fourth root of the fraction of image area they occupy; this ranking score does not replace raw confidence. A primary observation with raw confidence of at least 0.60 automatically creates one task. Lower confidence requires review, and no detection creates no task. The system retains raw evidence, the rule snapshot and review history. Corrections use the frozen rules, and idempotent requests prevent duplicate tasks.</w:t>
       </w:r>
     </w:p>
     <w:p>
@@ -4498,12 +4507,7 @@
         <w:rPr>
           <w:color w:val="000000"/>
         </w:rPr>
-        <w:t>Both planners read the same active tasks, crew availability, travel matrix and constraints from a consistent revision. Greedy selects the earliest available crew and a feasible task by priority, then travel time. The GA encodes a task permutation and crew-owner vector. Tournament selection, order-preserving crossover, reassignment, swap, reversal, relocation and elitism explore alternatives; evaluation caching avoids duplicate scoring. Online search includes the Greedy solution, whereas unseeded GA is retained for experimental comparison. Both planners also preserve durable task-to-crew constraints, including after a restart or the arrival of new tasks. Unavailable or infeasible constrained work remains explicitly unassigned rather than silently transferring crews.</w:t>
-      </w:r>
-    </w:p>
-    <w:p>
-      <w:r>
-        <w:t>Candidates minimise the ordered tuple (unassigned P1 count, unassigned P2 count, unassigned P3 count, J), where J = makespan + 0.2 × total travel + 0.5 × workload standard deviation + 0.5 × priority-weighted mean completion time. The final term averages completion times using P1/P2/P3 weights of 3/2/1. Components use minutes; J is a weighted objective, not elapsed time or money. No task deadlines are supplied, so priority-weighted completion is not lateness.</w:t>
+        <w:t xml:space="preserve">Both planners read the same active tasks, crew availability, travel matrix and constraints at a consistent revision. Greedy selects the earliest available crew, then selects a feasible task by priority and travel time. The GA represents each solution as a task permutation and a vector assigning tasks to crews. It explores alternatives through tournament selection, order-preserving crossover, reassignment, swap, reversal, relocation and elitism, while caching evaluations to avoid scoring the same solution twice.</w:t>
       </w:r>
     </w:p>
     <w:p>
@@ -4511,7 +4515,28 @@
         <w:rPr>
           <w:color w:val="000000"/>
         </w:rPr>
-        <w:t>Accepted uploads and review confirmation/correction automatically attempt paired GA/Greedy planning after task commit, using the same snapshot and matrix. Pending review, no detection and dismissal trigger none. Completion, cancellation, crew changes and assistant confirmations still require explicit replanning. A superseded input revision is rejected before paired plans are saved. A move preview retains all other assigned tasks and checks travel, service and configured return against the shift. Confirmation stores a durable crew constraint; cancellation retains history and removes active work. Stale or expired proposals, version conflicts, repeated confirmation and role/CSRF checks are handled explicitly. Reassignment immediately removes the previous crew’s task, inspection and completion access; the target crew receives access after a fresh saved GA plan. Completion also checks task version in the same transaction. The database schema is version 6.</w:t>
+        <w:t>Online search includes the Greedy solution; we retain unseeded GA for experimental comparison. Both planners preserve durable task-to-crew constraints after a restart or the arrival of new tasks. If constrained work cannot be assigned because the crew is unavailable or the work is infeasible, it remains explicitly unassigned rather than being silently transferred to another crew.</w:t>
+      </w:r>
+    </w:p>
+    <w:p>
+      <w:r>
+        <w:t xml:space="preserve">The planners compare candidates in order of unassigned P1 tasks, then unassigned P2 tasks, then unassigned P3 tasks. Only when these counts are equal do they minimise J = makespan + 0.2 × total travel + 0.5 × workload standard deviation + 0.5 × priority-weighted mean completion time. This ordering gives task coverage precedence over the weighted objective. Makespan is the longest crew schedule, and workload standard deviation measures differences in work duration between crews. The final term averages task completion times using P1/P2/P3 weights of 3/2/1. All components use minutes, but J is a weighted score rather than elapsed time or money. Since tasks have no deadlines, priority-weighted completion does not measure lateness.</w:t>
+      </w:r>
+    </w:p>
+    <w:p>
+      <w:r>
+        <w:rPr>
+          <w:color w:val="000000"/>
+        </w:rPr>
+        <w:t xml:space="preserve">Accepted uploads and review confirmations or corrections automatically trigger an attempt to plan with both GA and Greedy after the task is committed, using the same snapshot and matrix. Pending review, no detection and dismissal do not trigger planning. Completion, cancellation, crew changes and assistant confirmations require explicit replanning. Before saving the paired plans, the system rejects any input revision that has been superseded.</w:t>
+      </w:r>
+    </w:p>
+    <w:p>
+      <w:r>
+        <w:rPr>
+          <w:color w:val="000000"/>
+        </w:rPr>
+        <w:t>A move preview retains all other assigned tasks and checks travel, service and the configured return requirement against the shift limit. Confirmation stores a durable crew constraint. Cancellation retains history and removes the task from active work. The system explicitly handles stale or expired proposals, version conflicts and repeated confirmations, and enforces role and CSRF checks. Reassignment immediately revokes the previous crew’s access to the task and inspection and its permission to complete the task. The target crew gains access after a fresh GA plan is saved. Completion also checks the task version within the same transaction. The database schema is version 6.</w:t>
       </w:r>
     </w:p>
     <w:p>
@@ -4533,7 +4558,15 @@
         <w:rPr>
           <w:color w:val="000000"/>
         </w:rPr>
-        <w:t>The application supports uploads, inspection details, reviews, tasks, crew availability, route planning, algorithm comparison and a mobile crew workspace. Backend authorization enforces the role restrictions in Table 4 independently of visible navigation. Authentication uses hashed passwords and sessions, with CSRF checks for modifying requests. Route assistant presents English answers before default-collapsed View sources, and four saved-route crew cards with move/cancel previews. Query-v3 returns model identity from non-secret backend configuration without a provider call, gives explicit guidance for clearly unrelated questions, and retains strict evidence validation for repair and saved-route questions. Ambiguous or insufficient evidence remains explicit.</w:t>
+        <w:t xml:space="preserve">The application supports uploads, inspection details, reviews, tasks, crew availability, route planning, algorithm comparison and a mobile crew workspace. Backend authorization enforces the role restrictions in Table 4 independently of the navigation shown to users. Authentication uses hashed passwords and sessions, with CSRF checks for modifying requests.</w:t>
+      </w:r>
+    </w:p>
+    <w:p>
+      <w:r>
+        <w:rPr>
+          <w:color w:val="000000"/>
+        </w:rPr>
+        <w:t>Route assistant displays English answers before the View sources section, which is collapsed by default. It also presents four crew cards for saved routes, with previews for moving or cancelling tasks. Query-v3 returns model identity from non-secret backend configuration without calling the provider, gives explicit guidance for clearly unrelated questions, and applies strict evidence validation to repair and saved-route questions. It explicitly reports ambiguous or insufficient evidence.</w:t>
       </w:r>
     </w:p>
     <w:p>
@@ -4865,7 +4898,7 @@
                 <w:color w:val="000000"/>
                 <w:sz w:val="21"/>
               </w:rPr>
-              <w:t>Review, tasks, crews, planning, comparison, evidence questions and confirmed adjustments</w:t>
+              <w:t xml:space="preserve">Review inspections; manage tasks and crews; plan and compare routes; ask evidence questions; confirm adjustments</w:t>
             </w:r>
           </w:p>
         </w:tc>
@@ -5021,7 +5054,7 @@
         <w:spacing w:before="120"/>
       </w:pPr>
       <w:r>
-        <w:t>Travel providers supply either simulated geographic-distance estimates or optional Google road-network estimates, with validation and caching. Provider failure returns an error rather than silently changing the source. Routes are shown as schematic segments, not turn-by-turn road geometry. The interface exposes stale plans, source information and unassigned reasons; percentage comparisons require matched context and compatible assigned task sets.</w:t>
+        <w:t xml:space="preserve">Travel providers supply either simulated estimates based on geographic distance or optional Google estimates based on the road network. Estimates are validated and cached. A provider failure returns an error rather than silently changing the source. The interface displays routes as schematic segments rather than turn-by-turn road geometry, and shows stale plans, source information and reasons for unassigned tasks. Percentage comparisons require matching contexts and compatible sets of assigned tasks.</w:t>
       </w:r>
     </w:p>
     <w:p>
@@ -5107,7 +5140,7 @@
     </w:p>
     <w:p>
       <w:r>
-        <w:t>On mobile, crew accounts retain sign-out and their fixed crew identity, view the current route and confirm task completion. URL changes cannot grant another crew’s access. Recorded 360/390-pixel browser checks found no whole-page horizontal overflow.</w:t>
+        <w:t xml:space="preserve">On mobile, crew accounts can sign out, see their fixed crew identity, view the current route and confirm task completion. Changing the URL cannot grant access to another crew’s work. Recorded browser checks at widths of 360 and 390 pixels found no horizontal overflow across the page as a whole.</w:t>
       </w:r>
     </w:p>
     <w:p>
@@ -5199,7 +5232,7 @@
         <w:rPr>
           <w:color w:val="000000"/>
         </w:rPr>
-        <w:t>Learned visual perception supplies uncertain evidence; explicit rules determine the permitted business response; constrained search allocates accepted work. Retrieval and optional language generation explain reviewed knowledge and saved-plan facts, with server-owned citations and bounded validation. Confirmed business adjustments remain a separate guarded workflow. These complementary methods form the reasoning chain described in Sections 3.1 and 3.2. Appendix C maps delivered functions to MR, RS and CGS, with evidence, verification references and limitations.</w:t>
+        <w:t xml:space="preserve">The methods serve different roles in the same workflow. YOLO supplies a predicted damage type and location, with uncertainty represented by its confidence score. Explicit rules translate accepted observations into repair tasks, and constrained search assigns those tasks to crews. The assistant retrieves reviewed knowledge and saved-plan facts to explain decisions, with optional language generation and checks against the cited evidence. Proposed adjustments still require validation and confirmation. Sections 3.1 and 3.2 describe how these steps interact, while Appendix C maps them to MR, RS and CGS and identifies the supporting evaluation and its limits.</w:t>
       </w:r>
     </w:p>
     <w:p>
@@ -5472,7 +5505,7 @@
                 <w:color w:val="000000"/>
                 <w:sz w:val="21"/>
               </w:rPr>
-              <w:t>Data and model experiments; business rules and shared backend; model release; integration, authentication and later interface refinement.</w:t>
+              <w:t xml:space="preserve">Data preparation and model experiments; business rules and shared backend; model release; integration, authentication and later interface refinement.</w:t>
             </w:r>
           </w:p>
         </w:tc>
@@ -5592,7 +5625,7 @@
                 <w:color w:val="000000"/>
                 <w:sz w:val="21"/>
               </w:rPr>
-              <w:t>Four-crew Greedy and GA planning; crew and plan persistence; Google matrix provider; routing experiments and ablation.</w:t>
+              <w:t xml:space="preserve">Greedy and GA planning for four crews; persistence of crew and plan records; Google matrix provider; routing experiments and ablation.</w:t>
             </w:r>
           </w:p>
         </w:tc>
@@ -5712,7 +5745,7 @@
                 <w:color w:val="000000"/>
                 <w:sz w:val="21"/>
               </w:rPr>
-              <w:t>Frontend foundation and workflow pages; map and comparison integration; retrieval and confirmed-change assistant. Shared integration adds vector grounding and persistent task adjustments.</w:t>
+              <w:t xml:space="preserve">Frontend foundation and workflow pages; map and comparison integration; assistant for retrieval and confirmed changes. Shared integration added vector-based grounding and persistent task adjustments.</w:t>
             </w:r>
           </w:p>
         </w:tc>
@@ -5723,7 +5756,7 @@
         <w:spacing w:before="120"/>
       </w:pPr>
       <w:r>
-        <w:t>Responsibilities were confirmed by the coordinator and corroborated by repository history; squash commits make raw commit counts unsuitable as measures of individual contribution.</w:t>
+        <w:t xml:space="preserve">The coordinator confirmed these responsibilities, and repository history corroborated them. Because commits were squashed, raw commit counts are unsuitable as measures of individual contribution.</w:t>
       </w:r>
     </w:p>
     <w:p>
@@ -5742,25 +5775,36 @@
     </w:p>
     <w:p>
       <w:r>
-        <w:t>Evaluation separates recognition quality, scheduling quality and workflow correctness. The paired YOLO11n/YOLO11s experiments used COCO-pretrained initialisation, 30 epochs, 640-pixel inputs, batch 32, AdamW and seed 42. Subsequent YOLO11s fine-tuning used 40 additional epochs, 832-pixel inputs and batch 16. Multiple settings changed together, so the resulting gains cannot be attributed to one parameter.</w:t>
+        <w:t xml:space="preserve">We evaluated recognition quality, scheduling quality and workflow correctness separately. The paired YOLO11n/YOLO11s experiments used COCO-pretrained initialisation, 30 epochs, 640-pixel inputs, a batch size of 32, AdamW and seed 42. Subsequent YOLO11s fine-tuning used 40 additional epochs, 832-pixel inputs and a batch size of 16. Because multiple settings changed together, the resulting gains cannot be attributed to a single parameter.</w:t>
       </w:r>
     </w:p>
     <w:p>
       <w:r>
-        <w:t>Precision is TP/(TP+FP), Recall is TP/(TP+FN), and F1 is their harmonic mean. Box evaluation requires the correct eight-class label and one-to-one IoU ≥0.5 matching. These micro counts differ from native class-averaged PR operating points and mAP. Single-subject evaluation instead requires the correct primary image label without a box-overlap condition; a wrong label counts as both FP and FN.</w:t>
+        <w:t xml:space="preserve">We measure precision as TP/(TP+FP), recall as TP/(TP+FN), and F1 as their harmonic mean. TP, FP and FN denote true positives, false positives and false negatives. For box evaluation, a correct detection must have the right one of eight class labels and match an annotation at intersection over union (IoU) of at least 0.5. Each prediction and annotation can be matched only once. We pool the counts across images to calculate precision and recall; these results differ from the class-averaged values and mean average precision (mAP) reported by the native validator.</w:t>
       </w:r>
     </w:p>
     <w:p>
       <w:r>
-        <w:t>The 1,230 zero/one-annotation images were split deterministically by source group into 853 calibration and 377 confirmation cases; 691 multi-object images were considered separately. Eighty policies were compared on calibration only. Both subsets came from previously used validation data, so confirmation is not an independent test. Macro F1 averages all eight classes, assigning zero to undefined class ratios, including the unsupported wide-transverse class in confirmation.</w:t>
+        <w:rPr>
+          <w:color w:val="000000"/>
+        </w:rPr>
+        <w:t>The single-subject evaluation asks whether the selected detection has the correct primary damage type. It does not require the box to overlap the annotation. A wrong label counts as both a false positive for the predicted class and a false negative for the true class. This lets us examine classification and missed detections separately from box placement.</w:t>
       </w:r>
     </w:p>
     <w:p>
+      <w:r>
+        <w:t xml:space="preserve">We split the 1,230 images with zero or one annotation deterministically by source group into 853 calibration cases and 377 confirmation cases, and considered the 691 multi-object images separately. We compared eighty policies using only the calibration subset. Both subsets came from previously used validation data, so the confirmation subset is not an independent test. Macro F1 averages all eight classes, assigning zero to undefined class ratios, including the unsupported wide-transverse class in the confirmation subset.</w:t>
+      </w:r>
+    </w:p>
+    <w:p>
+      <w:pPr>
+        <w:pageBreakBefore w:val="1"/>
+      </w:pPr>
       <w:r>
         <w:rPr>
           <w:rFonts w:hint="eastAsia"/>
         </w:rPr>
-        <w:t>For the routing experiments, we combined three task counts (10, 15 and 20), two travel-time sources (simulated and Google), and two shift constraints (480 minutes and unlimited), resulting in 12 four-crew scenarios.</w:t>
+        <w:t xml:space="preserve">For routing, we combined three task counts (10, 15 and 20), two travel-time sources (simulated and Google), and two shift constraints (480 minutes and unlimited), producing 12 scenarios with four crews.</w:t>
       </w:r>
       <w:r>
         <w:rPr>
@@ -5770,7 +5814,15 @@
         <w:t xml:space="preserve"> </w:t>
       </w:r>
       <w:r>
-        <w:t>Each contains Greedy once, pure and Greedy-seeded GA with seeds 1–10, and 20 reference-budget runs with seeds 101–120: 492 runs in total. Default GA uses population 60, at most 300 generations, patience 80, crossover 0.9, mutation 0.3, tournament size 3 and two elites. Reference runs use population 150, at most 1,000 generations and patience 300, alternating pure and seeded initialisation. Inputs and the evaluator are identical within each scenario.</w:t>
+        <w:t xml:space="preserve">Each scenario includes one Greedy run, ten pure-GA runs and ten Greedy-seeded GA runs using seeds 1–10, plus 20 runs with a larger search budget using seeds 101–120. The experiments therefore contain 492 runs in total.</w:t>
+      </w:r>
+    </w:p>
+    <w:p>
+      <w:r>
+        <w:rPr>
+          <w:color w:val="000000"/>
+        </w:rPr>
+        <w:t>The default GA uses a population of 60 and runs for at most 300 generations, stopping after 80 generations without improvement. Its crossover and mutation probabilities are 0.9 and 0.3, respectively, with tournament size 3 and two elite solutions retained. The larger-budget reference runs use a population of 150, at most 1,000 generations and a stopping patience of 300 generations. They alternate between pure and Greedy-seeded initialisation. All runs within each scenario use identical inputs and the same evaluator.</w:t>
       </w:r>
     </w:p>
     <w:p>
@@ -5803,7 +5855,7 @@
     </w:p>
     <w:p>
       <w:r>
-        <w:t>The paired 30-epoch comparison selected YOLO11s for higher validation mAP50–95, but at confidence 0.25 it gained 107 correct matches and added 220 false positives relative to YOLO11n. Matched warm CPU timing on 40 images, repeated three times, gave median/P95 latency of 53.27/63.59 ms for n30 and 81.87/91.85 ms for s30. These timings include image preparation and inference, excluding cold loading, HTTP, database and task processing.</w:t>
+        <w:t xml:space="preserve">In the paired 30-epoch comparison, we selected YOLO11s because it achieved higher validation mAP50–95. At confidence 0.25, however, it produced 107 more correct matches and 220 more false positives than YOLO11n. We measured warm CPU latency under matched conditions on 40 images, repeating the measurement three times. Median/P95 latency was 53.27/63.59 ms for n30 and 81.87/91.85 ms for s30. These timings include image preparation and inference but exclude cold loading, HTTP, database operations and task processing.</w:t>
       </w:r>
     </w:p>
     <w:p>
@@ -6742,12 +6794,12 @@
         <w:pStyle w:val="165"/>
       </w:pPr>
       <w:r>
-        <w:t>Note. mAP values are percentages from native validation. P/R use eight-class, one-to-one IoU ≥0.5 matching on 2,623 boxes. The n10 run is contextual; n30 and s30 form the matched architecture comparison.</w:t>
+        <w:t xml:space="preserve">Note. The model labels n10, n30 and s30 denote YOLO11n trained for 10 epochs, YOLO11n for 30 epochs and YOLO11s for 30 epochs. The n30 and s30 runs form the matched architecture comparison; n10 provides context. Native validation reports mAP50 and mAP50–95 as percentages. Precision and recall use eight-class, one-to-one matching at IoU ≥0.5 on 2,623 annotated boxes.</w:t>
       </w:r>
     </w:p>
     <w:p>
       <w:r>
-        <w:t>Balanced fine-tuning made modest gains. Original-plus-horizontal-flip inference subsequently reached 53.02%/53.26% box P/R, but CPU median/P95 rose from 85.19/99.00 to 142.64/160.94 ms. This composite recipe was not deployed. The released single-v1 model uses the balanced weights and original-only 832-pixel inference with area-quarter primary selection.</w:t>
+        <w:t xml:space="preserve">Balanced fine-tuning produced modest gains. Combining predictions from each original image and its horizontal flip subsequently achieved box precision of 53.02% and recall of 53.26%. However, median CPU latency rose from 85.19 to 142.64 ms, and the 95th percentile rose from 99.00 to 160.94 ms. We did not deploy this combined method. The released single-v1 model uses the balanced weights and processes only the original image at 832 pixels. It selects the primary detection using the confidence-and-area score defined in Section 3.2.</w:t>
       </w:r>
     </w:p>
     <w:p>
@@ -6816,6 +6868,7 @@
             <w:pPr>
               <w:spacing w:after="40" w:line="264" w:lineRule="auto"/>
               <w:jc w:val="left"/>
+              <w:keepNext w:val="1"/>
             </w:pPr>
             <w:r>
               <w:rPr>
@@ -6850,6 +6903,7 @@
             <w:pPr>
               <w:spacing w:after="40" w:line="264" w:lineRule="auto"/>
               <w:jc w:val="left"/>
+              <w:keepNext w:val="1"/>
             </w:pPr>
             <w:r>
               <w:rPr>
@@ -6884,6 +6938,7 @@
             <w:pPr>
               <w:spacing w:after="40" w:line="264" w:lineRule="auto"/>
               <w:jc w:val="left"/>
+              <w:keepNext w:val="1"/>
             </w:pPr>
             <w:r>
               <w:rPr>
@@ -6918,6 +6973,7 @@
             <w:pPr>
               <w:spacing w:after="40" w:line="264" w:lineRule="auto"/>
               <w:jc w:val="left"/>
+              <w:keepNext w:val="1"/>
             </w:pPr>
             <w:r>
               <w:rPr>
@@ -6952,6 +7008,7 @@
             <w:pPr>
               <w:spacing w:after="40" w:line="264" w:lineRule="auto"/>
               <w:jc w:val="left"/>
+              <w:keepNext w:val="1"/>
             </w:pPr>
             <w:r>
               <w:rPr>
@@ -6986,6 +7043,7 @@
             <w:pPr>
               <w:spacing w:after="40" w:line="264" w:lineRule="auto"/>
               <w:jc w:val="left"/>
+              <w:keepNext w:val="1"/>
             </w:pPr>
             <w:r>
               <w:rPr>
@@ -7020,6 +7078,7 @@
             <w:pPr>
               <w:spacing w:after="40" w:line="264" w:lineRule="auto"/>
               <w:jc w:val="left"/>
+              <w:keepNext w:val="1"/>
             </w:pPr>
             <w:r>
               <w:rPr>
@@ -7066,6 +7125,7 @@
             <w:pPr>
               <w:spacing w:after="40" w:line="264" w:lineRule="auto"/>
               <w:jc w:val="left"/>
+              <w:keepNext w:val="1"/>
             </w:pPr>
             <w:r>
               <w:rPr>
@@ -7099,6 +7159,7 @@
             <w:pPr>
               <w:spacing w:after="40" w:line="264" w:lineRule="auto"/>
               <w:jc w:val="center"/>
+              <w:keepNext w:val="1"/>
             </w:pPr>
             <w:r>
               <w:rPr>
@@ -7132,6 +7193,7 @@
             <w:pPr>
               <w:spacing w:after="40" w:line="264" w:lineRule="auto"/>
               <w:jc w:val="center"/>
+              <w:keepNext w:val="1"/>
             </w:pPr>
             <w:r>
               <w:rPr>
@@ -7165,6 +7227,7 @@
             <w:pPr>
               <w:spacing w:after="40" w:line="264" w:lineRule="auto"/>
               <w:jc w:val="center"/>
+              <w:keepNext w:val="1"/>
             </w:pPr>
             <w:r>
               <w:rPr>
@@ -7198,6 +7261,7 @@
             <w:pPr>
               <w:spacing w:after="40" w:line="264" w:lineRule="auto"/>
               <w:jc w:val="center"/>
+              <w:keepNext w:val="1"/>
             </w:pPr>
             <w:r>
               <w:rPr>
@@ -7231,6 +7295,7 @@
             <w:pPr>
               <w:spacing w:after="40" w:line="264" w:lineRule="auto"/>
               <w:jc w:val="center"/>
+              <w:keepNext w:val="1"/>
             </w:pPr>
             <w:r>
               <w:rPr>
@@ -7264,6 +7329,7 @@
             <w:pPr>
               <w:spacing w:after="40" w:line="264" w:lineRule="auto"/>
               <w:jc w:val="center"/>
+              <w:keepNext w:val="1"/>
             </w:pPr>
             <w:r>
               <w:rPr>
@@ -7308,7 +7374,7 @@
           </w:tcPr>
           <w:p>
             <w:pPr>
-              <w:keepNext/>
+              <w:keepNext w:val="1"/>
               <w:spacing w:after="40" w:line="264" w:lineRule="auto"/>
               <w:jc w:val="left"/>
             </w:pPr>
@@ -7319,7 +7385,7 @@
                 <w:color w:val="000000"/>
                 <w:sz w:val="21"/>
               </w:rPr>
-              <w:t>Selected area-quarter, threshold 0.20</w:t>
+              <w:t xml:space="preserve">Confidence-and-area selection, threshold 0.20</w:t>
             </w:r>
           </w:p>
         </w:tc>
@@ -7342,7 +7408,7 @@
           </w:tcPr>
           <w:p>
             <w:pPr>
-              <w:keepNext/>
+              <w:keepNext w:val="1"/>
               <w:spacing w:after="40" w:line="264" w:lineRule="auto"/>
               <w:jc w:val="center"/>
             </w:pPr>
@@ -7376,7 +7442,7 @@
           </w:tcPr>
           <w:p>
             <w:pPr>
-              <w:keepNext/>
+              <w:keepNext w:val="1"/>
               <w:spacing w:after="40" w:line="264" w:lineRule="auto"/>
               <w:jc w:val="center"/>
             </w:pPr>
@@ -7410,7 +7476,7 @@
           </w:tcPr>
           <w:p>
             <w:pPr>
-              <w:keepNext/>
+              <w:keepNext w:val="1"/>
               <w:spacing w:after="40" w:line="264" w:lineRule="auto"/>
               <w:jc w:val="center"/>
             </w:pPr>
@@ -7444,7 +7510,7 @@
           </w:tcPr>
           <w:p>
             <w:pPr>
-              <w:keepNext/>
+              <w:keepNext w:val="1"/>
               <w:spacing w:after="40" w:line="264" w:lineRule="auto"/>
               <w:jc w:val="center"/>
             </w:pPr>
@@ -7478,7 +7544,7 @@
           </w:tcPr>
           <w:p>
             <w:pPr>
-              <w:keepNext/>
+              <w:keepNext w:val="1"/>
               <w:spacing w:after="40" w:line="264" w:lineRule="auto"/>
               <w:jc w:val="center"/>
             </w:pPr>
@@ -7534,17 +7600,25 @@
         <w:pStyle w:val="165"/>
       </w:pPr>
       <w:r>
-        <w:t>Note. Offline hash-verified GPU exports; 171 positive and 206 empty-annotation images. Localisation is not required. Macro F1 averages eight classes, with zero for the unsupported class. These are reused-validation results, not a new CPU-service or Jurong field test.</w:t>
+        <w:t xml:space="preserve">Note. These results use offline GPU exports verified by file hashes and include 171 positive images and 206 images with empty annotations. Localisation is not required for this metric. Macro F1 averages all eight classes, assigning zero to the class with no positive examples. The results reuse validation data; they do not represent a new CPU-service evaluation or a Jurong field test.</w:t>
       </w:r>
     </w:p>
     <w:p>
       <w:r>
-        <w:t>Selected image-type Precision/Recall were 61.63%/61.99%, versus 61.25%/57.31% for confidence-only selection. The selected policy produced eight more correctly typed images and four more false positives. Correct-type localisation at IoU 0.5 was lower, at 50.58%/50.88%. Results over all 1,230 eligible images were 65.68%/65.23%, but include calibration and cannot replace confirmation. Neither target of Precision and Recall above 70% was met.</w:t>
+        <w:t xml:space="preserve">On the 377-image confirmation subset, the selected policy achieved image-type precision of 61.63% and recall of 61.99%, compared with 61.25% and 57.31% for confidence-only selection. It correctly classified eight more images but also produced four more false positives. When a correct detection also required localisation at IoU 0.5, precision and recall fell to 50.58% and 50.88%.</w:t>
       </w:r>
     </w:p>
     <w:p>
       <w:r>
-        <w:t>The approximately 60% result reflects both classification errors and missed or spurious detections. Of 171 annotated positive images, 106 received the correct type, 31 received a wrong type and 34 produced no detection. Another 35 of 206 empty-annotation images produced a prediction. Thus the selected policy has 106 TP, 66 FP and 65 FN. Counting only damage presence gives 79.65% Precision and 80.12% Recall on the same images, but this easier diagnostic does not satisfy eight-class recognition. Box displacement cannot explain the image-type gap because overlap is not required by this metric.</w:t>
+        <w:rPr>
+          <w:color w:val="000000"/>
+        </w:rPr>
+        <w:t>Across all 1,230 eligible images, image-type precision and recall were 65.68% and 65.23%. This larger set includes the calibration images used to choose the policy, so it cannot replace the confirmation results. Neither precision nor recall met the target of above 70%.</w:t>
+      </w:r>
+    </w:p>
+    <w:p>
+      <w:r>
+        <w:t xml:space="preserve">Both incorrect classification and missed or spurious detections contributed to the precision and recall of approximately 60%. Among 171 annotated positive images, the selected policy assigned the correct type to 106, assigned the wrong type to 31 and returned no detection for 34. It also returned predictions for 35 of the 206 images with empty annotations. These outcomes give 106 true positives, 66 false positives and 65 false negatives under the image-type metric. If evaluation considers only the presence of damage, precision rises to 79.65% and recall to 80.12% on the same images. This easier diagnostic does not establish recognition across the eight damage classes. Displaced boxes cannot explain the image-type shortfall because this metric does not require overlap.</w:t>
       </w:r>
     </w:p>
     <w:p>
@@ -7610,6 +7684,7 @@
             <w:pPr>
               <w:spacing w:after="40" w:line="264" w:lineRule="auto"/>
               <w:jc w:val="left"/>
+              <w:keepNext w:val="1"/>
             </w:pPr>
             <w:r>
               <w:rPr>
@@ -7644,6 +7719,7 @@
             <w:pPr>
               <w:spacing w:after="40" w:line="264" w:lineRule="auto"/>
               <w:jc w:val="left"/>
+              <w:keepNext w:val="1"/>
             </w:pPr>
             <w:r>
               <w:rPr>
@@ -7678,6 +7754,7 @@
             <w:pPr>
               <w:spacing w:after="40" w:line="264" w:lineRule="auto"/>
               <w:jc w:val="left"/>
+              <w:keepNext w:val="1"/>
             </w:pPr>
             <w:r>
               <w:rPr>
@@ -7712,6 +7789,7 @@
             <w:pPr>
               <w:spacing w:after="40" w:line="264" w:lineRule="auto"/>
               <w:jc w:val="left"/>
+              <w:keepNext w:val="1"/>
             </w:pPr>
             <w:r>
               <w:rPr>
@@ -7758,6 +7836,7 @@
             <w:pPr>
               <w:spacing w:after="40" w:line="264" w:lineRule="auto"/>
               <w:jc w:val="left"/>
+              <w:keepNext w:val="1"/>
             </w:pPr>
             <w:r>
               <w:rPr>
@@ -7791,6 +7870,7 @@
             <w:pPr>
               <w:spacing w:after="40" w:line="264" w:lineRule="auto"/>
               <w:jc w:val="center"/>
+              <w:keepNext w:val="1"/>
             </w:pPr>
             <w:r>
               <w:rPr>
@@ -7824,6 +7904,7 @@
             <w:pPr>
               <w:spacing w:after="40" w:line="264" w:lineRule="auto"/>
               <w:jc w:val="center"/>
+              <w:keepNext w:val="1"/>
             </w:pPr>
             <w:r>
               <w:rPr>
@@ -7857,6 +7938,7 @@
             <w:pPr>
               <w:spacing w:after="40" w:line="264" w:lineRule="auto"/>
               <w:jc w:val="center"/>
+              <w:keepNext w:val="1"/>
             </w:pPr>
             <w:r>
               <w:rPr>
@@ -7903,6 +7985,7 @@
             <w:pPr>
               <w:spacing w:after="40" w:line="264" w:lineRule="auto"/>
               <w:jc w:val="left"/>
+              <w:keepNext w:val="1"/>
             </w:pPr>
             <w:r>
               <w:rPr>
@@ -7936,6 +8019,7 @@
             <w:pPr>
               <w:spacing w:after="40" w:line="264" w:lineRule="auto"/>
               <w:jc w:val="center"/>
+              <w:keepNext w:val="1"/>
             </w:pPr>
             <w:r>
               <w:rPr>
@@ -7969,6 +8053,7 @@
             <w:pPr>
               <w:spacing w:after="40" w:line="264" w:lineRule="auto"/>
               <w:jc w:val="center"/>
+              <w:keepNext w:val="1"/>
             </w:pPr>
             <w:r>
               <w:rPr>
@@ -8002,6 +8087,7 @@
             <w:pPr>
               <w:spacing w:after="40" w:line="264" w:lineRule="auto"/>
               <w:jc w:val="center"/>
+              <w:keepNext w:val="1"/>
             </w:pPr>
             <w:r>
               <w:rPr>
@@ -8048,6 +8134,7 @@
             <w:pPr>
               <w:spacing w:after="40" w:line="264" w:lineRule="auto"/>
               <w:jc w:val="left"/>
+              <w:keepNext w:val="1"/>
             </w:pPr>
             <w:r>
               <w:rPr>
@@ -8081,6 +8168,7 @@
             <w:pPr>
               <w:spacing w:after="40" w:line="264" w:lineRule="auto"/>
               <w:jc w:val="center"/>
+              <w:keepNext w:val="1"/>
             </w:pPr>
             <w:r>
               <w:rPr>
@@ -8114,6 +8202,7 @@
             <w:pPr>
               <w:spacing w:after="40" w:line="264" w:lineRule="auto"/>
               <w:jc w:val="center"/>
+              <w:keepNext w:val="1"/>
             </w:pPr>
             <w:r>
               <w:rPr>
@@ -8147,6 +8236,7 @@
             <w:pPr>
               <w:spacing w:after="40" w:line="264" w:lineRule="auto"/>
               <w:jc w:val="center"/>
+              <w:keepNext w:val="1"/>
             </w:pPr>
             <w:r>
               <w:rPr>
@@ -8193,6 +8283,7 @@
             <w:pPr>
               <w:spacing w:after="40" w:line="264" w:lineRule="auto"/>
               <w:jc w:val="left"/>
+              <w:keepNext w:val="1"/>
             </w:pPr>
             <w:r>
               <w:rPr>
@@ -8226,6 +8317,7 @@
             <w:pPr>
               <w:spacing w:after="40" w:line="264" w:lineRule="auto"/>
               <w:jc w:val="center"/>
+              <w:keepNext w:val="1"/>
             </w:pPr>
             <w:r>
               <w:rPr>
@@ -8259,6 +8351,7 @@
             <w:pPr>
               <w:spacing w:after="40" w:line="264" w:lineRule="auto"/>
               <w:jc w:val="center"/>
+              <w:keepNext w:val="1"/>
             </w:pPr>
             <w:r>
               <w:rPr>
@@ -8292,6 +8385,7 @@
             <w:pPr>
               <w:spacing w:after="40" w:line="264" w:lineRule="auto"/>
               <w:jc w:val="center"/>
+              <w:keepNext w:val="1"/>
             </w:pPr>
             <w:r>
               <w:rPr>
@@ -8338,6 +8432,7 @@
             <w:pPr>
               <w:spacing w:after="40" w:line="264" w:lineRule="auto"/>
               <w:jc w:val="left"/>
+              <w:keepNext w:val="1"/>
             </w:pPr>
             <w:r>
               <w:rPr>
@@ -8371,6 +8466,7 @@
             <w:pPr>
               <w:spacing w:after="40" w:line="264" w:lineRule="auto"/>
               <w:jc w:val="center"/>
+              <w:keepNext w:val="1"/>
             </w:pPr>
             <w:r>
               <w:rPr>
@@ -8404,6 +8500,7 @@
             <w:pPr>
               <w:spacing w:after="40" w:line="264" w:lineRule="auto"/>
               <w:jc w:val="center"/>
+              <w:keepNext w:val="1"/>
             </w:pPr>
             <w:r>
               <w:rPr>
@@ -8437,6 +8534,7 @@
             <w:pPr>
               <w:spacing w:after="40" w:line="264" w:lineRule="auto"/>
               <w:jc w:val="center"/>
+              <w:keepNext w:val="1"/>
             </w:pPr>
             <w:r>
               <w:rPr>
@@ -8483,6 +8581,7 @@
             <w:pPr>
               <w:spacing w:after="40" w:line="264" w:lineRule="auto"/>
               <w:jc w:val="left"/>
+              <w:keepNext w:val="1"/>
             </w:pPr>
             <w:r>
               <w:rPr>
@@ -8516,6 +8615,7 @@
             <w:pPr>
               <w:spacing w:after="40" w:line="264" w:lineRule="auto"/>
               <w:jc w:val="center"/>
+              <w:keepNext w:val="1"/>
             </w:pPr>
             <w:r>
               <w:rPr>
@@ -8549,6 +8649,7 @@
             <w:pPr>
               <w:spacing w:after="40" w:line="264" w:lineRule="auto"/>
               <w:jc w:val="center"/>
+              <w:keepNext w:val="1"/>
             </w:pPr>
             <w:r>
               <w:rPr>
@@ -8582,6 +8683,7 @@
             <w:pPr>
               <w:spacing w:after="40" w:line="264" w:lineRule="auto"/>
               <w:jc w:val="center"/>
+              <w:keepNext w:val="1"/>
             </w:pPr>
             <w:r>
               <w:rPr>
@@ -8628,6 +8730,7 @@
             <w:pPr>
               <w:spacing w:after="40" w:line="264" w:lineRule="auto"/>
               <w:jc w:val="left"/>
+              <w:keepNext w:val="1"/>
             </w:pPr>
             <w:r>
               <w:rPr>
@@ -8661,6 +8764,7 @@
             <w:pPr>
               <w:spacing w:after="40" w:line="264" w:lineRule="auto"/>
               <w:jc w:val="center"/>
+              <w:keepNext w:val="1"/>
             </w:pPr>
             <w:r>
               <w:rPr>
@@ -8694,6 +8798,7 @@
             <w:pPr>
               <w:spacing w:after="40" w:line="264" w:lineRule="auto"/>
               <w:jc w:val="center"/>
+              <w:keepNext w:val="1"/>
             </w:pPr>
             <w:r>
               <w:rPr>
@@ -8727,6 +8832,7 @@
             <w:pPr>
               <w:spacing w:after="40" w:line="264" w:lineRule="auto"/>
               <w:jc w:val="center"/>
+              <w:keepNext w:val="1"/>
             </w:pPr>
             <w:r>
               <w:rPr>
@@ -8771,7 +8877,7 @@
           </w:tcPr>
           <w:p>
             <w:pPr>
-              <w:keepNext/>
+              <w:keepNext w:val="1"/>
               <w:spacing w:after="40" w:line="264" w:lineRule="auto"/>
               <w:jc w:val="left"/>
             </w:pPr>
@@ -8805,7 +8911,7 @@
           </w:tcPr>
           <w:p>
             <w:pPr>
-              <w:keepNext/>
+              <w:keepNext w:val="1"/>
               <w:spacing w:after="40" w:line="264" w:lineRule="auto"/>
               <w:jc w:val="center"/>
             </w:pPr>
@@ -8839,7 +8945,7 @@
           </w:tcPr>
           <w:p>
             <w:pPr>
-              <w:keepNext/>
+              <w:keepNext w:val="1"/>
               <w:spacing w:after="40" w:line="264" w:lineRule="auto"/>
               <w:jc w:val="center"/>
             </w:pPr>
@@ -8895,22 +9001,30 @@
         <w:pStyle w:val="165"/>
       </w:pPr>
       <w:r>
-        <w:t>Note. These class results use all 1,230 eligible validation images, including calibration. Support counts annotated positive images, not boxes or independent capture scenes.</w:t>
+        <w:t xml:space="preserve">Note. These class results use all 1,230 eligible validation images, including calibration images. Support is the number of annotated positive images, rather than the number of boxes or independently captured scenes.</w:t>
       </w:r>
     </w:p>
     <w:p>
       <w:r>
-        <w:t>Class support and confusion suggest where further work is needed. In the full eligible set, longitudinal cracks have 250 positives but deep potholes only eight; confirmation contains no wide-transverse positive. In the separate full-validation box audit, 146 of 190 wrong-class matched pairs confused subtypes within a damage family. Small annotated regions also had lower recall: 45.4% below 1% of image area versus 75.0% at or above 20%. These findings support targeted subtype and scale analysis; they do not establish that all errors are caused by data quantity or incorrect annotation. No annotation defect was confirmed in that audit.</w:t>
+        <w:t xml:space="preserve">The class distribution and observed confusions identify areas for further investigation. The full eligible set contains 250 positive images of longitudinal cracks but only eight of deep potholes. The confirmation set contains no positive image of a wide transverse crack. In a separate box-level audit of the full validation set, 146 of 190 matched pairs with an incorrect class involved confusion between subtypes of the same damage family.</w:t>
       </w:r>
     </w:p>
     <w:p>
       <w:r>
-        <w:t>A known pothole photograph was still labelled alligator crack at approximately 0.253 confidence and required human correction. The comparisons show that greater capacity and permissive filtering alone do not establish reliable recognition: ranking and thresholds trade false positives against misses. Moderately distant phone imagery presents an additional, unmeasured transfer risk; it is not a demonstrated cause of these validation errors.</w:t>
+        <w:rPr>
+          <w:color w:val="000000"/>
+        </w:rPr>
+        <w:t>Recall was also lower for small annotated regions: 45.4% for regions covering less than 1% of image area, compared with 75.0% for those covering at least 20%. These findings support further analysis of subtypes and object scale. They do not establish that limited data or incorrect annotations caused all errors, and the audit confirmed no annotation defect.</w:t>
       </w:r>
     </w:p>
     <w:p>
       <w:r>
-        <w:t>The separate 0.60 gate has no measured accepted-task precision guarantee. Section 6.2 therefore prioritises independent local data and evaluation of acceptance precision, review workload and missed errors, retaining all eight labels.</w:t>
+        <w:t xml:space="preserve">The model still labelled a known pothole photograph as an alligator crack, with confidence of approximately 0.253, so human correction was required. The comparisons show that increasing model capacity and relaxing filtering alone do not establish reliable recognition: selection rankings and thresholds trade false positives against missed detections. Phone photographs taken from a moderate distance introduce a further risk when transferring the model to local use, but this risk has not been measured and is not a demonstrated cause of the validation errors.</w:t>
+      </w:r>
+    </w:p>
+    <w:p>
+      <w:r>
+        <w:t xml:space="preserve">The separate 0.60 confidence gate has not been shown to guarantee any particular precision among automatically accepted tasks. Section 6.2 therefore prioritises independent local data and evaluation of acceptance precision, review workload and errors that escape review, while retaining all eight labels.</w:t>
       </w:r>
     </w:p>
     <w:p>
@@ -8928,13 +9042,16 @@
       <w:bookmarkEnd w:id="31"/>
     </w:p>
     <w:p>
-      <w:r>
-        <w:t>BKS is the best lexicographic result among 41 runs per scenario, not a proven optimum. Objective gaps require matching unassigned P1/P2/P3 counts; inferior coverage is counted separately. Identical priority counts can still represent different tasks, so objective gains are not automatically workload-matched travel savings.</w:t>
+      <w:pPr>
+        <w:keepLines w:val="1"/>
+      </w:pPr>
+      <w:r>
+        <w:t xml:space="preserve">The best-known solution (BKS) is the best result under the lexicographic ranking among 41 runs for each scenario; it is not a proven optimum. Objective gaps are compared only when the numbers of unassigned P1, P2 and P3 tasks match, while runs with inferior coverage are counted separately. Even matching priority counts can involve different tasks. A lower objective therefore does not necessarily represent travel savings for the same workload.</w:t>
       </w:r>
     </w:p>
     <w:p>
       <w:r>
-        <w:t>Greedy-seeded GA improved all 120 default-budget runs, with scenario-mean objective reductions of 0.73–3.62%. Mean BKS gaps were 0.23–1.82%, versus Greedy’s 1.17–5.10%. Runtime averaged 104.6–361.9 ms; Greedy took less than one millisecond. Seeding and elitism mechanically prevent regression against the included baseline; improvement magnitude and the pure-GA comparison provide the substantive evidence.</w:t>
+        <w:t xml:space="preserve">The Greedy-seeded GA improved on Greedy in all 120 runs under the default search settings. Across scenarios, its mean objective reductions ranged from 0.73% to 3.62%, and its mean gaps from the BKS ranged from 0.23% to 1.82%, compared with 1.17–5.10% for Greedy. Its average runtime per scenario ranged from 104.6 to 361.9 ms, while Greedy took less than one millisecond. Including the Greedy solution and retaining elite solutions prevents the GA from returning a worse result than that baseline. The size of the improvements and the comparison with pure GA are therefore more informative than the absence of regression alone.</w:t>
       </w:r>
     </w:p>
     <w:p>
@@ -9517,7 +9634,7 @@
         <w:pStyle w:val="165"/>
       </w:pPr>
       <w:r>
-        <w:t>Note. Entries show Greedy / pure-GA mean over seeds 1–10. All tasks are assigned; values are minutes except weighted objective J. Improved J need not reduce every component, as simulated travel illustrates.</w:t>
+        <w:t xml:space="preserve">Note. Each entry gives the Greedy value followed by the pure-GA mean over seeds 1–10. All tasks are assigned. Values are in minutes, except for the weighted objective J. A lower J does not require every component to improve, as the simulated travel results show.</w:t>
       </w:r>
     </w:p>
     <w:p>
@@ -10988,33 +11105,34 @@
     <w:p>
       <w:pPr>
         <w:pStyle w:val="165"/>
-      </w:pPr>
-      <w:r>
-        <w:t>Note. Gaps are percentages over ten seeds; Google/480/15 pure GA uses five compatible-coverage runs, retaining five failures. Rows include capacity stress and worse seeded gaps. Full records: SystemCode/experiments/routing/results/.</w:t>
+        <w:keepLines w:val="1"/>
+      </w:pPr>
+      <w:r>
+        <w:t xml:space="preserve">Note. Gaps are percentages averaged over ten seeds. For pure GA in the Google/480/15 scenario, the gap uses the five runs with matching coverage; the other five runs remain recorded as coverage failures. The selected rows include capacity stress cases and cases where seeded GA had a larger gap. Full records are available in SystemCode/experiments/routing/results/.</w:t>
       </w:r>
     </w:p>
     <w:p>
       <w:r>
-        <w:t xml:space="preserve">Under Google/480/15, pure-GA seeds 2, 4, 5, 7 and 10 assigned 12 tasks versus Greedy’s 13. </w:t>
+        <w:t xml:space="preserve">In the Google/480/15 scenario, pure-GA seeds 2, 4, 5, 7 and 10 assigned 12 tasks, compared with 13 for Greedy. </w:t>
       </w:r>
       <w:r>
         <w:rPr>
           <w:rFonts w:hint="eastAsia"/>
         </w:rPr>
-        <w:t>Some remaining capacity was concentrated in one crew, but no additional task could be inserted directly. Improving the solution would therefore require reassigning tasks across crews.</w:t>
-      </w:r>
-      <w:r>
-        <w:t xml:space="preserve"> Seeding recovered 13 assignments in all ten runs. However, seeded mean gaps exceeded pure GA in three 20-task scenarios: seeding provides a dependable starting point, not universal superiority.</w:t>
+        <w:t xml:space="preserve">Some remaining capacity was concentrated in one crew, but no additional task could be inserted directly. Assigning more work would therefore require moving tasks between crews.</w:t>
+      </w:r>
+      <w:r>
+        <w:t xml:space="preserve"> Greedy seeding restored 13 assignments in all ten runs. However, the seeded GA had larger mean gaps than pure GA in three 20-task scenarios. Seeding thus provides a dependable starting point without outperforming pure GA in every scenario.</w:t>
       </w:r>
     </w:p>
     <w:p>
       <w:r>
-        <w:t>Fifteen tasks require 1,920 service minutes, exhausting four shifts before travel. Simulation leaves three unassigned; Google permits one additional P3 assignment. At 20 tasks, both matrices leave eight unassigned and no P1 omitted. Seeded GA reduces simulated travel from 194.9 to 187.1 minutes and Google makespan from 477.1 to 473.0, although task identities may differ. Unlimited shifts assign all 15/20 tasks but exceed 480 minutes; 10-task cases fit the limit.</w:t>
+        <w:t xml:space="preserve">The 15-task workload requires 1,920 service minutes, using the combined capacity of four 480-minute shifts before travel is included. Under the shift limit, the simulated matrix leaves three tasks unassigned, while the Google matrix allows one additional P3 task to be assigned. With 20 tasks, both matrices leave eight tasks unassigned, but all P1 tasks are assigned. Compared with Greedy, seeded GA reduces simulated travel from 194.9 to 187.1 minutes and Google makespan from 477.1 to 473.0 minutes, although the assigned task identities may differ. Unlimited shifts allow all tasks to be assigned in the 15- and 20-task cases, but the resulting schedules exceed 480 minutes. The 10-task cases fit within the limit.</w:t>
       </w:r>
     </w:p>
     <w:p>
       <w:r>
-        <w:t>Google experiments used historical traffic-unaware estimates; browser acceptance used simulation. API wait and algorithm runtime were recorded separately. These are conditional gains on constructed tasks, not measured field productivity.</w:t>
+        <w:t xml:space="preserve">The Google experiments used historical travel estimates that did not account for traffic, while browser acceptance checks used simulation. API waiting time and algorithm runtime were recorded separately. The results show conditional gains for constructed task sets; they do not measure productivity in field operations.</w:t>
       </w:r>
     </w:p>
     <w:p>
@@ -11033,7 +11151,7 @@
     </w:p>
     <w:p>
       <w:r>
-        <w:t>The 18 October integration record contains 20 acceptance groups and 201 HTTP requests through the frontend proxy. It covers real-model upload, human correction, invalid-image handling, idempotency, task completion, disabled crews and stale plans. In the constructed 20-task case, both planners assigned 12 and reported eight shift-limit exclusions without omitting P1 work.</w:t>
+        <w:t xml:space="preserve">The integration record dated 18 October contains 20 acceptance groups and 201 HTTP requests sent through the frontend proxy. These checks cover uploads using the real model, human correction, invalid-image handling, idempotency, task completion, disabled crews and stale plans. In the constructed 20-task case, both planners assigned 12 tasks and reported eight exclusions due to the shift limit, without omitting any P1 task.</w:t>
       </w:r>
     </w:p>
     <w:p>
@@ -11286,7 +11404,7 @@
                 <w:color w:val="000000"/>
                 <w:sz w:val="21"/>
               </w:rPr>
-              <w:t>Main workflow through frontend proxy</w:t>
+              <w:t xml:space="preserve">Main workflow verified through the frontend proxy</w:t>
             </w:r>
           </w:p>
         </w:tc>
@@ -11398,7 +11516,7 @@
                 <w:color w:val="000000"/>
                 <w:sz w:val="21"/>
               </w:rPr>
-              <w:t>Regression and remote CI evidence</w:t>
+              <w:t xml:space="preserve">Evidence from regression tests and remote CI</w:t>
             </w:r>
           </w:p>
         </w:tc>
@@ -11477,7 +11595,7 @@
                 <w:color w:val="000000"/>
                 <w:sz w:val="21"/>
               </w:rPr>
-              <w:t>Auto task / review; no active task</w:t>
+              <w:t xml:space="preserve">Automatic task at 0.60; review at 0.5999; no active task when no detection is returned</w:t>
             </w:r>
           </w:p>
         </w:tc>
@@ -11622,7 +11740,7 @@
                 <w:color w:val="000000"/>
                 <w:sz w:val="21"/>
               </w:rPr>
-              <w:t>No duplicate task or stale plan acceptance</w:t>
+              <w:t xml:space="preserve">No duplicate task created; stale plans rejected</w:t>
             </w:r>
           </w:p>
         </w:tc>
@@ -11734,7 +11852,7 @@
                 <w:color w:val="000000"/>
                 <w:sz w:val="21"/>
               </w:rPr>
-              <w:t>Tasks retained; cross-role/crew restrictions</w:t>
+              <w:t xml:space="preserve">Tasks retained; role and crew access restrictions enforced</w:t>
             </w:r>
           </w:p>
         </w:tc>
@@ -11813,7 +11931,7 @@
                 <w:color w:val="000000"/>
                 <w:sz w:val="21"/>
               </w:rPr>
-              <w:t>Four direct cases / no provider calls; two actual grounded GPT calls; separate HTTP/browser records</w:t>
+              <w:t xml:space="preserve">Four direct-answer cases with no provider calls; two actual grounded GPT calls; separate HTTP and browser records</w:t>
             </w:r>
           </w:p>
         </w:tc>
@@ -11846,7 +11964,7 @@
                 <w:color w:val="000000"/>
                 <w:sz w:val="21"/>
               </w:rPr>
-              <w:t>Targeted grounding and durable confirmed-change acceptance; scopes overlap and are not a combined test total</w:t>
+              <w:t xml:space="preserve">Targeted checks of grounding and confirmed changes that persist; these scopes overlap and do not form a combined test total</w:t>
             </w:r>
           </w:p>
         </w:tc>
@@ -11925,7 +12043,7 @@
                 <w:color w:val="000000"/>
                 <w:sz w:val="21"/>
               </w:rPr>
-              <w:t>GitHub CI: 1,255 backend passed / 1 skipped; 179 frontend passed; lint, type checks and build passed. Local infrastructure guardrails: 49 passed.</w:t>
+              <w:t xml:space="preserve">GitHub CI recorded 1,255 backend tests passed and 1 skipped, 179 frontend tests passed, and successful lint, type and build checks. Separately, 49 local infrastructure guardrail tests passed.</w:t>
             </w:r>
           </w:p>
         </w:tc>
@@ -11958,7 +12076,7 @@
                 <w:color w:val="000000"/>
                 <w:sz w:val="21"/>
               </w:rPr>
-              <w:t>GitHub run 39569241424 checked head 155d3183. Base CI omits optional vision dependencies; the YOLO test is skipped. Counts are distinct dated evidence, not additive to earlier suites.</w:t>
+              <w:t xml:space="preserve">GitHub run 39569241424 checked head 155d3183. Base CI excludes optional vision dependencies and skips the YOLO test. These counts describe separate, dated checks and must not be added to earlier suite totals.</w:t>
             </w:r>
           </w:p>
         </w:tc>
@@ -11972,7 +12090,7 @@
         <w:rPr>
           <w:color w:val="000000"/>
         </w:rPr>
-        <w:t>The release records in Table 11 have different dates and scopes and are not an overall quality score. Historical 18 October counts remain separate from later assistant and adjustment acceptance; overlapping suites must not be summed. Table 12 reconciles evaluation with the original objectives. Injected detections and synthetic routes verify controlled branches, not model accuracy, engineering validity or user productivity.</w:t>
+        <w:t xml:space="preserve">The release records in Table 11 cover different dates and scopes, so they do not form an overall quality score. The historical 18 October counts remain separate from the later assistant and adjustment checks, and overlapping suites must not be summed. Table 12 compares the evaluation with the original objectives. Injected detections and synthetic routes verify specific workflow branches; they do not establish model accuracy, engineering validity or user productivity.</w:t>
       </w:r>
     </w:p>
     <w:p>
@@ -11980,7 +12098,7 @@
         <w:rPr>
           <w:color w:val="000000"/>
         </w:rPr>
-        <w:t>On 21 October, intent-routing-20261021.json records four local direct-answer cases with zero provider calls and two actual gpt-4.1-mini grounded calls. The deep-pothole response retained the demonstration P1/240-minute rule; the saved-plan response matched 98.8 travel and 165.0 service minutes. These calls used the then-current a-knowledge-v16 package; later hash normalization and the a-knowledge-v17 documentation refresh do not retroactively re-execute them. Local E5 retrieval, provider-double validation and synthetic route tests are separate evidence categories.</w:t>
+        <w:t xml:space="preserve">The 21 October record, intent-routing-20261021.json, contains four local direct-answer cases with zero provider calls and two actual grounded calls to gpt-4.1-mini. The deep-pothole answer retained the demonstration rule of P1 and 240 minutes. The saved-plan answer matched the recorded 98.8 minutes of travel and 165.0 minutes of service. These calls used the a-knowledge-v16 package available at the time. Subsequent hash normalisation and the a-knowledge-v17 documentation refresh did not rerun those calls. Local E5 retrieval tests, validation using a provider test double, and synthetic route tests remain separate categories of evidence.</w:t>
       </w:r>
     </w:p>
     <w:p>
@@ -11988,7 +12106,7 @@
         <w:rPr>
           <w:color w:val="000000"/>
         </w:rPr>
-        <w:t>The task-adjustment acceptance record adds isolated authenticated HTTP/browser checks of all four route cards, move/cancel previews, explicit confirmation and recalculation, persistent assignment constraints and crew-access changes. Constructed routes exercise shift infeasibility while retaining other tasks. These bounded records do not demonstrate that every proposed ten-question and ten-change case was executed, nor universal answer correctness.</w:t>
+        <w:t xml:space="preserve">The task-adjustment acceptance record adds isolated, authenticated HTTP and browser checks covering all four route cards, move and cancellation previews, explicit confirmation and recalculation, persistent assignment constraints, and changes in crew access. Constructed routes test rejection when work exceeds the shift limit while retaining other tasks. These limited records do not establish that all ten proposed question cases and ten proposed change cases were executed, or that every answer is correct.</w:t>
       </w:r>
     </w:p>
     <w:p>
@@ -12173,7 +12291,7 @@
                 <w:color w:val="000000"/>
                 <w:sz w:val="21"/>
               </w:rPr>
-              <w:t>Validation experiments and historical n10 test; no independent local test of the final model.</w:t>
+              <w:t xml:space="preserve">Validation experiments and the historical n10 test are recorded; the final model has no independent local test.</w:t>
             </w:r>
           </w:p>
         </w:tc>
@@ -12252,7 +12370,7 @@
                 <w:color w:val="000000"/>
                 <w:sz w:val="21"/>
               </w:rPr>
-              <w:t>Boundary, no-detection and replay tests; accepted-case precision and review-rate study remain incomplete.</w:t>
+              <w:t xml:space="preserve">Boundary, no-detection and replay tests are recorded; accepted-case precision and review rates still require evaluation.</w:t>
             </w:r>
           </w:p>
         </w:tc>
@@ -12331,7 +12449,7 @@
                 <w:color w:val="000000"/>
                 <w:sz w:val="21"/>
               </w:rPr>
-              <w:t>Eight labels tested through automatic and corrected-review paths; frozen policies checked, but service assumptions remain unvalidated.</w:t>
+              <w:t xml:space="preserve">All eight labels were tested through automatic and corrected-review workflows. Frozen policies were checked, but service assumptions remain unvalidated.</w:t>
             </w:r>
           </w:p>
         </w:tc>
@@ -12410,7 +12528,7 @@
                 <w:color w:val="000000"/>
                 <w:sz w:val="21"/>
               </w:rPr>
-              <w:t>Four-crew 10/15/20-task experiments; accepted inspections now attempt automatic paired planning, while other changes retain explicit replanning. No deadline-based lateness evaluation.</w:t>
+              <w:t xml:space="preserve">Experiments cover four crews and 10, 15 and 20 tasks. Accepted inspections now trigger an attempt to generate paired plans automatically; other changes require explicit replanning. Lateness against deadlines has not been evaluated.</w:t>
             </w:r>
           </w:p>
         </w:tc>
@@ -12489,7 +12607,7 @@
                 <w:color w:val="000000"/>
                 <w:sz w:val="21"/>
               </w:rPr>
-              <w:t>Grounded repair/saved-plan answers, direct intent routing and confirmed adjustments have targeted actual-provider, local retrieval and controlled HTTP/browser evidence. The full proposed ten-question and ten-change suite is not established; broad semantic and user evaluation remain outstanding.</w:t>
+              <w:t xml:space="preserve">Targeted evidence covers grounded repair and saved-plan answers, direct intent routing and confirmed adjustments through actual-provider calls, local retrieval tests, and controlled HTTP and browser checks. Completion of the full proposed ten-question and ten-change suite is not established. Broad evaluation of answer meaning and user experience remains outstanding.</w:t>
             </w:r>
           </w:p>
         </w:tc>
@@ -12568,7 +12686,7 @@
                 <w:color w:val="000000"/>
                 <w:sz w:val="21"/>
               </w:rPr>
-              <w:t>Dated desktop/HTTP acceptance and separate mobile checks; no measured user-productivity outcome.</w:t>
+              <w:t xml:space="preserve">Dated desktop and HTTP acceptance records and separate mobile checks are available; user productivity has not been measured.</w:t>
             </w:r>
           </w:p>
         </w:tc>
@@ -12611,7 +12729,7 @@
         <w:rPr>
           <w:color w:val="000000"/>
         </w:rPr>
-        <w:t>RoadGuard integrates perception, rules, evolutionary scheduling, grounded explanations and confirmed persistent adjustments. Human correction, citations and revision checks preserve traceability. Recognition gains, seeded schedules, the pure-GA failure and bounded assistant acceptance demonstrate its value and limits.</w:t>
+        <w:t xml:space="preserve">RoadGuard connects image-based damage detection to repair decisions and crew schedules in one application. Inspectors submit photographs, dispatchers review uncertain results and adjust work, and crews view their routes and record completion. Stored evidence, citations and revision checks help explain how each decision was made. The experiments show modest recognition gains and better scheduling objectives with Greedy-seeded search. They also reveal unresolved classification errors, a pure-GA assignment failure and gaps in assistant evaluation. These findings support the prototype’s integrated workflow while defining the work still needed before operational use.</w:t>
       </w:r>
     </w:p>
     <w:p>
@@ -12622,13 +12740,13 @@
         <w:rPr>
           <w:color w:val="000000"/>
         </w:rPr>
-        <w:t>Reused validation, one training seed, sparse subtypes, one task family and one Google snapshot limit generalisation. Service durations, shift/return policies and objective weights remain assumptions. Optimality, statistical significance and operational savings are unproven; independent local validation remains essential. Targeted checks establish neither universal semantic correctness nor the complete assistant suite; no broad user study exists.</w:t>
+        <w:t xml:space="preserve">The reuse of validation data, a single training seed, sparse damage subtypes, one task family and one Google travel snapshot limit how widely the results can be generalised. Service durations, shift and return policies, and objective weights remain assumptions. The evaluation establishes neither optimality nor statistical significance, and operational savings have not been demonstrated. Independent local validation remains essential. Targeted assistant checks establish neither universal semantic correctness nor completion of the full proposed evaluation, and no broad user study has been conducted.</w:t>
       </w:r>
     </w:p>
     <w:p>
       <w:pPr>
         <w:pStyle w:val="4"/>
-        <w:pageBreakBefore w:val="0"/>
+        <w:pageBreakBefore w:val="1"/>
         <w:spacing w:before="160" w:after="100"/>
         <w:jc w:val="left"/>
       </w:pPr>
@@ -12648,7 +12766,7 @@
         <w:rPr>
           <w:color w:val="000000"/>
         </w:rPr>
-        <w:t>Review subtype labels, missed potholes and disputed negatives, retaining verified corrections. Add rare classes and hard negatives: patches, wet surfaces, shadows, gravel and manholes. Collect moderate-distance phone photographs with road context, all-object annotations and an identified primary subject.</w:t>
+        <w:t xml:space="preserve">Future vision work should review subtype labels, missed potholes and disputed negative examples, retaining corrections only after verification. The dataset should include more examples of rare classes and hard negatives such as patches, wet surfaces, shadows, gravel and manholes. Local collection should include phone photographs taken from a moderate distance, with road context, annotations for all objects and an identified primary subject.</w:t>
       </w:r>
     </w:p>
     <w:p>
@@ -12659,7 +12777,7 @@
         <w:rPr>
           <w:color w:val="000000"/>
         </w:rPr>
-        <w:t>Freeze an independently labelled local acceptance set grouped by location, defect and adjacent frames. Compare sampling, context-preserving augmentation and class calibration using training/calibration data only. Vary model size or resolution individually, with repeated seeds, latency checks and recovery checkpoints. Separately report eight-class P/R, class misses, localisation, automatic-acceptance precision and review rate. Precision and recall remain below 70%; improvements cannot guarantee these targets.</w:t>
+        <w:t xml:space="preserve">An independently labelled local acceptance set should be frozen, with images grouped by location, defect and adjacent frames. Comparisons of sampling strategies, context-preserving augmentation and class calibration should use only training and calibration data. Model size and resolution should be varied one at a time, with repeated seeds, latency checks and checkpoints that support recovery. Evaluation should report eight-class precision and recall, misses by class, localisation, precision among automatically accepted cases and the review rate separately. Current precision and recall remain below 70%, and these improvements cannot guarantee that either target will be met.</w:t>
       </w:r>
     </w:p>
     <w:p>
@@ -12670,7 +12788,7 @@
         <w:rPr>
           <w:color w:val="000000"/>
         </w:rPr>
-        <w:t>Routing needs verified access, measured service durations, varied travel periods, independent tasks and bounded/exact small-instance comparisons. Coordinated relocation could address insertion failure. GPT/RAG and confirmed adjustments need broader answer-quality, citation, multilingual-ambiguity and recovery evaluation, systematically covering the original questions and changes.</w:t>
+        <w:t xml:space="preserve">Future routing evaluation should use verified access information, measured service durations, travel estimates from varied periods and independent task sets. Comparisons with bounded or exact solutions on small instances would help assess solution quality. Coordinated moves between crews could address cases where direct insertion fails. The assistant and confirmed-adjustment workflows also need broader evaluation of answer quality, citations, multilingual ambiguity and recovery, systematically covering the original question and change cases.</w:t>
       </w:r>
     </w:p>
     <w:p>
@@ -12707,7 +12825,7 @@
         <w:rPr>
           <w:color w:val="000000"/>
         </w:rPr>
-        <w:t>This guide covers local installation, the inspection-to-completion workflow and dispatcher assistant. The final report reproduces this complete guide in Appendix A. Local acceptance used Windows, Python 3.12.14 and Node 22.23.3. Independent installation on a clean machine has not been validated.</w:t>
+        <w:t xml:space="preserve">This guide covers local installation, the workflow from inspection to completion, and the dispatcher assistant. Local acceptance checks used Windows, Python 3.12.14 and Node 22.23.3. Installation on an independent clean machine has not been validated.</w:t>
       </w:r>
     </w:p>
     <w:p>
@@ -12731,7 +12849,7 @@
         <w:rPr>
           <w:color w:val="000000"/>
         </w:rPr>
-        <w:t>Use Python 3.12 for the full application: the pinned numpy==2.5.2 requires Python &gt;=3.12. Base CI uses Python 3.11 without installing the optional vision dependency set, so its success is not evidence that vision runs on 3.11. Use Node 22.x &gt;=22.12 and npm &gt;=10.</w:t>
+        <w:t xml:space="preserve">Use Python 3.12 for the full application because the pinned numpy==2.5.2 requires Python &gt;=3.12. Base CI uses Python 3.11 and excludes the optional vision dependencies, so its success does not establish that vision runs on Python 3.11. Use Node 22.x &gt;=22.12 and npm &gt;=10.</w:t>
       </w:r>
     </w:p>
     <w:p>
@@ -12742,7 +12860,7 @@
         <w:rPr>
           <w:color w:val="000000"/>
         </w:rPr>
-        <w:t>Clone the private repository with authorised access. The approved YOLO checkpoint is included in SystemCode/backend/roadguard/model/; Dataset is not required for inference. From the repository root, create a new environment on first use:</w:t>
+        <w:t xml:space="preserve">Clone the private repository using authorised access. The approved YOLO checkpoint is included in SystemCode/backend/roadguard/model/, and the Dataset directory is not required for inference. On first use, create a new environment from the repository root:</w:t>
       </w:r>
     </w:p>
     <w:p>
@@ -12789,7 +12907,7 @@
         <w:rPr>
           <w:color w:val="000000"/>
         </w:rPr>
-        <w:t>If an existing .venv uses another Python version, create a separate Python 3.12 environment and substitute its path in all commands. Do not recreate an environment while it is in use. CPU inference is supported by the recorded local acceptance; GPU training has separate CUDA requirements.</w:t>
+        <w:t xml:space="preserve">If an existing .venv uses another Python version, create a separate Python 3.12 environment and use its path in every command below. Do not recreate an environment while it is in use. The recorded local acceptance tests support CPU inference. GPU training has separate CUDA requirements.</w:t>
       </w:r>
     </w:p>
     <w:p>
@@ -12860,7 +12978,7 @@
         <w:rPr>
           <w:color w:val="000000"/>
         </w:rPr>
-        <w:t>First setup downloads approximately 487 MB of pinned multilingual-e5-small model/tokenizer files and verifies their hashes. The encoder uses ONNX Runtime on CPU; it does not call an embedding API or change the YOLO model. Subsequent setup reuses verified files. After pulling a reviewed knowledge update, rebuild the current index with .\.venv\Scripts\python.exe -m roadguard.assistant.index_knowledge and restart the backend. HTTP requests never download models or rebuild indexes. The current package is a-knowledge-v19; Chroma collections are versioned against the manifest, encoder and chunking policy.</w:t>
+        <w:t xml:space="preserve">On first setup, the command downloads approximately 487 MB of pinned multilingual-e5-small model and tokenizer files and verifies their hashes. The encoder runs on CPU through ONNX Runtime. It does not call an embedding API or change the YOLO model. Later setup runs reuse the verified files.</w:t>
       </w:r>
     </w:p>
     <w:p>
@@ -12871,7 +12989,52 @@
         <w:rPr>
           <w:color w:val="000000"/>
         </w:rPr>
-        <w:t>The default Chroma path is SystemCode/backend/data/rag/chroma/; embedding files are under SystemCode/backend/data/rag/models/multilingual-e5-small/. Both are ignored local runtime storage. Server-side overrides are ROADGUARD_CHROMA_PATH and ROADGUARD_EMBEDDING_PATH. Dataset, uploads, account records and business databases are not indexed. Retrieval uses cosine similarity, whose score is not answer correctness. See the vector retrieval guide (../SystemCode/backend/roadguard/assistant/VECTOR_RETRIEVAL.md).</w:t>
+        <w:t>After pulling a reviewed knowledge update, rebuild the current index with the following command:</w:t>
+      </w:r>
+    </w:p>
+    <w:p>
+      <w:pPr>
+        <w:pStyle w:val="167"/>
+        <w:jc w:val="left"/>
+      </w:pPr>
+      <w:r>
+        <w:rPr>
+          <w:color w:val="000000"/>
+        </w:rPr>
+        <w:t>.\.venv\Scripts\python.exe -m roadguard.assistant.index_knowledge</w:t>
+      </w:r>
+    </w:p>
+    <w:p>
+      <w:pPr>
+        <w:jc w:val="left"/>
+      </w:pPr>
+      <w:r>
+        <w:rPr>
+          <w:color w:val="000000"/>
+        </w:rPr>
+        <w:t>Then restart the backend. HTTP requests never download models or rebuild indexes. The current knowledge package is a-knowledge-v19. Chroma collections are versioned against the manifest, encoder and chunking policy.</w:t>
+      </w:r>
+    </w:p>
+    <w:p>
+      <w:pPr>
+        <w:jc w:val="left"/>
+      </w:pPr>
+      <w:r>
+        <w:rPr>
+          <w:color w:val="000000"/>
+        </w:rPr>
+        <w:t xml:space="preserve">The default Chroma path is SystemCode/backend/data/rag/chroma/, and embedding files are stored under SystemCode/backend/data/rag/models/multilingual-e5-small/. Both locations hold local runtime files excluded from Git. To override them on the server, use ROADGUARD_CHROMA_PATH and ROADGUARD_EMBEDDING_PATH.</w:t>
+      </w:r>
+    </w:p>
+    <w:p>
+      <w:pPr>
+        <w:jc w:val="left"/>
+      </w:pPr>
+      <w:r>
+        <w:rPr>
+          <w:color w:val="000000"/>
+        </w:rPr>
+        <w:t>The index excludes the dataset, uploads, account records and business databases. Retrieval uses cosine similarity, which measures similarity rather than answer correctness. See the vector retrieval guide (../SystemCode/backend/roadguard/assistant/VECTOR_RETRIEVAL.md).</w:t>
       </w:r>
     </w:p>
     <w:p>
@@ -12953,7 +13116,18 @@
         <w:rPr>
           <w:color w:val="000000"/>
         </w:rPr>
-        <w:t>gpt-4.1-mini is the model used in the recorded targeted acceptance; select only a model available to your account. The enabled flag accepts exactly lowercase true or false; uppercase True is invalid. Restart the backend after changing environment settings. Never place the key in frontend code, Git or the report. The status endpoint reports non-secret configuration and usage, not credential validity. Optional limits are ROADGUARD_ASSISTANT_MAX_OUTPUT_TOKENS (default 1200, range 256–2000) and ROADGUARD_ASSISTANT_MAX_CALLS (default 20 per process, range 1–200). Attempted calls, including failures, consume the local budget; it resets on restart and is not an account-wide spending cap. Real provider requests may incur charges. There are no automatic retries or model fallbacks.</w:t>
+        <w:t xml:space="preserve">The recorded targeted acceptance tests used gpt-4.1-mini. Select a model available to your account. The enabled flag accepts exactly lowercase true or false; uppercase True is invalid. Restart the backend after changing environment settings. Keep the key out of frontend code, Git and the report. The status endpoint reports non-secret configuration and usage, but does not verify credential validity.</w:t>
+      </w:r>
+    </w:p>
+    <w:p>
+      <w:pPr>
+        <w:jc w:val="left"/>
+      </w:pPr>
+      <w:r>
+        <w:rPr>
+          <w:color w:val="000000"/>
+        </w:rPr>
+        <w:t>The optional limits are ROADGUARD_ASSISTANT_MAX_OUTPUT_TOKENS (default 1200, range 256–2000) and ROADGUARD_ASSISTANT_MAX_CALLS (default 20 per process, range 1–200). Every attempted call, including a failed call, consumes the local budget. This budget resets on restart and does not cap account-wide spending. Real provider requests may incur charges. The assistant does not automatically retry requests or fall back to another model.</w:t>
       </w:r>
     </w:p>
     <w:p>
@@ -13036,7 +13210,18 @@
         <w:rPr>
           <w:color w:val="000000"/>
         </w:rPr>
-        <w:t>Provision distinct usernames for crew-01, crew-03 and crew-04 when needed. Crew identity is fixed by the account. Accounts and passwords are local database records, not shared through Git. The default database is SystemCode/backend/data/roadguard.sqlite3; back it up with its adjacent uploads directory. If ROADGUARD_DB_PATH is customised, use the same value when provisioning accounts and starting the server. See account roles (../Miscellaneous/ACCOUNT_ROLES.md).</w:t>
+        <w:t xml:space="preserve">When needed, provision distinct usernames for crew-01, crew-03 and crew-04. Each account has a fixed crew identity. Accounts and passwords are stored in the local database and are not shared through Git.</w:t>
+      </w:r>
+    </w:p>
+    <w:p>
+      <w:pPr>
+        <w:jc w:val="left"/>
+      </w:pPr>
+      <w:r>
+        <w:rPr>
+          <w:color w:val="000000"/>
+        </w:rPr>
+        <w:t>The default database is SystemCode/backend/data/roadguard.sqlite3. Back it up together with the adjacent uploads directory. If you customise ROADGUARD_DB_PATH, use the same value when provisioning accounts and starting the server. See account roles (../Miscellaneous/ACCOUNT_ROLES.md).</w:t>
       </w:r>
     </w:p>
     <w:p>
@@ -13154,7 +13339,18 @@
         <w:rPr>
           <w:color w:val="000000"/>
         </w:rPr>
-        <w:t>Open http://127.0.0.1:5173 and sign in. API documentation is at http://127.0.0.1:8000/docs; the public health endpoint is /api/v1/health. Health checks application/database access only, and the model loads lazily on real inference. Stop the appropriate terminal with Ctrl+C. Do not start duplicate servers on occupied ports.</w:t>
+        <w:t xml:space="preserve">Open http://127.0.0.1:5173 and sign in. API documentation is available at http://127.0.0.1:8000/docs, and the public health endpoint is /api/v1/health. The health check verifies application and database access only. The model loads when real inference is first requested.</w:t>
+      </w:r>
+    </w:p>
+    <w:p>
+      <w:pPr>
+        <w:jc w:val="left"/>
+      </w:pPr>
+      <w:r>
+        <w:rPr>
+          <w:color w:val="000000"/>
+        </w:rPr>
+        <w:t>To stop a server, press Ctrl+C in its terminal. Do not start duplicate servers on occupied ports.</w:t>
       </w:r>
     </w:p>
     <w:p>
@@ -13178,7 +13374,7 @@
         <w:rPr>
           <w:color w:val="000000"/>
         </w:rPr>
-        <w:t>1. Sign in as an inspector. Upload a JPEG or PNG within 8 MiB and 20 megapixels, choose real inference or an explicit synthetic scenario, enter Jurong coordinates and declare road type. Coordinates such as 1.3405, 103.706 are synthetic unless verified as the photo's location.</w:t>
+        <w:t xml:space="preserve">1. Sign in as an inspector. Upload a JPEG or PNG within the limits of 8 MiB and 20 megapixels. Choose real inference or an explicit synthetic scenario, enter Jurong coordinates and declare the road type. Example coordinates such as 1.3405, 103.706 are synthetic unless verified as the photo's location.</w:t>
       </w:r>
     </w:p>
     <w:p>
@@ -13189,7 +13385,7 @@
         <w:rPr>
           <w:color w:val="000000"/>
         </w:rPr>
-        <w:t>2. Inspect the result. Upload returns inspection_id, status, one detection or null, and task_id. Real primary raw confidence &gt;=0.60 creates one task; lower confidence requires review, and no detection creates no task. Raw evidence and frozen rules remain available in inspection details.</w:t>
+        <w:t xml:space="preserve">2. Inspect the result. The upload response contains inspection_id, status, one detection or null, and task_id. For real inference, a primary detection with raw confidence &gt;=0.60 creates one task. A lower confidence requires review, while no detection creates no task. Open the inspection details to view the raw evidence and the frozen rules used for the decision.</w:t>
       </w:r>
     </w:p>
     <w:p>
@@ -13200,7 +13396,7 @@
         <w:rPr>
           <w:color w:val="000000"/>
         </w:rPr>
-        <w:t>3. Sign in as the dispatcher. Confirm, correct or reject pending inspections; corrections use stored rules. Accepted tasks contain the demonstration priority and service duration. Completed/cancelled records retain history and leave the active planning snapshot.</w:t>
+        <w:t xml:space="preserve">3. Sign in as the dispatcher. Confirm, correct or reject pending inspections. Corrections use the stored rules, and accepted tasks contain the demonstration priority and service duration. Completed and cancelled records retain their history but are excluded from the active planning snapshot.</w:t>
       </w:r>
     </w:p>
     <w:p>
@@ -13211,7 +13407,7 @@
         <w:rPr>
           <w:color w:val="000000"/>
         </w:rPr>
-        <w:t>4. Accepted uploads and review confirmation/correction automatically attempt paired planning after task commit. Both planners share the same snapshot and matrix and honor crew constraints. Inspect unassigned reasons and same-round comparison. Use the manual recalculation button to obtain same-round comparison evidence when no matching response is retained in the browser. Use manual recalculation after other input changes or a failed automatic attempt. The response waits for the attempt; X-RoadGuard-Replanning reports completed, failed or not_needed without changing the four upload JSON fields. A failure preserves the task and old stale plans and shows a warning. Accepted replay repairs missing/stale plans and skips a current pair. Automatic attempts are serialized per process with at most three attempts, retrying only stale conflicts; no durable worker retries after restart. A crash after task commit requires accepted replay or manual retry.</w:t>
+        <w:t xml:space="preserve">4. An accepted upload or review confirmation/correction automatically starts a paired planning attempt after the task is committed. GA and Greedy use the same task snapshot and travel matrix, and both honour crew constraints. Inspect any unassigned-task reasons and compare the results from the same planning round. If the browser no longer retains a matching response, use the manual recalculation button to obtain a comparison from one round. Manual recalculation is also required after other input changes or a failed automatic attempt.</w:t>
       </w:r>
     </w:p>
     <w:p>
@@ -13222,7 +13418,7 @@
         <w:rPr>
           <w:color w:val="000000"/>
         </w:rPr>
-        <w:t>5. Sign in as the crew assigned by the latest saved GA plan. View and complete that crew's tasks; the server checks current assignment and task version. Completion changes planning inputs, and dispatch must explicitly replan.</w:t>
+        <w:t>The upload or review response waits for the planning attempt. X-RoadGuard-Replanning reports completed, failed or not_needed, while the four upload JSON fields remain unchanged. If planning fails, the task is preserved, the previous plans remain stale and a warning appears. Repeating the accepted request recovers missing or stale plans and skips replanning when the pair is already current.</w:t>
       </w:r>
     </w:p>
     <w:p>
@@ -13233,7 +13429,29 @@
         <w:rPr>
           <w:color w:val="000000"/>
         </w:rPr>
-        <w:t>The frontend map shows schematic stop order, not turn-by-turn navigation. See the frontend guide (../SystemCode/frontend/README.md).</w:t>
+        <w:t>Automatic planning is serialized within each server process. It allows at most three attempts in total, or two retries, and retries only stale conflicts. There is no durable worker to resume retries after a restart. If the server crashes after the task is committed, repeat the accepted request or recalculate manually.</w:t>
+      </w:r>
+    </w:p>
+    <w:p>
+      <w:pPr>
+        <w:jc w:val="left"/>
+      </w:pPr>
+      <w:r>
+        <w:rPr>
+          <w:color w:val="000000"/>
+        </w:rPr>
+        <w:t xml:space="preserve">5. Sign in as the crew assigned by the latest saved GA plan. View and complete that crew's tasks. The server checks the current assignment and task version before accepting completion. Completion changes the planning inputs, so the dispatcher must explicitly replan.</w:t>
+      </w:r>
+    </w:p>
+    <w:p>
+      <w:pPr>
+        <w:jc w:val="left"/>
+      </w:pPr>
+      <w:r>
+        <w:rPr>
+          <w:color w:val="000000"/>
+        </w:rPr>
+        <w:t xml:space="preserve">The frontend map shows a schematic stop order rather than turn-by-turn navigation. See the frontend guide (../SystemCode/frontend/README.md).</w:t>
       </w:r>
     </w:p>
     <w:p>
@@ -13257,7 +13475,7 @@
         <w:rPr>
           <w:color w:val="000000"/>
         </w:rPr>
-        <w:t>Sign in as a dispatcher and open Route assistant. Ask about a supported repair rule or project operation, or select an explicit saved plan for route questions. Saved-plan answers use authorized persisted facts rather than browser-supplied totals. English and bounded Chinese question aliases are supported; generated answers and the interface are English.</w:t>
+        <w:t xml:space="preserve">Sign in as a dispatcher and open Route assistant. Ask about a supported repair rule or project operation. For a route question, select an explicit saved plan. Saved-plan answers use authorised facts stored on the server rather than totals supplied by the browser.</w:t>
       </w:r>
     </w:p>
     <w:p>
@@ -13268,7 +13486,7 @@
         <w:rPr>
           <w:color w:val="000000"/>
         </w:rPr>
-        <w:t>Read the answer first. Sources are closed by default; expand View sources to inspect exact quotations, citation IDs, package/version hashes and saved-plan provenance. The query-v3 grounded_summary mode uses local Chroma/E5 retrieval and one optional GPT call. GPT chooses server-owned evidence IDs; the server restores exact quotations and required context. Canonical repair answers are rendered from the matching rule rows, preserving demonstration qualifiers. Number, priority, identifier, label, source and plan checks reject unsupported output. These bounded checks do not establish universal semantic correctness.</w:t>
+        <w:t>Questions may use English or the supported, limited set of Chinese aliases. Generated answers and the interface are in English.</w:t>
       </w:r>
     </w:p>
     <w:p>
@@ -13279,7 +13497,51 @@
         <w:rPr>
           <w:color w:val="000000"/>
         </w:rPr>
-        <w:t>A standalone question such as “What model are you?” returns the configured model name using server_configuration, without GPT, retrieval or saved-plan reads. It remains usable when generation is disabled or the key is missing. It identifies configuration, not proof of provider execution or the separate YOLO detector. Clearly unrelated questions return scope_guidance with RoadGuard examples. These direct modes have no citations or knowledge-package metadata and consume no model-call budget. Ambiguous or mixed domain questions retain the evidence flow; insufficient evidence and validation failures remain explicit.</w:t>
+        <w:t xml:space="preserve">Read the answer first. Sources are closed by default. Expand View sources to inspect exact quotations, citation IDs, package/version hashes and the provenance of saved-plan facts.</w:t>
+      </w:r>
+    </w:p>
+    <w:p>
+      <w:pPr>
+        <w:jc w:val="left"/>
+      </w:pPr>
+      <w:r>
+        <w:rPr>
+          <w:color w:val="000000"/>
+        </w:rPr>
+        <w:t>The query-v3 grounded_summary mode retrieves evidence locally through Chroma/E5 and may make one GPT call. GPT selects evidence IDs owned by the server, which then restores the exact quotations and required context. For canonical repair questions, the server renders answers from matching rule rows and retains the demonstration qualifiers.</w:t>
+      </w:r>
+    </w:p>
+    <w:p>
+      <w:pPr>
+        <w:jc w:val="left"/>
+      </w:pPr>
+      <w:r>
+        <w:rPr>
+          <w:color w:val="000000"/>
+        </w:rPr>
+        <w:t>Checks on numbers, priorities, identifiers, labels, sources and plans reject unsupported output. These bounded checks do not establish semantic correctness for every possible answer.</w:t>
+      </w:r>
+    </w:p>
+    <w:p>
+      <w:pPr>
+        <w:jc w:val="left"/>
+      </w:pPr>
+      <w:r>
+        <w:rPr>
+          <w:color w:val="000000"/>
+        </w:rPr>
+        <w:t xml:space="preserve">A standalone question such as “What model are you?” returns the configured model name through server_configuration. It does not call GPT, retrieve knowledge or read saved plans, and remains available when generation is disabled or the key is missing. The answer identifies the configured assistant model. It does not prove provider execution or identify the separate YOLO detector.</w:t>
+      </w:r>
+    </w:p>
+    <w:p>
+      <w:pPr>
+        <w:jc w:val="left"/>
+      </w:pPr>
+      <w:r>
+        <w:rPr>
+          <w:color w:val="000000"/>
+        </w:rPr>
+        <w:t>Clearly unrelated questions return scope_guidance with RoadGuard examples. These direct modes provide no citations or knowledge-package metadata and consume no model-call budget. Ambiguous questions and questions that mix domain topics still follow the evidence flow. Insufficient evidence and validation failures are reported explicitly.</w:t>
       </w:r>
     </w:p>
     <w:p>
@@ -13314,7 +13576,7 @@
         <w:rPr>
           <w:color w:val="000000"/>
         </w:rPr>
-        <w:t>Open Crew adjustments in Route assistant and load a saved plan ID or the latest GA plan. Four crew cards show stop order, travel, service, required return travel, total work, remaining shift and persistent assignment badges. Use a current plan for changes. Crew availability changes remain a separate preview and confirmation workflow.</w:t>
+        <w:t xml:space="preserve">Open Crew adjustments in Route assistant and load a saved plan ID or the latest GA plan. The four crew cards show stop order, travel, service, required return travel, total work, remaining shift and persistent assignment badges. Use a current plan when making changes. Changes to crew availability have their own preview and confirmation workflow.</w:t>
       </w:r>
     </w:p>
     <w:p>
@@ -13325,7 +13587,7 @@
         <w:rPr>
           <w:color w:val="000000"/>
         </w:rPr>
-        <w:t>To move a task, select an assigned active task and a different available crew, then preview. Inspect before/after routes and acknowledge the preview before confirming. The server retains all other assigned work and checks travel plus service plus configured depot return against the shift limit (480 minutes in the routing demo). Unknown travel, infeasible work, stale input/configuration or expired previews are rejected without mutation. A rejected move never silently drops another task.</w:t>
+        <w:t xml:space="preserve">To move a task, select an assigned active task and a different available crew, then preview the move. Compare the routes before and after the change, acknowledge the preview and confirm.</w:t>
       </w:r>
     </w:p>
     <w:p>
@@ -13336,7 +13598,7 @@
         <w:rPr>
           <w:color w:val="000000"/>
         </w:rPr>
-        <w:t>Confirmation stores a durable task-to-crew constraint; it does not save a new route automatically. Choose Recalculate saved task change and reload the latest GA plan. Both Greedy and GA retain the constraint after restart and when new tasks are added. Stop order may change. Unavailable or infeasible constrained tasks are reported as unassigned instead of silently changing crews. The shift and return policies remain configurable demonstration assumptions.</w:t>
+        <w:t>The server retains all other assigned work. It checks that travel, service and the configured depot return fit within the shift limit, which is 480 minutes in the routing demo. It rejects the move without changing records if travel is unknown, the work is infeasible, inputs or configuration are stale, or the preview has expired. A rejected move never silently drops another task.</w:t>
       </w:r>
     </w:p>
     <w:p>
@@ -13347,7 +13609,7 @@
         <w:rPr>
           <w:color w:val="000000"/>
         </w:rPr>
-        <w:t>To cancel work, choose Cancel active task, preview and explicitly confirm. Assigned and unassigned active tasks can be cancelled. Cancellation retains task/history records and removes the task from active planning; explicitly recalculate to replace stale routes. Completed and cancelled tasks cannot be reopened. Discard task preview closes only an unconfirmed proposal and does not cancel a task. Use recent records or the change ID to recover after interruption; refresh before retrying a version conflict. Confirm/replan retries are bounded and idempotent.</w:t>
+        <w:t xml:space="preserve">Confirmation saves a durable task-to-crew constraint. To generate a new saved route, choose Recalculate saved task change and reload the latest GA plan.</w:t>
       </w:r>
     </w:p>
     <w:p>
@@ -13358,7 +13620,51 @@
         <w:rPr>
           <w:color w:val="000000"/>
         </w:rPr>
-        <w:t>Reassignment immediately removes the previous crew's task/inspection read and completion access. The target crew waits for an explicit saved GA recalculation. An affected old route is omitted with a stale/recalculation explanation. Crew and inspector accounts cannot perform dispatcher adjustment operations. These checks apply in the backend as well as the interface.</w:t>
+        <w:t>Both Greedy and GA retain the constraint after a restart and when new tasks are added, although stop order may change. If the constrained crew is unavailable or the assignment is infeasible, the task is reported as unassigned rather than silently moved to another crew. The shift and return policies remain configurable demonstration assumptions.</w:t>
+      </w:r>
+    </w:p>
+    <w:p>
+      <w:pPr>
+        <w:jc w:val="left"/>
+      </w:pPr>
+      <w:r>
+        <w:rPr>
+          <w:color w:val="000000"/>
+        </w:rPr>
+        <w:t xml:space="preserve">To cancel work, choose Cancel active task, preview the cancellation and explicitly confirm it. Both assigned and unassigned active tasks can be cancelled. Cancellation preserves the task and its history but removes it from active planning. Explicitly recalculate to replace stale routes. Completed and cancelled tasks cannot be reopened.</w:t>
+      </w:r>
+    </w:p>
+    <w:p>
+      <w:pPr>
+        <w:jc w:val="left"/>
+      </w:pPr>
+      <w:r>
+        <w:rPr>
+          <w:color w:val="000000"/>
+        </w:rPr>
+        <w:t>Discard task preview closes only an unconfirmed proposal; it does not cancel a task. After an interruption, use recent records or the change ID to recover the operation. Refresh before retrying a version conflict. Confirmation and replanning retries are bounded and idempotent.</w:t>
+      </w:r>
+    </w:p>
+    <w:p>
+      <w:pPr>
+        <w:jc w:val="left"/>
+      </w:pPr>
+      <w:r>
+        <w:rPr>
+          <w:color w:val="000000"/>
+        </w:rPr>
+        <w:t xml:space="preserve">Reassignment immediately removes the previous crew's access to read the task and inspection or complete the task. The target crew gains access through an explicitly recalculated saved GA plan. An affected old route is omitted, with an explanation that it is stale and requires recalculation.</w:t>
+      </w:r>
+    </w:p>
+    <w:p>
+      <w:pPr>
+        <w:jc w:val="left"/>
+      </w:pPr>
+      <w:r>
+        <w:rPr>
+          <w:color w:val="000000"/>
+        </w:rPr>
+        <w:t>Crew and inspector accounts cannot perform dispatcher adjustments. The backend enforces these checks as well as the interface.</w:t>
       </w:r>
     </w:p>
     <w:p>
@@ -13382,7 +13688,18 @@
         <w:rPr>
           <w:color w:val="000000"/>
         </w:rPr>
-        <w:t>In Swagger, call POST /api/v1/auth/login with a provisioned account. Keep the same host name for session cookies, and send the returned csrf_token as X-CSRF-Token for authenticated modifying requests. Upload uses multipart image and metadata, with a new Idempotency-Key for each new submission. Retry a lost response with identical content and the same key.</w:t>
+        <w:t xml:space="preserve">In Swagger, call POST /api/v1/auth/login with a provisioned account. Use the same host name throughout so that session cookies are retained. For authenticated requests that modify data, send the returned csrf_token as X-CSRF-Token.</w:t>
+      </w:r>
+    </w:p>
+    <w:p>
+      <w:pPr>
+        <w:jc w:val="left"/>
+      </w:pPr>
+      <w:r>
+        <w:rPr>
+          <w:color w:val="000000"/>
+        </w:rPr>
+        <w:t>An upload uses multipart image and metadata fields. Use a new Idempotency-Key for each new submission. If the response is lost, retry with identical content and the same key.</w:t>
       </w:r>
     </w:p>
     <w:p>
@@ -13537,7 +13854,7 @@
                 <w:color w:val="000000"/>
                 <w:sz w:val="21"/>
               </w:rPr>
-              <w:t>Check the environment interpreter is Python 3.12; base CI's 3.11 does not include vision</w:t>
+              <w:t xml:space="preserve">Check that the environment uses Python 3.12. Base CI uses Python 3.11 and does not include vision dependencies.</w:t>
             </w:r>
           </w:p>
         </w:tc>
@@ -13596,7 +13913,7 @@
                 <w:color w:val="000000"/>
                 <w:sz w:val="21"/>
               </w:rPr>
-              <w:t>Start the backend and match the frontend proxy target</w:t>
+              <w:t xml:space="preserve">Start the backend and check that the frontend proxy target matches its address.</w:t>
             </w:r>
           </w:p>
         </w:tc>
@@ -13655,7 +13972,7 @@
                 <w:color w:val="000000"/>
                 <w:sz w:val="21"/>
               </w:rPr>
-              <w:t>Check sign-in, account role, session host and CSRF token</w:t>
+              <w:t xml:space="preserve">Check sign-in, account role, session host and CSRF token.</w:t>
             </w:r>
           </w:p>
         </w:tc>
@@ -13714,7 +14031,7 @@
                 <w:color w:val="000000"/>
                 <w:sz w:val="21"/>
               </w:rPr>
-              <w:t>End outstanding viewer transactions; do not delete the database</w:t>
+              <w:t xml:space="preserve">End outstanding viewer transactions. Do not delete the database.</w:t>
             </w:r>
           </w:p>
         </w:tc>
@@ -13773,7 +14090,7 @@
                 <w:color w:val="000000"/>
                 <w:sz w:val="21"/>
               </w:rPr>
-              <w:t>Install vision requirements, verify the bundled weight/manifest and restart after a failed load</w:t>
+              <w:t xml:space="preserve">Install the vision requirements and verify the bundled weight and manifest. Restart after a failed model load.</w:t>
             </w:r>
           </w:p>
         </w:tc>
@@ -13832,7 +14149,7 @@
                 <w:color w:val="000000"/>
                 <w:sz w:val="21"/>
               </w:rPr>
-              <w:t>Refresh current state and explicitly replan or retry with the current record version</w:t>
+              <w:t xml:space="preserve">Refresh the current state, then explicitly replan or retry with the current record version.</w:t>
             </w:r>
           </w:p>
         </w:tc>
@@ -13891,7 +14208,7 @@
                 <w:color w:val="000000"/>
                 <w:sz w:val="21"/>
               </w:rPr>
-              <w:t>Read the reasons, including unavailable crews or shift limits</w:t>
+              <w:t xml:space="preserve">Read the reported reasons, such as unavailable crews or shift limits.</w:t>
             </w:r>
           </w:p>
         </w:tc>
@@ -13950,7 +14267,7 @@
                 <w:color w:val="000000"/>
                 <w:sz w:val="21"/>
               </w:rPr>
-              <w:t>Install full backend requirements, verify configured paths, run the explicit index command and restart; HTTP requests do not repair indexes</w:t>
+              <w:t xml:space="preserve">Install the full backend requirements, verify the configured paths, run the explicit index command and restart. HTTP requests do not repair indexes.</w:t>
             </w:r>
           </w:p>
         </w:tc>
@@ -14009,7 +14326,7 @@
                 <w:color w:val="000000"/>
                 <w:sz w:val="21"/>
               </w:rPr>
-              <w:t>Use lowercase true/false, a valid model name and documented limit ranges, then restart</w:t>
+              <w:t xml:space="preserve">Use lowercase true/false, a valid model name and the documented limit ranges, then restart.</w:t>
             </w:r>
           </w:p>
         </w:tc>
@@ -14068,7 +14385,7 @@
                 <w:color w:val="000000"/>
                 <w:sz w:val="21"/>
               </w:rPr>
-              <w:t>Check private server configuration, account access and local attempted-call budget; model identity remains available; do not repeatedly retry unknown outcomes</w:t>
+              <w:t xml:space="preserve">Check private server configuration, account access and the local attempted-call budget. Model identity remains available. Do not repeatedly retry requests whose outcomes are unknown.</w:t>
             </w:r>
           </w:p>
         </w:tc>
@@ -14127,7 +14444,7 @@
                 <w:color w:val="000000"/>
                 <w:sz w:val="21"/>
               </w:rPr>
-              <w:t>Narrow the question or select a current saved plan; inspect the explicit error, without bypassing citation validation</w:t>
+              <w:t xml:space="preserve">Narrow the question or select a current saved plan. Inspect the explicit error without bypassing citation validation.</w:t>
             </w:r>
           </w:p>
         </w:tc>
@@ -14186,7 +14503,7 @@
                 <w:color w:val="000000"/>
                 <w:sz w:val="21"/>
               </w:rPr>
-              <w:t>Refresh task/plan/configuration and create a new preview before confirmation</w:t>
+              <w:t xml:space="preserve">Refresh the task, plan and configuration, then create a new preview before confirming.</w:t>
             </w:r>
           </w:p>
         </w:tc>
@@ -14245,7 +14562,7 @@
                 <w:color w:val="000000"/>
                 <w:sz w:val="21"/>
               </w:rPr>
-              <w:t>Inspect travel/service/return totals and availability; choose a feasible crew; other tasks are retained</w:t>
+              <w:t xml:space="preserve">Inspect travel, service and return totals and crew availability, then choose a feasible crew. Other tasks are retained.</w:t>
             </w:r>
           </w:p>
         </w:tc>
@@ -14304,7 +14621,7 @@
                 <w:color w:val="000000"/>
                 <w:sz w:val="21"/>
               </w:rPr>
-              <w:t>Inspect the locked crew and reason; later recalculation preserves the constraint rather than silently transferring work</w:t>
+              <w:t xml:space="preserve">Inspect the locked crew and the reported reason. Later recalculation preserves the constraint rather than silently transferring the work.</w:t>
             </w:r>
           </w:p>
         </w:tc>
@@ -14363,7 +14680,7 @@
                 <w:color w:val="000000"/>
                 <w:sz w:val="21"/>
               </w:rPr>
-              <w:t>Dispatcher explicitly recalculates; the target crew then refreshes its latest saved GA route</w:t>
+              <w:t xml:space="preserve">The dispatcher must explicitly recalculate. The target crew can then refresh its latest saved GA route.</w:t>
             </w:r>
           </w:p>
         </w:tc>
@@ -14422,7 +14739,7 @@
                 <w:color w:val="000000"/>
                 <w:sz w:val="21"/>
               </w:rPr>
-              <w:t>Check server credentials/service access; errors do not silently become simulation</w:t>
+              <w:t xml:space="preserve">Check server credentials and service access. Provider errors do not silently switch the system to simulation.</w:t>
             </w:r>
           </w:p>
         </w:tc>
@@ -14489,7 +14806,7 @@
         <w:rPr>
           <w:color w:val="000000"/>
         </w:rPr>
-        <w:t>Usage may incur charges. Keep the key private and out of frontend source. The current provider uses traffic-unaware estimates; the map remains schematic. Old plans retain their original source. Recorded browser acceptance used simulation, not a new real-Google call. See the routing guide (../SystemCode/backend/roadguard/routing/README.md).</w:t>
+        <w:t xml:space="preserve">Usage may incur charges. Keep the key private and out of frontend source. The current provider uses traffic-unaware estimates, and the map remains schematic. Existing plans retain their original travel source.</w:t>
       </w:r>
     </w:p>
     <w:p>
@@ -14500,7 +14817,29 @@
         <w:rPr>
           <w:color w:val="000000"/>
         </w:rPr>
-        <w:t>Retained operating details. The pinned vision requirements include PyTorch, torchvision and Ultralytics. In the crew workflow, the example crew02 account can act only for Crew 02 and may be idle; use the crew assigned in the latest saved GA plan. On an upload, inspect the detail page for provenance and stored rule information. A changed upload payload requires a new submission and Idempotency-Key; GET requests do not require CSRF.</w:t>
+        <w:t>The recorded browser acceptance tests used simulation and did not make a new real-Google call. See the routing guide (../SystemCode/backend/roadguard/routing/README.md).</w:t>
+      </w:r>
+    </w:p>
+    <w:p>
+      <w:pPr>
+        <w:jc w:val="left"/>
+      </w:pPr>
+      <w:r>
+        <w:rPr>
+          <w:color w:val="000000"/>
+        </w:rPr>
+        <w:t xml:space="preserve">Additional operating details: the pinned vision requirements include PyTorch, torchvision and Ultralytics. The example crew02 account can act only for Crew 02 and may have no assigned work. For the crew workflow, use the crew assigned in the latest saved GA plan.</w:t>
+      </w:r>
+    </w:p>
+    <w:p>
+      <w:pPr>
+        <w:jc w:val="left"/>
+      </w:pPr>
+      <w:r>
+        <w:rPr>
+          <w:color w:val="000000"/>
+        </w:rPr>
+        <w:t>After an upload, open the detail page to inspect provenance and stored rule information. A changed upload payload requires a new submission and Idempotency-Key. GET requests do not require CSRF.</w:t>
       </w:r>
     </w:p>
     <w:p>
@@ -14553,7 +14892,7 @@
     </w:p>
     <w:p>
       <w:r>
-        <w:t>The submitted proposal is reproduced in full with its original contents, diagrams and pagination. Its cover retains the former Group 07 identifier; the current group is 37. The two-crew plan is historical. Sections 1.3 and 5.3 explain scope and evaluation changes. Report page numbering remains continuous.</w:t>
+        <w:t xml:space="preserve">The submitted proposal is reproduced in full, including its original contents, diagrams and pagination. Its cover retains the former Group 07 identifier; the current group is 37. The proposed two-crew arrangement records the original plan. Sections 1.3 and 5.3 explain subsequent changes to scope and evaluation. Report page numbering continues through the appendix.</w:t>
       </w:r>
     </w:p>
     <w:p>
@@ -15351,7 +15690,7 @@
     </w:p>
     <w:p>
       <w:r>
-        <w:t>Table C1 maps implemented functions to the MR, RS and CGS course content and the three applicable technique groups in the practice briefing. It indexes the design and evaluation in the main report without repeating experimental results.</w:t>
+        <w:t xml:space="preserve">Table C1 maps the implemented functions to the MR, RS and CGS course content and the three applicable technique groups in the practice briefing. It points to the design and evaluation evidence in the main report without repeating the experimental results.</w:t>
       </w:r>
     </w:p>
     <w:p>
@@ -15599,7 +15938,7 @@
                 <w:color w:val="000000"/>
                 <w:sz w:val="21"/>
               </w:rPr>
-              <w:t>Versioned policies, stored rule snapshots and decision traces; preview validation, durable crew constraints and automatic planning for accepted inspections and explicit replanning for other changes.</w:t>
+              <w:t xml:space="preserve">Versioned policies, stored rule snapshots and decision traces. Preview validation and durable crew constraints support adjustments. Accepted inspections trigger automatic planning; other changes require explicit replanning.</w:t>
             </w:r>
           </w:p>
         </w:tc>
@@ -15620,7 +15959,7 @@
                 <w:color w:val="000000"/>
                 <w:sz w:val="21"/>
               </w:rPr>
-              <w:t>Sections 2, 3.2 and 5.3: boundary, correction, replay and controlled adjustment checks. Service durations remain assumptions.</w:t>
+              <w:t xml:space="preserve">Sections 2, 3.2 and 5.3 cover boundary, correction, replay and controlled adjustment checks. Service durations remain assumptions.</w:t>
             </w:r>
           </w:p>
         </w:tc>
@@ -15702,7 +16041,7 @@
                 <w:color w:val="000000"/>
                 <w:sz w:val="21"/>
               </w:rPr>
-              <w:t>Four-crew task assignment and visit ordering. Priority-first coverage precedes a weighted completion, travel and workload objective.</w:t>
+              <w:t xml:space="preserve">Assign tasks and order visits for four crews. Priority-first coverage takes precedence over the weighted completion, travel and workload objective.</w:t>
             </w:r>
           </w:p>
         </w:tc>
@@ -15723,7 +16062,7 @@
                 <w:color w:val="000000"/>
                 <w:sz w:val="21"/>
               </w:rPr>
-              <w:t>Group-built GA: encoding, selection, crossover, mutation and elitism. GA and Greedy share the evaluator, task snapshot and matrix.</w:t>
+              <w:t xml:space="preserve">The group-built GA uses encoding, selection, crossover, mutation and elitism. GA and Greedy share the evaluator, task snapshot and travel matrix.</w:t>
             </w:r>
           </w:p>
         </w:tc>
@@ -15744,7 +16083,7 @@
                 <w:color w:val="000000"/>
                 <w:sz w:val="21"/>
               </w:rPr>
-              <w:t>Sections 3.2, 4 and 5.2: 10/15/20 tasks, multiple seeds, seeding ablation and unassigned-task failure analysis. Optimality is not established.</w:t>
+              <w:t xml:space="preserve">Sections 3.2, 4 and 5.2 cover 10/15/20-task scenarios, multiple seeds, a seeding ablation and analysis of unassigned-task failures. The evaluation does not establish optimality.</w:t>
             </w:r>
           </w:p>
         </w:tc>
@@ -15826,7 +16165,7 @@
                 <w:color w:val="000000"/>
                 <w:sz w:val="21"/>
               </w:rPr>
-              <w:t>YOLO11s predicts eight classes and boxes; primary selection supplies evidence to rules. Retrieval and optional GPT explain reviewed knowledge and authorized saved plans.</w:t>
+              <w:t xml:space="preserve">YOLO11s predicts eight damage classes and bounding boxes. Primary selection supplies evidence to the rules. Retrieval and optional GPT explain reviewed knowledge and authorised saved plans.</w:t>
             </w:r>
           </w:p>
         </w:tc>
@@ -15847,7 +16186,7 @@
                 <w:color w:val="000000"/>
                 <w:sz w:val="21"/>
               </w:rPr>
-              <w:t>Grouped data, supervised training and local inference; static Chroma/E5 index, query-v3 exact citations and server-derived rule answers. Plan facts remain outside the index.</w:t>
+              <w:t xml:space="preserve">Grouped data, supervised training and local inference support perception. A static Chroma/E5 index, query-v3 exact citations and server-derived rule answers support explanation. Plan facts remain outside the index.</w:t>
             </w:r>
           </w:p>
         </w:tc>
@@ -15868,7 +16207,7 @@
                 <w:color w:val="000000"/>
                 <w:sz w:val="21"/>
               </w:rPr>
-              <w:t>Sections 2–5: recognition metrics and failure audit; distinct actual GPT, local retrieval and controlled cases. Independent local vision validation and broad answer evaluation remain outstanding.</w:t>
+              <w:t xml:space="preserve">Sections 2–5 report recognition metrics and a failure audit, with separate actual-GPT, local-retrieval and controlled-case evaluations. Independent local vision validation and broad answer evaluation remain outstanding.</w:t>
             </w:r>
           </w:p>
         </w:tc>
@@ -15882,7 +16221,7 @@
         <w:rPr>
           <w:color w:val="000000"/>
         </w:rPr>
-        <w:t>Coverage boundary. Storage, authorization and interface display support these three technique groups. Targeted GPT/RAG acceptance establishes neither universal semantic accuracy nor the complete proposed evaluation.</w:t>
+        <w:t xml:space="preserve">Storage, authorisation and interface display support these three technique groups. The targeted GPT/RAG acceptance tests establish neither universal semantic accuracy nor completion of the full evaluation proposed in Appendix B.</w:t>
       </w:r>
     </w:p>
     <w:sectPr>

</xml_diff>

<commit_message>
docs(report): sync the latest Assignment final report
</commit_message>
<xml_diff>
--- a/ProjectReport/IRS-PM-2026-08-17-AIS08FT-GRP-Group37-RoadGuard-Group-Report.docx
+++ b/ProjectReport/IRS-PM-2026-08-17-AIS08FT-GRP-Group37-RoadGuard-Group-Report.docx
@@ -246,22 +246,36 @@
         <w:rPr>
           <w:color w:val="000000"/>
         </w:rPr>
-        <w:t xml:space="preserve">RoadGuard combines road-damage detection, rule-based decisions and maintenance scheduling for four crews in Jurong East and Jurong West. Inspectors upload geolocated images, and a local YOLO11s model selects one primary damage observation. A confidence policy then determines whether to create a repair task or request human review. A genetic algorithm and a Greedy baseline allocate accepted work from a common NUS-ISS dispatch origin. Inspectors, dispatchers and crews use a shared web application that retains task history and checks record revisions. A dispatcher assistant retrieves reviewed project knowledge and evidence from saved plans. Separate preview and confirmation workflows allow dispatchers to save crew assignments and cancel tasks.</w:t>
-      </w:r>
-    </w:p>
-    <w:p>
+        <w:t xml:space="preserve">RoadGuard combines road-damage detection, rule-based decisions and maintenance scheduling for  </w:t>
+      </w:r>
+      <w:r>
+        <w:rPr>
+          <w:rFonts w:hint="eastAsia"/>
+          <w:color w:val="000000"/>
+          <w:lang w:val="en-US" w:eastAsia="zh-CN"/>
+        </w:rPr>
+        <w:t>crews in Jurong</w:t>
+      </w:r>
       <w:r>
         <w:rPr>
           <w:color w:val="000000"/>
         </w:rPr>
-        <w:t xml:space="preserve">Our evaluation combines visual-recognition experiments, twelve routing scenarios and tests of the integrated workflow. The detector still needs improvement and independent local validation. The GA initialised with a Greedy solution improved on Greedy in all 120 runs under the default search settings. Mean objective reductions across scenarios ranged from 0.73–3.62%. </w:t>
+        <w:t>. Inspectors upload geolocated images, and a local YOLO11s model selects one primary damage observation. A confidence policy then determines whether to create a repair task or request human review. A genetic algorithm and a Greedy baseline allocate accepted work from a common NUS-ISS dispatch origin. Inspectors, dispatchers and crews use a shared web application that retains task history and checks record revisions. A dispatcher assistant retrieves reviewed project knowledge and evidence from saved plans. Separate preview and confirmation workflows allow dispatchers to save crew assignments and cancel tasks.</w:t>
+      </w:r>
+    </w:p>
+    <w:p>
+      <w:r>
+        <w:rPr>
+          <w:color w:val="000000"/>
+        </w:rPr>
+        <w:t xml:space="preserve">Our evaluation combines visual-recognition experiments, twelve routing scenarios and tests of the integrated workflow. The GA initialised with a Greedy solution improved on Greedy in all 120 runs under the default search settings. Mean objective reductions across scenarios ranged from 0.73–3.62%. </w:t>
       </w:r>
       <w:r>
         <w:rPr>
           <w:rFonts w:hint="eastAsia"/>
           <w:color w:val="000000"/>
         </w:rPr>
-        <w:t xml:space="preserve">We evaluated the assistant using actual GPT-generated responses and local retrieval tests, and separately verified user-confirmed task changes.</w:t>
+        <w:t>We evaluated the assistant using actual GPT-generated responses and local retrieval tests, and separately verified user-confirmed task changes.</w:t>
       </w:r>
       <w:r>
         <w:rPr>
@@ -271,13 +285,11 @@
         </w:rPr>
         <w:t xml:space="preserve"> </w:t>
       </w:r>
-      <w:bookmarkStart w:id="55" w:name="_GoBack"/>
-      <w:bookmarkEnd w:id="55"/>
       <w:r>
         <w:rPr>
           <w:color w:val="000000"/>
         </w:rPr>
-        <w:t xml:space="preserve">The project connects inspection evidence to crew planning while allowing human correction and retaining a record of decisions. Operational deployment requires validated rules, measured service assumptions and further field evaluation.</w:t>
+        <w:t>The project connects inspection evidence to crew planning while allowing human correction and retaining a record of decisions.</w:t>
       </w:r>
     </w:p>
     <w:p>
@@ -465,7 +477,7 @@
         <w:tab/>
       </w:r>
       <w:r>
-        <w:t>4</w:t>
+        <w:t>3</w:t>
       </w:r>
     </w:p>
     <w:p>
@@ -492,7 +504,7 @@
         <w:tab/>
       </w:r>
       <w:r>
-        <w:t>6</w:t>
+        <w:t>5</w:t>
       </w:r>
     </w:p>
     <w:p>
@@ -519,7 +531,7 @@
         <w:tab/>
       </w:r>
       <w:r>
-        <w:t>6</w:t>
+        <w:t>5</w:t>
       </w:r>
     </w:p>
     <w:p>
@@ -546,7 +558,7 @@
         <w:tab/>
       </w:r>
       <w:r>
-        <w:t>6</w:t>
+        <w:t>5</w:t>
       </w:r>
     </w:p>
     <w:p>
@@ -573,7 +585,7 @@
         <w:tab/>
       </w:r>
       <w:r>
-        <w:t>8</w:t>
+        <w:t>7</w:t>
       </w:r>
     </w:p>
     <w:p>
@@ -600,7 +612,7 @@
         <w:tab/>
       </w:r>
       <w:r>
-        <w:t>11</w:t>
+        <w:t>10</w:t>
       </w:r>
     </w:p>
     <w:p>
@@ -627,7 +639,7 @@
         <w:tab/>
       </w:r>
       <w:r>
-        <w:t>11</w:t>
+        <w:t>10</w:t>
       </w:r>
     </w:p>
     <w:p>
@@ -654,7 +666,7 @@
         <w:tab/>
       </w:r>
       <w:r>
-        <w:t>12</w:t>
+        <w:t>11</w:t>
       </w:r>
     </w:p>
     <w:p>
@@ -681,7 +693,7 @@
         <w:tab/>
       </w:r>
       <w:r>
-        <w:t>14</w:t>
+        <w:t>13</w:t>
       </w:r>
     </w:p>
     <w:p>
@@ -708,7 +720,7 @@
         <w:tab/>
       </w:r>
       <w:r>
-        <w:t>14</w:t>
+        <w:t>13</w:t>
       </w:r>
     </w:p>
     <w:p>
@@ -735,7 +747,7 @@
         <w:tab/>
       </w:r>
       <w:r>
-        <w:t>17</w:t>
+        <w:t>16</w:t>
       </w:r>
     </w:p>
     <w:p>
@@ -762,7 +774,7 @@
         <w:tab/>
       </w:r>
       <w:r>
-        <w:t>19</w:t>
+        <w:t>17</w:t>
       </w:r>
     </w:p>
     <w:p>
@@ -789,7 +801,7 @@
         <w:tab/>
       </w:r>
       <w:r>
-        <w:t>21</w:t>
+        <w:t>20</w:t>
       </w:r>
     </w:p>
     <w:p>
@@ -816,7 +828,7 @@
         <w:tab/>
       </w:r>
       <w:r>
-        <w:t>21</w:t>
+        <w:t>20</w:t>
       </w:r>
     </w:p>
     <w:p>
@@ -843,7 +855,7 @@
         <w:tab/>
       </w:r>
       <w:r>
-        <w:t>22</w:t>
+        <w:t>21</w:t>
       </w:r>
     </w:p>
     <w:p>
@@ -870,7 +882,7 @@
         <w:tab/>
       </w:r>
       <w:r>
-        <w:t>23</w:t>
+        <w:t>22</w:t>
       </w:r>
     </w:p>
     <w:p>
@@ -897,7 +909,7 @@
         <w:tab/>
       </w:r>
       <w:r>
-        <w:t>23</w:t>
+        <w:t>22</w:t>
       </w:r>
     </w:p>
     <w:p>
@@ -924,7 +936,7 @@
         <w:tab/>
       </w:r>
       <w:r>
-        <w:t>23</w:t>
+        <w:t>22</w:t>
       </w:r>
     </w:p>
     <w:p>
@@ -951,7 +963,7 @@
         <w:tab/>
       </w:r>
       <w:r>
-        <w:t>25</w:t>
+        <w:t>24</w:t>
       </w:r>
     </w:p>
     <w:p>
@@ -978,7 +990,7 @@
         <w:tab/>
       </w:r>
       <w:r>
-        <w:t>25</w:t>
+        <w:t>24</w:t>
       </w:r>
     </w:p>
     <w:p>
@@ -1005,7 +1017,7 @@
         <w:tab/>
       </w:r>
       <w:r>
-        <w:t>25</w:t>
+        <w:t>24</w:t>
       </w:r>
     </w:p>
     <w:p>
@@ -1032,7 +1044,7 @@
         <w:tab/>
       </w:r>
       <w:r>
-        <w:t>27</w:t>
+        <w:t>26</w:t>
       </w:r>
     </w:p>
     <w:p>
@@ -1059,7 +1071,7 @@
         <w:tab/>
       </w:r>
       <w:r>
-        <w:t>27</w:t>
+        <w:t>26</w:t>
       </w:r>
     </w:p>
     <w:p>
@@ -1086,7 +1098,7 @@
         <w:tab/>
       </w:r>
       <w:r>
-        <w:t>29</w:t>
+        <w:t>28</w:t>
       </w:r>
     </w:p>
     <w:p>
@@ -1113,7 +1125,7 @@
         <w:tab/>
       </w:r>
       <w:r>
-        <w:t>30</w:t>
+        <w:t>29</w:t>
       </w:r>
     </w:p>
     <w:p>
@@ -1140,7 +1152,7 @@
         <w:tab/>
       </w:r>
       <w:r>
-        <w:t>31</w:t>
+        <w:t>30</w:t>
       </w:r>
     </w:p>
     <w:p>
@@ -1167,7 +1179,7 @@
         <w:tab/>
       </w:r>
       <w:r>
-        <w:t>44</w:t>
+        <w:t>43</w:t>
       </w:r>
     </w:p>
     <w:p>
@@ -1188,8 +1200,8 @@
         <w:pageBreakBefore w:val="0"/>
         <w:jc w:val="left"/>
       </w:pPr>
-      <w:bookmarkStart w:id="2" w:name="RGCurrentHeading1"/>
-      <w:bookmarkStart w:id="3" w:name="_RGI_2"/>
+      <w:bookmarkStart w:id="2" w:name="_RGI_2"/>
+      <w:bookmarkStart w:id="3" w:name="RGCurrentHeading1"/>
       <w:r>
         <w:t>1 Introduction</w:t>
       </w:r>
@@ -1216,6 +1228,12 @@
       </w:r>
     </w:p>
     <w:p>
+      <w:pPr>
+        <w:rPr>
+          <w:rFonts w:hint="eastAsia" w:eastAsia="宋体"/>
+          <w:lang w:val="en-US" w:eastAsia="zh-CN"/>
+        </w:rPr>
+      </w:pPr>
       <w:r>
         <w:t xml:space="preserve">Singapore’s Land Transport Authority describes manual inspection and reporting as labour-intensive and dependent on inspectors’ judgement. Its published account of AI-assisted inspection and GeoFormSG also identifies the effort required to transfer location coordinates between applications. </w:t>
       </w:r>
@@ -1223,12 +1241,32 @@
         <w:rPr>
           <w:rFonts w:hint="eastAsia"/>
         </w:rPr>
-        <w:t xml:space="preserve">These observations highlight a practical challenge in Singapore's existing road inspection process. We developed RoadGuard as an independent prototype; it is not integrated with LTA systems.</w:t>
+        <w:t>These observations highlight a practical challenge in Singapore's existing road inspection process. We developed RoadGuard as an independent prototype</w:t>
+      </w:r>
+      <w:r>
+        <w:rPr>
+          <w:rFonts w:hint="eastAsia"/>
+          <w:lang w:val="en-US" w:eastAsia="zh-CN"/>
+        </w:rPr>
+        <w:t>.(System</w:t>
+      </w:r>
+      <w:r>
+        <w:rPr>
+          <w:rFonts w:hint="eastAsia"/>
+        </w:rPr>
+        <w:t xml:space="preserve"> is not integrated with LTA systems</w:t>
+      </w:r>
+      <w:r>
+        <w:rPr>
+          <w:rFonts w:hint="eastAsia"/>
+          <w:lang w:val="en-US" w:eastAsia="zh-CN"/>
+        </w:rPr>
+        <w:t>)</w:t>
       </w:r>
     </w:p>
     <w:p>
       <w:r>
-        <w:t>The project aims to connect inspectors, dispatchers and crews through one traceable workflow. Inspectors submit evidence, dispatchers correct and prioritise observations, and crews consult assigned work and record completion. The intended value is less repeated data handling and clearer allocation decisions. These benefits require later user and operational evaluation; they are not measured financial savings.</w:t>
+        <w:t>The project aims to connect inspectors, dispatchers and crews through one traceable workflow. Inspectors submit evidence, dispatchers correct and prioritise observations, and crews consult assigned work and record completion. The intended value is less repeated data handling and clearer allocation decisions.</w:t>
       </w:r>
     </w:p>
     <w:p>
@@ -1247,12 +1285,12 @@
     </w:p>
     <w:p>
       <w:r>
-        <w:t xml:space="preserve">Arya et al.’s RDD2022 benchmark contains 47,420 images from six countries and covers four damage families. RoadGuard uses the separately published eight-class RDD2022ES derivative. This dataset provides training material but does not establish performance in Singapore or determine repair priorities. Redmon et al.’s YOLO work provides the methodological basis for predicting bounding boxes and classes jointly. Our implemented detector uses the later Ultralytics YOLO11, which we selected through project experiments.</w:t>
+        <w:t>Arya et al.’s RDD2022 benchmark contains 47,420 images from six countries and covers four damage families. RoadGuard uses the separately published eight-class RDD2022ES derivative. Redmon et al.’s YOLO work provides the methodological basis for predicting bounding boxes and classes jointly. Our implemented detector uses the later Ultralytics YOLO11, which we selected through project experiments.</w:t>
       </w:r>
     </w:p>
     <w:p>
       <w:r>
-        <w:t xml:space="preserve">For scheduling, Vidal’s research on hybrid genetic search illustrates the value of combining evolutionary search with local improvement in capacitated routing. RoadGuard uses a smaller custom GA rather than Vidal’s HGS or SWAP* method. A deterministic Greedy baseline provides a transparent basis for comparison. Our contribution is the combination of learned perception, editable rules, human correction and evaluated crew planning, rather than a new detector architecture or search algorithm. Compared with an inspection-only tool, RoadGuard extends the workflow from accepted evidence to repair allocation and completion.</w:t>
+        <w:t>For scheduling, Vidal’s research on hybrid genetic search illustrates the value of combining evolutionary search with local improvement in capacitated routing. RoadGuard uses a smaller custom GA rather than Vidal’s HGS or SWAP* method. A deterministic Greedy baseline provides a transparent basis for comparison. Our contribution is the combination of learned perception, editable rules, human correction and evaluated crew planning, rather than a new detector architecture or search algorithm. Compared with an inspection-only tool, RoadGuard extends the workflow from accepted evidence to repair allocation and completion.</w:t>
       </w:r>
     </w:p>
     <w:p>
@@ -1261,8 +1299,8 @@
         <w:pageBreakBefore w:val="0"/>
         <w:jc w:val="left"/>
       </w:pPr>
-      <w:bookmarkStart w:id="8" w:name="RGCurrentHeading4"/>
-      <w:bookmarkStart w:id="9" w:name="_RGI_5"/>
+      <w:bookmarkStart w:id="8" w:name="_RGI_5"/>
+      <w:bookmarkStart w:id="9" w:name="RGCurrentHeading4"/>
       <w:r>
         <w:t>1.3 Scope and Project Evolution</w:t>
       </w:r>
@@ -1274,7 +1312,7 @@
         <w:rPr>
           <w:color w:val="000000"/>
         </w:rPr>
-        <w:t xml:space="preserve">Four crews serve eligible public motor roads in Jurong East and Jurong West within the frozen URA Master Plan 2025 boundaries, using a simulated NUS-ISS origin. Expressway mainlines and ramps, as well as private or restricted roads, are excluded. The backend checks whether a location falls within the permitted area, while users declare the road type. This is not an actual NUS-ISS maintenance operation.</w:t>
+        <w:t>Four crews serve eligible public motor roads in Jurong East and Jurong West within the frozen URA Master Plan 2025 boundaries, using a simulated NUS-ISS origin. Expressway mainlines and ramps, as well as private or restricted roads, are excluded. The backend checks whether a location falls within the permitted area, while users declare the road type.</w:t>
       </w:r>
     </w:p>
     <w:p>
@@ -1282,14 +1320,13 @@
         <w:rPr>
           <w:color w:val="000000"/>
         </w:rPr>
-        <w:t xml:space="preserve">The workflow covers primary damage detection, confidence-based review, rule-based task creation, comparative scheduling and crew completion. Accepted inspections trigger automatic planning attempts, while other changes require explicit replanning. The dispatcher assistant also provides answers grounded in evidence and supports confirmed adjustments. Table 1 compares the delivered scope with the submitted proposal in Appendix B. The restriction to Jurong and the use of four crews follow presentation feedback; the other changes reflect implementation decisions or gaps in evaluation.</w:t>
+        <w:t>The workflow covers primary damage detection, confidence-based review, rule-based task creation, comparative scheduling and crew completion. Accepted inspections trigger automatic planning attempts, while other changes require explicit replanning. The dispatcher assistant also provides answers grounded in evidence and supports confirmed adjustments. Table 1 compares the delivered scope with the submitted proposal in Appendix B. The restriction to Jurong and the use of four crews follow presentation feedback; the other changes reflect implementation decisions or gaps in evaluation.</w:t>
       </w:r>
     </w:p>
     <w:p>
       <w:pPr>
         <w:pStyle w:val="164"/>
         <w:keepNext/>
-        <w:pageBreakBefore w:val="1"/>
       </w:pPr>
       <w:r>
         <w:t>Table 1. Changes from the original project plan</w:t>
@@ -1760,7 +1797,7 @@
                 <w:color w:val="000000"/>
                 <w:sz w:val="21"/>
               </w:rPr>
-              <w:t xml:space="preserve">Accepted uploads and review confirmations or corrections trigger a planning attempt after the task is committed; other changes require explicit recalculation</w:t>
+              <w:t>Accepted uploads and review confirmations or corrections trigger a planning attempt after the task is committed; other changes require explicit recalculation</w:t>
             </w:r>
           </w:p>
         </w:tc>
@@ -1872,7 +1909,7 @@
                 <w:color w:val="000000"/>
                 <w:sz w:val="21"/>
               </w:rPr>
-              <w:t xml:space="preserve">Optional Google travel matrix; simulated travel by default; schematic SVG map</w:t>
+              <w:t>Optional Google travel matrix; simulated travel by default; schematic SVG map</w:t>
             </w:r>
           </w:p>
         </w:tc>
@@ -2208,7 +2245,7 @@
                 <w:color w:val="000000"/>
                 <w:sz w:val="21"/>
               </w:rPr>
-              <w:t xml:space="preserve">Authenticated roles; inspectors restricted to their own inspections and crew accounts to their fixed crew</w:t>
+              <w:t>Authenticated roles; inspectors restricted to their own inspections and crew accounts to their fixed crew</w:t>
             </w:r>
           </w:p>
         </w:tc>
@@ -2216,23 +2253,12 @@
     </w:tbl>
     <w:p>
       <w:pPr>
-        <w:spacing w:before="120"/>
-      </w:pPr>
-      <w:r>
-        <w:rPr>
-          <w:color w:val="000000"/>
-        </w:rPr>
-        <w:t xml:space="preserve">The configurable 480-minute shift and the requirement to return to the depot remain unapproved operational assumptions. GPT/RAG and the preview–confirm–replan workflow are implemented, but targeted acceptance tests do not establish completion of the full question-and-change evaluation proposed in Appendix B.</w:t>
-      </w:r>
-    </w:p>
-    <w:p>
-      <w:pPr>
         <w:pStyle w:val="3"/>
         <w:pageBreakBefore/>
         <w:jc w:val="left"/>
       </w:pPr>
-      <w:bookmarkStart w:id="10" w:name="RGCurrentHeading5"/>
-      <w:bookmarkStart w:id="11" w:name="_RGI_6"/>
+      <w:bookmarkStart w:id="10" w:name="_RGI_6"/>
+      <w:bookmarkStart w:id="11" w:name="RGCurrentHeading5"/>
       <w:r>
         <w:t>2 Data and Knowledge Preparation</w:t>
       </w:r>
@@ -2244,15 +2270,15 @@
         <w:rPr>
           <w:rFonts w:hint="eastAsia"/>
         </w:rPr>
-        <w:t xml:space="preserve">We used version 1 of the RDD2022ES dataset and retained its eight damage classes throughout model development.</w:t>
-      </w:r>
-      <w:r>
-        <w:t xml:space="preserve"> Our preparation pipeline decodes images and checks annotation coordinates and class IDs. It sets aside groups with missing labels or uncertain orientation, and records these decisions in exclusion manifests and file hashes. The publisher’s conflicting licence statements remain unresolved for prospective commercial reuse.</w:t>
+        <w:t>We used version 1 of the RDD2022ES dataset and retained its eight damage classes throughout model development.</w:t>
+      </w:r>
+      <w:r>
+        <w:t xml:space="preserve"> Our preparation pipeline decodes images and checks annotation coordinates and class IDs. It sets aside groups with missing labels or uncertain orientation, and records these decisions in exclusion manifests and file hashes. </w:t>
       </w:r>
     </w:p>
     <w:p>
       <w:r>
-        <w:t xml:space="preserve">We group original images with their mirrors before splitting the data, and use exact and conservative perceptual similarity checks to link other related images. We then allocate groups by country using seed 42 and approximate proportions of 70/15/15. Training includes mirrors, while validation and test use only original images. This procedure limits known duplicate leakage, but without sequence or location metadata it cannot establish that adjacent scenes are independent.</w:t>
+        <w:t>We group original images with their mirrors before splitting the data, and use exact and conservative perceptual similarity checks to link other related images. We then allocate groups by country using seed 42 and approximate proportions of 70/15/15. Training includes mirrors, while validation and test use only original images. This procedure limits known duplicate leakage, but without sequence or location metadata it cannot establish that adjacent scenes are independent.</w:t>
       </w:r>
     </w:p>
     <w:p>
@@ -3008,7 +3034,7 @@
         <w:spacing w:before="120"/>
       </w:pPr>
       <w:r>
-        <w:t xml:space="preserve">Only the historical YOLO11n 10-epoch baseline has a recorded test-set evaluation. We reused validation data for subsequent model and policy selection. The research photographs come from foreign sources. The synthetic Jurong task coordinates are separate scheduling inputs and do not establish where any photograph was captured.</w:t>
+        <w:t>The research photographs come from foreign sources. The synthetic Jurong task coordinates are separate scheduling inputs and do not establish where any photograph was captured.</w:t>
       </w:r>
     </w:p>
     <w:p>
@@ -3016,7 +3042,7 @@
         <w:rPr>
           <w:color w:val="000000"/>
         </w:rPr>
-        <w:t xml:space="preserve">Versioned business rules specify severity, priority, service time in minutes and explanations. The a-knowledge-v19 package records the reviewed scope, label meanings, rules and workflows, together with hashes of its sources. We index it locally in ChromaDB using multilingual-e5-small embeddings. The package was checked against repository content but has not been approved by engineering experts. Only reviewed static documents enter the index; facts from saved plans are obtained separately with authorization checks. The visual qualifiers “wide”, “sunken” and “deep” are categorical labels rather than measurements of width, depth or structural condition.</w:t>
+        <w:t>Versioned business rules specify severity, priority, service time in minutes and explanations. The a-knowledge-v19 package records the reviewed scope, label meanings, rules and workflows, together with hashes of its sources. We index it locally in ChromaDB using multilingual-e5-small embeddings. The package was checked against repository content. Only reviewed static documents enter the index; facts from saved plans are obtained separately with authorization checks. The visual qualifiers “wide”, “sunken” and “deep” are categorical labels rather than measurements of width, depth or structural condition.</w:t>
       </w:r>
     </w:p>
     <w:p>
@@ -4363,7 +4389,7 @@
         <w:spacing w:before="120"/>
       </w:pPr>
       <w:r>
-        <w:t xml:space="preserve">Confidence determines whether an observation is accepted, while the selected label determines the rule outcome. An incorrect label with high confidence can therefore create an incorrect task. Service times are project assumptions rather than measured construction standards.</w:t>
+        <w:t>Confidence determines whether an observation is accepted, while the selected label determines the rule outcome. An incorrect label with high confidence can therefore create an incorrect task. Service times are project assumptions rather than measured construction standards.</w:t>
       </w:r>
     </w:p>
     <w:p>
@@ -4372,8 +4398,8 @@
         <w:pageBreakBefore/>
         <w:jc w:val="left"/>
       </w:pPr>
-      <w:bookmarkStart w:id="12" w:name="_RGI_7"/>
-      <w:bookmarkStart w:id="13" w:name="RGCurrentHeading6"/>
+      <w:bookmarkStart w:id="12" w:name="RGCurrentHeading6"/>
+      <w:bookmarkStart w:id="13" w:name="_RGI_7"/>
       <w:r>
         <w:t>3 System Design and Implementation</w:t>
       </w:r>
@@ -4399,7 +4425,7 @@
         <w:rPr>
           <w:color w:val="000000"/>
         </w:rPr>
-        <w:t xml:space="preserve">The React frontend connects to one FastAPI backend and a shared SQLite database. Separate services handle vision, rules, inspections, tasks, crews and planning. YOLO predicts the damage class and its location within the image for review. Repair policy is held in explicit rules, so it can change without retraining the model. The GA searches for suitable task assignments and visit orders, while Greedy provides a baseline and an initial solution.</w:t>
+        <w:t>The React frontend connects to one FastAPI backend and a shared SQLite database. Separate services handle vision, rules, inspections, tasks, crews and planning. YOLO predicts the damage class and its location within the image for review. Repair policy is held in explicit rules, so it can change without retraining the model. The GA searches for suitable task assignments and visit orders, while Greedy provides a baseline and an initial solution.</w:t>
       </w:r>
     </w:p>
     <w:p>
@@ -4480,7 +4506,7 @@
         <w:rPr>
           <w:color w:val="000000"/>
         </w:rPr>
-        <w:t xml:space="preserve">Note. Questions do not change business records. Dispatchers must confirm proposed adjustments and explicitly recalculate the affected routes. Source checks and validation of specific answer fields reduce unsupported output but cannot guarantee that every answer is semantically correct.</w:t>
+        <w:t>Note. Questions do not change business records. Dispatchers must confirm proposed adjustments and explicitly recalculate the affected routes.</w:t>
       </w:r>
     </w:p>
     <w:p>
@@ -4489,17 +4515,23 @@
         <w:pageBreakBefore w:val="0"/>
         <w:jc w:val="left"/>
       </w:pPr>
-      <w:bookmarkStart w:id="16" w:name="RGCurrentHeading8"/>
-      <w:bookmarkStart w:id="17" w:name="_RGI_9"/>
-      <w:r>
-        <w:t xml:space="preserve">3.2 Detection Decisions and Route Scheduling</w:t>
+      <w:bookmarkStart w:id="16" w:name="_RGI_9"/>
+      <w:bookmarkStart w:id="17" w:name="RGCurrentHeading8"/>
+      <w:r>
+        <w:t>3.2 Detection Decisions and Route Scheduling</w:t>
       </w:r>
       <w:bookmarkEnd w:id="16"/>
       <w:bookmarkEnd w:id="17"/>
     </w:p>
     <w:p>
       <w:r>
-        <w:t xml:space="preserve">The backend checks the local model manifest, weight hash and eight-class schema. Inference filters candidates at confidence 0.20. It ranks primary-box candidates by confidence multiplied by the fourth root of the fraction of image area they occupy; this ranking score does not replace raw confidence. A primary observation with raw confidence of at least 0.60 automatically creates one task. Lower confidence requires review, and no detection creates no task. The system retains raw evidence, the rule snapshot and review history. Corrections use the frozen rules, and idempotent requests prevent duplicate tasks.</w:t>
+        <w:rPr>
+          <w:rFonts w:hint="eastAsia"/>
+        </w:rPr>
+        <w:t>Before loading the model, the backend verifies that its configuration, weight file and eight damage-class labels match the expected definitions, including the mapping between class IDs and labels.</w:t>
+      </w:r>
+      <w:r>
+        <w:t xml:space="preserve"> Inference filters candidates at confidence 0.20. It ranks primary-box candidates by confidence multiplied by the fourth root of the fraction of image area they occupy; this ranking score does not replace raw confidence. A primary observation with raw confidence of at least 0.60 automatically creates one task. Lower confidence requires review, and no detection creates no task. The system retains raw evidence, the rule snapshot and review history. Corrections use the frozen rules, and idempotent requests prevent duplicate tasks.</w:t>
       </w:r>
     </w:p>
     <w:p>
@@ -4507,7 +4539,27 @@
         <w:rPr>
           <w:color w:val="000000"/>
         </w:rPr>
-        <w:t xml:space="preserve">Both planners read the same active tasks, crew availability, travel matrix and constraints at a consistent revision. Greedy selects the earliest available crew, then selects a feasible task by priority and travel time. The GA represents each solution as a task permutation and a vector assigning tasks to crews. It explores alternatives through tournament selection, order-preserving crossover, reassignment, swap, reversal, relocation and elitism, while caching evaluations to avoid scoring the same solution twice.</w:t>
+        <w:t>Both planners read the same active tasks, crew availability, travel matrix and constraints at a consistent revision. Greedy selects the earliest available crew, then selects a feasible task by priority and travel time. The GA represents each solution as a task permutation and a vector assigning tasks to crews. It explores alternatives through tournament selection, order-preserving crossover, reassignment, swap, reversal, relocation and elitism, while caching evaluations to avoid scoring the same solution twice.</w:t>
+      </w:r>
+    </w:p>
+    <w:p>
+      <w:pPr>
+        <w:rPr>
+          <w:rFonts w:hint="eastAsia"/>
+          <w:color w:val="000000"/>
+        </w:rPr>
+      </w:pPr>
+      <w:r>
+        <w:rPr>
+          <w:rFonts w:hint="eastAsia"/>
+          <w:color w:val="000000"/>
+        </w:rPr>
+        <w:t>During route planning, the GA uses the Greedy solution as an initial candidate. We also evaluate a GA without this initial candidate to assess the benefit of Greedy seeding. Both the Greedy and GA planners respect saved task-to-crew assignments, including after a system restart or when new tasks trigger recalculation. If the assigned crew is unavailable or cannot accommodate the task within the planning constraints, the task is marked as unassigned. It is not automatically transferred to another crew.</w:t>
+      </w:r>
+    </w:p>
+    <w:p>
+      <w:r>
+        <w:t>The planners compare candidates in order of unassigned P1 tasks, then unassigned P2 tasks, then unassigned P3 tasks. Only when these counts are equal do they minimise J = makespan + 0.2 × total travel + 0.5 × workload standard deviation + 0.5 × priority-weighted mean completion time. This ordering gives task coverage precedence over the weighted objective. Makespan is the longest crew schedule, and workload standard deviation measures differences in work duration between crews. The final term averages task completion times using P1/P2/P3 weights of 3/2/1. All components use minutes, but J is a weighted score rather than elapsed time or money. Since tasks have no deadlines, priority-weighted completion does not measure lateness.</w:t>
       </w:r>
     </w:p>
     <w:p>
@@ -4515,28 +4567,37 @@
         <w:rPr>
           <w:color w:val="000000"/>
         </w:rPr>
-        <w:t>Online search includes the Greedy solution; we retain unseeded GA for experimental comparison. Both planners preserve durable task-to-crew constraints after a restart or the arrival of new tasks. If constrained work cannot be assigned because the crew is unavailable or the work is infeasible, it remains explicitly unassigned rather than being silently transferred to another crew.</w:t>
+        <w:t>Accepted uploads and review confirmations or corrections automatically trigger an attempt to plan with both GA and Greedy after the task is committed, using the same snapshot and matrix. Pending review, no detection and dismissal do not trigger planning. Completion, cancellation, crew changes and assistant confirmations require explicit replanning. Before saving the paired plans, the system rejects any input revision that has been superseded.</w:t>
       </w:r>
     </w:p>
     <w:p>
-      <w:r>
-        <w:t xml:space="preserve">The planners compare candidates in order of unassigned P1 tasks, then unassigned P2 tasks, then unassigned P3 tasks. Only when these counts are equal do they minimise J = makespan + 0.2 × total travel + 0.5 × workload standard deviation + 0.5 × priority-weighted mean completion time. This ordering gives task coverage precedence over the weighted objective. Makespan is the longest crew schedule, and workload standard deviation measures differences in work duration between crews. The final term averages task completion times using P1/P2/P3 weights of 3/2/1. All components use minutes, but J is a weighted score rather than elapsed time or money. Since tasks have no deadlines, priority-weighted completion does not measure lateness.</w:t>
+      <w:pPr>
+        <w:rPr>
+          <w:rFonts w:hint="eastAsia"/>
+          <w:color w:val="000000"/>
+        </w:rPr>
+      </w:pPr>
+      <w:r>
+        <w:rPr>
+          <w:rFonts w:hint="eastAsia"/>
+          <w:color w:val="000000"/>
+        </w:rPr>
+        <w:t>Since dispatchers can move tasks between crews, the system previews each proposed move to check that the revised schedule remains feasible. It keeps all other assigned tasks in place and checks whether travel, repair work and any required return journey fit within the shift limit. Once the dispatcher confirms the move, the new crew assignment is saved and respected in future planning. Cancelling a task removes it from active work but preserves its history.</w:t>
       </w:r>
     </w:p>
     <w:p>
+      <w:r>
+        <w:rPr>
+          <w:rFonts w:hint="eastAsia"/>
+          <w:color w:val="000000"/>
+        </w:rPr>
+        <w:t>The system prevents outdated previews, conflicting changes and repeated confirmations from causing unintended updates. It also checks user permissions and protects against unauthorised requests from other websites. After reassignment, the previous crew immediately loses access to the task and its inspection record and can no longer mark it as complete. The receiving crew gains access once a new GA route plan has been saved. Before recording task completion, the system checks that the task has not changed since the crew retrieved it.</w:t>
+      </w:r>
       <w:r>
         <w:rPr>
           <w:color w:val="000000"/>
         </w:rPr>
-        <w:t xml:space="preserve">Accepted uploads and review confirmations or corrections automatically trigger an attempt to plan with both GA and Greedy after the task is committed, using the same snapshot and matrix. Pending review, no detection and dismissal do not trigger planning. Completion, cancellation, crew changes and assistant confirmations require explicit replanning. Before saving the paired plans, the system rejects any input revision that has been superseded.</w:t>
-      </w:r>
-    </w:p>
-    <w:p>
-      <w:r>
-        <w:rPr>
-          <w:color w:val="000000"/>
-        </w:rPr>
-        <w:t>A move preview retains all other assigned tasks and checks travel, service and the configured return requirement against the shift limit. Confirmation stores a durable crew constraint. Cancellation retains history and removes the task from active work. The system explicitly handles stale or expired proposals, version conflicts and repeated confirmations, and enforces role and CSRF checks. Reassignment immediately revokes the previous crew’s access to the task and inspection and its permission to complete the task. The target crew gains access after a fresh GA plan is saved. Completion also checks the task version within the same transaction. The database schema is version 6.</w:t>
+        <w:t>.</w:t>
       </w:r>
     </w:p>
     <w:p>
@@ -4558,15 +4619,37 @@
         <w:rPr>
           <w:color w:val="000000"/>
         </w:rPr>
-        <w:t xml:space="preserve">The application supports uploads, inspection details, reviews, tasks, crew availability, route planning, algorithm comparison and a mobile crew workspace. Backend authorization enforces the role restrictions in Table 4 independently of the navigation shown to users. Authentication uses hashed passwords and sessions, with CSRF checks for modifying requests.</w:t>
+        <w:t>The application supports uploads, inspection details, reviews, tasks, crew availability, route planning, algorithm comparison and a mobile crew workspace. Backend authorization enforces the role restrictions in Table 4 independently of the navigation shown to users. Authentication uses hashed passwords and sessions, with CSRF checks for modifying requests.</w:t>
       </w:r>
     </w:p>
     <w:p>
+      <w:pPr>
+        <w:rPr>
+          <w:rFonts w:hint="eastAsia"/>
+          <w:color w:val="000000"/>
+        </w:rPr>
+      </w:pPr>
+      <w:r>
+        <w:rPr>
+          <w:rFonts w:hint="eastAsia"/>
+          <w:color w:val="000000"/>
+        </w:rPr>
+        <w:t>The Route assistant presents its answer in English first, with supporting sources available in a “View sources” section that is collapsed by default. It also displays the saved routes for all four crews and lets dispatchers preview task moves or cancellations before confirming them.</w:t>
+      </w:r>
+    </w:p>
+    <w:p>
+      <w:r>
+        <w:rPr>
+          <w:rFonts w:hint="eastAsia"/>
+          <w:color w:val="000000"/>
+        </w:rPr>
+        <w:t>When asked which model it uses, the assistant reads the model name directly from the backend settings without contacting the AI service or exposing sensitive information. For questions clearly outside the project’s scope, it explains what it can help with. Answers about repair rules and saved routes must be supported by relevant evidence and pass the system’s citation checks. If the question is unclear or the available evidence is insufficient, the assistant states this explicitly</w:t>
+      </w:r>
       <w:r>
         <w:rPr>
           <w:color w:val="000000"/>
         </w:rPr>
-        <w:t>Route assistant displays English answers before the View sources section, which is collapsed by default. It also presents four crew cards for saved routes, with previews for moving or cancelling tasks. Query-v3 returns model identity from non-secret backend configuration without calling the provider, gives explicit guidance for clearly unrelated questions, and applies strict evidence validation to repair and saved-route questions. It explicitly reports ambiguous or insufficient evidence.</w:t>
+        <w:t>.</w:t>
       </w:r>
     </w:p>
     <w:p>
@@ -4898,7 +4981,7 @@
                 <w:color w:val="000000"/>
                 <w:sz w:val="21"/>
               </w:rPr>
-              <w:t xml:space="preserve">Review inspections; manage tasks and crews; plan and compare routes; ask evidence questions; confirm adjustments</w:t>
+              <w:t>Review inspections; manage tasks and crews; plan and compare routes; ask evidence questions; confirm adjustments</w:t>
             </w:r>
           </w:p>
         </w:tc>
@@ -5051,21 +5134,26 @@
     </w:tbl>
     <w:p>
       <w:pPr>
-        <w:spacing w:before="120"/>
-      </w:pPr>
-      <w:r>
-        <w:t xml:space="preserve">Travel providers supply either simulated estimates based on geographic distance or optional Google estimates based on the road network. Estimates are validated and cached. A provider failure returns an error rather than silently changing the source. The interface displays routes as schematic segments rather than turn-by-turn road geometry, and shows stale plans, source information and reasons for unassigned tasks. Percentage comparisons require matching contexts and compatible sets of assigned tasks.</w:t>
-      </w:r>
-    </w:p>
-    <w:p>
-      <w:r>
         <w:rPr>
           <w:rFonts w:hint="eastAsia"/>
         </w:rPr>
-        <w:t>During integration testing, we discovered that loading the vision library unexpectedly replaced the image decoder used for uploads. As a result, malformed images triggered a server error instead of being rejected normally.</w:t>
-      </w:r>
-      <w:r>
-        <w:t xml:space="preserve"> Retaining the validated decoder reference and adding a regression case resolved the failure. This demonstrates the need to exercise the actual model together with the upload workflow.</w:t>
+      </w:pPr>
+      <w:r>
+        <w:rPr>
+          <w:rFonts w:hint="eastAsia"/>
+        </w:rPr>
+        <w:t>The saved routes discussed by the assistant depend on the travel estimates used during planning. These estimates come either from geographic distances or, when enabled, Google road-network data. The system checks and caches them for reuse. If the selected source fails, it reports an error rather than silently switching to another source. To help dispatchers interpret the results, the interface identifies the source, flags plans that need updating and explains why some tasks remain unassigned. Routes are shown as schematic connections between stops rather than detailed driving directions. Percentage comparisons between algorithms are shown only when the planning conditions and assigned workloads are comparable.</w:t>
+      </w:r>
+    </w:p>
+    <w:p>
+      <w:r>
+        <w:rPr>
+          <w:rFonts w:hint="eastAsia"/>
+        </w:rPr>
+        <w:t>We tested these features as part of the complete workflow, from image upload and damage detection to task creation, route planning and assistant queries. This integration testing also revealed an unexpected interaction between the vision library and the upload process. Loading the library replaced the image decoder used for uploads, causing malformed images to produce a server error instead of a normal rejection. We retained the original validated decoder and added a regression test to prevent the problem from recurring. This experience showed why testing individual components was not sufficient: we also needed to verify how they behaved when used together</w:t>
+      </w:r>
+      <w:r>
+        <w:t>.</w:t>
       </w:r>
     </w:p>
     <w:p>
@@ -5127,7 +5215,7 @@
         <w:t xml:space="preserve">Figure 2. </w:t>
       </w:r>
       <w:r>
-        <w:t>Dispatcher review interface showing a synthetic confidence case. Capture dated 19 October 2026; the current group is 37.</w:t>
+        <w:t>Dispatcher review interface showing a synthetic confidence case. Capture dated 19 October 2026.</w:t>
       </w:r>
     </w:p>
     <w:p>
@@ -5135,12 +5223,12 @@
         <w:pStyle w:val="165"/>
       </w:pPr>
       <w:r>
-        <w:t>Note. Recorded on 19 October 2026. The 42% result is a controlled review case rather than a model-accuracy measurement.</w:t>
+        <w:t>Note. The 42% result is a controlled review case rather than a model-accuracy measurement.</w:t>
       </w:r>
     </w:p>
     <w:p>
       <w:r>
-        <w:t xml:space="preserve">On mobile, crew accounts can sign out, see their fixed crew identity, view the current route and confirm task completion. Changing the URL cannot grant access to another crew’s work. Recorded browser checks at widths of 360 and 390 pixels found no horizontal overflow across the page as a whole.</w:t>
+        <w:t>On mobile, crew accounts can sign out, see their fixed crew identity, view the current route and confirm task completion. Changing the URL cannot grant access to another crew’s work. Recorded browser checks at widths of 360 and 390 pixels found no horizontal overflow across the page as a whole.</w:t>
       </w:r>
     </w:p>
     <w:p>
@@ -5232,7 +5320,7 @@
         <w:rPr>
           <w:color w:val="000000"/>
         </w:rPr>
-        <w:t xml:space="preserve">The methods serve different roles in the same workflow. YOLO supplies a predicted damage type and location, with uncertainty represented by its confidence score. Explicit rules translate accepted observations into repair tasks, and constrained search assigns those tasks to crews. The assistant retrieves reviewed knowledge and saved-plan facts to explain decisions, with optional language generation and checks against the cited evidence. Proposed adjustments still require validation and confirmation. Sections 3.1 and 3.2 describe how these steps interact, while Appendix C maps them to MR, RS and CGS and identifies the supporting evaluation and its limits.</w:t>
+        <w:t>The methods serve different roles in the same workflow. YOLO supplies a predicted damage type and location, with uncertainty represented by its confidence score. Explicit rules translate accepted observations into repair tasks, and constrained search assigns those tasks to crews. The assistant retrieves reviewed knowledge and saved-plan facts to explain decisions, with optional language generation and checks against the cited evidence. Sections 3.1 and 3.2 describe how these steps interact, while Appendix C maps them to MR, RS and CGS and identifies the supporting evaluation and its limits.</w:t>
       </w:r>
     </w:p>
     <w:p>
@@ -5505,7 +5593,45 @@
                 <w:color w:val="000000"/>
                 <w:sz w:val="21"/>
               </w:rPr>
-              <w:t xml:space="preserve">Data preparation and model experiments; business rules and shared backend; model release; integration, authentication and later interface refinement.</w:t>
+              <w:t>Data preparation and</w:t>
+            </w:r>
+            <w:r>
+              <w:rPr>
+                <w:rFonts w:hint="eastAsia"/>
+                <w:b w:val="0"/>
+                <w:color w:val="000000"/>
+                <w:sz w:val="21"/>
+                <w:lang w:val="en-US" w:eastAsia="zh-CN"/>
+              </w:rPr>
+              <w:t xml:space="preserve"> YOLO</w:t>
+            </w:r>
+            <w:r>
+              <w:rPr>
+                <w:rFonts w:ascii="Times New Roman" w:hAnsi="Times New Roman"/>
+                <w:b w:val="0"/>
+                <w:color w:val="000000"/>
+                <w:sz w:val="21"/>
+              </w:rPr>
+              <w:t xml:space="preserve"> model experiments</w:t>
+            </w:r>
+            <w:r>
+              <w:rPr>
+                <w:rFonts w:hint="eastAsia"/>
+                <w:b w:val="0"/>
+                <w:color w:val="000000"/>
+                <w:sz w:val="21"/>
+                <w:lang w:val="en-US" w:eastAsia="zh-CN"/>
+              </w:rPr>
+              <w:t xml:space="preserve"> and training</w:t>
+            </w:r>
+            <w:r>
+              <w:rPr>
+                <w:rFonts w:ascii="Times New Roman" w:hAnsi="Times New Roman"/>
+                <w:b w:val="0"/>
+                <w:color w:val="000000"/>
+                <w:sz w:val="21"/>
+              </w:rPr>
+              <w:t>; business rules and shared backend; model release; integration, authentication and later interface refinement.</w:t>
             </w:r>
           </w:p>
         </w:tc>
@@ -5625,7 +5751,7 @@
                 <w:color w:val="000000"/>
                 <w:sz w:val="21"/>
               </w:rPr>
-              <w:t xml:space="preserve">Greedy and GA planning for four crews; persistence of crew and plan records; Google matrix provider; routing experiments and ablation.</w:t>
+              <w:t>Greedy and GA planning for four crews; persistence of crew and plan records; Google matrix provider; routing experiments and ablation.</w:t>
             </w:r>
           </w:p>
         </w:tc>
@@ -5745,20 +5871,12 @@
                 <w:color w:val="000000"/>
                 <w:sz w:val="21"/>
               </w:rPr>
-              <w:t xml:space="preserve">Frontend foundation and workflow pages; map and comparison integration; assistant for retrieval and confirmed changes. Shared integration added vector-based grounding and persistent task adjustments.</w:t>
+              <w:t>Frontend foundation and workflow pages; map and comparison integration; assistant for retrieval and confirmed changes. Shared integration added vector-based grounding and persistent task adjustments.</w:t>
             </w:r>
           </w:p>
         </w:tc>
       </w:tr>
     </w:tbl>
-    <w:p>
-      <w:pPr>
-        <w:spacing w:before="120"/>
-      </w:pPr>
-      <w:r>
-        <w:t xml:space="preserve">The coordinator confirmed these responsibilities, and repository history corroborated them. Because commits were squashed, raw commit counts are unsuitable as measures of individual contribution.</w:t>
-      </w:r>
-    </w:p>
     <w:p>
       <w:pPr>
         <w:pStyle w:val="3"/>
@@ -5775,12 +5893,12 @@
     </w:p>
     <w:p>
       <w:r>
-        <w:t xml:space="preserve">We evaluated recognition quality, scheduling quality and workflow correctness separately. The paired YOLO11n/YOLO11s experiments used COCO-pretrained initialisation, 30 epochs, 640-pixel inputs, a batch size of 32, AdamW and seed 42. Subsequent YOLO11s fine-tuning used 40 additional epochs, 832-pixel inputs and a batch size of 16. Because multiple settings changed together, the resulting gains cannot be attributed to a single parameter.</w:t>
+        <w:t>We evaluated recognition quality, scheduling quality and workflow correctness separately. The paired YOLO11n/YOLO11s experiments used COCO-pretrained initialisation, 30 epochs, 640-pixel inputs, a batch size of 32, AdamW and seed 42. Subsequent YOLO11s fine-tuning used 40 additional epochs, 832-pixel inputs and a batch size of 16. Because multiple settings changed together, the resulting gains cannot be attributed to a single parameter.</w:t>
       </w:r>
     </w:p>
     <w:p>
       <w:r>
-        <w:t xml:space="preserve">We measure precision as TP/(TP+FP), recall as TP/(TP+FN), and F1 as their harmonic mean. TP, FP and FN denote true positives, false positives and false negatives. For box evaluation, a correct detection must have the right one of eight class labels and match an annotation at intersection over union (IoU) of at least 0.5. Each prediction and annotation can be matched only once. We pool the counts across images to calculate precision and recall; these results differ from the class-averaged values and mean average precision (mAP) reported by the native validator.</w:t>
+        <w:t>We measure precision as TP/(TP+FP), recall as TP/(TP+FN), and F1 as their harmonic mean. TP, FP and FN denote true positives, false positives and false negatives. For box evaluation, a correct detection must have the right one of eight class labels and match an annotation at intersection over union (IoU) of at least 0.5. Each prediction and annotation can be matched only once. We pool the counts across images to calculate precision and recall; these results differ from the class-averaged values and mean average precision (mAP) reported by the native validator.</w:t>
       </w:r>
     </w:p>
     <w:p>
@@ -5793,36 +5911,34 @@
     </w:p>
     <w:p>
       <w:r>
-        <w:t xml:space="preserve">We split the 1,230 images with zero or one annotation deterministically by source group into 853 calibration cases and 377 confirmation cases, and considered the 691 multi-object images separately. We compared eighty policies using only the calibration subset. Both subsets came from previously used validation data, so the confirmation subset is not an independent test. Macro F1 averages all eight classes, assigning zero to undefined class ratios, including the unsupported wide-transverse class in the confirmation subset.</w:t>
+        <w:t>We split the 1,230 images with zero or one annotation deterministically by source group into 853 calibration cases and 377 confirmation cases, and considered the 691 multi-object images separately. We compared eighty policies using only the calibration subset. Both subsets came from previously used validation data, so the confirmation subset is not an independent test. Macro F1 averages all eight classes, assigning zero to undefined class ratios, including the unsupported wide-transverse class in the confirmation subset.</w:t>
       </w:r>
     </w:p>
     <w:p>
       <w:pPr>
-        <w:pageBreakBefore w:val="1"/>
-      </w:pPr>
-      <w:r>
         <w:rPr>
           <w:rFonts w:hint="eastAsia"/>
         </w:rPr>
-        <w:t xml:space="preserve">For routing, we combined three task counts (10, 15 and 20), two travel-time sources (simulated and Google), and two shift constraints (480 minutes and unlimited), producing 12 scenarios with four crews.</w:t>
-      </w:r>
+      </w:pPr>
       <w:r>
         <w:rPr>
           <w:rFonts w:hint="eastAsia"/>
-          <w:lang w:val="en-US" w:eastAsia="zh-CN"/>
         </w:rPr>
-        <w:t xml:space="preserve"> </w:t>
-      </w:r>
-      <w:r>
-        <w:t xml:space="preserve">Each scenario includes one Greedy run, ten pure-GA runs and ten Greedy-seeded GA runs using seeds 1–10, plus 20 runs with a larger search budget using seeds 101–120. The experiments therefore contain 492 runs in total.</w:t>
+        <w:t>We evaluated the routing algorithms in 12 scenarios, each with four crews. The scenarios combined three workloads of 10, 15 or 20 tasks, two sources of travel-time estimates (simulated or Google), and two working-time settings (a 480-minute shift limit or no limit). For each scenario, we ran Greedy once and tested both GA approaches ten times using random seeds 1–10. One GA approach started without a Greedy solution, while the other included it as an initial candidate. We also performed 20 additional runs with more extensive searches, using seeds 101–120, to establish a reference for comparison. This produced 41 runs per scenario and 492 runs overall.</w:t>
       </w:r>
     </w:p>
     <w:p>
+      <w:r>
+        <w:rPr>
+          <w:rFonts w:hint="eastAsia"/>
+        </w:rPr>
+        <w:t>In the standard experiments, the GA maintained 60 candidate solutions and searched for up to 300 generations, stopping early if the best solution did not improve for 80 consecutive generations. The crossover and mutation probabilities were 0.9 and 0.3. Parents were selected through tournaments of three candidates, and the two best solutions were carried forward to the next generation. The reference runs increased the population to 150 candidates and allowed up to 1,000 generations, with early stopping after 300 generations without improvement. These runs alternated between starting with and without a Greedy solution. Within each scenario, all runs used the same task data, travel estimates, constraints and evaluation method to ensure a fair comparison</w:t>
+      </w:r>
       <w:r>
         <w:rPr>
           <w:color w:val="000000"/>
         </w:rPr>
-        <w:t>The default GA uses a population of 60 and runs for at most 300 generations, stopping after 80 generations without improvement. Its crossover and mutation probabilities are 0.9 and 0.3, respectively, with tournament size 3 and two elite solutions retained. The larger-budget reference runs use a population of 150, at most 1,000 generations and a stopping patience of 300 generations. They alternate between pure and Greedy-seeded initialisation. All runs within each scenario use identical inputs and the same evaluator.</w:t>
+        <w:t>.</w:t>
       </w:r>
     </w:p>
     <w:p>
@@ -5855,7 +5971,7 @@
     </w:p>
     <w:p>
       <w:r>
-        <w:t xml:space="preserve">In the paired 30-epoch comparison, we selected YOLO11s because it achieved higher validation mAP50–95. At confidence 0.25, however, it produced 107 more correct matches and 220 more false positives than YOLO11n. We measured warm CPU latency under matched conditions on 40 images, repeating the measurement three times. Median/P95 latency was 53.27/63.59 ms for n30 and 81.87/91.85 ms for s30. These timings include image preparation and inference but exclude cold loading, HTTP, database operations and task processing.</w:t>
+        <w:t>In the paired 30-epoch comparison, we selected YOLO11s because it achieved higher validation mAP50–95. At confidence 0.25, however, it produced 107 more correct matches and 220 more false positives than YOLO11n. We measured warm CPU latency under matched conditions on 40 images, repeating the measurement three times. Median/P95 latency was 53.27/63.59 ms for n30 and 81.87/91.85 ms for s30. These timings include image preparation and inference but exclude cold loading, HTTP, database operations and task processing.</w:t>
       </w:r>
     </w:p>
     <w:p>
@@ -6794,12 +6910,12 @@
         <w:pStyle w:val="165"/>
       </w:pPr>
       <w:r>
-        <w:t xml:space="preserve">Note. The model labels n10, n30 and s30 denote YOLO11n trained for 10 epochs, YOLO11n for 30 epochs and YOLO11s for 30 epochs. The n30 and s30 runs form the matched architecture comparison; n10 provides context. Native validation reports mAP50 and mAP50–95 as percentages. Precision and recall use eight-class, one-to-one matching at IoU ≥0.5 on 2,623 annotated boxes.</w:t>
+        <w:t>Note. The model labels n10, n30 and s30 denote YOLO11n trained for 10 epochs, YOLO11n for 30 epochs and YOLO11s for 30 epochs. The n30 and s30 runs form the matched architecture comparison; n10 provides context. Native validation reports mAP50 and mAP50–95 as percentages. Precision and recall use eight-class, one-to-one matching at IoU ≥0.5 on 2,623 annotated boxes.</w:t>
       </w:r>
     </w:p>
     <w:p>
       <w:r>
-        <w:t xml:space="preserve">Balanced fine-tuning produced modest gains. Combining predictions from each original image and its horizontal flip subsequently achieved box precision of 53.02% and recall of 53.26%. However, median CPU latency rose from 85.19 to 142.64 ms, and the 95th percentile rose from 99.00 to 160.94 ms. We did not deploy this combined method. The released single-v1 model uses the balanced weights and processes only the original image at 832 pixels. It selects the primary detection using the confidence-and-area score defined in Section 3.2.</w:t>
+        <w:t>Balanced fine-tuning produced modest gains. Combining predictions from each original image and its horizontal flip subsequently achieved box precision of 53.02% and recall of 53.26%. However, median CPU latency rose from 85.19 to 142.64 ms, and the 95th percentile rose from 99.00 to 160.94 ms. We did not deploy this combined method. The released single-v1 model uses the balanced weights and processes only the original image at 832 pixels. It selects the primary detection using the confidence-and-area score defined in Section 3.2.</w:t>
       </w:r>
     </w:p>
     <w:p>
@@ -6866,9 +6982,9 @@
           </w:tcPr>
           <w:p>
             <w:pPr>
+              <w:keepNext/>
               <w:spacing w:after="40" w:line="264" w:lineRule="auto"/>
               <w:jc w:val="left"/>
-              <w:keepNext w:val="1"/>
             </w:pPr>
             <w:r>
               <w:rPr>
@@ -6901,9 +7017,9 @@
           </w:tcPr>
           <w:p>
             <w:pPr>
+              <w:keepNext/>
               <w:spacing w:after="40" w:line="264" w:lineRule="auto"/>
               <w:jc w:val="left"/>
-              <w:keepNext w:val="1"/>
             </w:pPr>
             <w:r>
               <w:rPr>
@@ -6936,9 +7052,9 @@
           </w:tcPr>
           <w:p>
             <w:pPr>
+              <w:keepNext/>
               <w:spacing w:after="40" w:line="264" w:lineRule="auto"/>
               <w:jc w:val="left"/>
-              <w:keepNext w:val="1"/>
             </w:pPr>
             <w:r>
               <w:rPr>
@@ -6971,9 +7087,9 @@
           </w:tcPr>
           <w:p>
             <w:pPr>
+              <w:keepNext/>
               <w:spacing w:after="40" w:line="264" w:lineRule="auto"/>
               <w:jc w:val="left"/>
-              <w:keepNext w:val="1"/>
             </w:pPr>
             <w:r>
               <w:rPr>
@@ -7006,9 +7122,9 @@
           </w:tcPr>
           <w:p>
             <w:pPr>
+              <w:keepNext/>
               <w:spacing w:after="40" w:line="264" w:lineRule="auto"/>
               <w:jc w:val="left"/>
-              <w:keepNext w:val="1"/>
             </w:pPr>
             <w:r>
               <w:rPr>
@@ -7041,9 +7157,9 @@
           </w:tcPr>
           <w:p>
             <w:pPr>
+              <w:keepNext/>
               <w:spacing w:after="40" w:line="264" w:lineRule="auto"/>
               <w:jc w:val="left"/>
-              <w:keepNext w:val="1"/>
             </w:pPr>
             <w:r>
               <w:rPr>
@@ -7076,9 +7192,9 @@
           </w:tcPr>
           <w:p>
             <w:pPr>
+              <w:keepNext/>
               <w:spacing w:after="40" w:line="264" w:lineRule="auto"/>
               <w:jc w:val="left"/>
-              <w:keepNext w:val="1"/>
             </w:pPr>
             <w:r>
               <w:rPr>
@@ -7123,9 +7239,9 @@
           </w:tcPr>
           <w:p>
             <w:pPr>
+              <w:keepNext/>
               <w:spacing w:after="40" w:line="264" w:lineRule="auto"/>
               <w:jc w:val="left"/>
-              <w:keepNext w:val="1"/>
             </w:pPr>
             <w:r>
               <w:rPr>
@@ -7157,9 +7273,9 @@
           </w:tcPr>
           <w:p>
             <w:pPr>
+              <w:keepNext/>
               <w:spacing w:after="40" w:line="264" w:lineRule="auto"/>
               <w:jc w:val="center"/>
-              <w:keepNext w:val="1"/>
             </w:pPr>
             <w:r>
               <w:rPr>
@@ -7191,9 +7307,9 @@
           </w:tcPr>
           <w:p>
             <w:pPr>
+              <w:keepNext/>
               <w:spacing w:after="40" w:line="264" w:lineRule="auto"/>
               <w:jc w:val="center"/>
-              <w:keepNext w:val="1"/>
             </w:pPr>
             <w:r>
               <w:rPr>
@@ -7225,9 +7341,9 @@
           </w:tcPr>
           <w:p>
             <w:pPr>
+              <w:keepNext/>
               <w:spacing w:after="40" w:line="264" w:lineRule="auto"/>
               <w:jc w:val="center"/>
-              <w:keepNext w:val="1"/>
             </w:pPr>
             <w:r>
               <w:rPr>
@@ -7259,9 +7375,9 @@
           </w:tcPr>
           <w:p>
             <w:pPr>
+              <w:keepNext/>
               <w:spacing w:after="40" w:line="264" w:lineRule="auto"/>
               <w:jc w:val="center"/>
-              <w:keepNext w:val="1"/>
             </w:pPr>
             <w:r>
               <w:rPr>
@@ -7293,9 +7409,9 @@
           </w:tcPr>
           <w:p>
             <w:pPr>
+              <w:keepNext/>
               <w:spacing w:after="40" w:line="264" w:lineRule="auto"/>
               <w:jc w:val="center"/>
-              <w:keepNext w:val="1"/>
             </w:pPr>
             <w:r>
               <w:rPr>
@@ -7327,9 +7443,9 @@
           </w:tcPr>
           <w:p>
             <w:pPr>
+              <w:keepNext/>
               <w:spacing w:after="40" w:line="264" w:lineRule="auto"/>
               <w:jc w:val="center"/>
-              <w:keepNext w:val="1"/>
             </w:pPr>
             <w:r>
               <w:rPr>
@@ -7374,7 +7490,7 @@
           </w:tcPr>
           <w:p>
             <w:pPr>
-              <w:keepNext w:val="1"/>
+              <w:keepNext/>
               <w:spacing w:after="40" w:line="264" w:lineRule="auto"/>
               <w:jc w:val="left"/>
             </w:pPr>
@@ -7385,7 +7501,7 @@
                 <w:color w:val="000000"/>
                 <w:sz w:val="21"/>
               </w:rPr>
-              <w:t xml:space="preserve">Confidence-and-area selection, threshold 0.20</w:t>
+              <w:t>Confidence-and-area selection, threshold 0.20</w:t>
             </w:r>
           </w:p>
         </w:tc>
@@ -7408,7 +7524,7 @@
           </w:tcPr>
           <w:p>
             <w:pPr>
-              <w:keepNext w:val="1"/>
+              <w:keepNext/>
               <w:spacing w:after="40" w:line="264" w:lineRule="auto"/>
               <w:jc w:val="center"/>
             </w:pPr>
@@ -7442,7 +7558,7 @@
           </w:tcPr>
           <w:p>
             <w:pPr>
-              <w:keepNext w:val="1"/>
+              <w:keepNext/>
               <w:spacing w:after="40" w:line="264" w:lineRule="auto"/>
               <w:jc w:val="center"/>
             </w:pPr>
@@ -7476,7 +7592,7 @@
           </w:tcPr>
           <w:p>
             <w:pPr>
-              <w:keepNext w:val="1"/>
+              <w:keepNext/>
               <w:spacing w:after="40" w:line="264" w:lineRule="auto"/>
               <w:jc w:val="center"/>
             </w:pPr>
@@ -7510,7 +7626,7 @@
           </w:tcPr>
           <w:p>
             <w:pPr>
-              <w:keepNext w:val="1"/>
+              <w:keepNext/>
               <w:spacing w:after="40" w:line="264" w:lineRule="auto"/>
               <w:jc w:val="center"/>
             </w:pPr>
@@ -7544,7 +7660,7 @@
           </w:tcPr>
           <w:p>
             <w:pPr>
-              <w:keepNext w:val="1"/>
+              <w:keepNext/>
               <w:spacing w:after="40" w:line="264" w:lineRule="auto"/>
               <w:jc w:val="center"/>
             </w:pPr>
@@ -7600,12 +7716,12 @@
         <w:pStyle w:val="165"/>
       </w:pPr>
       <w:r>
-        <w:t xml:space="preserve">Note. These results use offline GPU exports verified by file hashes and include 171 positive images and 206 images with empty annotations. Localisation is not required for this metric. Macro F1 averages all eight classes, assigning zero to the class with no positive examples. The results reuse validation data; they do not represent a new CPU-service evaluation or a Jurong field test.</w:t>
+        <w:t>Note. These results use offline GPU exports verified by file hashes and include 171 positive images and 206 images with empty annotations. Localisation is not required for this metric. Macro F1 averages all eight classes, assigning zero to the class with no positive examples.</w:t>
       </w:r>
     </w:p>
     <w:p>
       <w:r>
-        <w:t xml:space="preserve">On the 377-image confirmation subset, the selected policy achieved image-type precision of 61.63% and recall of 61.99%, compared with 61.25% and 57.31% for confidence-only selection. It correctly classified eight more images but also produced four more false positives. When a correct detection also required localisation at IoU 0.5, precision and recall fell to 50.58% and 50.88%.</w:t>
+        <w:t>On the 377-image confirmation subset, the selected policy achieved image-type precision of 61.63% and recall of 61.99%, compared with 61.25% and 57.31% for confidence-only selection. It correctly classified eight more images but also produced four more false positives. When a correct detection also required localisation at IoU 0.5, precision and recall fell to 50.58% and 50.88%.</w:t>
       </w:r>
     </w:p>
     <w:p>
@@ -7618,7 +7734,7 @@
     </w:p>
     <w:p>
       <w:r>
-        <w:t xml:space="preserve">Both incorrect classification and missed or spurious detections contributed to the precision and recall of approximately 60%. Among 171 annotated positive images, the selected policy assigned the correct type to 106, assigned the wrong type to 31 and returned no detection for 34. It also returned predictions for 35 of the 206 images with empty annotations. These outcomes give 106 true positives, 66 false positives and 65 false negatives under the image-type metric. If evaluation considers only the presence of damage, precision rises to 79.65% and recall to 80.12% on the same images. This easier diagnostic does not establish recognition across the eight damage classes. Displaced boxes cannot explain the image-type shortfall because this metric does not require overlap.</w:t>
+        <w:t>Both incorrect classification and missed or spurious detections contributed to the precision and recall of approximately 60%. Among 171 annotated positive images, the selected policy assigned the correct type to 106, assigned the wrong type to 31 and returned no detection for 34. It also returned predictions for 35 of the 206 images with empty annotations. These outcomes give 106 true positives, 66 false positives and 65 false negatives under the image-type metric. If evaluation considers only the presence of damage, precision rises to 79.65% and recall to 80.12% on the same images. This easier diagnostic does not establish recognition across the eight damage classes. Displaced boxes cannot explain the image-type shortfall because this metric does not require overlap.</w:t>
       </w:r>
     </w:p>
     <w:p>
@@ -7682,9 +7798,9 @@
           </w:tcPr>
           <w:p>
             <w:pPr>
+              <w:keepNext/>
               <w:spacing w:after="40" w:line="264" w:lineRule="auto"/>
               <w:jc w:val="left"/>
-              <w:keepNext w:val="1"/>
             </w:pPr>
             <w:r>
               <w:rPr>
@@ -7717,9 +7833,9 @@
           </w:tcPr>
           <w:p>
             <w:pPr>
+              <w:keepNext/>
               <w:spacing w:after="40" w:line="264" w:lineRule="auto"/>
               <w:jc w:val="left"/>
-              <w:keepNext w:val="1"/>
             </w:pPr>
             <w:r>
               <w:rPr>
@@ -7752,9 +7868,9 @@
           </w:tcPr>
           <w:p>
             <w:pPr>
+              <w:keepNext/>
               <w:spacing w:after="40" w:line="264" w:lineRule="auto"/>
               <w:jc w:val="left"/>
-              <w:keepNext w:val="1"/>
             </w:pPr>
             <w:r>
               <w:rPr>
@@ -7787,9 +7903,9 @@
           </w:tcPr>
           <w:p>
             <w:pPr>
+              <w:keepNext/>
               <w:spacing w:after="40" w:line="264" w:lineRule="auto"/>
               <w:jc w:val="left"/>
-              <w:keepNext w:val="1"/>
             </w:pPr>
             <w:r>
               <w:rPr>
@@ -7834,9 +7950,9 @@
           </w:tcPr>
           <w:p>
             <w:pPr>
+              <w:keepNext/>
               <w:spacing w:after="40" w:line="264" w:lineRule="auto"/>
               <w:jc w:val="left"/>
-              <w:keepNext w:val="1"/>
             </w:pPr>
             <w:r>
               <w:rPr>
@@ -7868,9 +7984,9 @@
           </w:tcPr>
           <w:p>
             <w:pPr>
+              <w:keepNext/>
               <w:spacing w:after="40" w:line="264" w:lineRule="auto"/>
               <w:jc w:val="center"/>
-              <w:keepNext w:val="1"/>
             </w:pPr>
             <w:r>
               <w:rPr>
@@ -7902,9 +8018,9 @@
           </w:tcPr>
           <w:p>
             <w:pPr>
+              <w:keepNext/>
               <w:spacing w:after="40" w:line="264" w:lineRule="auto"/>
               <w:jc w:val="center"/>
-              <w:keepNext w:val="1"/>
             </w:pPr>
             <w:r>
               <w:rPr>
@@ -7936,9 +8052,9 @@
           </w:tcPr>
           <w:p>
             <w:pPr>
+              <w:keepNext/>
               <w:spacing w:after="40" w:line="264" w:lineRule="auto"/>
               <w:jc w:val="center"/>
-              <w:keepNext w:val="1"/>
             </w:pPr>
             <w:r>
               <w:rPr>
@@ -7983,9 +8099,9 @@
           </w:tcPr>
           <w:p>
             <w:pPr>
+              <w:keepNext/>
               <w:spacing w:after="40" w:line="264" w:lineRule="auto"/>
               <w:jc w:val="left"/>
-              <w:keepNext w:val="1"/>
             </w:pPr>
             <w:r>
               <w:rPr>
@@ -8017,9 +8133,9 @@
           </w:tcPr>
           <w:p>
             <w:pPr>
+              <w:keepNext/>
               <w:spacing w:after="40" w:line="264" w:lineRule="auto"/>
               <w:jc w:val="center"/>
-              <w:keepNext w:val="1"/>
             </w:pPr>
             <w:r>
               <w:rPr>
@@ -8051,9 +8167,9 @@
           </w:tcPr>
           <w:p>
             <w:pPr>
+              <w:keepNext/>
               <w:spacing w:after="40" w:line="264" w:lineRule="auto"/>
               <w:jc w:val="center"/>
-              <w:keepNext w:val="1"/>
             </w:pPr>
             <w:r>
               <w:rPr>
@@ -8085,9 +8201,9 @@
           </w:tcPr>
           <w:p>
             <w:pPr>
+              <w:keepNext/>
               <w:spacing w:after="40" w:line="264" w:lineRule="auto"/>
               <w:jc w:val="center"/>
-              <w:keepNext w:val="1"/>
             </w:pPr>
             <w:r>
               <w:rPr>
@@ -8132,9 +8248,9 @@
           </w:tcPr>
           <w:p>
             <w:pPr>
+              <w:keepNext/>
               <w:spacing w:after="40" w:line="264" w:lineRule="auto"/>
               <w:jc w:val="left"/>
-              <w:keepNext w:val="1"/>
             </w:pPr>
             <w:r>
               <w:rPr>
@@ -8166,9 +8282,9 @@
           </w:tcPr>
           <w:p>
             <w:pPr>
+              <w:keepNext/>
               <w:spacing w:after="40" w:line="264" w:lineRule="auto"/>
               <w:jc w:val="center"/>
-              <w:keepNext w:val="1"/>
             </w:pPr>
             <w:r>
               <w:rPr>
@@ -8200,9 +8316,9 @@
           </w:tcPr>
           <w:p>
             <w:pPr>
+              <w:keepNext/>
               <w:spacing w:after="40" w:line="264" w:lineRule="auto"/>
               <w:jc w:val="center"/>
-              <w:keepNext w:val="1"/>
             </w:pPr>
             <w:r>
               <w:rPr>
@@ -8234,9 +8350,9 @@
           </w:tcPr>
           <w:p>
             <w:pPr>
+              <w:keepNext/>
               <w:spacing w:after="40" w:line="264" w:lineRule="auto"/>
               <w:jc w:val="center"/>
-              <w:keepNext w:val="1"/>
             </w:pPr>
             <w:r>
               <w:rPr>
@@ -8281,9 +8397,9 @@
           </w:tcPr>
           <w:p>
             <w:pPr>
+              <w:keepNext/>
               <w:spacing w:after="40" w:line="264" w:lineRule="auto"/>
               <w:jc w:val="left"/>
-              <w:keepNext w:val="1"/>
             </w:pPr>
             <w:r>
               <w:rPr>
@@ -8315,9 +8431,9 @@
           </w:tcPr>
           <w:p>
             <w:pPr>
+              <w:keepNext/>
               <w:spacing w:after="40" w:line="264" w:lineRule="auto"/>
               <w:jc w:val="center"/>
-              <w:keepNext w:val="1"/>
             </w:pPr>
             <w:r>
               <w:rPr>
@@ -8349,9 +8465,9 @@
           </w:tcPr>
           <w:p>
             <w:pPr>
+              <w:keepNext/>
               <w:spacing w:after="40" w:line="264" w:lineRule="auto"/>
               <w:jc w:val="center"/>
-              <w:keepNext w:val="1"/>
             </w:pPr>
             <w:r>
               <w:rPr>
@@ -8383,9 +8499,9 @@
           </w:tcPr>
           <w:p>
             <w:pPr>
+              <w:keepNext/>
               <w:spacing w:after="40" w:line="264" w:lineRule="auto"/>
               <w:jc w:val="center"/>
-              <w:keepNext w:val="1"/>
             </w:pPr>
             <w:r>
               <w:rPr>
@@ -8430,9 +8546,9 @@
           </w:tcPr>
           <w:p>
             <w:pPr>
+              <w:keepNext/>
               <w:spacing w:after="40" w:line="264" w:lineRule="auto"/>
               <w:jc w:val="left"/>
-              <w:keepNext w:val="1"/>
             </w:pPr>
             <w:r>
               <w:rPr>
@@ -8464,9 +8580,9 @@
           </w:tcPr>
           <w:p>
             <w:pPr>
+              <w:keepNext/>
               <w:spacing w:after="40" w:line="264" w:lineRule="auto"/>
               <w:jc w:val="center"/>
-              <w:keepNext w:val="1"/>
             </w:pPr>
             <w:r>
               <w:rPr>
@@ -8498,9 +8614,9 @@
           </w:tcPr>
           <w:p>
             <w:pPr>
+              <w:keepNext/>
               <w:spacing w:after="40" w:line="264" w:lineRule="auto"/>
               <w:jc w:val="center"/>
-              <w:keepNext w:val="1"/>
             </w:pPr>
             <w:r>
               <w:rPr>
@@ -8532,9 +8648,9 @@
           </w:tcPr>
           <w:p>
             <w:pPr>
+              <w:keepNext/>
               <w:spacing w:after="40" w:line="264" w:lineRule="auto"/>
               <w:jc w:val="center"/>
-              <w:keepNext w:val="1"/>
             </w:pPr>
             <w:r>
               <w:rPr>
@@ -8579,9 +8695,9 @@
           </w:tcPr>
           <w:p>
             <w:pPr>
+              <w:keepNext/>
               <w:spacing w:after="40" w:line="264" w:lineRule="auto"/>
               <w:jc w:val="left"/>
-              <w:keepNext w:val="1"/>
             </w:pPr>
             <w:r>
               <w:rPr>
@@ -8613,9 +8729,9 @@
           </w:tcPr>
           <w:p>
             <w:pPr>
+              <w:keepNext/>
               <w:spacing w:after="40" w:line="264" w:lineRule="auto"/>
               <w:jc w:val="center"/>
-              <w:keepNext w:val="1"/>
             </w:pPr>
             <w:r>
               <w:rPr>
@@ -8647,9 +8763,9 @@
           </w:tcPr>
           <w:p>
             <w:pPr>
+              <w:keepNext/>
               <w:spacing w:after="40" w:line="264" w:lineRule="auto"/>
               <w:jc w:val="center"/>
-              <w:keepNext w:val="1"/>
             </w:pPr>
             <w:r>
               <w:rPr>
@@ -8681,9 +8797,9 @@
           </w:tcPr>
           <w:p>
             <w:pPr>
+              <w:keepNext/>
               <w:spacing w:after="40" w:line="264" w:lineRule="auto"/>
               <w:jc w:val="center"/>
-              <w:keepNext w:val="1"/>
             </w:pPr>
             <w:r>
               <w:rPr>
@@ -8728,9 +8844,9 @@
           </w:tcPr>
           <w:p>
             <w:pPr>
+              <w:keepNext/>
               <w:spacing w:after="40" w:line="264" w:lineRule="auto"/>
               <w:jc w:val="left"/>
-              <w:keepNext w:val="1"/>
             </w:pPr>
             <w:r>
               <w:rPr>
@@ -8762,9 +8878,9 @@
           </w:tcPr>
           <w:p>
             <w:pPr>
+              <w:keepNext/>
               <w:spacing w:after="40" w:line="264" w:lineRule="auto"/>
               <w:jc w:val="center"/>
-              <w:keepNext w:val="1"/>
             </w:pPr>
             <w:r>
               <w:rPr>
@@ -8796,9 +8912,9 @@
           </w:tcPr>
           <w:p>
             <w:pPr>
+              <w:keepNext/>
               <w:spacing w:after="40" w:line="264" w:lineRule="auto"/>
               <w:jc w:val="center"/>
-              <w:keepNext w:val="1"/>
             </w:pPr>
             <w:r>
               <w:rPr>
@@ -8830,9 +8946,9 @@
           </w:tcPr>
           <w:p>
             <w:pPr>
+              <w:keepNext/>
               <w:spacing w:after="40" w:line="264" w:lineRule="auto"/>
               <w:jc w:val="center"/>
-              <w:keepNext w:val="1"/>
             </w:pPr>
             <w:r>
               <w:rPr>
@@ -8877,7 +8993,7 @@
           </w:tcPr>
           <w:p>
             <w:pPr>
-              <w:keepNext w:val="1"/>
+              <w:keepNext/>
               <w:spacing w:after="40" w:line="264" w:lineRule="auto"/>
               <w:jc w:val="left"/>
             </w:pPr>
@@ -8911,7 +9027,7 @@
           </w:tcPr>
           <w:p>
             <w:pPr>
-              <w:keepNext w:val="1"/>
+              <w:keepNext/>
               <w:spacing w:after="40" w:line="264" w:lineRule="auto"/>
               <w:jc w:val="center"/>
             </w:pPr>
@@ -8945,7 +9061,7 @@
           </w:tcPr>
           <w:p>
             <w:pPr>
-              <w:keepNext w:val="1"/>
+              <w:keepNext/>
               <w:spacing w:after="40" w:line="264" w:lineRule="auto"/>
               <w:jc w:val="center"/>
             </w:pPr>
@@ -9001,12 +9117,12 @@
         <w:pStyle w:val="165"/>
       </w:pPr>
       <w:r>
-        <w:t xml:space="preserve">Note. These class results use all 1,230 eligible validation images, including calibration images. Support is the number of annotated positive images, rather than the number of boxes or independently captured scenes.</w:t>
+        <w:t>Note. These class results use all 1,230 eligible validation images, including calibration images. Support is the number of annotated positive images, rather than the number of boxes or independently captured scenes.</w:t>
       </w:r>
     </w:p>
     <w:p>
       <w:r>
-        <w:t xml:space="preserve">The class distribution and observed confusions identify areas for further investigation. The full eligible set contains 250 positive images of longitudinal cracks but only eight of deep potholes. The confirmation set contains no positive image of a wide transverse crack. In a separate box-level audit of the full validation set, 146 of 190 matched pairs with an incorrect class involved confusion between subtypes of the same damage family.</w:t>
+        <w:t>The class distribution and observed confusions identify areas for further investigation. The full eligible set contains 250 positive images of longitudinal cracks but only eight of deep potholes. The confirmation set contains no positive image of a wide transverse crack. In a separate box-level audit of the full validation set, 146 of 190 matched pairs with an incorrect class involved confusion between subtypes of the same damage family.</w:t>
       </w:r>
     </w:p>
     <w:p>
@@ -9014,17 +9130,17 @@
         <w:rPr>
           <w:color w:val="000000"/>
         </w:rPr>
-        <w:t>Recall was also lower for small annotated regions: 45.4% for regions covering less than 1% of image area, compared with 75.0% for those covering at least 20%. These findings support further analysis of subtypes and object scale. They do not establish that limited data or incorrect annotations caused all errors, and the audit confirmed no annotation defect.</w:t>
+        <w:t>Recall was also lower for small annotated regions: 45.4% for regions covering less than 1% of image area, compared with 75.0% for those covering at least 20%. These findings support further analysis of subtypes and object scale. The audit confirmed no annotation defect.</w:t>
       </w:r>
     </w:p>
     <w:p>
       <w:r>
-        <w:t xml:space="preserve">The model still labelled a known pothole photograph as an alligator crack, with confidence of approximately 0.253, so human correction was required. The comparisons show that increasing model capacity and relaxing filtering alone do not establish reliable recognition: selection rankings and thresholds trade false positives against missed detections. Phone photographs taken from a moderate distance introduce a further risk when transferring the model to local use, but this risk has not been measured and is not a demonstrated cause of the validation errors.</w:t>
+        <w:t>The model still labelled a known pothole photograph as an alligator crack, with confidence of approximately 0.253, so human correction was required. The comparisons show that increasing model capacity and relaxing filtering alone do not establish reliable recognition: selection rankings and thresholds trade false positives against missed detections.</w:t>
       </w:r>
     </w:p>
     <w:p>
       <w:r>
-        <w:t xml:space="preserve">The separate 0.60 confidence gate has not been shown to guarantee any particular precision among automatically accepted tasks. Section 6.2 therefore prioritises independent local data and evaluation of acceptance precision, review workload and errors that escape review, while retaining all eight labels.</w:t>
+        <w:t>Precision among tasks accepted at the 0.60 confidence gate remains to be measured. Section 6.2 therefore prioritises independent local data and evaluation of acceptance precision, review workload and errors that escape review, while retaining all eight labels.</w:t>
       </w:r>
     </w:p>
     <w:p>
@@ -9043,15 +9159,15 @@
     </w:p>
     <w:p>
       <w:pPr>
-        <w:keepLines w:val="1"/>
-      </w:pPr>
-      <w:r>
-        <w:t xml:space="preserve">The best-known solution (BKS) is the best result under the lexicographic ranking among 41 runs for each scenario; it is not a proven optimum. Objective gaps are compared only when the numbers of unassigned P1, P2 and P3 tasks match, while runs with inferior coverage are counted separately. Even matching priority counts can involve different tasks. A lower objective therefore does not necessarily represent travel savings for the same workload.</w:t>
+        <w:keepLines/>
+      </w:pPr>
+      <w:r>
+        <w:t>The best-known solution (BKS) is the best result under the lexicographic ranking among 41 runs for each scenario; it is not a proven optimum. Objective gaps are compared only when the numbers of unassigned P1, P2 and P3 tasks match, while runs with inferior coverage are counted separately. Even matching priority counts can involve different tasks. A lower objective therefore does not necessarily represent travel savings for the same workload.</w:t>
       </w:r>
     </w:p>
     <w:p>
       <w:r>
-        <w:t xml:space="preserve">The Greedy-seeded GA improved on Greedy in all 120 runs under the default search settings. Across scenarios, its mean objective reductions ranged from 0.73% to 3.62%, and its mean gaps from the BKS ranged from 0.23% to 1.82%, compared with 1.17–5.10% for Greedy. Its average runtime per scenario ranged from 104.6 to 361.9 ms, while Greedy took less than one millisecond. Including the Greedy solution and retaining elite solutions prevents the GA from returning a worse result than that baseline. The size of the improvements and the comparison with pure GA are therefore more informative than the absence of regression alone.</w:t>
+        <w:t>The Greedy-seeded GA improved on Greedy in all 120 runs under the default search settings. Across scenarios, its mean objective reductions ranged from 0.73% to 3.62%, and its mean gaps from the BKS ranged from 0.23% to 1.82%, compared with 1.17–5.10% for Greedy. Its average runtime per scenario ranged from 104.6 to 361.9 ms, while Greedy took less than one millisecond. Including the Greedy solution and retaining elite solutions prevents the GA from returning a worse result than that baseline. The size of the improvements and the comparison with pure GA are therefore more informative than the absence of regression alone.</w:t>
       </w:r>
     </w:p>
     <w:p>
@@ -9634,7 +9750,7 @@
         <w:pStyle w:val="165"/>
       </w:pPr>
       <w:r>
-        <w:t xml:space="preserve">Note. Each entry gives the Greedy value followed by the pure-GA mean over seeds 1–10. All tasks are assigned. Values are in minutes, except for the weighted objective J. A lower J does not require every component to improve, as the simulated travel results show.</w:t>
+        <w:t>Note. Each entry gives the Greedy value followed by the pure-GA mean over seeds 1–10. All tasks are assigned. Values are in minutes, except for the weighted objective J. A lower J does not require every component to improve, as the simulated travel results show.</w:t>
       </w:r>
     </w:p>
     <w:p>
@@ -11105,10 +11221,10 @@
     <w:p>
       <w:pPr>
         <w:pStyle w:val="165"/>
-        <w:keepLines w:val="1"/>
-      </w:pPr>
-      <w:r>
-        <w:t xml:space="preserve">Note. Gaps are percentages averaged over ten seeds. For pure GA in the Google/480/15 scenario, the gap uses the five runs with matching coverage; the other five runs remain recorded as coverage failures. The selected rows include capacity stress cases and cases where seeded GA had a larger gap. Full records are available in SystemCode/experiments/routing/results/.</w:t>
+        <w:keepLines/>
+      </w:pPr>
+      <w:r>
+        <w:t>Note. Gaps are percentages averaged over ten seeds. For pure GA in the Google/480/15 scenario, the gap uses the five runs with matching coverage; the other five runs remain recorded as coverage failures. The selected rows include capacity stress cases and cases where seeded GA had a larger gap. Full records are available in SystemCode/experiments/routing/results/.</w:t>
       </w:r>
     </w:p>
     <w:p>
@@ -11119,7 +11235,7 @@
         <w:rPr>
           <w:rFonts w:hint="eastAsia"/>
         </w:rPr>
-        <w:t xml:space="preserve">Some remaining capacity was concentrated in one crew, but no additional task could be inserted directly. Assigning more work would therefore require moving tasks between crews.</w:t>
+        <w:t>Some remaining capacity was concentrated in one crew, but no additional task could be inserted directly. Assigning more work would therefore require moving tasks between crews.</w:t>
       </w:r>
       <w:r>
         <w:t xml:space="preserve"> Greedy seeding restored 13 assignments in all ten runs. However, the seeded GA had larger mean gaps than pure GA in three 20-task scenarios. Seeding thus provides a dependable starting point without outperforming pure GA in every scenario.</w:t>
@@ -11127,12 +11243,12 @@
     </w:p>
     <w:p>
       <w:r>
-        <w:t xml:space="preserve">The 15-task workload requires 1,920 service minutes, using the combined capacity of four 480-minute shifts before travel is included. Under the shift limit, the simulated matrix leaves three tasks unassigned, while the Google matrix allows one additional P3 task to be assigned. With 20 tasks, both matrices leave eight tasks unassigned, but all P1 tasks are assigned. Compared with Greedy, seeded GA reduces simulated travel from 194.9 to 187.1 minutes and Google makespan from 477.1 to 473.0 minutes, although the assigned task identities may differ. Unlimited shifts allow all tasks to be assigned in the 15- and 20-task cases, but the resulting schedules exceed 480 minutes. The 10-task cases fit within the limit.</w:t>
+        <w:t>The 15-task workload requires 1,920 service minutes, using the combined capacity of four 480-minute shifts before travel is included. Under the shift limit, the simulated matrix leaves three tasks unassigned, while the Google matrix allows one additional P3 task to be assigned. With 20 tasks, both matrices leave eight tasks unassigned, but all P1 tasks are assigned. Compared with Greedy, seeded GA reduces simulated travel from 194.9 to 187.1 minutes and Google makespan from 477.1 to 473.0 minutes, although the assigned task identities may differ. Unlimited shifts allow all tasks to be assigned in the 15- and 20-task cases, but the resulting schedules exceed 480 minutes. The 10-task cases fit within the limit.</w:t>
       </w:r>
     </w:p>
     <w:p>
       <w:r>
-        <w:t xml:space="preserve">The Google experiments used historical travel estimates that did not account for traffic, while browser acceptance checks used simulation. API waiting time and algorithm runtime were recorded separately. The results show conditional gains for constructed task sets; they do not measure productivity in field operations.</w:t>
+        <w:t>The Google experiments used historical travel estimates that did not account for traffic, while browser acceptance checks used simulation. API waiting time and algorithm runtime were recorded separately.</w:t>
       </w:r>
     </w:p>
     <w:p>
@@ -11151,7 +11267,7 @@
     </w:p>
     <w:p>
       <w:r>
-        <w:t xml:space="preserve">The integration record dated 18 October contains 20 acceptance groups and 201 HTTP requests sent through the frontend proxy. These checks cover uploads using the real model, human correction, invalid-image handling, idempotency, task completion, disabled crews and stale plans. In the constructed 20-task case, both planners assigned 12 tasks and reported eight exclusions due to the shift limit, without omitting any P1 task.</w:t>
+        <w:t>The integration record contains 20 acceptance groups and 201 HTTP requests sent through the frontend proxy. These checks cover uploads using the real model, human correction, invalid-image handling, idempotency, task completion, disabled crews and stale plans. In the constructed 20-task case, both planners assigned 12 tasks and reported eight exclusions due to the shift limit, without omitting any P1 task.</w:t>
       </w:r>
     </w:p>
     <w:p>
@@ -11404,7 +11520,7 @@
                 <w:color w:val="000000"/>
                 <w:sz w:val="21"/>
               </w:rPr>
-              <w:t xml:space="preserve">Main workflow verified through the frontend proxy</w:t>
+              <w:t>Main workflow verified through the frontend proxy</w:t>
             </w:r>
           </w:p>
         </w:tc>
@@ -11516,7 +11632,7 @@
                 <w:color w:val="000000"/>
                 <w:sz w:val="21"/>
               </w:rPr>
-              <w:t xml:space="preserve">Evidence from regression tests and remote CI</w:t>
+              <w:t>Evidence from regression tests and remote CI</w:t>
             </w:r>
           </w:p>
         </w:tc>
@@ -11595,7 +11711,7 @@
                 <w:color w:val="000000"/>
                 <w:sz w:val="21"/>
               </w:rPr>
-              <w:t xml:space="preserve">Automatic task at 0.60; review at 0.5999; no active task when no detection is returned</w:t>
+              <w:t>Automatic task at 0.60; review at 0.5999; no active task when no detection is returned</w:t>
             </w:r>
           </w:p>
         </w:tc>
@@ -11740,7 +11856,7 @@
                 <w:color w:val="000000"/>
                 <w:sz w:val="21"/>
               </w:rPr>
-              <w:t xml:space="preserve">No duplicate task created; stale plans rejected</w:t>
+              <w:t>No duplicate task created; stale plans rejected</w:t>
             </w:r>
           </w:p>
         </w:tc>
@@ -11852,7 +11968,7 @@
                 <w:color w:val="000000"/>
                 <w:sz w:val="21"/>
               </w:rPr>
-              <w:t xml:space="preserve">Tasks retained; role and crew access restrictions enforced</w:t>
+              <w:t>Tasks retained; role and crew access restrictions enforced</w:t>
             </w:r>
           </w:p>
         </w:tc>
@@ -11931,7 +12047,7 @@
                 <w:color w:val="000000"/>
                 <w:sz w:val="21"/>
               </w:rPr>
-              <w:t xml:space="preserve">Four direct-answer cases with no provider calls; two actual grounded GPT calls; separate HTTP and browser records</w:t>
+              <w:t>Four direct-answer cases with no provider calls; two actual grounded GPT calls; separate HTTP and browser records</w:t>
             </w:r>
           </w:p>
         </w:tc>
@@ -11964,7 +12080,7 @@
                 <w:color w:val="000000"/>
                 <w:sz w:val="21"/>
               </w:rPr>
-              <w:t xml:space="preserve">Targeted checks of grounding and confirmed changes that persist; these scopes overlap and do not form a combined test total</w:t>
+              <w:t>Targeted checks of grounding and confirmed changes that persist</w:t>
             </w:r>
           </w:p>
         </w:tc>
@@ -12043,7 +12159,7 @@
                 <w:color w:val="000000"/>
                 <w:sz w:val="21"/>
               </w:rPr>
-              <w:t xml:space="preserve">GitHub CI recorded 1,255 backend tests passed and 1 skipped, 179 frontend tests passed, and successful lint, type and build checks. Separately, 49 local infrastructure guardrail tests passed.</w:t>
+              <w:t>GitHub CI recorded 1,255 backend tests passed and 1 skipped, 179 frontend tests passed, and successful lint, type and build checks. Separately, 49 local infrastructure guardrail tests passed.</w:t>
             </w:r>
           </w:p>
         </w:tc>
@@ -12076,7 +12192,7 @@
                 <w:color w:val="000000"/>
                 <w:sz w:val="21"/>
               </w:rPr>
-              <w:t xml:space="preserve">GitHub run 39569241424 checked head 155d3183. Base CI excludes optional vision dependencies and skips the YOLO test. These counts describe separate, dated checks and must not be added to earlier suite totals.</w:t>
+              <w:t>GitHub run 39569241424 checked head 155d3183. Base CI excludes optional vision dependencies and skips the YOLO test.</w:t>
             </w:r>
           </w:p>
         </w:tc>
@@ -12084,13 +12200,32 @@
     </w:tbl>
     <w:p>
       <w:pPr>
-        <w:spacing w:before="120"/>
-      </w:pPr>
+        <w:rPr>
+          <w:rFonts w:hint="eastAsia"/>
+          <w:color w:val="000000"/>
+        </w:rPr>
+      </w:pPr>
+      <w:r>
+        <w:rPr>
+          <w:rFonts w:hint="eastAsia"/>
+          <w:color w:val="000000"/>
+        </w:rPr>
+        <w:t>Table 11 summarises the checks performed at different stages of development. Some checks cover the same tests, so their counts are reported separately rather than added together. These checks assess whether the application behaves as intended, complementing the recognition and routing experiments in Sections 5.1 and 5.2. Table 12 summarises how this evaluation addresses the original project objectives.</w:t>
+      </w:r>
+    </w:p>
+    <w:p>
+      <w:r>
+        <w:rPr>
+          <w:rFonts w:hint="eastAsia"/>
+          <w:color w:val="000000"/>
+        </w:rPr>
+        <w:t>We tested how the assistant handled both simple questions and questions requiring supporting evidence. Four direct-answer cases were handled locally without contacting the AI service. Two further cases used GPT-4.1-mini to answer questions based on project information. For the deep-pothole question, the answer correctly stated the project’s P1 priority and 240-minute repair duration. For the saved-route question, it reported 98.8 minutes of travel and 165.0 minutes of service, matching the stored plan. These results apply to the knowledge base available during testing; the two GPT cases were not repeated after the subsequent knowledge-base maintenance and documentation update</w:t>
+      </w:r>
       <w:r>
         <w:rPr>
           <w:color w:val="000000"/>
         </w:rPr>
-        <w:t xml:space="preserve">The release records in Table 11 cover different dates and scopes, so they do not form an overall quality score. The historical 18 October counts remain separate from the later assistant and adjustment checks, and overlapping suites must not be summed. Table 12 compares the evaluation with the original objectives. Injected detections and synthetic routes verify specific workflow branches; they do not establish model accuracy, engineering validity or user productivity.</w:t>
+        <w:t>.</w:t>
       </w:r>
     </w:p>
     <w:p>
@@ -12098,15 +12233,7 @@
         <w:rPr>
           <w:color w:val="000000"/>
         </w:rPr>
-        <w:t xml:space="preserve">The 21 October record, intent-routing-20261021.json, contains four local direct-answer cases with zero provider calls and two actual grounded calls to gpt-4.1-mini. The deep-pothole answer retained the demonstration rule of P1 and 240 minutes. The saved-plan answer matched the recorded 98.8 minutes of travel and 165.0 minutes of service. These calls used the a-knowledge-v16 package available at the time. Subsequent hash normalisation and the a-knowledge-v17 documentation refresh did not rerun those calls. Local E5 retrieval tests, validation using a provider test double, and synthetic route tests remain separate categories of evidence.</w:t>
-      </w:r>
-    </w:p>
-    <w:p>
-      <w:r>
-        <w:rPr>
-          <w:color w:val="000000"/>
-        </w:rPr>
-        <w:t xml:space="preserve">The task-adjustment acceptance record adds isolated, authenticated HTTP and browser checks covering all four route cards, move and cancellation previews, explicit confirmation and recalculation, persistent assignment constraints, and changes in crew access. Constructed routes test rejection when work exceeds the shift limit while retaining other tasks. These limited records do not establish that all ten proposed question cases and ten proposed change cases were executed, or that every answer is correct.</w:t>
+        <w:t>The task-adjustment acceptance record adds isolated, authenticated HTTP and browser checks covering all four route cards, move and cancellation previews, explicit confirmation and recalculation, persistent assignment constraints, and changes in crew access. Constructed routes test rejection when work exceeds the shift limit while retaining other tasks.</w:t>
       </w:r>
     </w:p>
     <w:p>
@@ -12291,7 +12418,7 @@
                 <w:color w:val="000000"/>
                 <w:sz w:val="21"/>
               </w:rPr>
-              <w:t xml:space="preserve">Validation experiments and the historical n10 test are recorded; the final model has no independent local test.</w:t>
+              <w:t>Validation experiments and the historical n10 test are recorded; the final model has no independent local test.</w:t>
             </w:r>
           </w:p>
         </w:tc>
@@ -12370,7 +12497,7 @@
                 <w:color w:val="000000"/>
                 <w:sz w:val="21"/>
               </w:rPr>
-              <w:t xml:space="preserve">Boundary, no-detection and replay tests are recorded; accepted-case precision and review rates still require evaluation.</w:t>
+              <w:t>Boundary, no-detection and replay tests are recorded; accepted-case precision and review rates still require evaluation.</w:t>
             </w:r>
           </w:p>
         </w:tc>
@@ -12449,7 +12576,7 @@
                 <w:color w:val="000000"/>
                 <w:sz w:val="21"/>
               </w:rPr>
-              <w:t xml:space="preserve">All eight labels were tested through automatic and corrected-review workflows. Frozen policies were checked, but service assumptions remain unvalidated.</w:t>
+              <w:t>All eight labels were tested through automatic and corrected-review workflows. Frozen policies were checked, but service assumptions remain unvalidated.</w:t>
             </w:r>
           </w:p>
         </w:tc>
@@ -12528,7 +12655,7 @@
                 <w:color w:val="000000"/>
                 <w:sz w:val="21"/>
               </w:rPr>
-              <w:t xml:space="preserve">Experiments cover four crews and 10, 15 and 20 tasks. Accepted inspections now trigger an attempt to generate paired plans automatically; other changes require explicit replanning. Lateness against deadlines has not been evaluated.</w:t>
+              <w:t>Experiments cover four crews and 10, 15 and 20 tasks. Accepted inspections now trigger an attempt to generate paired plans automatically; other changes require explicit replanning. Lateness against deadlines has not been evaluated.</w:t>
             </w:r>
           </w:p>
         </w:tc>
@@ -12607,7 +12734,7 @@
                 <w:color w:val="000000"/>
                 <w:sz w:val="21"/>
               </w:rPr>
-              <w:t xml:space="preserve">Targeted evidence covers grounded repair and saved-plan answers, direct intent routing and confirmed adjustments through actual-provider calls, local retrieval tests, and controlled HTTP and browser checks. Completion of the full proposed ten-question and ten-change suite is not established. Broad evaluation of answer meaning and user experience remains outstanding.</w:t>
+              <w:t>Targeted evidence covers grounded repair and saved-plan answers, direct intent routing and confirmed adjustments through actual-provider calls, local retrieval tests, and controlled HTTP and browser checks. Completion of the full proposed ten-question and ten-change suite is not established. Broad evaluation of answer meaning and user experience remains outstanding.</w:t>
             </w:r>
           </w:p>
         </w:tc>
@@ -12686,7 +12813,7 @@
                 <w:color w:val="000000"/>
                 <w:sz w:val="21"/>
               </w:rPr>
-              <w:t xml:space="preserve">Dated desktop and HTTP acceptance records and separate mobile checks are available; user productivity has not been measured.</w:t>
+              <w:t>Dated desktop and HTTP acceptance records and separate mobile checks are available; user productivity has not been measured.</w:t>
             </w:r>
           </w:p>
         </w:tc>
@@ -12729,7 +12856,7 @@
         <w:rPr>
           <w:color w:val="000000"/>
         </w:rPr>
-        <w:t xml:space="preserve">RoadGuard connects image-based damage detection to repair decisions and crew schedules in one application. Inspectors submit photographs, dispatchers review uncertain results and adjust work, and crews view their routes and record completion. Stored evidence, citations and revision checks help explain how each decision was made. The experiments show modest recognition gains and better scheduling objectives with Greedy-seeded search. They also reveal unresolved classification errors, a pure-GA assignment failure and gaps in assistant evaluation. These findings support the prototype’s integrated workflow while defining the work still needed before operational use.</w:t>
+        <w:t>RoadGuard connects image-based damage detection to repair decisions and crew schedules in one application. Inspectors submit photographs, dispatchers review uncertain results and adjust work, and crews view their routes and record completion. Stored evidence, citations and revision checks help explain how each decision was made. The experiments show modest recognition gains and better scheduling objectives with Greedy-seeded search. They also reveal unresolved classification errors, a pure-GA assignment failure and gaps in assistant evaluation.</w:t>
       </w:r>
     </w:p>
     <w:p>
@@ -12740,18 +12867,18 @@
         <w:rPr>
           <w:color w:val="000000"/>
         </w:rPr>
-        <w:t xml:space="preserve">The reuse of validation data, a single training seed, sparse damage subtypes, one task family and one Google travel snapshot limit how widely the results can be generalised. Service durations, shift and return policies, and objective weights remain assumptions. The evaluation establishes neither optimality nor statistical significance, and operational savings have not been demonstrated. Independent local validation remains essential. Targeted assistant checks establish neither universal semantic correctness nor completion of the full proposed evaluation, and no broad user study has been conducted.</w:t>
+        <w:t>Generalisation is limited by reused validation data, a single training seed, sparse damage subtypes, one task family and one Google travel snapshot. Service durations, shift and return policies, and objective weights are project assumptions requiring operational validation. Routing results compare constructed scenarios against an empirical best-known solution, and statistical significance has not been established. Independent local vision testing, broader assistant and user evaluation, and measurements of operational savings remain future work.</w:t>
       </w:r>
     </w:p>
     <w:p>
       <w:pPr>
         <w:pStyle w:val="4"/>
-        <w:pageBreakBefore w:val="1"/>
+        <w:pageBreakBefore/>
         <w:spacing w:before="160" w:after="100"/>
         <w:jc w:val="left"/>
       </w:pPr>
-      <w:bookmarkStart w:id="38" w:name="_RGI_29"/>
-      <w:bookmarkStart w:id="39" w:name="RGCurrentHeading19"/>
+      <w:bookmarkStart w:id="38" w:name="RGCurrentHeading19"/>
+      <w:bookmarkStart w:id="39" w:name="_RGI_29"/>
       <w:r>
         <w:t>6.2 Future Work</w:t>
       </w:r>
@@ -12766,7 +12893,7 @@
         <w:rPr>
           <w:color w:val="000000"/>
         </w:rPr>
-        <w:t xml:space="preserve">Future vision work should review subtype labels, missed potholes and disputed negative examples, retaining corrections only after verification. The dataset should include more examples of rare classes and hard negatives such as patches, wet surfaces, shadows, gravel and manholes. Local collection should include phone photographs taken from a moderate distance, with road context, annotations for all objects and an identified primary subject.</w:t>
+        <w:t>Future vision work should review subtype labels, missed potholes and disputed negative examples, retaining corrections only after verification. The dataset should include more examples of rare classes and hard negatives such as patches, wet surfaces, shadows, gravel and manholes. Local collection should include phone photographs taken from a moderate distance, with road context, annotations for all objects and an identified primary subject.</w:t>
       </w:r>
     </w:p>
     <w:p>
@@ -12777,7 +12904,7 @@
         <w:rPr>
           <w:color w:val="000000"/>
         </w:rPr>
-        <w:t xml:space="preserve">An independently labelled local acceptance set should be frozen, with images grouped by location, defect and adjacent frames. Comparisons of sampling strategies, context-preserving augmentation and class calibration should use only training and calibration data. Model size and resolution should be varied one at a time, with repeated seeds, latency checks and checkpoints that support recovery. Evaluation should report eight-class precision and recall, misses by class, localisation, precision among automatically accepted cases and the review rate separately. Current precision and recall remain below 70%, and these improvements cannot guarantee that either target will be met.</w:t>
+        <w:t>An independently labelled local acceptance set should be frozen, with images grouped by location, defect and adjacent frames. Comparisons of sampling strategies, context-preserving augmentation and class calibration should use only training and calibration data. Model size and resolution should be varied one at a time, with repeated seeds, latency checks and checkpoints that support recovery. Evaluation should report eight-class precision and recall, misses by class, localisation, precision among automatically accepted cases and the review rate separately.</w:t>
       </w:r>
     </w:p>
     <w:p>
@@ -12788,20 +12915,10 @@
         <w:rPr>
           <w:color w:val="000000"/>
         </w:rPr>
-        <w:t xml:space="preserve">Future routing evaluation should use verified access information, measured service durations, travel estimates from varied periods and independent task sets. Comparisons with bounded or exact solutions on small instances would help assess solution quality. Coordinated moves between crews could address cases where direct insertion fails. The assistant and confirmed-adjustment workflows also need broader evaluation of answer quality, citations, multilingual ambiguity and recovery, systematically covering the original question and change cases.</w:t>
-      </w:r>
-    </w:p>
-    <w:p>
-      <w:pPr>
-        <w:spacing w:before="200" w:after="60" w:line="240" w:lineRule="auto"/>
-      </w:pPr>
-      <w:r>
-        <w:rPr>
-          <w:color w:val="000000"/>
-          <w:sz w:val="21"/>
-        </w:rPr>
-        <w:t>Acknowledgements. The group thanks the NUS-ISS teaching team for feedback on scope and crew allocation.</w:t>
-      </w:r>
+        <w:t>Future routing evaluation should use verified access information, measured service durations, travel estimates from varied periods and independent task sets. Comparisons with bounded or exact solutions on small instances would help assess solution quality. Coordinated moves between crews could address cases where direct insertion fails. The assistant and confirmed-adjustment workflows also need broader evaluation of answer quality, citations, multilingual ambiguity and recovery, systematically covering the original question and change cases.</w:t>
+      </w:r>
+      <w:bookmarkStart w:id="55" w:name="_GoBack"/>
+      <w:bookmarkEnd w:id="55"/>
     </w:p>
     <w:p>
       <w:pPr>
@@ -12825,7 +12942,7 @@
         <w:rPr>
           <w:color w:val="000000"/>
         </w:rPr>
-        <w:t xml:space="preserve">This guide covers local installation, the workflow from inspection to completion, and the dispatcher assistant. Local acceptance checks used Windows, Python 3.12.14 and Node 22.23.3. Installation on an independent clean machine has not been validated.</w:t>
+        <w:t>This guide covers local installation, the workflow from inspection to completion, and the dispatcher assistant. Local acceptance checks used Windows, Python 3.12.14 and Node 22.23.3. Installation on an independent clean machine has not been validated.</w:t>
       </w:r>
     </w:p>
     <w:p>
@@ -12849,7 +12966,7 @@
         <w:rPr>
           <w:color w:val="000000"/>
         </w:rPr>
-        <w:t xml:space="preserve">Use Python 3.12 for the full application because the pinned numpy==2.5.2 requires Python &gt;=3.12. Base CI uses Python 3.11 and excludes the optional vision dependencies, so its success does not establish that vision runs on Python 3.11. Use Node 22.x &gt;=22.12 and npm &gt;=10.</w:t>
+        <w:t>Use Python 3.12 for the full application because the pinned numpy==2.5.2 requires Python &gt;=3.12. Base CI uses Python 3.11 and excludes the optional vision dependencies, so its success does not establish that vision runs on Python 3.11. Use Node 22.x &gt;=22.12 and npm &gt;=10.</w:t>
       </w:r>
     </w:p>
     <w:p>
@@ -12860,7 +12977,7 @@
         <w:rPr>
           <w:color w:val="000000"/>
         </w:rPr>
-        <w:t xml:space="preserve">Clone the private repository using authorised access. The approved YOLO checkpoint is included in SystemCode/backend/roadguard/model/, and the Dataset directory is not required for inference. On first use, create a new environment from the repository root:</w:t>
+        <w:t>Clone the private repository using authorised access. The approved YOLO checkpoint is included in SystemCode/backend/roadguard/model/, and the Dataset directory is not required for inference. On first use, create a new environment from the repository root:</w:t>
       </w:r>
     </w:p>
     <w:p>
@@ -12907,7 +13024,7 @@
         <w:rPr>
           <w:color w:val="000000"/>
         </w:rPr>
-        <w:t xml:space="preserve">If an existing .venv uses another Python version, create a separate Python 3.12 environment and use its path in every command below. Do not recreate an environment while it is in use. The recorded local acceptance tests support CPU inference. GPU training has separate CUDA requirements.</w:t>
+        <w:t>If an existing .venv uses another Python version, create a separate Python 3.12 environment and use its path in every command below. Do not recreate an environment while it is in use. The recorded local acceptance tests support CPU inference. GPU training has separate CUDA requirements.</w:t>
       </w:r>
     </w:p>
     <w:p>
@@ -12978,7 +13095,7 @@
         <w:rPr>
           <w:color w:val="000000"/>
         </w:rPr>
-        <w:t xml:space="preserve">On first setup, the command downloads approximately 487 MB of pinned multilingual-e5-small model and tokenizer files and verifies their hashes. The encoder runs on CPU through ONNX Runtime. It does not call an embedding API or change the YOLO model. Later setup runs reuse the verified files.</w:t>
+        <w:t>On first setup, the command downloads approximately 487 MB of pinned multilingual-e5-small model and tokenizer files and verifies their hashes. The encoder runs on CPU through ONNX Runtime. It does not call an embedding API or change the YOLO model. Later setup runs reuse the verified files.</w:t>
       </w:r>
     </w:p>
     <w:p>
@@ -13023,7 +13140,7 @@
         <w:rPr>
           <w:color w:val="000000"/>
         </w:rPr>
-        <w:t xml:space="preserve">The default Chroma path is SystemCode/backend/data/rag/chroma/, and embedding files are stored under SystemCode/backend/data/rag/models/multilingual-e5-small/. Both locations hold local runtime files excluded from Git. To override them on the server, use ROADGUARD_CHROMA_PATH and ROADGUARD_EMBEDDING_PATH.</w:t>
+        <w:t>The default Chroma path is SystemCode/backend/data/rag/chroma/, and embedding files are stored under SystemCode/backend/data/rag/models/multilingual-e5-small/. Both locations hold local runtime files excluded from Git. To override them on the server, use ROADGUARD_CHROMA_PATH and ROADGUARD_EMBEDDING_PATH.</w:t>
       </w:r>
     </w:p>
     <w:p>
@@ -13116,7 +13233,7 @@
         <w:rPr>
           <w:color w:val="000000"/>
         </w:rPr>
-        <w:t xml:space="preserve">The recorded targeted acceptance tests used gpt-4.1-mini. Select a model available to your account. The enabled flag accepts exactly lowercase true or false; uppercase True is invalid. Restart the backend after changing environment settings. Keep the key out of frontend code, Git and the report. The status endpoint reports non-secret configuration and usage, but does not verify credential validity.</w:t>
+        <w:t>The recorded targeted acceptance tests used gpt-4.1-mini. Select a model available to your account. The enabled flag accepts exactly lowercase true or false; uppercase True is invalid. Restart the backend after changing environment settings. Keep the key out of frontend code, Git and the report. The status endpoint reports non-secret configuration and usage, but does not verify credential validity.</w:t>
       </w:r>
     </w:p>
     <w:p>
@@ -13210,7 +13327,7 @@
         <w:rPr>
           <w:color w:val="000000"/>
         </w:rPr>
-        <w:t xml:space="preserve">When needed, provision distinct usernames for crew-01, crew-03 and crew-04. Each account has a fixed crew identity. Accounts and passwords are stored in the local database and are not shared through Git.</w:t>
+        <w:t>When needed, provision distinct usernames for crew-01, crew-03 and crew-04. Each account has a fixed crew identity. Accounts and passwords are stored in the local database and are not shared through Git.</w:t>
       </w:r>
     </w:p>
     <w:p>
@@ -13339,7 +13456,7 @@
         <w:rPr>
           <w:color w:val="000000"/>
         </w:rPr>
-        <w:t xml:space="preserve">Open http://127.0.0.1:5173 and sign in. API documentation is available at http://127.0.0.1:8000/docs, and the public health endpoint is /api/v1/health. The health check verifies application and database access only. The model loads when real inference is first requested.</w:t>
+        <w:t>Open http://127.0.0.1:5173 and sign in. API documentation is available at http://127.0.0.1:8000/docs, and the public health endpoint is /api/v1/health. The health check verifies application and database access only. The model loads when real inference is first requested.</w:t>
       </w:r>
     </w:p>
     <w:p>
@@ -13374,7 +13491,7 @@
         <w:rPr>
           <w:color w:val="000000"/>
         </w:rPr>
-        <w:t xml:space="preserve">1. Sign in as an inspector. Upload a JPEG or PNG within the limits of 8 MiB and 20 megapixels. Choose real inference or an explicit synthetic scenario, enter Jurong coordinates and declare the road type. Example coordinates such as 1.3405, 103.706 are synthetic unless verified as the photo's location.</w:t>
+        <w:t>1. Sign in as an inspector. Upload a JPEG or PNG within the limits of 8 MiB and 20 megapixels. Choose real inference or an explicit synthetic scenario, enter Jurong coordinates and declare the road type. Example coordinates such as 1.3405, 103.706 are synthetic unless verified as the photo's location.</w:t>
       </w:r>
     </w:p>
     <w:p>
@@ -13385,7 +13502,7 @@
         <w:rPr>
           <w:color w:val="000000"/>
         </w:rPr>
-        <w:t xml:space="preserve">2. Inspect the result. The upload response contains inspection_id, status, one detection or null, and task_id. For real inference, a primary detection with raw confidence &gt;=0.60 creates one task. A lower confidence requires review, while no detection creates no task. Open the inspection details to view the raw evidence and the frozen rules used for the decision.</w:t>
+        <w:t>2. Inspect the result. The upload response contains inspection_id, status, one detection or null, and task_id. For real inference, a primary detection with raw confidence &gt;=0.60 creates one task. A lower confidence requires review, while no detection creates no task. Open the inspection details to view the raw evidence and the frozen rules used for the decision.</w:t>
       </w:r>
     </w:p>
     <w:p>
@@ -13396,7 +13513,7 @@
         <w:rPr>
           <w:color w:val="000000"/>
         </w:rPr>
-        <w:t xml:space="preserve">3. Sign in as the dispatcher. Confirm, correct or reject pending inspections. Corrections use the stored rules, and accepted tasks contain the demonstration priority and service duration. Completed and cancelled records retain their history but are excluded from the active planning snapshot.</w:t>
+        <w:t>3. Sign in as the dispatcher. Confirm, correct or reject pending inspections. Corrections use the stored rules, and accepted tasks contain the demonstration priority and service duration. Completed and cancelled records retain their history but are excluded from the active planning snapshot.</w:t>
       </w:r>
     </w:p>
     <w:p>
@@ -13407,7 +13524,7 @@
         <w:rPr>
           <w:color w:val="000000"/>
         </w:rPr>
-        <w:t xml:space="preserve">4. An accepted upload or review confirmation/correction automatically starts a paired planning attempt after the task is committed. GA and Greedy use the same task snapshot and travel matrix, and both honour crew constraints. Inspect any unassigned-task reasons and compare the results from the same planning round. If the browser no longer retains a matching response, use the manual recalculation button to obtain a comparison from one round. Manual recalculation is also required after other input changes or a failed automatic attempt.</w:t>
+        <w:t>4. An accepted upload or review confirmation/correction automatically starts a paired planning attempt after the task is committed. GA and Greedy use the same task snapshot and travel matrix, and both honour crew constraints. Inspect any unassigned-task reasons and compare the results from the same planning round. If the browser no longer retains a matching response, use the manual recalculation button to obtain a comparison from one round. Manual recalculation is also required after other input changes or a failed automatic attempt.</w:t>
       </w:r>
     </w:p>
     <w:p>
@@ -13440,7 +13557,7 @@
         <w:rPr>
           <w:color w:val="000000"/>
         </w:rPr>
-        <w:t xml:space="preserve">5. Sign in as the crew assigned by the latest saved GA plan. View and complete that crew's tasks. The server checks the current assignment and task version before accepting completion. Completion changes the planning inputs, so the dispatcher must explicitly replan.</w:t>
+        <w:t>5. Sign in as the crew assigned by the latest saved GA plan. View and complete that crew's tasks. The server checks the current assignment and task version before accepting completion. Completion changes the planning inputs, so the dispatcher must explicitly replan.</w:t>
       </w:r>
     </w:p>
     <w:p>
@@ -13451,7 +13568,7 @@
         <w:rPr>
           <w:color w:val="000000"/>
         </w:rPr>
-        <w:t xml:space="preserve">The frontend map shows a schematic stop order rather than turn-by-turn navigation. See the frontend guide (../SystemCode/frontend/README.md).</w:t>
+        <w:t>The frontend map shows a schematic stop order rather than turn-by-turn navigation. See the frontend guide (../SystemCode/frontend/README.md).</w:t>
       </w:r>
     </w:p>
     <w:p>
@@ -13475,7 +13592,7 @@
         <w:rPr>
           <w:color w:val="000000"/>
         </w:rPr>
-        <w:t xml:space="preserve">Sign in as a dispatcher and open Route assistant. Ask about a supported repair rule or project operation. For a route question, select an explicit saved plan. Saved-plan answers use authorised facts stored on the server rather than totals supplied by the browser.</w:t>
+        <w:t>Sign in as a dispatcher and open Route assistant. Ask about a supported repair rule or project operation. For a route question, select an explicit saved plan. Saved-plan answers use authorised facts stored on the server rather than totals supplied by the browser.</w:t>
       </w:r>
     </w:p>
     <w:p>
@@ -13497,7 +13614,7 @@
         <w:rPr>
           <w:color w:val="000000"/>
         </w:rPr>
-        <w:t xml:space="preserve">Read the answer first. Sources are closed by default. Expand View sources to inspect exact quotations, citation IDs, package/version hashes and the provenance of saved-plan facts.</w:t>
+        <w:t>Read the answer first. Sources are closed by default. Expand View sources to inspect exact quotations, citation IDs, package/version hashes and the provenance of saved-plan facts.</w:t>
       </w:r>
     </w:p>
     <w:p>
@@ -13530,7 +13647,7 @@
         <w:rPr>
           <w:color w:val="000000"/>
         </w:rPr>
-        <w:t xml:space="preserve">A standalone question such as “What model are you?” returns the configured model name through server_configuration. It does not call GPT, retrieve knowledge or read saved plans, and remains available when generation is disabled or the key is missing. The answer identifies the configured assistant model. It does not prove provider execution or identify the separate YOLO detector.</w:t>
+        <w:t>A standalone question such as “What model are you?” returns the configured model name through server_configuration. It does not call GPT, retrieve knowledge or read saved plans, and remains available when generation is disabled or the key is missing. The answer identifies the configured assistant model. It does not prove provider execution or identify the separate YOLO detector.</w:t>
       </w:r>
     </w:p>
     <w:p>
@@ -13576,7 +13693,7 @@
         <w:rPr>
           <w:color w:val="000000"/>
         </w:rPr>
-        <w:t xml:space="preserve">Open Crew adjustments in Route assistant and load a saved plan ID or the latest GA plan. The four crew cards show stop order, travel, service, required return travel, total work, remaining shift and persistent assignment badges. Use a current plan when making changes. Changes to crew availability have their own preview and confirmation workflow.</w:t>
+        <w:t>Open Crew adjustments in Route assistant and load a saved plan ID or the latest GA plan. The four crew cards show stop order, travel, service, required return travel, total work, remaining shift and persistent assignment badges. Use a current plan when making changes. Changes to crew availability have their own preview and confirmation workflow.</w:t>
       </w:r>
     </w:p>
     <w:p>
@@ -13587,7 +13704,7 @@
         <w:rPr>
           <w:color w:val="000000"/>
         </w:rPr>
-        <w:t xml:space="preserve">To move a task, select an assigned active task and a different available crew, then preview the move. Compare the routes before and after the change, acknowledge the preview and confirm.</w:t>
+        <w:t>To move a task, select an assigned active task and a different available crew, then preview the move. Compare the routes before and after the change, acknowledge the preview and confirm.</w:t>
       </w:r>
     </w:p>
     <w:p>
@@ -13609,7 +13726,7 @@
         <w:rPr>
           <w:color w:val="000000"/>
         </w:rPr>
-        <w:t xml:space="preserve">Confirmation saves a durable task-to-crew constraint. To generate a new saved route, choose Recalculate saved task change and reload the latest GA plan.</w:t>
+        <w:t>Confirmation saves a durable task-to-crew constraint. To generate a new saved route, choose Recalculate saved task change and reload the latest GA plan.</w:t>
       </w:r>
     </w:p>
     <w:p>
@@ -13631,7 +13748,7 @@
         <w:rPr>
           <w:color w:val="000000"/>
         </w:rPr>
-        <w:t xml:space="preserve">To cancel work, choose Cancel active task, preview the cancellation and explicitly confirm it. Both assigned and unassigned active tasks can be cancelled. Cancellation preserves the task and its history but removes it from active planning. Explicitly recalculate to replace stale routes. Completed and cancelled tasks cannot be reopened.</w:t>
+        <w:t>To cancel work, choose Cancel active task, preview the cancellation and explicitly confirm it. Both assigned and unassigned active tasks can be cancelled. Cancellation preserves the task and its history but removes it from active planning. Explicitly recalculate to replace stale routes. Completed and cancelled tasks cannot be reopened.</w:t>
       </w:r>
     </w:p>
     <w:p>
@@ -13653,7 +13770,7 @@
         <w:rPr>
           <w:color w:val="000000"/>
         </w:rPr>
-        <w:t xml:space="preserve">Reassignment immediately removes the previous crew's access to read the task and inspection or complete the task. The target crew gains access through an explicitly recalculated saved GA plan. An affected old route is omitted, with an explanation that it is stale and requires recalculation.</w:t>
+        <w:t>Reassignment immediately removes the previous crew's access to read the task and inspection or complete the task. The target crew gains access through an explicitly recalculated saved GA plan. An affected old route is omitted, with an explanation that it is stale and requires recalculation.</w:t>
       </w:r>
     </w:p>
     <w:p>
@@ -13688,7 +13805,7 @@
         <w:rPr>
           <w:color w:val="000000"/>
         </w:rPr>
-        <w:t xml:space="preserve">In Swagger, call POST /api/v1/auth/login with a provisioned account. Use the same host name throughout so that session cookies are retained. For authenticated requests that modify data, send the returned csrf_token as X-CSRF-Token.</w:t>
+        <w:t>In Swagger, call POST /api/v1/auth/login with a provisioned account. Use the same host name throughout so that session cookies are retained. For authenticated requests that modify data, send the returned csrf_token as X-CSRF-Token.</w:t>
       </w:r>
     </w:p>
     <w:p>
@@ -13854,7 +13971,7 @@
                 <w:color w:val="000000"/>
                 <w:sz w:val="21"/>
               </w:rPr>
-              <w:t xml:space="preserve">Check that the environment uses Python 3.12. Base CI uses Python 3.11 and does not include vision dependencies.</w:t>
+              <w:t>Check that the environment uses Python 3.12. Base CI uses Python 3.11 and does not include vision dependencies.</w:t>
             </w:r>
           </w:p>
         </w:tc>
@@ -13913,7 +14030,7 @@
                 <w:color w:val="000000"/>
                 <w:sz w:val="21"/>
               </w:rPr>
-              <w:t xml:space="preserve">Start the backend and check that the frontend proxy target matches its address.</w:t>
+              <w:t>Start the backend and check that the frontend proxy target matches its address.</w:t>
             </w:r>
           </w:p>
         </w:tc>
@@ -13972,7 +14089,7 @@
                 <w:color w:val="000000"/>
                 <w:sz w:val="21"/>
               </w:rPr>
-              <w:t xml:space="preserve">Check sign-in, account role, session host and CSRF token.</w:t>
+              <w:t>Check sign-in, account role, session host and CSRF token.</w:t>
             </w:r>
           </w:p>
         </w:tc>
@@ -14031,7 +14148,7 @@
                 <w:color w:val="000000"/>
                 <w:sz w:val="21"/>
               </w:rPr>
-              <w:t xml:space="preserve">End outstanding viewer transactions. Do not delete the database.</w:t>
+              <w:t>End outstanding viewer transactions. Do not delete the database.</w:t>
             </w:r>
           </w:p>
         </w:tc>
@@ -14090,7 +14207,7 @@
                 <w:color w:val="000000"/>
                 <w:sz w:val="21"/>
               </w:rPr>
-              <w:t xml:space="preserve">Install the vision requirements and verify the bundled weight and manifest. Restart after a failed model load.</w:t>
+              <w:t>Install the vision requirements and verify the bundled weight and manifest. Restart after a failed model load.</w:t>
             </w:r>
           </w:p>
         </w:tc>
@@ -14149,7 +14266,7 @@
                 <w:color w:val="000000"/>
                 <w:sz w:val="21"/>
               </w:rPr>
-              <w:t xml:space="preserve">Refresh the current state, then explicitly replan or retry with the current record version.</w:t>
+              <w:t>Refresh the current state, then explicitly replan or retry with the current record version.</w:t>
             </w:r>
           </w:p>
         </w:tc>
@@ -14208,7 +14325,7 @@
                 <w:color w:val="000000"/>
                 <w:sz w:val="21"/>
               </w:rPr>
-              <w:t xml:space="preserve">Read the reported reasons, such as unavailable crews or shift limits.</w:t>
+              <w:t>Read the reported reasons, such as unavailable crews or shift limits.</w:t>
             </w:r>
           </w:p>
         </w:tc>
@@ -14267,7 +14384,7 @@
                 <w:color w:val="000000"/>
                 <w:sz w:val="21"/>
               </w:rPr>
-              <w:t xml:space="preserve">Install the full backend requirements, verify the configured paths, run the explicit index command and restart. HTTP requests do not repair indexes.</w:t>
+              <w:t>Install the full backend requirements, verify the configured paths, run the explicit index command and restart. HTTP requests do not repair indexes.</w:t>
             </w:r>
           </w:p>
         </w:tc>
@@ -14326,7 +14443,7 @@
                 <w:color w:val="000000"/>
                 <w:sz w:val="21"/>
               </w:rPr>
-              <w:t xml:space="preserve">Use lowercase true/false, a valid model name and the documented limit ranges, then restart.</w:t>
+              <w:t>Use lowercase true/false, a valid model name and the documented limit ranges, then restart.</w:t>
             </w:r>
           </w:p>
         </w:tc>
@@ -14385,7 +14502,7 @@
                 <w:color w:val="000000"/>
                 <w:sz w:val="21"/>
               </w:rPr>
-              <w:t xml:space="preserve">Check private server configuration, account access and the local attempted-call budget. Model identity remains available. Do not repeatedly retry requests whose outcomes are unknown.</w:t>
+              <w:t>Check private server configuration, account access and the local attempted-call budget. Model identity remains available. Do not repeatedly retry requests whose outcomes are unknown.</w:t>
             </w:r>
           </w:p>
         </w:tc>
@@ -14444,7 +14561,7 @@
                 <w:color w:val="000000"/>
                 <w:sz w:val="21"/>
               </w:rPr>
-              <w:t xml:space="preserve">Narrow the question or select a current saved plan. Inspect the explicit error without bypassing citation validation.</w:t>
+              <w:t>Narrow the question or select a current saved plan. Inspect the explicit error without bypassing citation validation.</w:t>
             </w:r>
           </w:p>
         </w:tc>
@@ -14503,7 +14620,7 @@
                 <w:color w:val="000000"/>
                 <w:sz w:val="21"/>
               </w:rPr>
-              <w:t xml:space="preserve">Refresh the task, plan and configuration, then create a new preview before confirming.</w:t>
+              <w:t>Refresh the task, plan and configuration, then create a new preview before confirming.</w:t>
             </w:r>
           </w:p>
         </w:tc>
@@ -14562,7 +14679,7 @@
                 <w:color w:val="000000"/>
                 <w:sz w:val="21"/>
               </w:rPr>
-              <w:t xml:space="preserve">Inspect travel, service and return totals and crew availability, then choose a feasible crew. Other tasks are retained.</w:t>
+              <w:t>Inspect travel, service and return totals and crew availability, then choose a feasible crew. Other tasks are retained.</w:t>
             </w:r>
           </w:p>
         </w:tc>
@@ -14621,7 +14738,7 @@
                 <w:color w:val="000000"/>
                 <w:sz w:val="21"/>
               </w:rPr>
-              <w:t xml:space="preserve">Inspect the locked crew and the reported reason. Later recalculation preserves the constraint rather than silently transferring the work.</w:t>
+              <w:t>Inspect the locked crew and the reported reason. Later recalculation preserves the constraint rather than silently transferring the work.</w:t>
             </w:r>
           </w:p>
         </w:tc>
@@ -14680,7 +14797,7 @@
                 <w:color w:val="000000"/>
                 <w:sz w:val="21"/>
               </w:rPr>
-              <w:t xml:space="preserve">The dispatcher must explicitly recalculate. The target crew can then refresh its latest saved GA route.</w:t>
+              <w:t>The dispatcher must explicitly recalculate. The target crew can then refresh its latest saved GA route.</w:t>
             </w:r>
           </w:p>
         </w:tc>
@@ -14739,7 +14856,7 @@
                 <w:color w:val="000000"/>
                 <w:sz w:val="21"/>
               </w:rPr>
-              <w:t xml:space="preserve">Check server credentials and service access. Provider errors do not silently switch the system to simulation.</w:t>
+              <w:t>Check server credentials and service access. Provider errors do not silently switch the system to simulation.</w:t>
             </w:r>
           </w:p>
         </w:tc>
@@ -14806,7 +14923,7 @@
         <w:rPr>
           <w:color w:val="000000"/>
         </w:rPr>
-        <w:t xml:space="preserve">Usage may incur charges. Keep the key private and out of frontend source. The current provider uses traffic-unaware estimates, and the map remains schematic. Existing plans retain their original travel source.</w:t>
+        <w:t>Usage may incur charges. Keep the key private and out of frontend source. The current provider uses traffic-unaware estimates, and the map remains schematic. Existing plans retain their original travel source.</w:t>
       </w:r>
     </w:p>
     <w:p>
@@ -14828,7 +14945,7 @@
         <w:rPr>
           <w:color w:val="000000"/>
         </w:rPr>
-        <w:t xml:space="preserve">Additional operating details: the pinned vision requirements include PyTorch, torchvision and Ultralytics. The example crew02 account can act only for Crew 02 and may have no assigned work. For the crew workflow, use the crew assigned in the latest saved GA plan.</w:t>
+        <w:t>Additional operating details: the pinned vision requirements include PyTorch, torchvision and Ultralytics. The example crew02 account can act only for Crew 02 and may have no assigned work. For the crew workflow, use the crew assigned in the latest saved GA plan.</w:t>
       </w:r>
     </w:p>
     <w:p>
@@ -14892,7 +15009,7 @@
     </w:p>
     <w:p>
       <w:r>
-        <w:t xml:space="preserve">The submitted proposal is reproduced in full, including its original contents, diagrams and pagination. Its cover retains the former Group 07 identifier; the current group is 37. The proposed two-crew arrangement records the original plan. Sections 1.3 and 5.3 explain subsequent changes to scope and evaluation. Report page numbering continues through the appendix.</w:t>
+        <w:t>The submitted proposal is reproduced in full, including its original contents, diagrams and pagination. Its cover retains the former Group 07 identifier; the current group is 37. The proposed two-crew arrangement records the original plan. Sections 1.3 and 5.3 explain subsequent changes to scope and evaluation. Report page numbering continues through the appendix.</w:t>
       </w:r>
     </w:p>
     <w:p>
@@ -15690,7 +15807,7 @@
     </w:p>
     <w:p>
       <w:r>
-        <w:t xml:space="preserve">Table C1 maps the implemented functions to the MR, RS and CGS course content and the three applicable technique groups in the practice briefing. It points to the design and evaluation evidence in the main report without repeating the experimental results.</w:t>
+        <w:t>Table C1 maps the implemented functions to the MR, RS and CGS course content and the three applicable technique groups in the practice briefing. It points to the design and evaluation evidence in the main report without repeating the experimental results.</w:t>
       </w:r>
     </w:p>
     <w:p>
@@ -15835,7 +15952,7 @@
                 <w:color w:val="000000"/>
                 <w:sz w:val="21"/>
               </w:rPr>
-              <w:t>Verification and limits</w:t>
+              <w:t>Verification evidence</w:t>
             </w:r>
           </w:p>
         </w:tc>
@@ -15938,7 +16055,7 @@
                 <w:color w:val="000000"/>
                 <w:sz w:val="21"/>
               </w:rPr>
-              <w:t xml:space="preserve">Versioned policies, stored rule snapshots and decision traces. Preview validation and durable crew constraints support adjustments. Accepted inspections trigger automatic planning; other changes require explicit replanning.</w:t>
+              <w:t>Versioned policies, stored rule snapshots and decision traces. Preview validation and durable crew constraints support adjustments. Accepted inspections trigger automatic planning; other changes require explicit replanning.</w:t>
             </w:r>
           </w:p>
         </w:tc>
@@ -15959,7 +16076,7 @@
                 <w:color w:val="000000"/>
                 <w:sz w:val="21"/>
               </w:rPr>
-              <w:t xml:space="preserve">Sections 2, 3.2 and 5.3 cover boundary, correction, replay and controlled adjustment checks. Service durations remain assumptions.</w:t>
+              <w:t>Sections 2, 3.2 and 5.3 cover boundary, correction, replay and controlled adjustment checks.</w:t>
             </w:r>
           </w:p>
         </w:tc>
@@ -16041,7 +16158,7 @@
                 <w:color w:val="000000"/>
                 <w:sz w:val="21"/>
               </w:rPr>
-              <w:t xml:space="preserve">Assign tasks and order visits for four crews. Priority-first coverage takes precedence over the weighted completion, travel and workload objective.</w:t>
+              <w:t>Assign tasks and order visits for four crews. Priority-first coverage takes precedence over the weighted completion, travel and workload objective.</w:t>
             </w:r>
           </w:p>
         </w:tc>
@@ -16062,7 +16179,7 @@
                 <w:color w:val="000000"/>
                 <w:sz w:val="21"/>
               </w:rPr>
-              <w:t xml:space="preserve">The group-built GA uses encoding, selection, crossover, mutation and elitism. GA and Greedy share the evaluator, task snapshot and travel matrix.</w:t>
+              <w:t>The group-built GA uses encoding, selection, crossover, mutation and elitism. GA and Greedy share the evaluator, task snapshot and travel matrix.</w:t>
             </w:r>
           </w:p>
         </w:tc>
@@ -16083,7 +16200,7 @@
                 <w:color w:val="000000"/>
                 <w:sz w:val="21"/>
               </w:rPr>
-              <w:t xml:space="preserve">Sections 3.2, 4 and 5.2 cover 10/15/20-task scenarios, multiple seeds, a seeding ablation and analysis of unassigned-task failures. The evaluation does not establish optimality.</w:t>
+              <w:t>Sections 3.2, 4 and 5.2 cover 10/15/20-task scenarios, multiple seeds, a seeding ablation and analysis of unassigned-task failures.</w:t>
             </w:r>
           </w:p>
         </w:tc>
@@ -16165,7 +16282,7 @@
                 <w:color w:val="000000"/>
                 <w:sz w:val="21"/>
               </w:rPr>
-              <w:t xml:space="preserve">YOLO11s predicts eight damage classes and bounding boxes. Primary selection supplies evidence to the rules. Retrieval and optional GPT explain reviewed knowledge and authorised saved plans.</w:t>
+              <w:t>YOLO11s predicts eight damage classes and bounding boxes. Primary selection supplies evidence to the rules. Retrieval and optional GPT explain reviewed knowledge and authorised saved plans.</w:t>
             </w:r>
           </w:p>
         </w:tc>
@@ -16186,7 +16303,7 @@
                 <w:color w:val="000000"/>
                 <w:sz w:val="21"/>
               </w:rPr>
-              <w:t xml:space="preserve">Grouped data, supervised training and local inference support perception. A static Chroma/E5 index, query-v3 exact citations and server-derived rule answers support explanation. Plan facts remain outside the index.</w:t>
+              <w:t>Grouped data, supervised training and local inference support perception. A static Chroma/E5 index, query-v3 exact citations and server-derived rule answers support explanation. Plan facts remain outside the index.</w:t>
             </w:r>
           </w:p>
         </w:tc>
@@ -16207,7 +16324,7 @@
                 <w:color w:val="000000"/>
                 <w:sz w:val="21"/>
               </w:rPr>
-              <w:t xml:space="preserve">Sections 2–5 report recognition metrics and a failure audit, with separate actual-GPT, local-retrieval and controlled-case evaluations. Independent local vision validation and broad answer evaluation remain outstanding.</w:t>
+              <w:t>Sections 2–5 report recognition metrics and a failure audit, with separate actual-GPT, local-retrieval and controlled-case evaluations.</w:t>
             </w:r>
           </w:p>
         </w:tc>
@@ -16221,7 +16338,7 @@
         <w:rPr>
           <w:color w:val="000000"/>
         </w:rPr>
-        <w:t xml:space="preserve">Storage, authorisation and interface display support these three technique groups. The targeted GPT/RAG acceptance tests establish neither universal semantic accuracy nor completion of the full evaluation proposed in Appendix B.</w:t>
+        <w:t>Storage, authorisation and interface display support these three technique groups.</w:t>
       </w:r>
     </w:p>
     <w:sectPr>
@@ -16618,7 +16735,7 @@
     <w:lsdException w:uiPriority="99" w:name="Normal Indent"/>
     <w:lsdException w:uiPriority="99" w:name="footnote text"/>
     <w:lsdException w:uiPriority="99" w:name="annotation text"/>
-    <w:lsdException w:uiPriority="99" w:semiHidden="0" w:name="header"/>
+    <w:lsdException w:qFormat="1" w:uiPriority="99" w:semiHidden="0" w:name="header"/>
     <w:lsdException w:qFormat="1" w:uiPriority="99" w:semiHidden="0" w:name="footer"/>
     <w:lsdException w:uiPriority="99" w:name="index heading"/>
     <w:lsdException w:qFormat="1" w:uiPriority="35" w:name="caption"/>
@@ -16632,32 +16749,32 @@
     <w:lsdException w:uiPriority="99" w:name="endnote reference"/>
     <w:lsdException w:uiPriority="99" w:name="endnote text"/>
     <w:lsdException w:uiPriority="99" w:name="table of authorities"/>
-    <w:lsdException w:uiPriority="99" w:semiHidden="0" w:name="macro"/>
+    <w:lsdException w:qFormat="1" w:uiPriority="99" w:semiHidden="0" w:name="macro"/>
     <w:lsdException w:uiPriority="99" w:name="toa heading"/>
     <w:lsdException w:qFormat="1" w:uiPriority="99" w:semiHidden="0" w:name="List"/>
-    <w:lsdException w:uiPriority="99" w:semiHidden="0" w:name="List Bullet"/>
-    <w:lsdException w:uiPriority="99" w:semiHidden="0" w:name="List Number"/>
+    <w:lsdException w:qFormat="1" w:uiPriority="99" w:semiHidden="0" w:name="List Bullet"/>
+    <w:lsdException w:qFormat="1" w:uiPriority="99" w:semiHidden="0" w:name="List Number"/>
     <w:lsdException w:uiPriority="99" w:semiHidden="0" w:name="List 2"/>
-    <w:lsdException w:uiPriority="99" w:semiHidden="0" w:name="List 3"/>
+    <w:lsdException w:qFormat="1" w:uiPriority="99" w:semiHidden="0" w:name="List 3"/>
     <w:lsdException w:uiPriority="99" w:name="List 4"/>
     <w:lsdException w:uiPriority="99" w:name="List 5"/>
     <w:lsdException w:uiPriority="99" w:semiHidden="0" w:name="List Bullet 2"/>
-    <w:lsdException w:uiPriority="99" w:semiHidden="0" w:name="List Bullet 3"/>
+    <w:lsdException w:qFormat="1" w:uiPriority="99" w:semiHidden="0" w:name="List Bullet 3"/>
     <w:lsdException w:uiPriority="99" w:name="List Bullet 4"/>
     <w:lsdException w:uiPriority="99" w:name="List Bullet 5"/>
     <w:lsdException w:qFormat="1" w:uiPriority="99" w:semiHidden="0" w:name="List Number 2"/>
-    <w:lsdException w:uiPriority="99" w:semiHidden="0" w:name="List Number 3"/>
+    <w:lsdException w:qFormat="1" w:uiPriority="99" w:semiHidden="0" w:name="List Number 3"/>
     <w:lsdException w:uiPriority="99" w:name="List Number 4"/>
     <w:lsdException w:uiPriority="99" w:name="List Number 5"/>
     <w:lsdException w:qFormat="1" w:unhideWhenUsed="0" w:uiPriority="10" w:semiHidden="0" w:name="Title"/>
     <w:lsdException w:uiPriority="99" w:name="Closing"/>
     <w:lsdException w:uiPriority="99" w:name="Signature"/>
-    <w:lsdException w:uiPriority="1" w:name="Default Paragraph Font"/>
+    <w:lsdException w:qFormat="1" w:uiPriority="1" w:name="Default Paragraph Font"/>
     <w:lsdException w:qFormat="1" w:uiPriority="99" w:semiHidden="0" w:name="Body Text"/>
     <w:lsdException w:uiPriority="99" w:name="Body Text Indent"/>
-    <w:lsdException w:uiPriority="99" w:semiHidden="0" w:name="List Continue"/>
-    <w:lsdException w:uiPriority="99" w:semiHidden="0" w:name="List Continue 2"/>
-    <w:lsdException w:uiPriority="99" w:semiHidden="0" w:name="List Continue 3"/>
+    <w:lsdException w:qFormat="1" w:uiPriority="99" w:semiHidden="0" w:name="List Continue"/>
+    <w:lsdException w:qFormat="1" w:uiPriority="99" w:semiHidden="0" w:name="List Continue 2"/>
+    <w:lsdException w:qFormat="1" w:uiPriority="99" w:semiHidden="0" w:name="List Continue 3"/>
     <w:lsdException w:uiPriority="99" w:name="List Continue 4"/>
     <w:lsdException w:uiPriority="99" w:name="List Continue 5"/>
     <w:lsdException w:uiPriority="99" w:name="Message Header"/>
@@ -16667,8 +16784,8 @@
     <w:lsdException w:uiPriority="99" w:name="Body Text First Indent"/>
     <w:lsdException w:uiPriority="99" w:name="Body Text First Indent 2"/>
     <w:lsdException w:uiPriority="99" w:name="Note Heading"/>
-    <w:lsdException w:uiPriority="99" w:semiHidden="0" w:name="Body Text 2"/>
-    <w:lsdException w:uiPriority="99" w:semiHidden="0" w:name="Body Text 3"/>
+    <w:lsdException w:qFormat="1" w:uiPriority="99" w:semiHidden="0" w:name="Body Text 2"/>
+    <w:lsdException w:qFormat="1" w:uiPriority="99" w:semiHidden="0" w:name="Body Text 3"/>
     <w:lsdException w:uiPriority="99" w:name="Body Text Indent 2"/>
     <w:lsdException w:uiPriority="99" w:name="Body Text Indent 3"/>
     <w:lsdException w:uiPriority="99" w:name="Block Text"/>
@@ -17062,6 +17179,7 @@
     <w:name w:val="Default Paragraph Font"/>
     <w:semiHidden/>
     <w:unhideWhenUsed/>
+    <w:qFormat/>
     <w:uiPriority w:val="1"/>
     <w:rPr>
       <w:rFonts w:ascii="Times New Roman" w:hAnsi="Times New Roman"/>
@@ -17091,6 +17209,7 @@
     <w:name w:val="macro"/>
     <w:link w:val="147"/>
     <w:unhideWhenUsed/>
+    <w:qFormat/>
     <w:uiPriority w:val="99"/>
     <w:pPr>
       <w:tabs>
@@ -17116,6 +17235,7 @@
     <w:name w:val="List 3"/>
     <w:basedOn w:val="1"/>
     <w:unhideWhenUsed/>
+    <w:qFormat/>
     <w:uiPriority w:val="99"/>
     <w:pPr>
       <w:ind w:left="1080" w:hanging="360"/>
@@ -17148,6 +17268,7 @@
     <w:name w:val="List Number"/>
     <w:basedOn w:val="1"/>
     <w:unhideWhenUsed/>
+    <w:qFormat/>
     <w:uiPriority w:val="99"/>
     <w:pPr>
       <w:numPr>
@@ -17185,6 +17306,7 @@
     <w:name w:val="List Bullet"/>
     <w:basedOn w:val="1"/>
     <w:unhideWhenUsed/>
+    <w:qFormat/>
     <w:uiPriority w:val="99"/>
     <w:pPr>
       <w:numPr>
@@ -17203,6 +17325,7 @@
     <w:basedOn w:val="1"/>
     <w:link w:val="146"/>
     <w:unhideWhenUsed/>
+    <w:qFormat/>
     <w:uiPriority w:val="99"/>
     <w:pPr>
       <w:spacing w:after="120"/>
@@ -17218,6 +17341,7 @@
     <w:name w:val="List Bullet 3"/>
     <w:basedOn w:val="1"/>
     <w:unhideWhenUsed/>
+    <w:qFormat/>
     <w:uiPriority w:val="99"/>
     <w:pPr>
       <w:numPr>
@@ -17250,6 +17374,7 @@
     <w:name w:val="List Number 3"/>
     <w:basedOn w:val="1"/>
     <w:unhideWhenUsed/>
+    <w:qFormat/>
     <w:uiPriority w:val="99"/>
     <w:pPr>
       <w:numPr>
@@ -17281,6 +17406,7 @@
     <w:name w:val="List Continue"/>
     <w:basedOn w:val="1"/>
     <w:unhideWhenUsed/>
+    <w:qFormat/>
     <w:uiPriority w:val="99"/>
     <w:pPr>
       <w:spacing w:after="120"/>
@@ -17333,6 +17459,7 @@
     <w:basedOn w:val="1"/>
     <w:link w:val="135"/>
     <w:unhideWhenUsed/>
+    <w:qFormat/>
     <w:uiPriority w:val="99"/>
     <w:pPr>
       <w:tabs>
@@ -17383,6 +17510,7 @@
     <w:basedOn w:val="1"/>
     <w:link w:val="145"/>
     <w:unhideWhenUsed/>
+    <w:qFormat/>
     <w:uiPriority w:val="99"/>
     <w:pPr>
       <w:spacing w:after="120" w:line="480" w:lineRule="auto"/>
@@ -17396,6 +17524,7 @@
     <w:name w:val="List Continue 2"/>
     <w:basedOn w:val="1"/>
     <w:unhideWhenUsed/>
+    <w:qFormat/>
     <w:uiPriority w:val="99"/>
     <w:pPr>
       <w:spacing w:after="120"/>
@@ -17411,6 +17540,7 @@
     <w:name w:val="List Continue 3"/>
     <w:basedOn w:val="1"/>
     <w:unhideWhenUsed/>
+    <w:qFormat/>
     <w:uiPriority w:val="99"/>
     <w:pPr>
       <w:spacing w:after="120"/>

</xml_diff>

<commit_message>
Sync the final report from the latest Assignment version
The repository report now matches the owner's latest saved Assignment document byte for byte. This includes the owner's prose revisions and consolidation of repetitive qualifications. Only the group-report DOCX is changed; application interfaces and dependencies are unchanged.

Validation: DOCX ZIP integrity and repository checks passed. The Assignment and repository copies have SHA-256 3a18706df990da82e22c13af7c34292b31c8aee86b162c7285b4a425f6a6d04f. The current 47-page document was rendered and reviewed. Existing editorial findings, including stale contents page numbers and a historical interface screenshot, are preserved as requested; this synchronization does not claim those findings are fixed.

Dataset, local vector databases, model caches and all 14 pre-existing model-training files are excluded. Merge through the existing automatic workflow after CI passes.
</commit_message>
<xml_diff>
--- a/ProjectReport/IRS-PM-2026-08-17-AIS08FT-GRP-Group37-RoadGuard-Group-Report.docx
+++ b/ProjectReport/IRS-PM-2026-08-17-AIS08FT-GRP-Group37-RoadGuard-Group-Report.docx
@@ -246,22 +246,36 @@
         <w:rPr>
           <w:color w:val="000000"/>
         </w:rPr>
-        <w:t xml:space="preserve">RoadGuard combines road-damage detection, rule-based decisions and maintenance scheduling for four crews in Jurong East and Jurong West. Inspectors upload geolocated images, and a local YOLO11s model selects one primary damage observation. A confidence policy then determines whether to create a repair task or request human review. A genetic algorithm and a Greedy baseline allocate accepted work from a common NUS-ISS dispatch origin. Inspectors, dispatchers and crews use a shared web application that retains task history and checks record revisions. A dispatcher assistant retrieves reviewed project knowledge and evidence from saved plans. Separate preview and confirmation workflows allow dispatchers to save crew assignments and cancel tasks.</w:t>
-      </w:r>
-    </w:p>
-    <w:p>
+        <w:t xml:space="preserve">RoadGuard combines road-damage detection, rule-based decisions and maintenance scheduling for  </w:t>
+      </w:r>
+      <w:r>
+        <w:rPr>
+          <w:rFonts w:hint="eastAsia"/>
+          <w:color w:val="000000"/>
+          <w:lang w:val="en-US" w:eastAsia="zh-CN"/>
+        </w:rPr>
+        <w:t>crews in Jurong</w:t>
+      </w:r>
       <w:r>
         <w:rPr>
           <w:color w:val="000000"/>
         </w:rPr>
-        <w:t xml:space="preserve">Our evaluation combines visual-recognition experiments, twelve routing scenarios and tests of the integrated workflow. The detector still needs improvement and independent local validation. The GA initialised with a Greedy solution improved on Greedy in all 120 runs under the default search settings. Mean objective reductions across scenarios ranged from 0.73–3.62%. </w:t>
+        <w:t>. Inspectors upload geolocated images, and a local YOLO11s model selects one primary damage observation. A confidence policy then determines whether to create a repair task or request human review. A genetic algorithm and a Greedy baseline allocate accepted work from a common NUS-ISS dispatch origin. Inspectors, dispatchers and crews use a shared web application that retains task history and checks record revisions. A dispatcher assistant retrieves reviewed project knowledge and evidence from saved plans. Separate preview and confirmation workflows allow dispatchers to save crew assignments and cancel tasks.</w:t>
+      </w:r>
+    </w:p>
+    <w:p>
+      <w:r>
+        <w:rPr>
+          <w:color w:val="000000"/>
+        </w:rPr>
+        <w:t xml:space="preserve">Our evaluation combines visual-recognition experiments, twelve routing scenarios and tests of the integrated workflow. The GA initialised with a Greedy solution improved on Greedy in all 120 runs under the default search settings. Mean objective reductions across scenarios ranged from 0.73–3.62%. </w:t>
       </w:r>
       <w:r>
         <w:rPr>
           <w:rFonts w:hint="eastAsia"/>
           <w:color w:val="000000"/>
         </w:rPr>
-        <w:t xml:space="preserve">We evaluated the assistant using actual GPT-generated responses and local retrieval tests, and separately verified user-confirmed task changes.</w:t>
+        <w:t>We evaluated the assistant using actual GPT-generated responses and local retrieval tests, and separately verified user-confirmed task changes.</w:t>
       </w:r>
       <w:r>
         <w:rPr>
@@ -271,13 +285,11 @@
         </w:rPr>
         <w:t xml:space="preserve"> </w:t>
       </w:r>
-      <w:bookmarkStart w:id="55" w:name="_GoBack"/>
-      <w:bookmarkEnd w:id="55"/>
       <w:r>
         <w:rPr>
           <w:color w:val="000000"/>
         </w:rPr>
-        <w:t xml:space="preserve">The project connects inspection evidence to crew planning while allowing human correction and retaining a record of decisions. Operational deployment requires validated rules, measured service assumptions and further field evaluation.</w:t>
+        <w:t>The project connects inspection evidence to crew planning while allowing human correction and retaining a record of decisions.</w:t>
       </w:r>
     </w:p>
     <w:p>
@@ -465,7 +477,7 @@
         <w:tab/>
       </w:r>
       <w:r>
-        <w:t>4</w:t>
+        <w:t>3</w:t>
       </w:r>
     </w:p>
     <w:p>
@@ -492,7 +504,7 @@
         <w:tab/>
       </w:r>
       <w:r>
-        <w:t>6</w:t>
+        <w:t>5</w:t>
       </w:r>
     </w:p>
     <w:p>
@@ -519,7 +531,7 @@
         <w:tab/>
       </w:r>
       <w:r>
-        <w:t>6</w:t>
+        <w:t>5</w:t>
       </w:r>
     </w:p>
     <w:p>
@@ -546,7 +558,7 @@
         <w:tab/>
       </w:r>
       <w:r>
-        <w:t>6</w:t>
+        <w:t>5</w:t>
       </w:r>
     </w:p>
     <w:p>
@@ -573,7 +585,7 @@
         <w:tab/>
       </w:r>
       <w:r>
-        <w:t>8</w:t>
+        <w:t>7</w:t>
       </w:r>
     </w:p>
     <w:p>
@@ -600,7 +612,7 @@
         <w:tab/>
       </w:r>
       <w:r>
-        <w:t>11</w:t>
+        <w:t>10</w:t>
       </w:r>
     </w:p>
     <w:p>
@@ -627,7 +639,7 @@
         <w:tab/>
       </w:r>
       <w:r>
-        <w:t>11</w:t>
+        <w:t>10</w:t>
       </w:r>
     </w:p>
     <w:p>
@@ -654,7 +666,7 @@
         <w:tab/>
       </w:r>
       <w:r>
-        <w:t>12</w:t>
+        <w:t>11</w:t>
       </w:r>
     </w:p>
     <w:p>
@@ -681,7 +693,7 @@
         <w:tab/>
       </w:r>
       <w:r>
-        <w:t>14</w:t>
+        <w:t>13</w:t>
       </w:r>
     </w:p>
     <w:p>
@@ -708,7 +720,7 @@
         <w:tab/>
       </w:r>
       <w:r>
-        <w:t>14</w:t>
+        <w:t>13</w:t>
       </w:r>
     </w:p>
     <w:p>
@@ -735,7 +747,7 @@
         <w:tab/>
       </w:r>
       <w:r>
-        <w:t>17</w:t>
+        <w:t>16</w:t>
       </w:r>
     </w:p>
     <w:p>
@@ -762,7 +774,7 @@
         <w:tab/>
       </w:r>
       <w:r>
-        <w:t>19</w:t>
+        <w:t>17</w:t>
       </w:r>
     </w:p>
     <w:p>
@@ -789,7 +801,7 @@
         <w:tab/>
       </w:r>
       <w:r>
-        <w:t>21</w:t>
+        <w:t>20</w:t>
       </w:r>
     </w:p>
     <w:p>
@@ -816,7 +828,7 @@
         <w:tab/>
       </w:r>
       <w:r>
-        <w:t>21</w:t>
+        <w:t>20</w:t>
       </w:r>
     </w:p>
     <w:p>
@@ -843,7 +855,7 @@
         <w:tab/>
       </w:r>
       <w:r>
-        <w:t>22</w:t>
+        <w:t>21</w:t>
       </w:r>
     </w:p>
     <w:p>
@@ -870,7 +882,7 @@
         <w:tab/>
       </w:r>
       <w:r>
-        <w:t>23</w:t>
+        <w:t>22</w:t>
       </w:r>
     </w:p>
     <w:p>
@@ -897,7 +909,7 @@
         <w:tab/>
       </w:r>
       <w:r>
-        <w:t>23</w:t>
+        <w:t>22</w:t>
       </w:r>
     </w:p>
     <w:p>
@@ -924,7 +936,7 @@
         <w:tab/>
       </w:r>
       <w:r>
-        <w:t>23</w:t>
+        <w:t>22</w:t>
       </w:r>
     </w:p>
     <w:p>
@@ -951,7 +963,7 @@
         <w:tab/>
       </w:r>
       <w:r>
-        <w:t>25</w:t>
+        <w:t>24</w:t>
       </w:r>
     </w:p>
     <w:p>
@@ -978,7 +990,7 @@
         <w:tab/>
       </w:r>
       <w:r>
-        <w:t>25</w:t>
+        <w:t>24</w:t>
       </w:r>
     </w:p>
     <w:p>
@@ -1005,7 +1017,7 @@
         <w:tab/>
       </w:r>
       <w:r>
-        <w:t>25</w:t>
+        <w:t>24</w:t>
       </w:r>
     </w:p>
     <w:p>
@@ -1032,7 +1044,7 @@
         <w:tab/>
       </w:r>
       <w:r>
-        <w:t>27</w:t>
+        <w:t>26</w:t>
       </w:r>
     </w:p>
     <w:p>
@@ -1059,7 +1071,7 @@
         <w:tab/>
       </w:r>
       <w:r>
-        <w:t>27</w:t>
+        <w:t>26</w:t>
       </w:r>
     </w:p>
     <w:p>
@@ -1086,7 +1098,7 @@
         <w:tab/>
       </w:r>
       <w:r>
-        <w:t>29</w:t>
+        <w:t>28</w:t>
       </w:r>
     </w:p>
     <w:p>
@@ -1113,7 +1125,7 @@
         <w:tab/>
       </w:r>
       <w:r>
-        <w:t>30</w:t>
+        <w:t>29</w:t>
       </w:r>
     </w:p>
     <w:p>
@@ -1140,7 +1152,7 @@
         <w:tab/>
       </w:r>
       <w:r>
-        <w:t>31</w:t>
+        <w:t>30</w:t>
       </w:r>
     </w:p>
     <w:p>
@@ -1167,7 +1179,7 @@
         <w:tab/>
       </w:r>
       <w:r>
-        <w:t>44</w:t>
+        <w:t>43</w:t>
       </w:r>
     </w:p>
     <w:p>
@@ -1188,8 +1200,8 @@
         <w:pageBreakBefore w:val="0"/>
         <w:jc w:val="left"/>
       </w:pPr>
-      <w:bookmarkStart w:id="2" w:name="RGCurrentHeading1"/>
-      <w:bookmarkStart w:id="3" w:name="_RGI_2"/>
+      <w:bookmarkStart w:id="2" w:name="_RGI_2"/>
+      <w:bookmarkStart w:id="3" w:name="RGCurrentHeading1"/>
       <w:r>
         <w:t>1 Introduction</w:t>
       </w:r>
@@ -1216,6 +1228,12 @@
       </w:r>
     </w:p>
     <w:p>
+      <w:pPr>
+        <w:rPr>
+          <w:rFonts w:hint="eastAsia" w:eastAsia="宋体"/>
+          <w:lang w:val="en-US" w:eastAsia="zh-CN"/>
+        </w:rPr>
+      </w:pPr>
       <w:r>
         <w:t xml:space="preserve">Singapore’s Land Transport Authority describes manual inspection and reporting as labour-intensive and dependent on inspectors’ judgement. Its published account of AI-assisted inspection and GeoFormSG also identifies the effort required to transfer location coordinates between applications. </w:t>
       </w:r>
@@ -1223,12 +1241,32 @@
         <w:rPr>
           <w:rFonts w:hint="eastAsia"/>
         </w:rPr>
-        <w:t xml:space="preserve">These observations highlight a practical challenge in Singapore's existing road inspection process. We developed RoadGuard as an independent prototype; it is not integrated with LTA systems.</w:t>
+        <w:t>These observations highlight a practical challenge in Singapore's existing road inspection process. We developed RoadGuard as an independent prototype</w:t>
+      </w:r>
+      <w:r>
+        <w:rPr>
+          <w:rFonts w:hint="eastAsia"/>
+          <w:lang w:val="en-US" w:eastAsia="zh-CN"/>
+        </w:rPr>
+        <w:t>.(System</w:t>
+      </w:r>
+      <w:r>
+        <w:rPr>
+          <w:rFonts w:hint="eastAsia"/>
+        </w:rPr>
+        <w:t xml:space="preserve"> is not integrated with LTA systems</w:t>
+      </w:r>
+      <w:r>
+        <w:rPr>
+          <w:rFonts w:hint="eastAsia"/>
+          <w:lang w:val="en-US" w:eastAsia="zh-CN"/>
+        </w:rPr>
+        <w:t>)</w:t>
       </w:r>
     </w:p>
     <w:p>
       <w:r>
-        <w:t>The project aims to connect inspectors, dispatchers and crews through one traceable workflow. Inspectors submit evidence, dispatchers correct and prioritise observations, and crews consult assigned work and record completion. The intended value is less repeated data handling and clearer allocation decisions. These benefits require later user and operational evaluation; they are not measured financial savings.</w:t>
+        <w:t>The project aims to connect inspectors, dispatchers and crews through one traceable workflow. Inspectors submit evidence, dispatchers correct and prioritise observations, and crews consult assigned work and record completion. The intended value is less repeated data handling and clearer allocation decisions.</w:t>
       </w:r>
     </w:p>
     <w:p>
@@ -1247,12 +1285,12 @@
     </w:p>
     <w:p>
       <w:r>
-        <w:t xml:space="preserve">Arya et al.’s RDD2022 benchmark contains 47,420 images from six countries and covers four damage families. RoadGuard uses the separately published eight-class RDD2022ES derivative. This dataset provides training material but does not establish performance in Singapore or determine repair priorities. Redmon et al.’s YOLO work provides the methodological basis for predicting bounding boxes and classes jointly. Our implemented detector uses the later Ultralytics YOLO11, which we selected through project experiments.</w:t>
+        <w:t>Arya et al.’s RDD2022 benchmark contains 47,420 images from six countries and covers four damage families. RoadGuard uses the separately published eight-class RDD2022ES derivative. Redmon et al.’s YOLO work provides the methodological basis for predicting bounding boxes and classes jointly. Our implemented detector uses the later Ultralytics YOLO11, which we selected through project experiments.</w:t>
       </w:r>
     </w:p>
     <w:p>
       <w:r>
-        <w:t xml:space="preserve">For scheduling, Vidal’s research on hybrid genetic search illustrates the value of combining evolutionary search with local improvement in capacitated routing. RoadGuard uses a smaller custom GA rather than Vidal’s HGS or SWAP* method. A deterministic Greedy baseline provides a transparent basis for comparison. Our contribution is the combination of learned perception, editable rules, human correction and evaluated crew planning, rather than a new detector architecture or search algorithm. Compared with an inspection-only tool, RoadGuard extends the workflow from accepted evidence to repair allocation and completion.</w:t>
+        <w:t>For scheduling, Vidal’s research on hybrid genetic search illustrates the value of combining evolutionary search with local improvement in capacitated routing. RoadGuard uses a smaller custom GA rather than Vidal’s HGS or SWAP* method. A deterministic Greedy baseline provides a transparent basis for comparison. Our contribution is the combination of learned perception, editable rules, human correction and evaluated crew planning, rather than a new detector architecture or search algorithm. Compared with an inspection-only tool, RoadGuard extends the workflow from accepted evidence to repair allocation and completion.</w:t>
       </w:r>
     </w:p>
     <w:p>
@@ -1261,8 +1299,8 @@
         <w:pageBreakBefore w:val="0"/>
         <w:jc w:val="left"/>
       </w:pPr>
-      <w:bookmarkStart w:id="8" w:name="RGCurrentHeading4"/>
-      <w:bookmarkStart w:id="9" w:name="_RGI_5"/>
+      <w:bookmarkStart w:id="8" w:name="_RGI_5"/>
+      <w:bookmarkStart w:id="9" w:name="RGCurrentHeading4"/>
       <w:r>
         <w:t>1.3 Scope and Project Evolution</w:t>
       </w:r>
@@ -1274,7 +1312,7 @@
         <w:rPr>
           <w:color w:val="000000"/>
         </w:rPr>
-        <w:t xml:space="preserve">Four crews serve eligible public motor roads in Jurong East and Jurong West within the frozen URA Master Plan 2025 boundaries, using a simulated NUS-ISS origin. Expressway mainlines and ramps, as well as private or restricted roads, are excluded. The backend checks whether a location falls within the permitted area, while users declare the road type. This is not an actual NUS-ISS maintenance operation.</w:t>
+        <w:t>Four crews serve eligible public motor roads in Jurong East and Jurong West within the frozen URA Master Plan 2025 boundaries, using a simulated NUS-ISS origin. Expressway mainlines and ramps, as well as private or restricted roads, are excluded. The backend checks whether a location falls within the permitted area, while users declare the road type.</w:t>
       </w:r>
     </w:p>
     <w:p>
@@ -1282,14 +1320,13 @@
         <w:rPr>
           <w:color w:val="000000"/>
         </w:rPr>
-        <w:t xml:space="preserve">The workflow covers primary damage detection, confidence-based review, rule-based task creation, comparative scheduling and crew completion. Accepted inspections trigger automatic planning attempts, while other changes require explicit replanning. The dispatcher assistant also provides answers grounded in evidence and supports confirmed adjustments. Table 1 compares the delivered scope with the submitted proposal in Appendix B. The restriction to Jurong and the use of four crews follow presentation feedback; the other changes reflect implementation decisions or gaps in evaluation.</w:t>
+        <w:t>The workflow covers primary damage detection, confidence-based review, rule-based task creation, comparative scheduling and crew completion. Accepted inspections trigger automatic planning attempts, while other changes require explicit replanning. The dispatcher assistant also provides answers grounded in evidence and supports confirmed adjustments. Table 1 compares the delivered scope with the submitted proposal in Appendix B. The restriction to Jurong and the use of four crews follow presentation feedback; the other changes reflect implementation decisions or gaps in evaluation.</w:t>
       </w:r>
     </w:p>
     <w:p>
       <w:pPr>
         <w:pStyle w:val="164"/>
         <w:keepNext/>
-        <w:pageBreakBefore w:val="1"/>
       </w:pPr>
       <w:r>
         <w:t>Table 1. Changes from the original project plan</w:t>
@@ -1760,7 +1797,7 @@
                 <w:color w:val="000000"/>
                 <w:sz w:val="21"/>
               </w:rPr>
-              <w:t xml:space="preserve">Accepted uploads and review confirmations or corrections trigger a planning attempt after the task is committed; other changes require explicit recalculation</w:t>
+              <w:t>Accepted uploads and review confirmations or corrections trigger a planning attempt after the task is committed; other changes require explicit recalculation</w:t>
             </w:r>
           </w:p>
         </w:tc>
@@ -1872,7 +1909,7 @@
                 <w:color w:val="000000"/>
                 <w:sz w:val="21"/>
               </w:rPr>
-              <w:t xml:space="preserve">Optional Google travel matrix; simulated travel by default; schematic SVG map</w:t>
+              <w:t>Optional Google travel matrix; simulated travel by default; schematic SVG map</w:t>
             </w:r>
           </w:p>
         </w:tc>
@@ -2208,7 +2245,7 @@
                 <w:color w:val="000000"/>
                 <w:sz w:val="21"/>
               </w:rPr>
-              <w:t xml:space="preserve">Authenticated roles; inspectors restricted to their own inspections and crew accounts to their fixed crew</w:t>
+              <w:t>Authenticated roles; inspectors restricted to their own inspections and crew accounts to their fixed crew</w:t>
             </w:r>
           </w:p>
         </w:tc>
@@ -2216,23 +2253,12 @@
     </w:tbl>
     <w:p>
       <w:pPr>
-        <w:spacing w:before="120"/>
-      </w:pPr>
-      <w:r>
-        <w:rPr>
-          <w:color w:val="000000"/>
-        </w:rPr>
-        <w:t xml:space="preserve">The configurable 480-minute shift and the requirement to return to the depot remain unapproved operational assumptions. GPT/RAG and the preview–confirm–replan workflow are implemented, but targeted acceptance tests do not establish completion of the full question-and-change evaluation proposed in Appendix B.</w:t>
-      </w:r>
-    </w:p>
-    <w:p>
-      <w:pPr>
         <w:pStyle w:val="3"/>
         <w:pageBreakBefore/>
         <w:jc w:val="left"/>
       </w:pPr>
-      <w:bookmarkStart w:id="10" w:name="RGCurrentHeading5"/>
-      <w:bookmarkStart w:id="11" w:name="_RGI_6"/>
+      <w:bookmarkStart w:id="10" w:name="_RGI_6"/>
+      <w:bookmarkStart w:id="11" w:name="RGCurrentHeading5"/>
       <w:r>
         <w:t>2 Data and Knowledge Preparation</w:t>
       </w:r>
@@ -2244,15 +2270,15 @@
         <w:rPr>
           <w:rFonts w:hint="eastAsia"/>
         </w:rPr>
-        <w:t xml:space="preserve">We used version 1 of the RDD2022ES dataset and retained its eight damage classes throughout model development.</w:t>
-      </w:r>
-      <w:r>
-        <w:t xml:space="preserve"> Our preparation pipeline decodes images and checks annotation coordinates and class IDs. It sets aside groups with missing labels or uncertain orientation, and records these decisions in exclusion manifests and file hashes. The publisher’s conflicting licence statements remain unresolved for prospective commercial reuse.</w:t>
+        <w:t>We used version 1 of the RDD2022ES dataset and retained its eight damage classes throughout model development.</w:t>
+      </w:r>
+      <w:r>
+        <w:t xml:space="preserve"> Our preparation pipeline decodes images and checks annotation coordinates and class IDs. It sets aside groups with missing labels or uncertain orientation, and records these decisions in exclusion manifests and file hashes. </w:t>
       </w:r>
     </w:p>
     <w:p>
       <w:r>
-        <w:t xml:space="preserve">We group original images with their mirrors before splitting the data, and use exact and conservative perceptual similarity checks to link other related images. We then allocate groups by country using seed 42 and approximate proportions of 70/15/15. Training includes mirrors, while validation and test use only original images. This procedure limits known duplicate leakage, but without sequence or location metadata it cannot establish that adjacent scenes are independent.</w:t>
+        <w:t>We group original images with their mirrors before splitting the data, and use exact and conservative perceptual similarity checks to link other related images. We then allocate groups by country using seed 42 and approximate proportions of 70/15/15. Training includes mirrors, while validation and test use only original images. This procedure limits known duplicate leakage, but without sequence or location metadata it cannot establish that adjacent scenes are independent.</w:t>
       </w:r>
     </w:p>
     <w:p>
@@ -3008,7 +3034,7 @@
         <w:spacing w:before="120"/>
       </w:pPr>
       <w:r>
-        <w:t xml:space="preserve">Only the historical YOLO11n 10-epoch baseline has a recorded test-set evaluation. We reused validation data for subsequent model and policy selection. The research photographs come from foreign sources. The synthetic Jurong task coordinates are separate scheduling inputs and do not establish where any photograph was captured.</w:t>
+        <w:t>The research photographs come from foreign sources. The synthetic Jurong task coordinates are separate scheduling inputs and do not establish where any photograph was captured.</w:t>
       </w:r>
     </w:p>
     <w:p>
@@ -3016,7 +3042,7 @@
         <w:rPr>
           <w:color w:val="000000"/>
         </w:rPr>
-        <w:t xml:space="preserve">Versioned business rules specify severity, priority, service time in minutes and explanations. The a-knowledge-v19 package records the reviewed scope, label meanings, rules and workflows, together with hashes of its sources. We index it locally in ChromaDB using multilingual-e5-small embeddings. The package was checked against repository content but has not been approved by engineering experts. Only reviewed static documents enter the index; facts from saved plans are obtained separately with authorization checks. The visual qualifiers “wide”, “sunken” and “deep” are categorical labels rather than measurements of width, depth or structural condition.</w:t>
+        <w:t>Versioned business rules specify severity, priority, service time in minutes and explanations. The a-knowledge-v19 package records the reviewed scope, label meanings, rules and workflows, together with hashes of its sources. We index it locally in ChromaDB using multilingual-e5-small embeddings. The package was checked against repository content. Only reviewed static documents enter the index; facts from saved plans are obtained separately with authorization checks. The visual qualifiers “wide”, “sunken” and “deep” are categorical labels rather than measurements of width, depth or structural condition.</w:t>
       </w:r>
     </w:p>
     <w:p>
@@ -4363,7 +4389,7 @@
         <w:spacing w:before="120"/>
       </w:pPr>
       <w:r>
-        <w:t xml:space="preserve">Confidence determines whether an observation is accepted, while the selected label determines the rule outcome. An incorrect label with high confidence can therefore create an incorrect task. Service times are project assumptions rather than measured construction standards.</w:t>
+        <w:t>Confidence determines whether an observation is accepted, while the selected label determines the rule outcome. An incorrect label with high confidence can therefore create an incorrect task. Service times are project assumptions rather than measured construction standards.</w:t>
       </w:r>
     </w:p>
     <w:p>
@@ -4372,8 +4398,8 @@
         <w:pageBreakBefore/>
         <w:jc w:val="left"/>
       </w:pPr>
-      <w:bookmarkStart w:id="12" w:name="_RGI_7"/>
-      <w:bookmarkStart w:id="13" w:name="RGCurrentHeading6"/>
+      <w:bookmarkStart w:id="12" w:name="RGCurrentHeading6"/>
+      <w:bookmarkStart w:id="13" w:name="_RGI_7"/>
       <w:r>
         <w:t>3 System Design and Implementation</w:t>
       </w:r>
@@ -4399,7 +4425,7 @@
         <w:rPr>
           <w:color w:val="000000"/>
         </w:rPr>
-        <w:t xml:space="preserve">The React frontend connects to one FastAPI backend and a shared SQLite database. Separate services handle vision, rules, inspections, tasks, crews and planning. YOLO predicts the damage class and its location within the image for review. Repair policy is held in explicit rules, so it can change without retraining the model. The GA searches for suitable task assignments and visit orders, while Greedy provides a baseline and an initial solution.</w:t>
+        <w:t>The React frontend connects to one FastAPI backend and a shared SQLite database. Separate services handle vision, rules, inspections, tasks, crews and planning. YOLO predicts the damage class and its location within the image for review. Repair policy is held in explicit rules, so it can change without retraining the model. The GA searches for suitable task assignments and visit orders, while Greedy provides a baseline and an initial solution.</w:t>
       </w:r>
     </w:p>
     <w:p>
@@ -4480,7 +4506,7 @@
         <w:rPr>
           <w:color w:val="000000"/>
         </w:rPr>
-        <w:t xml:space="preserve">Note. Questions do not change business records. Dispatchers must confirm proposed adjustments and explicitly recalculate the affected routes. Source checks and validation of specific answer fields reduce unsupported output but cannot guarantee that every answer is semantically correct.</w:t>
+        <w:t>Note. Questions do not change business records. Dispatchers must confirm proposed adjustments and explicitly recalculate the affected routes.</w:t>
       </w:r>
     </w:p>
     <w:p>
@@ -4489,17 +4515,23 @@
         <w:pageBreakBefore w:val="0"/>
         <w:jc w:val="left"/>
       </w:pPr>
-      <w:bookmarkStart w:id="16" w:name="RGCurrentHeading8"/>
-      <w:bookmarkStart w:id="17" w:name="_RGI_9"/>
-      <w:r>
-        <w:t xml:space="preserve">3.2 Detection Decisions and Route Scheduling</w:t>
+      <w:bookmarkStart w:id="16" w:name="_RGI_9"/>
+      <w:bookmarkStart w:id="17" w:name="RGCurrentHeading8"/>
+      <w:r>
+        <w:t>3.2 Detection Decisions and Route Scheduling</w:t>
       </w:r>
       <w:bookmarkEnd w:id="16"/>
       <w:bookmarkEnd w:id="17"/>
     </w:p>
     <w:p>
       <w:r>
-        <w:t xml:space="preserve">The backend checks the local model manifest, weight hash and eight-class schema. Inference filters candidates at confidence 0.20. It ranks primary-box candidates by confidence multiplied by the fourth root of the fraction of image area they occupy; this ranking score does not replace raw confidence. A primary observation with raw confidence of at least 0.60 automatically creates one task. Lower confidence requires review, and no detection creates no task. The system retains raw evidence, the rule snapshot and review history. Corrections use the frozen rules, and idempotent requests prevent duplicate tasks.</w:t>
+        <w:rPr>
+          <w:rFonts w:hint="eastAsia"/>
+        </w:rPr>
+        <w:t>Before loading the model, the backend verifies that its configuration, weight file and eight damage-class labels match the expected definitions, including the mapping between class IDs and labels.</w:t>
+      </w:r>
+      <w:r>
+        <w:t xml:space="preserve"> Inference filters candidates at confidence 0.20. It ranks primary-box candidates by confidence multiplied by the fourth root of the fraction of image area they occupy; this ranking score does not replace raw confidence. A primary observation with raw confidence of at least 0.60 automatically creates one task. Lower confidence requires review, and no detection creates no task. The system retains raw evidence, the rule snapshot and review history. Corrections use the frozen rules, and idempotent requests prevent duplicate tasks.</w:t>
       </w:r>
     </w:p>
     <w:p>
@@ -4507,7 +4539,27 @@
         <w:rPr>
           <w:color w:val="000000"/>
         </w:rPr>
-        <w:t xml:space="preserve">Both planners read the same active tasks, crew availability, travel matrix and constraints at a consistent revision. Greedy selects the earliest available crew, then selects a feasible task by priority and travel time. The GA represents each solution as a task permutation and a vector assigning tasks to crews. It explores alternatives through tournament selection, order-preserving crossover, reassignment, swap, reversal, relocation and elitism, while caching evaluations to avoid scoring the same solution twice.</w:t>
+        <w:t>Both planners read the same active tasks, crew availability, travel matrix and constraints at a consistent revision. Greedy selects the earliest available crew, then selects a feasible task by priority and travel time. The GA represents each solution as a task permutation and a vector assigning tasks to crews. It explores alternatives through tournament selection, order-preserving crossover, reassignment, swap, reversal, relocation and elitism, while caching evaluations to avoid scoring the same solution twice.</w:t>
+      </w:r>
+    </w:p>
+    <w:p>
+      <w:pPr>
+        <w:rPr>
+          <w:rFonts w:hint="eastAsia"/>
+          <w:color w:val="000000"/>
+        </w:rPr>
+      </w:pPr>
+      <w:r>
+        <w:rPr>
+          <w:rFonts w:hint="eastAsia"/>
+          <w:color w:val="000000"/>
+        </w:rPr>
+        <w:t>During route planning, the GA uses the Greedy solution as an initial candidate. We also evaluate a GA without this initial candidate to assess the benefit of Greedy seeding. Both the Greedy and GA planners respect saved task-to-crew assignments, including after a system restart or when new tasks trigger recalculation. If the assigned crew is unavailable or cannot accommodate the task within the planning constraints, the task is marked as unassigned. It is not automatically transferred to another crew.</w:t>
+      </w:r>
+    </w:p>
+    <w:p>
+      <w:r>
+        <w:t>The planners compare candidates in order of unassigned P1 tasks, then unassigned P2 tasks, then unassigned P3 tasks. Only when these counts are equal do they minimise J = makespan + 0.2 × total travel + 0.5 × workload standard deviation + 0.5 × priority-weighted mean completion time. This ordering gives task coverage precedence over the weighted objective. Makespan is the longest crew schedule, and workload standard deviation measures differences in work duration between crews. The final term averages task completion times using P1/P2/P3 weights of 3/2/1. All components use minutes, but J is a weighted score rather than elapsed time or money. Since tasks have no deadlines, priority-weighted completion does not measure lateness.</w:t>
       </w:r>
     </w:p>
     <w:p>
@@ -4515,28 +4567,37 @@
         <w:rPr>
           <w:color w:val="000000"/>
         </w:rPr>
-        <w:t>Online search includes the Greedy solution; we retain unseeded GA for experimental comparison. Both planners preserve durable task-to-crew constraints after a restart or the arrival of new tasks. If constrained work cannot be assigned because the crew is unavailable or the work is infeasible, it remains explicitly unassigned rather than being silently transferred to another crew.</w:t>
+        <w:t>Accepted uploads and review confirmations or corrections automatically trigger an attempt to plan with both GA and Greedy after the task is committed, using the same snapshot and matrix. Pending review, no detection and dismissal do not trigger planning. Completion, cancellation, crew changes and assistant confirmations require explicit replanning. Before saving the paired plans, the system rejects any input revision that has been superseded.</w:t>
       </w:r>
     </w:p>
     <w:p>
-      <w:r>
-        <w:t xml:space="preserve">The planners compare candidates in order of unassigned P1 tasks, then unassigned P2 tasks, then unassigned P3 tasks. Only when these counts are equal do they minimise J = makespan + 0.2 × total travel + 0.5 × workload standard deviation + 0.5 × priority-weighted mean completion time. This ordering gives task coverage precedence over the weighted objective. Makespan is the longest crew schedule, and workload standard deviation measures differences in work duration between crews. The final term averages task completion times using P1/P2/P3 weights of 3/2/1. All components use minutes, but J is a weighted score rather than elapsed time or money. Since tasks have no deadlines, priority-weighted completion does not measure lateness.</w:t>
+      <w:pPr>
+        <w:rPr>
+          <w:rFonts w:hint="eastAsia"/>
+          <w:color w:val="000000"/>
+        </w:rPr>
+      </w:pPr>
+      <w:r>
+        <w:rPr>
+          <w:rFonts w:hint="eastAsia"/>
+          <w:color w:val="000000"/>
+        </w:rPr>
+        <w:t>Since dispatchers can move tasks between crews, the system previews each proposed move to check that the revised schedule remains feasible. It keeps all other assigned tasks in place and checks whether travel, repair work and any required return journey fit within the shift limit. Once the dispatcher confirms the move, the new crew assignment is saved and respected in future planning. Cancelling a task removes it from active work but preserves its history.</w:t>
       </w:r>
     </w:p>
     <w:p>
+      <w:r>
+        <w:rPr>
+          <w:rFonts w:hint="eastAsia"/>
+          <w:color w:val="000000"/>
+        </w:rPr>
+        <w:t>The system prevents outdated previews, conflicting changes and repeated confirmations from causing unintended updates. It also checks user permissions and protects against unauthorised requests from other websites. After reassignment, the previous crew immediately loses access to the task and its inspection record and can no longer mark it as complete. The receiving crew gains access once a new GA route plan has been saved. Before recording task completion, the system checks that the task has not changed since the crew retrieved it.</w:t>
+      </w:r>
       <w:r>
         <w:rPr>
           <w:color w:val="000000"/>
         </w:rPr>
-        <w:t xml:space="preserve">Accepted uploads and review confirmations or corrections automatically trigger an attempt to plan with both GA and Greedy after the task is committed, using the same snapshot and matrix. Pending review, no detection and dismissal do not trigger planning. Completion, cancellation, crew changes and assistant confirmations require explicit replanning. Before saving the paired plans, the system rejects any input revision that has been superseded.</w:t>
-      </w:r>
-    </w:p>
-    <w:p>
-      <w:r>
-        <w:rPr>
-          <w:color w:val="000000"/>
-        </w:rPr>
-        <w:t>A move preview retains all other assigned tasks and checks travel, service and the configured return requirement against the shift limit. Confirmation stores a durable crew constraint. Cancellation retains history and removes the task from active work. The system explicitly handles stale or expired proposals, version conflicts and repeated confirmations, and enforces role and CSRF checks. Reassignment immediately revokes the previous crew’s access to the task and inspection and its permission to complete the task. The target crew gains access after a fresh GA plan is saved. Completion also checks the task version within the same transaction. The database schema is version 6.</w:t>
+        <w:t>.</w:t>
       </w:r>
     </w:p>
     <w:p>
@@ -4558,15 +4619,37 @@
         <w:rPr>
           <w:color w:val="000000"/>
         </w:rPr>
-        <w:t xml:space="preserve">The application supports uploads, inspection details, reviews, tasks, crew availability, route planning, algorithm comparison and a mobile crew workspace. Backend authorization enforces the role restrictions in Table 4 independently of the navigation shown to users. Authentication uses hashed passwords and sessions, with CSRF checks for modifying requests.</w:t>
+        <w:t>The application supports uploads, inspection details, reviews, tasks, crew availability, route planning, algorithm comparison and a mobile crew workspace. Backend authorization enforces the role restrictions in Table 4 independently of the navigation shown to users. Authentication uses hashed passwords and sessions, with CSRF checks for modifying requests.</w:t>
       </w:r>
     </w:p>
     <w:p>
+      <w:pPr>
+        <w:rPr>
+          <w:rFonts w:hint="eastAsia"/>
+          <w:color w:val="000000"/>
+        </w:rPr>
+      </w:pPr>
+      <w:r>
+        <w:rPr>
+          <w:rFonts w:hint="eastAsia"/>
+          <w:color w:val="000000"/>
+        </w:rPr>
+        <w:t>The Route assistant presents its answer in English first, with supporting sources available in a “View sources” section that is collapsed by default. It also displays the saved routes for all four crews and lets dispatchers preview task moves or cancellations before confirming them.</w:t>
+      </w:r>
+    </w:p>
+    <w:p>
+      <w:r>
+        <w:rPr>
+          <w:rFonts w:hint="eastAsia"/>
+          <w:color w:val="000000"/>
+        </w:rPr>
+        <w:t>When asked which model it uses, the assistant reads the model name directly from the backend settings without contacting the AI service or exposing sensitive information. For questions clearly outside the project’s scope, it explains what it can help with. Answers about repair rules and saved routes must be supported by relevant evidence and pass the system’s citation checks. If the question is unclear or the available evidence is insufficient, the assistant states this explicitly</w:t>
+      </w:r>
       <w:r>
         <w:rPr>
           <w:color w:val="000000"/>
         </w:rPr>
-        <w:t>Route assistant displays English answers before the View sources section, which is collapsed by default. It also presents four crew cards for saved routes, with previews for moving or cancelling tasks. Query-v3 returns model identity from non-secret backend configuration without calling the provider, gives explicit guidance for clearly unrelated questions, and applies strict evidence validation to repair and saved-route questions. It explicitly reports ambiguous or insufficient evidence.</w:t>
+        <w:t>.</w:t>
       </w:r>
     </w:p>
     <w:p>
@@ -4898,7 +4981,7 @@
                 <w:color w:val="000000"/>
                 <w:sz w:val="21"/>
               </w:rPr>
-              <w:t xml:space="preserve">Review inspections; manage tasks and crews; plan and compare routes; ask evidence questions; confirm adjustments</w:t>
+              <w:t>Review inspections; manage tasks and crews; plan and compare routes; ask evidence questions; confirm adjustments</w:t>
             </w:r>
           </w:p>
         </w:tc>
@@ -5051,21 +5134,26 @@
     </w:tbl>
     <w:p>
       <w:pPr>
-        <w:spacing w:before="120"/>
-      </w:pPr>
-      <w:r>
-        <w:t xml:space="preserve">Travel providers supply either simulated estimates based on geographic distance or optional Google estimates based on the road network. Estimates are validated and cached. A provider failure returns an error rather than silently changing the source. The interface displays routes as schematic segments rather than turn-by-turn road geometry, and shows stale plans, source information and reasons for unassigned tasks. Percentage comparisons require matching contexts and compatible sets of assigned tasks.</w:t>
-      </w:r>
-    </w:p>
-    <w:p>
-      <w:r>
         <w:rPr>
           <w:rFonts w:hint="eastAsia"/>
         </w:rPr>
-        <w:t>During integration testing, we discovered that loading the vision library unexpectedly replaced the image decoder used for uploads. As a result, malformed images triggered a server error instead of being rejected normally.</w:t>
-      </w:r>
-      <w:r>
-        <w:t xml:space="preserve"> Retaining the validated decoder reference and adding a regression case resolved the failure. This demonstrates the need to exercise the actual model together with the upload workflow.</w:t>
+      </w:pPr>
+      <w:r>
+        <w:rPr>
+          <w:rFonts w:hint="eastAsia"/>
+        </w:rPr>
+        <w:t>The saved routes discussed by the assistant depend on the travel estimates used during planning. These estimates come either from geographic distances or, when enabled, Google road-network data. The system checks and caches them for reuse. If the selected source fails, it reports an error rather than silently switching to another source. To help dispatchers interpret the results, the interface identifies the source, flags plans that need updating and explains why some tasks remain unassigned. Routes are shown as schematic connections between stops rather than detailed driving directions. Percentage comparisons between algorithms are shown only when the planning conditions and assigned workloads are comparable.</w:t>
+      </w:r>
+    </w:p>
+    <w:p>
+      <w:r>
+        <w:rPr>
+          <w:rFonts w:hint="eastAsia"/>
+        </w:rPr>
+        <w:t>We tested these features as part of the complete workflow, from image upload and damage detection to task creation, route planning and assistant queries. This integration testing also revealed an unexpected interaction between the vision library and the upload process. Loading the library replaced the image decoder used for uploads, causing malformed images to produce a server error instead of a normal rejection. We retained the original validated decoder and added a regression test to prevent the problem from recurring. This experience showed why testing individual components was not sufficient: we also needed to verify how they behaved when used together</w:t>
+      </w:r>
+      <w:r>
+        <w:t>.</w:t>
       </w:r>
     </w:p>
     <w:p>
@@ -5127,7 +5215,7 @@
         <w:t xml:space="preserve">Figure 2. </w:t>
       </w:r>
       <w:r>
-        <w:t>Dispatcher review interface showing a synthetic confidence case. Capture dated 19 October 2026; the current group is 37.</w:t>
+        <w:t>Dispatcher review interface showing a synthetic confidence case. Capture dated 19 October 2026.</w:t>
       </w:r>
     </w:p>
     <w:p>
@@ -5135,12 +5223,12 @@
         <w:pStyle w:val="165"/>
       </w:pPr>
       <w:r>
-        <w:t>Note. Recorded on 19 October 2026. The 42% result is a controlled review case rather than a model-accuracy measurement.</w:t>
+        <w:t>Note. The 42% result is a controlled review case rather than a model-accuracy measurement.</w:t>
       </w:r>
     </w:p>
     <w:p>
       <w:r>
-        <w:t xml:space="preserve">On mobile, crew accounts can sign out, see their fixed crew identity, view the current route and confirm task completion. Changing the URL cannot grant access to another crew’s work. Recorded browser checks at widths of 360 and 390 pixels found no horizontal overflow across the page as a whole.</w:t>
+        <w:t>On mobile, crew accounts can sign out, see their fixed crew identity, view the current route and confirm task completion. Changing the URL cannot grant access to another crew’s work. Recorded browser checks at widths of 360 and 390 pixels found no horizontal overflow across the page as a whole.</w:t>
       </w:r>
     </w:p>
     <w:p>
@@ -5232,7 +5320,7 @@
         <w:rPr>
           <w:color w:val="000000"/>
         </w:rPr>
-        <w:t xml:space="preserve">The methods serve different roles in the same workflow. YOLO supplies a predicted damage type and location, with uncertainty represented by its confidence score. Explicit rules translate accepted observations into repair tasks, and constrained search assigns those tasks to crews. The assistant retrieves reviewed knowledge and saved-plan facts to explain decisions, with optional language generation and checks against the cited evidence. Proposed adjustments still require validation and confirmation. Sections 3.1 and 3.2 describe how these steps interact, while Appendix C maps them to MR, RS and CGS and identifies the supporting evaluation and its limits.</w:t>
+        <w:t>The methods serve different roles in the same workflow. YOLO supplies a predicted damage type and location, with uncertainty represented by its confidence score. Explicit rules translate accepted observations into repair tasks, and constrained search assigns those tasks to crews. The assistant retrieves reviewed knowledge and saved-plan facts to explain decisions, with optional language generation and checks against the cited evidence. Sections 3.1 and 3.2 describe how these steps interact, while Appendix C maps them to MR, RS and CGS and identifies the supporting evaluation and its limits.</w:t>
       </w:r>
     </w:p>
     <w:p>
@@ -5505,7 +5593,45 @@
                 <w:color w:val="000000"/>
                 <w:sz w:val="21"/>
               </w:rPr>
-              <w:t xml:space="preserve">Data preparation and model experiments; business rules and shared backend; model release; integration, authentication and later interface refinement.</w:t>
+              <w:t>Data preparation and</w:t>
+            </w:r>
+            <w:r>
+              <w:rPr>
+                <w:rFonts w:hint="eastAsia"/>
+                <w:b w:val="0"/>
+                <w:color w:val="000000"/>
+                <w:sz w:val="21"/>
+                <w:lang w:val="en-US" w:eastAsia="zh-CN"/>
+              </w:rPr>
+              <w:t xml:space="preserve"> YOLO</w:t>
+            </w:r>
+            <w:r>
+              <w:rPr>
+                <w:rFonts w:ascii="Times New Roman" w:hAnsi="Times New Roman"/>
+                <w:b w:val="0"/>
+                <w:color w:val="000000"/>
+                <w:sz w:val="21"/>
+              </w:rPr>
+              <w:t xml:space="preserve"> model experiments</w:t>
+            </w:r>
+            <w:r>
+              <w:rPr>
+                <w:rFonts w:hint="eastAsia"/>
+                <w:b w:val="0"/>
+                <w:color w:val="000000"/>
+                <w:sz w:val="21"/>
+                <w:lang w:val="en-US" w:eastAsia="zh-CN"/>
+              </w:rPr>
+              <w:t xml:space="preserve"> and training</w:t>
+            </w:r>
+            <w:r>
+              <w:rPr>
+                <w:rFonts w:ascii="Times New Roman" w:hAnsi="Times New Roman"/>
+                <w:b w:val="0"/>
+                <w:color w:val="000000"/>
+                <w:sz w:val="21"/>
+              </w:rPr>
+              <w:t>; business rules and shared backend; model release; integration, authentication and later interface refinement.</w:t>
             </w:r>
           </w:p>
         </w:tc>
@@ -5625,7 +5751,7 @@
                 <w:color w:val="000000"/>
                 <w:sz w:val="21"/>
               </w:rPr>
-              <w:t xml:space="preserve">Greedy and GA planning for four crews; persistence of crew and plan records; Google matrix provider; routing experiments and ablation.</w:t>
+              <w:t>Greedy and GA planning for four crews; persistence of crew and plan records; Google matrix provider; routing experiments and ablation.</w:t>
             </w:r>
           </w:p>
         </w:tc>
@@ -5745,20 +5871,12 @@
                 <w:color w:val="000000"/>
                 <w:sz w:val="21"/>
               </w:rPr>
-              <w:t xml:space="preserve">Frontend foundation and workflow pages; map and comparison integration; assistant for retrieval and confirmed changes. Shared integration added vector-based grounding and persistent task adjustments.</w:t>
+              <w:t>Frontend foundation and workflow pages; map and comparison integration; assistant for retrieval and confirmed changes. Shared integration added vector-based grounding and persistent task adjustments.</w:t>
             </w:r>
           </w:p>
         </w:tc>
       </w:tr>
     </w:tbl>
-    <w:p>
-      <w:pPr>
-        <w:spacing w:before="120"/>
-      </w:pPr>
-      <w:r>
-        <w:t xml:space="preserve">The coordinator confirmed these responsibilities, and repository history corroborated them. Because commits were squashed, raw commit counts are unsuitable as measures of individual contribution.</w:t>
-      </w:r>
-    </w:p>
     <w:p>
       <w:pPr>
         <w:pStyle w:val="3"/>
@@ -5775,12 +5893,12 @@
     </w:p>
     <w:p>
       <w:r>
-        <w:t xml:space="preserve">We evaluated recognition quality, scheduling quality and workflow correctness separately. The paired YOLO11n/YOLO11s experiments used COCO-pretrained initialisation, 30 epochs, 640-pixel inputs, a batch size of 32, AdamW and seed 42. Subsequent YOLO11s fine-tuning used 40 additional epochs, 832-pixel inputs and a batch size of 16. Because multiple settings changed together, the resulting gains cannot be attributed to a single parameter.</w:t>
+        <w:t>We evaluated recognition quality, scheduling quality and workflow correctness separately. The paired YOLO11n/YOLO11s experiments used COCO-pretrained initialisation, 30 epochs, 640-pixel inputs, a batch size of 32, AdamW and seed 42. Subsequent YOLO11s fine-tuning used 40 additional epochs, 832-pixel inputs and a batch size of 16. Because multiple settings changed together, the resulting gains cannot be attributed to a single parameter.</w:t>
       </w:r>
     </w:p>
     <w:p>
       <w:r>
-        <w:t xml:space="preserve">We measure precision as TP/(TP+FP), recall as TP/(TP+FN), and F1 as their harmonic mean. TP, FP and FN denote true positives, false positives and false negatives. For box evaluation, a correct detection must have the right one of eight class labels and match an annotation at intersection over union (IoU) of at least 0.5. Each prediction and annotation can be matched only once. We pool the counts across images to calculate precision and recall; these results differ from the class-averaged values and mean average precision (mAP) reported by the native validator.</w:t>
+        <w:t>We measure precision as TP/(TP+FP), recall as TP/(TP+FN), and F1 as their harmonic mean. TP, FP and FN denote true positives, false positives and false negatives. For box evaluation, a correct detection must have the right one of eight class labels and match an annotation at intersection over union (IoU) of at least 0.5. Each prediction and annotation can be matched only once. We pool the counts across images to calculate precision and recall; these results differ from the class-averaged values and mean average precision (mAP) reported by the native validator.</w:t>
       </w:r>
     </w:p>
     <w:p>
@@ -5793,36 +5911,34 @@
     </w:p>
     <w:p>
       <w:r>
-        <w:t xml:space="preserve">We split the 1,230 images with zero or one annotation deterministically by source group into 853 calibration cases and 377 confirmation cases, and considered the 691 multi-object images separately. We compared eighty policies using only the calibration subset. Both subsets came from previously used validation data, so the confirmation subset is not an independent test. Macro F1 averages all eight classes, assigning zero to undefined class ratios, including the unsupported wide-transverse class in the confirmation subset.</w:t>
+        <w:t>We split the 1,230 images with zero or one annotation deterministically by source group into 853 calibration cases and 377 confirmation cases, and considered the 691 multi-object images separately. We compared eighty policies using only the calibration subset. Both subsets came from previously used validation data, so the confirmation subset is not an independent test. Macro F1 averages all eight classes, assigning zero to undefined class ratios, including the unsupported wide-transverse class in the confirmation subset.</w:t>
       </w:r>
     </w:p>
     <w:p>
       <w:pPr>
-        <w:pageBreakBefore w:val="1"/>
-      </w:pPr>
-      <w:r>
         <w:rPr>
           <w:rFonts w:hint="eastAsia"/>
         </w:rPr>
-        <w:t xml:space="preserve">For routing, we combined three task counts (10, 15 and 20), two travel-time sources (simulated and Google), and two shift constraints (480 minutes and unlimited), producing 12 scenarios with four crews.</w:t>
-      </w:r>
+      </w:pPr>
       <w:r>
         <w:rPr>
           <w:rFonts w:hint="eastAsia"/>
-          <w:lang w:val="en-US" w:eastAsia="zh-CN"/>
         </w:rPr>
-        <w:t xml:space="preserve"> </w:t>
-      </w:r>
-      <w:r>
-        <w:t xml:space="preserve">Each scenario includes one Greedy run, ten pure-GA runs and ten Greedy-seeded GA runs using seeds 1–10, plus 20 runs with a larger search budget using seeds 101–120. The experiments therefore contain 492 runs in total.</w:t>
+        <w:t>We evaluated the routing algorithms in 12 scenarios, each with four crews. The scenarios combined three workloads of 10, 15 or 20 tasks, two sources of travel-time estimates (simulated or Google), and two working-time settings (a 480-minute shift limit or no limit). For each scenario, we ran Greedy once and tested both GA approaches ten times using random seeds 1–10. One GA approach started without a Greedy solution, while the other included it as an initial candidate. We also performed 20 additional runs with more extensive searches, using seeds 101–120, to establish a reference for comparison. This produced 41 runs per scenario and 492 runs overall.</w:t>
       </w:r>
     </w:p>
     <w:p>
+      <w:r>
+        <w:rPr>
+          <w:rFonts w:hint="eastAsia"/>
+        </w:rPr>
+        <w:t>In the standard experiments, the GA maintained 60 candidate solutions and searched for up to 300 generations, stopping early if the best solution did not improve for 80 consecutive generations. The crossover and mutation probabilities were 0.9 and 0.3. Parents were selected through tournaments of three candidates, and the two best solutions were carried forward to the next generation. The reference runs increased the population to 150 candidates and allowed up to 1,000 generations, with early stopping after 300 generations without improvement. These runs alternated between starting with and without a Greedy solution. Within each scenario, all runs used the same task data, travel estimates, constraints and evaluation method to ensure a fair comparison</w:t>
+      </w:r>
       <w:r>
         <w:rPr>
           <w:color w:val="000000"/>
         </w:rPr>
-        <w:t>The default GA uses a population of 60 and runs for at most 300 generations, stopping after 80 generations without improvement. Its crossover and mutation probabilities are 0.9 and 0.3, respectively, with tournament size 3 and two elite solutions retained. The larger-budget reference runs use a population of 150, at most 1,000 generations and a stopping patience of 300 generations. They alternate between pure and Greedy-seeded initialisation. All runs within each scenario use identical inputs and the same evaluator.</w:t>
+        <w:t>.</w:t>
       </w:r>
     </w:p>
     <w:p>
@@ -5855,7 +5971,7 @@
     </w:p>
     <w:p>
       <w:r>
-        <w:t xml:space="preserve">In the paired 30-epoch comparison, we selected YOLO11s because it achieved higher validation mAP50–95. At confidence 0.25, however, it produced 107 more correct matches and 220 more false positives than YOLO11n. We measured warm CPU latency under matched conditions on 40 images, repeating the measurement three times. Median/P95 latency was 53.27/63.59 ms for n30 and 81.87/91.85 ms for s30. These timings include image preparation and inference but exclude cold loading, HTTP, database operations and task processing.</w:t>
+        <w:t>In the paired 30-epoch comparison, we selected YOLO11s because it achieved higher validation mAP50–95. At confidence 0.25, however, it produced 107 more correct matches and 220 more false positives than YOLO11n. We measured warm CPU latency under matched conditions on 40 images, repeating the measurement three times. Median/P95 latency was 53.27/63.59 ms for n30 and 81.87/91.85 ms for s30. These timings include image preparation and inference but exclude cold loading, HTTP, database operations and task processing.</w:t>
       </w:r>
     </w:p>
     <w:p>
@@ -6794,12 +6910,12 @@
         <w:pStyle w:val="165"/>
       </w:pPr>
       <w:r>
-        <w:t xml:space="preserve">Note. The model labels n10, n30 and s30 denote YOLO11n trained for 10 epochs, YOLO11n for 30 epochs and YOLO11s for 30 epochs. The n30 and s30 runs form the matched architecture comparison; n10 provides context. Native validation reports mAP50 and mAP50–95 as percentages. Precision and recall use eight-class, one-to-one matching at IoU ≥0.5 on 2,623 annotated boxes.</w:t>
+        <w:t>Note. The model labels n10, n30 and s30 denote YOLO11n trained for 10 epochs, YOLO11n for 30 epochs and YOLO11s for 30 epochs. The n30 and s30 runs form the matched architecture comparison; n10 provides context. Native validation reports mAP50 and mAP50–95 as percentages. Precision and recall use eight-class, one-to-one matching at IoU ≥0.5 on 2,623 annotated boxes.</w:t>
       </w:r>
     </w:p>
     <w:p>
       <w:r>
-        <w:t xml:space="preserve">Balanced fine-tuning produced modest gains. Combining predictions from each original image and its horizontal flip subsequently achieved box precision of 53.02% and recall of 53.26%. However, median CPU latency rose from 85.19 to 142.64 ms, and the 95th percentile rose from 99.00 to 160.94 ms. We did not deploy this combined method. The released single-v1 model uses the balanced weights and processes only the original image at 832 pixels. It selects the primary detection using the confidence-and-area score defined in Section 3.2.</w:t>
+        <w:t>Balanced fine-tuning produced modest gains. Combining predictions from each original image and its horizontal flip subsequently achieved box precision of 53.02% and recall of 53.26%. However, median CPU latency rose from 85.19 to 142.64 ms, and the 95th percentile rose from 99.00 to 160.94 ms. We did not deploy this combined method. The released single-v1 model uses the balanced weights and processes only the original image at 832 pixels. It selects the primary detection using the confidence-and-area score defined in Section 3.2.</w:t>
       </w:r>
     </w:p>
     <w:p>
@@ -6866,9 +6982,9 @@
           </w:tcPr>
           <w:p>
             <w:pPr>
+              <w:keepNext/>
               <w:spacing w:after="40" w:line="264" w:lineRule="auto"/>
               <w:jc w:val="left"/>
-              <w:keepNext w:val="1"/>
             </w:pPr>
             <w:r>
               <w:rPr>
@@ -6901,9 +7017,9 @@
           </w:tcPr>
           <w:p>
             <w:pPr>
+              <w:keepNext/>
               <w:spacing w:after="40" w:line="264" w:lineRule="auto"/>
               <w:jc w:val="left"/>
-              <w:keepNext w:val="1"/>
             </w:pPr>
             <w:r>
               <w:rPr>
@@ -6936,9 +7052,9 @@
           </w:tcPr>
           <w:p>
             <w:pPr>
+              <w:keepNext/>
               <w:spacing w:after="40" w:line="264" w:lineRule="auto"/>
               <w:jc w:val="left"/>
-              <w:keepNext w:val="1"/>
             </w:pPr>
             <w:r>
               <w:rPr>
@@ -6971,9 +7087,9 @@
           </w:tcPr>
           <w:p>
             <w:pPr>
+              <w:keepNext/>
               <w:spacing w:after="40" w:line="264" w:lineRule="auto"/>
               <w:jc w:val="left"/>
-              <w:keepNext w:val="1"/>
             </w:pPr>
             <w:r>
               <w:rPr>
@@ -7006,9 +7122,9 @@
           </w:tcPr>
           <w:p>
             <w:pPr>
+              <w:keepNext/>
               <w:spacing w:after="40" w:line="264" w:lineRule="auto"/>
               <w:jc w:val="left"/>
-              <w:keepNext w:val="1"/>
             </w:pPr>
             <w:r>
               <w:rPr>
@@ -7041,9 +7157,9 @@
           </w:tcPr>
           <w:p>
             <w:pPr>
+              <w:keepNext/>
               <w:spacing w:after="40" w:line="264" w:lineRule="auto"/>
               <w:jc w:val="left"/>
-              <w:keepNext w:val="1"/>
             </w:pPr>
             <w:r>
               <w:rPr>
@@ -7076,9 +7192,9 @@
           </w:tcPr>
           <w:p>
             <w:pPr>
+              <w:keepNext/>
               <w:spacing w:after="40" w:line="264" w:lineRule="auto"/>
               <w:jc w:val="left"/>
-              <w:keepNext w:val="1"/>
             </w:pPr>
             <w:r>
               <w:rPr>
@@ -7123,9 +7239,9 @@
           </w:tcPr>
           <w:p>
             <w:pPr>
+              <w:keepNext/>
               <w:spacing w:after="40" w:line="264" w:lineRule="auto"/>
               <w:jc w:val="left"/>
-              <w:keepNext w:val="1"/>
             </w:pPr>
             <w:r>
               <w:rPr>
@@ -7157,9 +7273,9 @@
           </w:tcPr>
           <w:p>
             <w:pPr>
+              <w:keepNext/>
               <w:spacing w:after="40" w:line="264" w:lineRule="auto"/>
               <w:jc w:val="center"/>
-              <w:keepNext w:val="1"/>
             </w:pPr>
             <w:r>
               <w:rPr>
@@ -7191,9 +7307,9 @@
           </w:tcPr>
           <w:p>
             <w:pPr>
+              <w:keepNext/>
               <w:spacing w:after="40" w:line="264" w:lineRule="auto"/>
               <w:jc w:val="center"/>
-              <w:keepNext w:val="1"/>
             </w:pPr>
             <w:r>
               <w:rPr>
@@ -7225,9 +7341,9 @@
           </w:tcPr>
           <w:p>
             <w:pPr>
+              <w:keepNext/>
               <w:spacing w:after="40" w:line="264" w:lineRule="auto"/>
               <w:jc w:val="center"/>
-              <w:keepNext w:val="1"/>
             </w:pPr>
             <w:r>
               <w:rPr>
@@ -7259,9 +7375,9 @@
           </w:tcPr>
           <w:p>
             <w:pPr>
+              <w:keepNext/>
               <w:spacing w:after="40" w:line="264" w:lineRule="auto"/>
               <w:jc w:val="center"/>
-              <w:keepNext w:val="1"/>
             </w:pPr>
             <w:r>
               <w:rPr>
@@ -7293,9 +7409,9 @@
           </w:tcPr>
           <w:p>
             <w:pPr>
+              <w:keepNext/>
               <w:spacing w:after="40" w:line="264" w:lineRule="auto"/>
               <w:jc w:val="center"/>
-              <w:keepNext w:val="1"/>
             </w:pPr>
             <w:r>
               <w:rPr>
@@ -7327,9 +7443,9 @@
           </w:tcPr>
           <w:p>
             <w:pPr>
+              <w:keepNext/>
               <w:spacing w:after="40" w:line="264" w:lineRule="auto"/>
               <w:jc w:val="center"/>
-              <w:keepNext w:val="1"/>
             </w:pPr>
             <w:r>
               <w:rPr>
@@ -7374,7 +7490,7 @@
           </w:tcPr>
           <w:p>
             <w:pPr>
-              <w:keepNext w:val="1"/>
+              <w:keepNext/>
               <w:spacing w:after="40" w:line="264" w:lineRule="auto"/>
               <w:jc w:val="left"/>
             </w:pPr>
@@ -7385,7 +7501,7 @@
                 <w:color w:val="000000"/>
                 <w:sz w:val="21"/>
               </w:rPr>
-              <w:t xml:space="preserve">Confidence-and-area selection, threshold 0.20</w:t>
+              <w:t>Confidence-and-area selection, threshold 0.20</w:t>
             </w:r>
           </w:p>
         </w:tc>
@@ -7408,7 +7524,7 @@
           </w:tcPr>
           <w:p>
             <w:pPr>
-              <w:keepNext w:val="1"/>
+              <w:keepNext/>
               <w:spacing w:after="40" w:line="264" w:lineRule="auto"/>
               <w:jc w:val="center"/>
             </w:pPr>
@@ -7442,7 +7558,7 @@
           </w:tcPr>
           <w:p>
             <w:pPr>
-              <w:keepNext w:val="1"/>
+              <w:keepNext/>
               <w:spacing w:after="40" w:line="264" w:lineRule="auto"/>
               <w:jc w:val="center"/>
             </w:pPr>
@@ -7476,7 +7592,7 @@
           </w:tcPr>
           <w:p>
             <w:pPr>
-              <w:keepNext w:val="1"/>
+              <w:keepNext/>
               <w:spacing w:after="40" w:line="264" w:lineRule="auto"/>
               <w:jc w:val="center"/>
             </w:pPr>
@@ -7510,7 +7626,7 @@
           </w:tcPr>
           <w:p>
             <w:pPr>
-              <w:keepNext w:val="1"/>
+              <w:keepNext/>
               <w:spacing w:after="40" w:line="264" w:lineRule="auto"/>
               <w:jc w:val="center"/>
             </w:pPr>
@@ -7544,7 +7660,7 @@
           </w:tcPr>
           <w:p>
             <w:pPr>
-              <w:keepNext w:val="1"/>
+              <w:keepNext/>
               <w:spacing w:after="40" w:line="264" w:lineRule="auto"/>
               <w:jc w:val="center"/>
             </w:pPr>
@@ -7600,12 +7716,12 @@
         <w:pStyle w:val="165"/>
       </w:pPr>
       <w:r>
-        <w:t xml:space="preserve">Note. These results use offline GPU exports verified by file hashes and include 171 positive images and 206 images with empty annotations. Localisation is not required for this metric. Macro F1 averages all eight classes, assigning zero to the class with no positive examples. The results reuse validation data; they do not represent a new CPU-service evaluation or a Jurong field test.</w:t>
+        <w:t>Note. These results use offline GPU exports verified by file hashes and include 171 positive images and 206 images with empty annotations. Localisation is not required for this metric. Macro F1 averages all eight classes, assigning zero to the class with no positive examples.</w:t>
       </w:r>
     </w:p>
     <w:p>
       <w:r>
-        <w:t xml:space="preserve">On the 377-image confirmation subset, the selected policy achieved image-type precision of 61.63% and recall of 61.99%, compared with 61.25% and 57.31% for confidence-only selection. It correctly classified eight more images but also produced four more false positives. When a correct detection also required localisation at IoU 0.5, precision and recall fell to 50.58% and 50.88%.</w:t>
+        <w:t>On the 377-image confirmation subset, the selected policy achieved image-type precision of 61.63% and recall of 61.99%, compared with 61.25% and 57.31% for confidence-only selection. It correctly classified eight more images but also produced four more false positives. When a correct detection also required localisation at IoU 0.5, precision and recall fell to 50.58% and 50.88%.</w:t>
       </w:r>
     </w:p>
     <w:p>
@@ -7618,7 +7734,7 @@
     </w:p>
     <w:p>
       <w:r>
-        <w:t xml:space="preserve">Both incorrect classification and missed or spurious detections contributed to the precision and recall of approximately 60%. Among 171 annotated positive images, the selected policy assigned the correct type to 106, assigned the wrong type to 31 and returned no detection for 34. It also returned predictions for 35 of the 206 images with empty annotations. These outcomes give 106 true positives, 66 false positives and 65 false negatives under the image-type metric. If evaluation considers only the presence of damage, precision rises to 79.65% and recall to 80.12% on the same images. This easier diagnostic does not establish recognition across the eight damage classes. Displaced boxes cannot explain the image-type shortfall because this metric does not require overlap.</w:t>
+        <w:t>Both incorrect classification and missed or spurious detections contributed to the precision and recall of approximately 60%. Among 171 annotated positive images, the selected policy assigned the correct type to 106, assigned the wrong type to 31 and returned no detection for 34. It also returned predictions for 35 of the 206 images with empty annotations. These outcomes give 106 true positives, 66 false positives and 65 false negatives under the image-type metric. If evaluation considers only the presence of damage, precision rises to 79.65% and recall to 80.12% on the same images. This easier diagnostic does not establish recognition across the eight damage classes. Displaced boxes cannot explain the image-type shortfall because this metric does not require overlap.</w:t>
       </w:r>
     </w:p>
     <w:p>
@@ -7682,9 +7798,9 @@
           </w:tcPr>
           <w:p>
             <w:pPr>
+              <w:keepNext/>
               <w:spacing w:after="40" w:line="264" w:lineRule="auto"/>
               <w:jc w:val="left"/>
-              <w:keepNext w:val="1"/>
             </w:pPr>
             <w:r>
               <w:rPr>
@@ -7717,9 +7833,9 @@
           </w:tcPr>
           <w:p>
             <w:pPr>
+              <w:keepNext/>
               <w:spacing w:after="40" w:line="264" w:lineRule="auto"/>
               <w:jc w:val="left"/>
-              <w:keepNext w:val="1"/>
             </w:pPr>
             <w:r>
               <w:rPr>
@@ -7752,9 +7868,9 @@
           </w:tcPr>
           <w:p>
             <w:pPr>
+              <w:keepNext/>
               <w:spacing w:after="40" w:line="264" w:lineRule="auto"/>
               <w:jc w:val="left"/>
-              <w:keepNext w:val="1"/>
             </w:pPr>
             <w:r>
               <w:rPr>
@@ -7787,9 +7903,9 @@
           </w:tcPr>
           <w:p>
             <w:pPr>
+              <w:keepNext/>
               <w:spacing w:after="40" w:line="264" w:lineRule="auto"/>
               <w:jc w:val="left"/>
-              <w:keepNext w:val="1"/>
             </w:pPr>
             <w:r>
               <w:rPr>
@@ -7834,9 +7950,9 @@
           </w:tcPr>
           <w:p>
             <w:pPr>
+              <w:keepNext/>
               <w:spacing w:after="40" w:line="264" w:lineRule="auto"/>
               <w:jc w:val="left"/>
-              <w:keepNext w:val="1"/>
             </w:pPr>
             <w:r>
               <w:rPr>
@@ -7868,9 +7984,9 @@
           </w:tcPr>
           <w:p>
             <w:pPr>
+              <w:keepNext/>
               <w:spacing w:after="40" w:line="264" w:lineRule="auto"/>
               <w:jc w:val="center"/>
-              <w:keepNext w:val="1"/>
             </w:pPr>
             <w:r>
               <w:rPr>
@@ -7902,9 +8018,9 @@
           </w:tcPr>
           <w:p>
             <w:pPr>
+              <w:keepNext/>
               <w:spacing w:after="40" w:line="264" w:lineRule="auto"/>
               <w:jc w:val="center"/>
-              <w:keepNext w:val="1"/>
             </w:pPr>
             <w:r>
               <w:rPr>
@@ -7936,9 +8052,9 @@
           </w:tcPr>
           <w:p>
             <w:pPr>
+              <w:keepNext/>
               <w:spacing w:after="40" w:line="264" w:lineRule="auto"/>
               <w:jc w:val="center"/>
-              <w:keepNext w:val="1"/>
             </w:pPr>
             <w:r>
               <w:rPr>
@@ -7983,9 +8099,9 @@
           </w:tcPr>
           <w:p>
             <w:pPr>
+              <w:keepNext/>
               <w:spacing w:after="40" w:line="264" w:lineRule="auto"/>
               <w:jc w:val="left"/>
-              <w:keepNext w:val="1"/>
             </w:pPr>
             <w:r>
               <w:rPr>
@@ -8017,9 +8133,9 @@
           </w:tcPr>
           <w:p>
             <w:pPr>
+              <w:keepNext/>
               <w:spacing w:after="40" w:line="264" w:lineRule="auto"/>
               <w:jc w:val="center"/>
-              <w:keepNext w:val="1"/>
             </w:pPr>
             <w:r>
               <w:rPr>
@@ -8051,9 +8167,9 @@
           </w:tcPr>
           <w:p>
             <w:pPr>
+              <w:keepNext/>
               <w:spacing w:after="40" w:line="264" w:lineRule="auto"/>
               <w:jc w:val="center"/>
-              <w:keepNext w:val="1"/>
             </w:pPr>
             <w:r>
               <w:rPr>
@@ -8085,9 +8201,9 @@
           </w:tcPr>
           <w:p>
             <w:pPr>
+              <w:keepNext/>
               <w:spacing w:after="40" w:line="264" w:lineRule="auto"/>
               <w:jc w:val="center"/>
-              <w:keepNext w:val="1"/>
             </w:pPr>
             <w:r>
               <w:rPr>
@@ -8132,9 +8248,9 @@
           </w:tcPr>
           <w:p>
             <w:pPr>
+              <w:keepNext/>
               <w:spacing w:after="40" w:line="264" w:lineRule="auto"/>
               <w:jc w:val="left"/>
-              <w:keepNext w:val="1"/>
             </w:pPr>
             <w:r>
               <w:rPr>
@@ -8166,9 +8282,9 @@
           </w:tcPr>
           <w:p>
             <w:pPr>
+              <w:keepNext/>
               <w:spacing w:after="40" w:line="264" w:lineRule="auto"/>
               <w:jc w:val="center"/>
-              <w:keepNext w:val="1"/>
             </w:pPr>
             <w:r>
               <w:rPr>
@@ -8200,9 +8316,9 @@
           </w:tcPr>
           <w:p>
             <w:pPr>
+              <w:keepNext/>
               <w:spacing w:after="40" w:line="264" w:lineRule="auto"/>
               <w:jc w:val="center"/>
-              <w:keepNext w:val="1"/>
             </w:pPr>
             <w:r>
               <w:rPr>
@@ -8234,9 +8350,9 @@
           </w:tcPr>
           <w:p>
             <w:pPr>
+              <w:keepNext/>
               <w:spacing w:after="40" w:line="264" w:lineRule="auto"/>
               <w:jc w:val="center"/>
-              <w:keepNext w:val="1"/>
             </w:pPr>
             <w:r>
               <w:rPr>
@@ -8281,9 +8397,9 @@
           </w:tcPr>
           <w:p>
             <w:pPr>
+              <w:keepNext/>
               <w:spacing w:after="40" w:line="264" w:lineRule="auto"/>
               <w:jc w:val="left"/>
-              <w:keepNext w:val="1"/>
             </w:pPr>
             <w:r>
               <w:rPr>
@@ -8315,9 +8431,9 @@
           </w:tcPr>
           <w:p>
             <w:pPr>
+              <w:keepNext/>
               <w:spacing w:after="40" w:line="264" w:lineRule="auto"/>
               <w:jc w:val="center"/>
-              <w:keepNext w:val="1"/>
             </w:pPr>
             <w:r>
               <w:rPr>
@@ -8349,9 +8465,9 @@
           </w:tcPr>
           <w:p>
             <w:pPr>
+              <w:keepNext/>
               <w:spacing w:after="40" w:line="264" w:lineRule="auto"/>
               <w:jc w:val="center"/>
-              <w:keepNext w:val="1"/>
             </w:pPr>
             <w:r>
               <w:rPr>
@@ -8383,9 +8499,9 @@
           </w:tcPr>
           <w:p>
             <w:pPr>
+              <w:keepNext/>
               <w:spacing w:after="40" w:line="264" w:lineRule="auto"/>
               <w:jc w:val="center"/>
-              <w:keepNext w:val="1"/>
             </w:pPr>
             <w:r>
               <w:rPr>
@@ -8430,9 +8546,9 @@
           </w:tcPr>
           <w:p>
             <w:pPr>
+              <w:keepNext/>
               <w:spacing w:after="40" w:line="264" w:lineRule="auto"/>
               <w:jc w:val="left"/>
-              <w:keepNext w:val="1"/>
             </w:pPr>
             <w:r>
               <w:rPr>
@@ -8464,9 +8580,9 @@
           </w:tcPr>
           <w:p>
             <w:pPr>
+              <w:keepNext/>
               <w:spacing w:after="40" w:line="264" w:lineRule="auto"/>
               <w:jc w:val="center"/>
-              <w:keepNext w:val="1"/>
             </w:pPr>
             <w:r>
               <w:rPr>
@@ -8498,9 +8614,9 @@
           </w:tcPr>
           <w:p>
             <w:pPr>
+              <w:keepNext/>
               <w:spacing w:after="40" w:line="264" w:lineRule="auto"/>
               <w:jc w:val="center"/>
-              <w:keepNext w:val="1"/>
             </w:pPr>
             <w:r>
               <w:rPr>
@@ -8532,9 +8648,9 @@
           </w:tcPr>
           <w:p>
             <w:pPr>
+              <w:keepNext/>
               <w:spacing w:after="40" w:line="264" w:lineRule="auto"/>
               <w:jc w:val="center"/>
-              <w:keepNext w:val="1"/>
             </w:pPr>
             <w:r>
               <w:rPr>
@@ -8579,9 +8695,9 @@
           </w:tcPr>
           <w:p>
             <w:pPr>
+              <w:keepNext/>
               <w:spacing w:after="40" w:line="264" w:lineRule="auto"/>
               <w:jc w:val="left"/>
-              <w:keepNext w:val="1"/>
             </w:pPr>
             <w:r>
               <w:rPr>
@@ -8613,9 +8729,9 @@
           </w:tcPr>
           <w:p>
             <w:pPr>
+              <w:keepNext/>
               <w:spacing w:after="40" w:line="264" w:lineRule="auto"/>
               <w:jc w:val="center"/>
-              <w:keepNext w:val="1"/>
             </w:pPr>
             <w:r>
               <w:rPr>
@@ -8647,9 +8763,9 @@
           </w:tcPr>
           <w:p>
             <w:pPr>
+              <w:keepNext/>
               <w:spacing w:after="40" w:line="264" w:lineRule="auto"/>
               <w:jc w:val="center"/>
-              <w:keepNext w:val="1"/>
             </w:pPr>
             <w:r>
               <w:rPr>
@@ -8681,9 +8797,9 @@
           </w:tcPr>
           <w:p>
             <w:pPr>
+              <w:keepNext/>
               <w:spacing w:after="40" w:line="264" w:lineRule="auto"/>
               <w:jc w:val="center"/>
-              <w:keepNext w:val="1"/>
             </w:pPr>
             <w:r>
               <w:rPr>
@@ -8728,9 +8844,9 @@
           </w:tcPr>
           <w:p>
             <w:pPr>
+              <w:keepNext/>
               <w:spacing w:after="40" w:line="264" w:lineRule="auto"/>
               <w:jc w:val="left"/>
-              <w:keepNext w:val="1"/>
             </w:pPr>
             <w:r>
               <w:rPr>
@@ -8762,9 +8878,9 @@
           </w:tcPr>
           <w:p>
             <w:pPr>
+              <w:keepNext/>
               <w:spacing w:after="40" w:line="264" w:lineRule="auto"/>
               <w:jc w:val="center"/>
-              <w:keepNext w:val="1"/>
             </w:pPr>
             <w:r>
               <w:rPr>
@@ -8796,9 +8912,9 @@
           </w:tcPr>
           <w:p>
             <w:pPr>
+              <w:keepNext/>
               <w:spacing w:after="40" w:line="264" w:lineRule="auto"/>
               <w:jc w:val="center"/>
-              <w:keepNext w:val="1"/>
             </w:pPr>
             <w:r>
               <w:rPr>
@@ -8830,9 +8946,9 @@
           </w:tcPr>
           <w:p>
             <w:pPr>
+              <w:keepNext/>
               <w:spacing w:after="40" w:line="264" w:lineRule="auto"/>
               <w:jc w:val="center"/>
-              <w:keepNext w:val="1"/>
             </w:pPr>
             <w:r>
               <w:rPr>
@@ -8877,7 +8993,7 @@
           </w:tcPr>
           <w:p>
             <w:pPr>
-              <w:keepNext w:val="1"/>
+              <w:keepNext/>
               <w:spacing w:after="40" w:line="264" w:lineRule="auto"/>
               <w:jc w:val="left"/>
             </w:pPr>
@@ -8911,7 +9027,7 @@
           </w:tcPr>
           <w:p>
             <w:pPr>
-              <w:keepNext w:val="1"/>
+              <w:keepNext/>
               <w:spacing w:after="40" w:line="264" w:lineRule="auto"/>
               <w:jc w:val="center"/>
             </w:pPr>
@@ -8945,7 +9061,7 @@
           </w:tcPr>
           <w:p>
             <w:pPr>
-              <w:keepNext w:val="1"/>
+              <w:keepNext/>
               <w:spacing w:after="40" w:line="264" w:lineRule="auto"/>
               <w:jc w:val="center"/>
             </w:pPr>
@@ -9001,12 +9117,12 @@
         <w:pStyle w:val="165"/>
       </w:pPr>
       <w:r>
-        <w:t xml:space="preserve">Note. These class results use all 1,230 eligible validation images, including calibration images. Support is the number of annotated positive images, rather than the number of boxes or independently captured scenes.</w:t>
+        <w:t>Note. These class results use all 1,230 eligible validation images, including calibration images. Support is the number of annotated positive images, rather than the number of boxes or independently captured scenes.</w:t>
       </w:r>
     </w:p>
     <w:p>
       <w:r>
-        <w:t xml:space="preserve">The class distribution and observed confusions identify areas for further investigation. The full eligible set contains 250 positive images of longitudinal cracks but only eight of deep potholes. The confirmation set contains no positive image of a wide transverse crack. In a separate box-level audit of the full validation set, 146 of 190 matched pairs with an incorrect class involved confusion between subtypes of the same damage family.</w:t>
+        <w:t>The class distribution and observed confusions identify areas for further investigation. The full eligible set contains 250 positive images of longitudinal cracks but only eight of deep potholes. The confirmation set contains no positive image of a wide transverse crack. In a separate box-level audit of the full validation set, 146 of 190 matched pairs with an incorrect class involved confusion between subtypes of the same damage family.</w:t>
       </w:r>
     </w:p>
     <w:p>
@@ -9014,17 +9130,17 @@
         <w:rPr>
           <w:color w:val="000000"/>
         </w:rPr>
-        <w:t>Recall was also lower for small annotated regions: 45.4% for regions covering less than 1% of image area, compared with 75.0% for those covering at least 20%. These findings support further analysis of subtypes and object scale. They do not establish that limited data or incorrect annotations caused all errors, and the audit confirmed no annotation defect.</w:t>
+        <w:t>Recall was also lower for small annotated regions: 45.4% for regions covering less than 1% of image area, compared with 75.0% for those covering at least 20%. These findings support further analysis of subtypes and object scale. The audit confirmed no annotation defect.</w:t>
       </w:r>
     </w:p>
     <w:p>
       <w:r>
-        <w:t xml:space="preserve">The model still labelled a known pothole photograph as an alligator crack, with confidence of approximately 0.253, so human correction was required. The comparisons show that increasing model capacity and relaxing filtering alone do not establish reliable recognition: selection rankings and thresholds trade false positives against missed detections. Phone photographs taken from a moderate distance introduce a further risk when transferring the model to local use, but this risk has not been measured and is not a demonstrated cause of the validation errors.</w:t>
+        <w:t>The model still labelled a known pothole photograph as an alligator crack, with confidence of approximately 0.253, so human correction was required. The comparisons show that increasing model capacity and relaxing filtering alone do not establish reliable recognition: selection rankings and thresholds trade false positives against missed detections.</w:t>
       </w:r>
     </w:p>
     <w:p>
       <w:r>
-        <w:t xml:space="preserve">The separate 0.60 confidence gate has not been shown to guarantee any particular precision among automatically accepted tasks. Section 6.2 therefore prioritises independent local data and evaluation of acceptance precision, review workload and errors that escape review, while retaining all eight labels.</w:t>
+        <w:t>Precision among tasks accepted at the 0.60 confidence gate remains to be measured. Section 6.2 therefore prioritises independent local data and evaluation of acceptance precision, review workload and errors that escape review, while retaining all eight labels.</w:t>
       </w:r>
     </w:p>
     <w:p>
@@ -9043,15 +9159,15 @@
     </w:p>
     <w:p>
       <w:pPr>
-        <w:keepLines w:val="1"/>
-      </w:pPr>
-      <w:r>
-        <w:t xml:space="preserve">The best-known solution (BKS) is the best result under the lexicographic ranking among 41 runs for each scenario; it is not a proven optimum. Objective gaps are compared only when the numbers of unassigned P1, P2 and P3 tasks match, while runs with inferior coverage are counted separately. Even matching priority counts can involve different tasks. A lower objective therefore does not necessarily represent travel savings for the same workload.</w:t>
+        <w:keepLines/>
+      </w:pPr>
+      <w:r>
+        <w:t>The best-known solution (BKS) is the best result under the lexicographic ranking among 41 runs for each scenario; it is not a proven optimum. Objective gaps are compared only when the numbers of unassigned P1, P2 and P3 tasks match, while runs with inferior coverage are counted separately. Even matching priority counts can involve different tasks. A lower objective therefore does not necessarily represent travel savings for the same workload.</w:t>
       </w:r>
     </w:p>
     <w:p>
       <w:r>
-        <w:t xml:space="preserve">The Greedy-seeded GA improved on Greedy in all 120 runs under the default search settings. Across scenarios, its mean objective reductions ranged from 0.73% to 3.62%, and its mean gaps from the BKS ranged from 0.23% to 1.82%, compared with 1.17–5.10% for Greedy. Its average runtime per scenario ranged from 104.6 to 361.9 ms, while Greedy took less than one millisecond. Including the Greedy solution and retaining elite solutions prevents the GA from returning a worse result than that baseline. The size of the improvements and the comparison with pure GA are therefore more informative than the absence of regression alone.</w:t>
+        <w:t>The Greedy-seeded GA improved on Greedy in all 120 runs under the default search settings. Across scenarios, its mean objective reductions ranged from 0.73% to 3.62%, and its mean gaps from the BKS ranged from 0.23% to 1.82%, compared with 1.17–5.10% for Greedy. Its average runtime per scenario ranged from 104.6 to 361.9 ms, while Greedy took less than one millisecond. Including the Greedy solution and retaining elite solutions prevents the GA from returning a worse result than that baseline. The size of the improvements and the comparison with pure GA are therefore more informative than the absence of regression alone.</w:t>
       </w:r>
     </w:p>
     <w:p>
@@ -9634,7 +9750,7 @@
         <w:pStyle w:val="165"/>
       </w:pPr>
       <w:r>
-        <w:t xml:space="preserve">Note. Each entry gives the Greedy value followed by the pure-GA mean over seeds 1–10. All tasks are assigned. Values are in minutes, except for the weighted objective J. A lower J does not require every component to improve, as the simulated travel results show.</w:t>
+        <w:t>Note. Each entry gives the Greedy value followed by the pure-GA mean over seeds 1–10. All tasks are assigned. Values are in minutes, except for the weighted objective J. A lower J does not require every component to improve, as the simulated travel results show.</w:t>
       </w:r>
     </w:p>
     <w:p>
@@ -11105,10 +11221,10 @@
     <w:p>
       <w:pPr>
         <w:pStyle w:val="165"/>
-        <w:keepLines w:val="1"/>
-      </w:pPr>
-      <w:r>
-        <w:t xml:space="preserve">Note. Gaps are percentages averaged over ten seeds. For pure GA in the Google/480/15 scenario, the gap uses the five runs with matching coverage; the other five runs remain recorded as coverage failures. The selected rows include capacity stress cases and cases where seeded GA had a larger gap. Full records are available in SystemCode/experiments/routing/results/.</w:t>
+        <w:keepLines/>
+      </w:pPr>
+      <w:r>
+        <w:t>Note. Gaps are percentages averaged over ten seeds. For pure GA in the Google/480/15 scenario, the gap uses the five runs with matching coverage; the other five runs remain recorded as coverage failures. The selected rows include capacity stress cases and cases where seeded GA had a larger gap. Full records are available in SystemCode/experiments/routing/results/.</w:t>
       </w:r>
     </w:p>
     <w:p>
@@ -11119,7 +11235,7 @@
         <w:rPr>
           <w:rFonts w:hint="eastAsia"/>
         </w:rPr>
-        <w:t xml:space="preserve">Some remaining capacity was concentrated in one crew, but no additional task could be inserted directly. Assigning more work would therefore require moving tasks between crews.</w:t>
+        <w:t>Some remaining capacity was concentrated in one crew, but no additional task could be inserted directly. Assigning more work would therefore require moving tasks between crews.</w:t>
       </w:r>
       <w:r>
         <w:t xml:space="preserve"> Greedy seeding restored 13 assignments in all ten runs. However, the seeded GA had larger mean gaps than pure GA in three 20-task scenarios. Seeding thus provides a dependable starting point without outperforming pure GA in every scenario.</w:t>
@@ -11127,12 +11243,12 @@
     </w:p>
     <w:p>
       <w:r>
-        <w:t xml:space="preserve">The 15-task workload requires 1,920 service minutes, using the combined capacity of four 480-minute shifts before travel is included. Under the shift limit, the simulated matrix leaves three tasks unassigned, while the Google matrix allows one additional P3 task to be assigned. With 20 tasks, both matrices leave eight tasks unassigned, but all P1 tasks are assigned. Compared with Greedy, seeded GA reduces simulated travel from 194.9 to 187.1 minutes and Google makespan from 477.1 to 473.0 minutes, although the assigned task identities may differ. Unlimited shifts allow all tasks to be assigned in the 15- and 20-task cases, but the resulting schedules exceed 480 minutes. The 10-task cases fit within the limit.</w:t>
+        <w:t>The 15-task workload requires 1,920 service minutes, using the combined capacity of four 480-minute shifts before travel is included. Under the shift limit, the simulated matrix leaves three tasks unassigned, while the Google matrix allows one additional P3 task to be assigned. With 20 tasks, both matrices leave eight tasks unassigned, but all P1 tasks are assigned. Compared with Greedy, seeded GA reduces simulated travel from 194.9 to 187.1 minutes and Google makespan from 477.1 to 473.0 minutes, although the assigned task identities may differ. Unlimited shifts allow all tasks to be assigned in the 15- and 20-task cases, but the resulting schedules exceed 480 minutes. The 10-task cases fit within the limit.</w:t>
       </w:r>
     </w:p>
     <w:p>
       <w:r>
-        <w:t xml:space="preserve">The Google experiments used historical travel estimates that did not account for traffic, while browser acceptance checks used simulation. API waiting time and algorithm runtime were recorded separately. The results show conditional gains for constructed task sets; they do not measure productivity in field operations.</w:t>
+        <w:t>The Google experiments used historical travel estimates that did not account for traffic, while browser acceptance checks used simulation. API waiting time and algorithm runtime were recorded separately.</w:t>
       </w:r>
     </w:p>
     <w:p>
@@ -11151,7 +11267,7 @@
     </w:p>
     <w:p>
       <w:r>
-        <w:t xml:space="preserve">The integration record dated 18 October contains 20 acceptance groups and 201 HTTP requests sent through the frontend proxy. These checks cover uploads using the real model, human correction, invalid-image handling, idempotency, task completion, disabled crews and stale plans. In the constructed 20-task case, both planners assigned 12 tasks and reported eight exclusions due to the shift limit, without omitting any P1 task.</w:t>
+        <w:t>The integration record contains 20 acceptance groups and 201 HTTP requests sent through the frontend proxy. These checks cover uploads using the real model, human correction, invalid-image handling, idempotency, task completion, disabled crews and stale plans. In the constructed 20-task case, both planners assigned 12 tasks and reported eight exclusions due to the shift limit, without omitting any P1 task.</w:t>
       </w:r>
     </w:p>
     <w:p>
@@ -11404,7 +11520,7 @@
                 <w:color w:val="000000"/>
                 <w:sz w:val="21"/>
               </w:rPr>
-              <w:t xml:space="preserve">Main workflow verified through the frontend proxy</w:t>
+              <w:t>Main workflow verified through the frontend proxy</w:t>
             </w:r>
           </w:p>
         </w:tc>
@@ -11516,7 +11632,7 @@
                 <w:color w:val="000000"/>
                 <w:sz w:val="21"/>
               </w:rPr>
-              <w:t xml:space="preserve">Evidence from regression tests and remote CI</w:t>
+              <w:t>Evidence from regression tests and remote CI</w:t>
             </w:r>
           </w:p>
         </w:tc>
@@ -11595,7 +11711,7 @@
                 <w:color w:val="000000"/>
                 <w:sz w:val="21"/>
               </w:rPr>
-              <w:t xml:space="preserve">Automatic task at 0.60; review at 0.5999; no active task when no detection is returned</w:t>
+              <w:t>Automatic task at 0.60; review at 0.5999; no active task when no detection is returned</w:t>
             </w:r>
           </w:p>
         </w:tc>
@@ -11740,7 +11856,7 @@
                 <w:color w:val="000000"/>
                 <w:sz w:val="21"/>
               </w:rPr>
-              <w:t xml:space="preserve">No duplicate task created; stale plans rejected</w:t>
+              <w:t>No duplicate task created; stale plans rejected</w:t>
             </w:r>
           </w:p>
         </w:tc>
@@ -11852,7 +11968,7 @@
                 <w:color w:val="000000"/>
                 <w:sz w:val="21"/>
               </w:rPr>
-              <w:t xml:space="preserve">Tasks retained; role and crew access restrictions enforced</w:t>
+              <w:t>Tasks retained; role and crew access restrictions enforced</w:t>
             </w:r>
           </w:p>
         </w:tc>
@@ -11931,7 +12047,7 @@
                 <w:color w:val="000000"/>
                 <w:sz w:val="21"/>
               </w:rPr>
-              <w:t xml:space="preserve">Four direct-answer cases with no provider calls; two actual grounded GPT calls; separate HTTP and browser records</w:t>
+              <w:t>Four direct-answer cases with no provider calls; two actual grounded GPT calls; separate HTTP and browser records</w:t>
             </w:r>
           </w:p>
         </w:tc>
@@ -11964,7 +12080,7 @@
                 <w:color w:val="000000"/>
                 <w:sz w:val="21"/>
               </w:rPr>
-              <w:t xml:space="preserve">Targeted checks of grounding and confirmed changes that persist; these scopes overlap and do not form a combined test total</w:t>
+              <w:t>Targeted checks of grounding and confirmed changes that persist</w:t>
             </w:r>
           </w:p>
         </w:tc>
@@ -12043,7 +12159,7 @@
                 <w:color w:val="000000"/>
                 <w:sz w:val="21"/>
               </w:rPr>
-              <w:t xml:space="preserve">GitHub CI recorded 1,255 backend tests passed and 1 skipped, 179 frontend tests passed, and successful lint, type and build checks. Separately, 49 local infrastructure guardrail tests passed.</w:t>
+              <w:t>GitHub CI recorded 1,255 backend tests passed and 1 skipped, 179 frontend tests passed, and successful lint, type and build checks. Separately, 49 local infrastructure guardrail tests passed.</w:t>
             </w:r>
           </w:p>
         </w:tc>
@@ -12076,7 +12192,7 @@
                 <w:color w:val="000000"/>
                 <w:sz w:val="21"/>
               </w:rPr>
-              <w:t xml:space="preserve">GitHub run 39569241424 checked head 155d3183. Base CI excludes optional vision dependencies and skips the YOLO test. These counts describe separate, dated checks and must not be added to earlier suite totals.</w:t>
+              <w:t>GitHub run 39569241424 checked head 155d3183. Base CI excludes optional vision dependencies and skips the YOLO test.</w:t>
             </w:r>
           </w:p>
         </w:tc>
@@ -12084,13 +12200,32 @@
     </w:tbl>
     <w:p>
       <w:pPr>
-        <w:spacing w:before="120"/>
-      </w:pPr>
+        <w:rPr>
+          <w:rFonts w:hint="eastAsia"/>
+          <w:color w:val="000000"/>
+        </w:rPr>
+      </w:pPr>
+      <w:r>
+        <w:rPr>
+          <w:rFonts w:hint="eastAsia"/>
+          <w:color w:val="000000"/>
+        </w:rPr>
+        <w:t>Table 11 summarises the checks performed at different stages of development. Some checks cover the same tests, so their counts are reported separately rather than added together. These checks assess whether the application behaves as intended, complementing the recognition and routing experiments in Sections 5.1 and 5.2. Table 12 summarises how this evaluation addresses the original project objectives.</w:t>
+      </w:r>
+    </w:p>
+    <w:p>
+      <w:r>
+        <w:rPr>
+          <w:rFonts w:hint="eastAsia"/>
+          <w:color w:val="000000"/>
+        </w:rPr>
+        <w:t>We tested how the assistant handled both simple questions and questions requiring supporting evidence. Four direct-answer cases were handled locally without contacting the AI service. Two further cases used GPT-4.1-mini to answer questions based on project information. For the deep-pothole question, the answer correctly stated the project’s P1 priority and 240-minute repair duration. For the saved-route question, it reported 98.8 minutes of travel and 165.0 minutes of service, matching the stored plan. These results apply to the knowledge base available during testing; the two GPT cases were not repeated after the subsequent knowledge-base maintenance and documentation update</w:t>
+      </w:r>
       <w:r>
         <w:rPr>
           <w:color w:val="000000"/>
         </w:rPr>
-        <w:t xml:space="preserve">The release records in Table 11 cover different dates and scopes, so they do not form an overall quality score. The historical 18 October counts remain separate from the later assistant and adjustment checks, and overlapping suites must not be summed. Table 12 compares the evaluation with the original objectives. Injected detections and synthetic routes verify specific workflow branches; they do not establish model accuracy, engineering validity or user productivity.</w:t>
+        <w:t>.</w:t>
       </w:r>
     </w:p>
     <w:p>
@@ -12098,15 +12233,7 @@
         <w:rPr>
           <w:color w:val="000000"/>
         </w:rPr>
-        <w:t xml:space="preserve">The 21 October record, intent-routing-20261021.json, contains four local direct-answer cases with zero provider calls and two actual grounded calls to gpt-4.1-mini. The deep-pothole answer retained the demonstration rule of P1 and 240 minutes. The saved-plan answer matched the recorded 98.8 minutes of travel and 165.0 minutes of service. These calls used the a-knowledge-v16 package available at the time. Subsequent hash normalisation and the a-knowledge-v17 documentation refresh did not rerun those calls. Local E5 retrieval tests, validation using a provider test double, and synthetic route tests remain separate categories of evidence.</w:t>
-      </w:r>
-    </w:p>
-    <w:p>
-      <w:r>
-        <w:rPr>
-          <w:color w:val="000000"/>
-        </w:rPr>
-        <w:t xml:space="preserve">The task-adjustment acceptance record adds isolated, authenticated HTTP and browser checks covering all four route cards, move and cancellation previews, explicit confirmation and recalculation, persistent assignment constraints, and changes in crew access. Constructed routes test rejection when work exceeds the shift limit while retaining other tasks. These limited records do not establish that all ten proposed question cases and ten proposed change cases were executed, or that every answer is correct.</w:t>
+        <w:t>The task-adjustment acceptance record adds isolated, authenticated HTTP and browser checks covering all four route cards, move and cancellation previews, explicit confirmation and recalculation, persistent assignment constraints, and changes in crew access. Constructed routes test rejection when work exceeds the shift limit while retaining other tasks.</w:t>
       </w:r>
     </w:p>
     <w:p>
@@ -12291,7 +12418,7 @@
                 <w:color w:val="000000"/>
                 <w:sz w:val="21"/>
               </w:rPr>
-              <w:t xml:space="preserve">Validation experiments and the historical n10 test are recorded; the final model has no independent local test.</w:t>
+              <w:t>Validation experiments and the historical n10 test are recorded; the final model has no independent local test.</w:t>
             </w:r>
           </w:p>
         </w:tc>
@@ -12370,7 +12497,7 @@
                 <w:color w:val="000000"/>
                 <w:sz w:val="21"/>
               </w:rPr>
-              <w:t xml:space="preserve">Boundary, no-detection and replay tests are recorded; accepted-case precision and review rates still require evaluation.</w:t>
+              <w:t>Boundary, no-detection and replay tests are recorded; accepted-case precision and review rates still require evaluation.</w:t>
             </w:r>
           </w:p>
         </w:tc>
@@ -12449,7 +12576,7 @@
                 <w:color w:val="000000"/>
                 <w:sz w:val="21"/>
               </w:rPr>
-              <w:t xml:space="preserve">All eight labels were tested through automatic and corrected-review workflows. Frozen policies were checked, but service assumptions remain unvalidated.</w:t>
+              <w:t>All eight labels were tested through automatic and corrected-review workflows. Frozen policies were checked, but service assumptions remain unvalidated.</w:t>
             </w:r>
           </w:p>
         </w:tc>
@@ -12528,7 +12655,7 @@
                 <w:color w:val="000000"/>
                 <w:sz w:val="21"/>
               </w:rPr>
-              <w:t xml:space="preserve">Experiments cover four crews and 10, 15 and 20 tasks. Accepted inspections now trigger an attempt to generate paired plans automatically; other changes require explicit replanning. Lateness against deadlines has not been evaluated.</w:t>
+              <w:t>Experiments cover four crews and 10, 15 and 20 tasks. Accepted inspections now trigger an attempt to generate paired plans automatically; other changes require explicit replanning. Lateness against deadlines has not been evaluated.</w:t>
             </w:r>
           </w:p>
         </w:tc>
@@ -12607,7 +12734,7 @@
                 <w:color w:val="000000"/>
                 <w:sz w:val="21"/>
               </w:rPr>
-              <w:t xml:space="preserve">Targeted evidence covers grounded repair and saved-plan answers, direct intent routing and confirmed adjustments through actual-provider calls, local retrieval tests, and controlled HTTP and browser checks. Completion of the full proposed ten-question and ten-change suite is not established. Broad evaluation of answer meaning and user experience remains outstanding.</w:t>
+              <w:t>Targeted evidence covers grounded repair and saved-plan answers, direct intent routing and confirmed adjustments through actual-provider calls, local retrieval tests, and controlled HTTP and browser checks. Completion of the full proposed ten-question and ten-change suite is not established. Broad evaluation of answer meaning and user experience remains outstanding.</w:t>
             </w:r>
           </w:p>
         </w:tc>
@@ -12686,7 +12813,7 @@
                 <w:color w:val="000000"/>
                 <w:sz w:val="21"/>
               </w:rPr>
-              <w:t xml:space="preserve">Dated desktop and HTTP acceptance records and separate mobile checks are available; user productivity has not been measured.</w:t>
+              <w:t>Dated desktop and HTTP acceptance records and separate mobile checks are available; user productivity has not been measured.</w:t>
             </w:r>
           </w:p>
         </w:tc>
@@ -12729,7 +12856,7 @@
         <w:rPr>
           <w:color w:val="000000"/>
         </w:rPr>
-        <w:t xml:space="preserve">RoadGuard connects image-based damage detection to repair decisions and crew schedules in one application. Inspectors submit photographs, dispatchers review uncertain results and adjust work, and crews view their routes and record completion. Stored evidence, citations and revision checks help explain how each decision was made. The experiments show modest recognition gains and better scheduling objectives with Greedy-seeded search. They also reveal unresolved classification errors, a pure-GA assignment failure and gaps in assistant evaluation. These findings support the prototype’s integrated workflow while defining the work still needed before operational use.</w:t>
+        <w:t>RoadGuard connects image-based damage detection to repair decisions and crew schedules in one application. Inspectors submit photographs, dispatchers review uncertain results and adjust work, and crews view their routes and record completion. Stored evidence, citations and revision checks help explain how each decision was made. The experiments show modest recognition gains and better scheduling objectives with Greedy-seeded search. They also reveal unresolved classification errors, a pure-GA assignment failure and gaps in assistant evaluation.</w:t>
       </w:r>
     </w:p>
     <w:p>
@@ -12740,18 +12867,18 @@
         <w:rPr>
           <w:color w:val="000000"/>
         </w:rPr>
-        <w:t xml:space="preserve">The reuse of validation data, a single training seed, sparse damage subtypes, one task family and one Google travel snapshot limit how widely the results can be generalised. Service durations, shift and return policies, and objective weights remain assumptions. The evaluation establishes neither optimality nor statistical significance, and operational savings have not been demonstrated. Independent local validation remains essential. Targeted assistant checks establish neither universal semantic correctness nor completion of the full proposed evaluation, and no broad user study has been conducted.</w:t>
+        <w:t>Generalisation is limited by reused validation data, a single training seed, sparse damage subtypes, one task family and one Google travel snapshot. Service durations, shift and return policies, and objective weights are project assumptions requiring operational validation. Routing results compare constructed scenarios against an empirical best-known solution, and statistical significance has not been established. Independent local vision testing, broader assistant and user evaluation, and measurements of operational savings remain future work.</w:t>
       </w:r>
     </w:p>
     <w:p>
       <w:pPr>
         <w:pStyle w:val="4"/>
-        <w:pageBreakBefore w:val="1"/>
+        <w:pageBreakBefore/>
         <w:spacing w:before="160" w:after="100"/>
         <w:jc w:val="left"/>
       </w:pPr>
-      <w:bookmarkStart w:id="38" w:name="_RGI_29"/>
-      <w:bookmarkStart w:id="39" w:name="RGCurrentHeading19"/>
+      <w:bookmarkStart w:id="38" w:name="RGCurrentHeading19"/>
+      <w:bookmarkStart w:id="39" w:name="_RGI_29"/>
       <w:r>
         <w:t>6.2 Future Work</w:t>
       </w:r>
@@ -12766,7 +12893,7 @@
         <w:rPr>
           <w:color w:val="000000"/>
         </w:rPr>
-        <w:t xml:space="preserve">Future vision work should review subtype labels, missed potholes and disputed negative examples, retaining corrections only after verification. The dataset should include more examples of rare classes and hard negatives such as patches, wet surfaces, shadows, gravel and manholes. Local collection should include phone photographs taken from a moderate distance, with road context, annotations for all objects and an identified primary subject.</w:t>
+        <w:t>Future vision work should review subtype labels, missed potholes and disputed negative examples, retaining corrections only after verification. The dataset should include more examples of rare classes and hard negatives such as patches, wet surfaces, shadows, gravel and manholes. Local collection should include phone photographs taken from a moderate distance, with road context, annotations for all objects and an identified primary subject.</w:t>
       </w:r>
     </w:p>
     <w:p>
@@ -12777,7 +12904,7 @@
         <w:rPr>
           <w:color w:val="000000"/>
         </w:rPr>
-        <w:t xml:space="preserve">An independently labelled local acceptance set should be frozen, with images grouped by location, defect and adjacent frames. Comparisons of sampling strategies, context-preserving augmentation and class calibration should use only training and calibration data. Model size and resolution should be varied one at a time, with repeated seeds, latency checks and checkpoints that support recovery. Evaluation should report eight-class precision and recall, misses by class, localisation, precision among automatically accepted cases and the review rate separately. Current precision and recall remain below 70%, and these improvements cannot guarantee that either target will be met.</w:t>
+        <w:t>An independently labelled local acceptance set should be frozen, with images grouped by location, defect and adjacent frames. Comparisons of sampling strategies, context-preserving augmentation and class calibration should use only training and calibration data. Model size and resolution should be varied one at a time, with repeated seeds, latency checks and checkpoints that support recovery. Evaluation should report eight-class precision and recall, misses by class, localisation, precision among automatically accepted cases and the review rate separately.</w:t>
       </w:r>
     </w:p>
     <w:p>
@@ -12788,20 +12915,10 @@
         <w:rPr>
           <w:color w:val="000000"/>
         </w:rPr>
-        <w:t xml:space="preserve">Future routing evaluation should use verified access information, measured service durations, travel estimates from varied periods and independent task sets. Comparisons with bounded or exact solutions on small instances would help assess solution quality. Coordinated moves between crews could address cases where direct insertion fails. The assistant and confirmed-adjustment workflows also need broader evaluation of answer quality, citations, multilingual ambiguity and recovery, systematically covering the original question and change cases.</w:t>
-      </w:r>
-    </w:p>
-    <w:p>
-      <w:pPr>
-        <w:spacing w:before="200" w:after="60" w:line="240" w:lineRule="auto"/>
-      </w:pPr>
-      <w:r>
-        <w:rPr>
-          <w:color w:val="000000"/>
-          <w:sz w:val="21"/>
-        </w:rPr>
-        <w:t>Acknowledgements. The group thanks the NUS-ISS teaching team for feedback on scope and crew allocation.</w:t>
-      </w:r>
+        <w:t>Future routing evaluation should use verified access information, measured service durations, travel estimates from varied periods and independent task sets. Comparisons with bounded or exact solutions on small instances would help assess solution quality. Coordinated moves between crews could address cases where direct insertion fails. The assistant and confirmed-adjustment workflows also need broader evaluation of answer quality, citations, multilingual ambiguity and recovery, systematically covering the original question and change cases.</w:t>
+      </w:r>
+      <w:bookmarkStart w:id="55" w:name="_GoBack"/>
+      <w:bookmarkEnd w:id="55"/>
     </w:p>
     <w:p>
       <w:pPr>
@@ -12825,7 +12942,7 @@
         <w:rPr>
           <w:color w:val="000000"/>
         </w:rPr>
-        <w:t xml:space="preserve">This guide covers local installation, the workflow from inspection to completion, and the dispatcher assistant. Local acceptance checks used Windows, Python 3.12.14 and Node 22.23.3. Installation on an independent clean machine has not been validated.</w:t>
+        <w:t>This guide covers local installation, the workflow from inspection to completion, and the dispatcher assistant. Local acceptance checks used Windows, Python 3.12.14 and Node 22.23.3. Installation on an independent clean machine has not been validated.</w:t>
       </w:r>
     </w:p>
     <w:p>
@@ -12849,7 +12966,7 @@
         <w:rPr>
           <w:color w:val="000000"/>
         </w:rPr>
-        <w:t xml:space="preserve">Use Python 3.12 for the full application because the pinned numpy==2.5.2 requires Python &gt;=3.12. Base CI uses Python 3.11 and excludes the optional vision dependencies, so its success does not establish that vision runs on Python 3.11. Use Node 22.x &gt;=22.12 and npm &gt;=10.</w:t>
+        <w:t>Use Python 3.12 for the full application because the pinned numpy==2.5.2 requires Python &gt;=3.12. Base CI uses Python 3.11 and excludes the optional vision dependencies, so its success does not establish that vision runs on Python 3.11. Use Node 22.x &gt;=22.12 and npm &gt;=10.</w:t>
       </w:r>
     </w:p>
     <w:p>
@@ -12860,7 +12977,7 @@
         <w:rPr>
           <w:color w:val="000000"/>
         </w:rPr>
-        <w:t xml:space="preserve">Clone the private repository using authorised access. The approved YOLO checkpoint is included in SystemCode/backend/roadguard/model/, and the Dataset directory is not required for inference. On first use, create a new environment from the repository root:</w:t>
+        <w:t>Clone the private repository using authorised access. The approved YOLO checkpoint is included in SystemCode/backend/roadguard/model/, and the Dataset directory is not required for inference. On first use, create a new environment from the repository root:</w:t>
       </w:r>
     </w:p>
     <w:p>
@@ -12907,7 +13024,7 @@
         <w:rPr>
           <w:color w:val="000000"/>
         </w:rPr>
-        <w:t xml:space="preserve">If an existing .venv uses another Python version, create a separate Python 3.12 environment and use its path in every command below. Do not recreate an environment while it is in use. The recorded local acceptance tests support CPU inference. GPU training has separate CUDA requirements.</w:t>
+        <w:t>If an existing .venv uses another Python version, create a separate Python 3.12 environment and use its path in every command below. Do not recreate an environment while it is in use. The recorded local acceptance tests support CPU inference. GPU training has separate CUDA requirements.</w:t>
       </w:r>
     </w:p>
     <w:p>
@@ -12978,7 +13095,7 @@
         <w:rPr>
           <w:color w:val="000000"/>
         </w:rPr>
-        <w:t xml:space="preserve">On first setup, the command downloads approximately 487 MB of pinned multilingual-e5-small model and tokenizer files and verifies their hashes. The encoder runs on CPU through ONNX Runtime. It does not call an embedding API or change the YOLO model. Later setup runs reuse the verified files.</w:t>
+        <w:t>On first setup, the command downloads approximately 487 MB of pinned multilingual-e5-small model and tokenizer files and verifies their hashes. The encoder runs on CPU through ONNX Runtime. It does not call an embedding API or change the YOLO model. Later setup runs reuse the verified files.</w:t>
       </w:r>
     </w:p>
     <w:p>
@@ -13023,7 +13140,7 @@
         <w:rPr>
           <w:color w:val="000000"/>
         </w:rPr>
-        <w:t xml:space="preserve">The default Chroma path is SystemCode/backend/data/rag/chroma/, and embedding files are stored under SystemCode/backend/data/rag/models/multilingual-e5-small/. Both locations hold local runtime files excluded from Git. To override them on the server, use ROADGUARD_CHROMA_PATH and ROADGUARD_EMBEDDING_PATH.</w:t>
+        <w:t>The default Chroma path is SystemCode/backend/data/rag/chroma/, and embedding files are stored under SystemCode/backend/data/rag/models/multilingual-e5-small/. Both locations hold local runtime files excluded from Git. To override them on the server, use ROADGUARD_CHROMA_PATH and ROADGUARD_EMBEDDING_PATH.</w:t>
       </w:r>
     </w:p>
     <w:p>
@@ -13116,7 +13233,7 @@
         <w:rPr>
           <w:color w:val="000000"/>
         </w:rPr>
-        <w:t xml:space="preserve">The recorded targeted acceptance tests used gpt-4.1-mini. Select a model available to your account. The enabled flag accepts exactly lowercase true or false; uppercase True is invalid. Restart the backend after changing environment settings. Keep the key out of frontend code, Git and the report. The status endpoint reports non-secret configuration and usage, but does not verify credential validity.</w:t>
+        <w:t>The recorded targeted acceptance tests used gpt-4.1-mini. Select a model available to your account. The enabled flag accepts exactly lowercase true or false; uppercase True is invalid. Restart the backend after changing environment settings. Keep the key out of frontend code, Git and the report. The status endpoint reports non-secret configuration and usage, but does not verify credential validity.</w:t>
       </w:r>
     </w:p>
     <w:p>
@@ -13210,7 +13327,7 @@
         <w:rPr>
           <w:color w:val="000000"/>
         </w:rPr>
-        <w:t xml:space="preserve">When needed, provision distinct usernames for crew-01, crew-03 and crew-04. Each account has a fixed crew identity. Accounts and passwords are stored in the local database and are not shared through Git.</w:t>
+        <w:t>When needed, provision distinct usernames for crew-01, crew-03 and crew-04. Each account has a fixed crew identity. Accounts and passwords are stored in the local database and are not shared through Git.</w:t>
       </w:r>
     </w:p>
     <w:p>
@@ -13339,7 +13456,7 @@
         <w:rPr>
           <w:color w:val="000000"/>
         </w:rPr>
-        <w:t xml:space="preserve">Open http://127.0.0.1:5173 and sign in. API documentation is available at http://127.0.0.1:8000/docs, and the public health endpoint is /api/v1/health. The health check verifies application and database access only. The model loads when real inference is first requested.</w:t>
+        <w:t>Open http://127.0.0.1:5173 and sign in. API documentation is available at http://127.0.0.1:8000/docs, and the public health endpoint is /api/v1/health. The health check verifies application and database access only. The model loads when real inference is first requested.</w:t>
       </w:r>
     </w:p>
     <w:p>
@@ -13374,7 +13491,7 @@
         <w:rPr>
           <w:color w:val="000000"/>
         </w:rPr>
-        <w:t xml:space="preserve">1. Sign in as an inspector. Upload a JPEG or PNG within the limits of 8 MiB and 20 megapixels. Choose real inference or an explicit synthetic scenario, enter Jurong coordinates and declare the road type. Example coordinates such as 1.3405, 103.706 are synthetic unless verified as the photo's location.</w:t>
+        <w:t>1. Sign in as an inspector. Upload a JPEG or PNG within the limits of 8 MiB and 20 megapixels. Choose real inference or an explicit synthetic scenario, enter Jurong coordinates and declare the road type. Example coordinates such as 1.3405, 103.706 are synthetic unless verified as the photo's location.</w:t>
       </w:r>
     </w:p>
     <w:p>
@@ -13385,7 +13502,7 @@
         <w:rPr>
           <w:color w:val="000000"/>
         </w:rPr>
-        <w:t xml:space="preserve">2. Inspect the result. The upload response contains inspection_id, status, one detection or null, and task_id. For real inference, a primary detection with raw confidence &gt;=0.60 creates one task. A lower confidence requires review, while no detection creates no task. Open the inspection details to view the raw evidence and the frozen rules used for the decision.</w:t>
+        <w:t>2. Inspect the result. The upload response contains inspection_id, status, one detection or null, and task_id. For real inference, a primary detection with raw confidence &gt;=0.60 creates one task. A lower confidence requires review, while no detection creates no task. Open the inspection details to view the raw evidence and the frozen rules used for the decision.</w:t>
       </w:r>
     </w:p>
     <w:p>
@@ -13396,7 +13513,7 @@
         <w:rPr>
           <w:color w:val="000000"/>
         </w:rPr>
-        <w:t xml:space="preserve">3. Sign in as the dispatcher. Confirm, correct or reject pending inspections. Corrections use the stored rules, and accepted tasks contain the demonstration priority and service duration. Completed and cancelled records retain their history but are excluded from the active planning snapshot.</w:t>
+        <w:t>3. Sign in as the dispatcher. Confirm, correct or reject pending inspections. Corrections use the stored rules, and accepted tasks contain the demonstration priority and service duration. Completed and cancelled records retain their history but are excluded from the active planning snapshot.</w:t>
       </w:r>
     </w:p>
     <w:p>
@@ -13407,7 +13524,7 @@
         <w:rPr>
           <w:color w:val="000000"/>
         </w:rPr>
-        <w:t xml:space="preserve">4. An accepted upload or review confirmation/correction automatically starts a paired planning attempt after the task is committed. GA and Greedy use the same task snapshot and travel matrix, and both honour crew constraints. Inspect any unassigned-task reasons and compare the results from the same planning round. If the browser no longer retains a matching response, use the manual recalculation button to obtain a comparison from one round. Manual recalculation is also required after other input changes or a failed automatic attempt.</w:t>
+        <w:t>4. An accepted upload or review confirmation/correction automatically starts a paired planning attempt after the task is committed. GA and Greedy use the same task snapshot and travel matrix, and both honour crew constraints. Inspect any unassigned-task reasons and compare the results from the same planning round. If the browser no longer retains a matching response, use the manual recalculation button to obtain a comparison from one round. Manual recalculation is also required after other input changes or a failed automatic attempt.</w:t>
       </w:r>
     </w:p>
     <w:p>
@@ -13440,7 +13557,7 @@
         <w:rPr>
           <w:color w:val="000000"/>
         </w:rPr>
-        <w:t xml:space="preserve">5. Sign in as the crew assigned by the latest saved GA plan. View and complete that crew's tasks. The server checks the current assignment and task version before accepting completion. Completion changes the planning inputs, so the dispatcher must explicitly replan.</w:t>
+        <w:t>5. Sign in as the crew assigned by the latest saved GA plan. View and complete that crew's tasks. The server checks the current assignment and task version before accepting completion. Completion changes the planning inputs, so the dispatcher must explicitly replan.</w:t>
       </w:r>
     </w:p>
     <w:p>
@@ -13451,7 +13568,7 @@
         <w:rPr>
           <w:color w:val="000000"/>
         </w:rPr>
-        <w:t xml:space="preserve">The frontend map shows a schematic stop order rather than turn-by-turn navigation. See the frontend guide (../SystemCode/frontend/README.md).</w:t>
+        <w:t>The frontend map shows a schematic stop order rather than turn-by-turn navigation. See the frontend guide (../SystemCode/frontend/README.md).</w:t>
       </w:r>
     </w:p>
     <w:p>
@@ -13475,7 +13592,7 @@
         <w:rPr>
           <w:color w:val="000000"/>
         </w:rPr>
-        <w:t xml:space="preserve">Sign in as a dispatcher and open Route assistant. Ask about a supported repair rule or project operation. For a route question, select an explicit saved plan. Saved-plan answers use authorised facts stored on the server rather than totals supplied by the browser.</w:t>
+        <w:t>Sign in as a dispatcher and open Route assistant. Ask about a supported repair rule or project operation. For a route question, select an explicit saved plan. Saved-plan answers use authorised facts stored on the server rather than totals supplied by the browser.</w:t>
       </w:r>
     </w:p>
     <w:p>
@@ -13497,7 +13614,7 @@
         <w:rPr>
           <w:color w:val="000000"/>
         </w:rPr>
-        <w:t xml:space="preserve">Read the answer first. Sources are closed by default. Expand View sources to inspect exact quotations, citation IDs, package/version hashes and the provenance of saved-plan facts.</w:t>
+        <w:t>Read the answer first. Sources are closed by default. Expand View sources to inspect exact quotations, citation IDs, package/version hashes and the provenance of saved-plan facts.</w:t>
       </w:r>
     </w:p>
     <w:p>
@@ -13530,7 +13647,7 @@
         <w:rPr>
           <w:color w:val="000000"/>
         </w:rPr>
-        <w:t xml:space="preserve">A standalone question such as “What model are you?” returns the configured model name through server_configuration. It does not call GPT, retrieve knowledge or read saved plans, and remains available when generation is disabled or the key is missing. The answer identifies the configured assistant model. It does not prove provider execution or identify the separate YOLO detector.</w:t>
+        <w:t>A standalone question such as “What model are you?” returns the configured model name through server_configuration. It does not call GPT, retrieve knowledge or read saved plans, and remains available when generation is disabled or the key is missing. The answer identifies the configured assistant model. It does not prove provider execution or identify the separate YOLO detector.</w:t>
       </w:r>
     </w:p>
     <w:p>
@@ -13576,7 +13693,7 @@
         <w:rPr>
           <w:color w:val="000000"/>
         </w:rPr>
-        <w:t xml:space="preserve">Open Crew adjustments in Route assistant and load a saved plan ID or the latest GA plan. The four crew cards show stop order, travel, service, required return travel, total work, remaining shift and persistent assignment badges. Use a current plan when making changes. Changes to crew availability have their own preview and confirmation workflow.</w:t>
+        <w:t>Open Crew adjustments in Route assistant and load a saved plan ID or the latest GA plan. The four crew cards show stop order, travel, service, required return travel, total work, remaining shift and persistent assignment badges. Use a current plan when making changes. Changes to crew availability have their own preview and confirmation workflow.</w:t>
       </w:r>
     </w:p>
     <w:p>
@@ -13587,7 +13704,7 @@
         <w:rPr>
           <w:color w:val="000000"/>
         </w:rPr>
-        <w:t xml:space="preserve">To move a task, select an assigned active task and a different available crew, then preview the move. Compare the routes before and after the change, acknowledge the preview and confirm.</w:t>
+        <w:t>To move a task, select an assigned active task and a different available crew, then preview the move. Compare the routes before and after the change, acknowledge the preview and confirm.</w:t>
       </w:r>
     </w:p>
     <w:p>
@@ -13609,7 +13726,7 @@
         <w:rPr>
           <w:color w:val="000000"/>
         </w:rPr>
-        <w:t xml:space="preserve">Confirmation saves a durable task-to-crew constraint. To generate a new saved route, choose Recalculate saved task change and reload the latest GA plan.</w:t>
+        <w:t>Confirmation saves a durable task-to-crew constraint. To generate a new saved route, choose Recalculate saved task change and reload the latest GA plan.</w:t>
       </w:r>
     </w:p>
     <w:p>
@@ -13631,7 +13748,7 @@
         <w:rPr>
           <w:color w:val="000000"/>
         </w:rPr>
-        <w:t xml:space="preserve">To cancel work, choose Cancel active task, preview the cancellation and explicitly confirm it. Both assigned and unassigned active tasks can be cancelled. Cancellation preserves the task and its history but removes it from active planning. Explicitly recalculate to replace stale routes. Completed and cancelled tasks cannot be reopened.</w:t>
+        <w:t>To cancel work, choose Cancel active task, preview the cancellation and explicitly confirm it. Both assigned and unassigned active tasks can be cancelled. Cancellation preserves the task and its history but removes it from active planning. Explicitly recalculate to replace stale routes. Completed and cancelled tasks cannot be reopened.</w:t>
       </w:r>
     </w:p>
     <w:p>
@@ -13653,7 +13770,7 @@
         <w:rPr>
           <w:color w:val="000000"/>
         </w:rPr>
-        <w:t xml:space="preserve">Reassignment immediately removes the previous crew's access to read the task and inspection or complete the task. The target crew gains access through an explicitly recalculated saved GA plan. An affected old route is omitted, with an explanation that it is stale and requires recalculation.</w:t>
+        <w:t>Reassignment immediately removes the previous crew's access to read the task and inspection or complete the task. The target crew gains access through an explicitly recalculated saved GA plan. An affected old route is omitted, with an explanation that it is stale and requires recalculation.</w:t>
       </w:r>
     </w:p>
     <w:p>
@@ -13688,7 +13805,7 @@
         <w:rPr>
           <w:color w:val="000000"/>
         </w:rPr>
-        <w:t xml:space="preserve">In Swagger, call POST /api/v1/auth/login with a provisioned account. Use the same host name throughout so that session cookies are retained. For authenticated requests that modify data, send the returned csrf_token as X-CSRF-Token.</w:t>
+        <w:t>In Swagger, call POST /api/v1/auth/login with a provisioned account. Use the same host name throughout so that session cookies are retained. For authenticated requests that modify data, send the returned csrf_token as X-CSRF-Token.</w:t>
       </w:r>
     </w:p>
     <w:p>
@@ -13854,7 +13971,7 @@
                 <w:color w:val="000000"/>
                 <w:sz w:val="21"/>
               </w:rPr>
-              <w:t xml:space="preserve">Check that the environment uses Python 3.12. Base CI uses Python 3.11 and does not include vision dependencies.</w:t>
+              <w:t>Check that the environment uses Python 3.12. Base CI uses Python 3.11 and does not include vision dependencies.</w:t>
             </w:r>
           </w:p>
         </w:tc>
@@ -13913,7 +14030,7 @@
                 <w:color w:val="000000"/>
                 <w:sz w:val="21"/>
               </w:rPr>
-              <w:t xml:space="preserve">Start the backend and check that the frontend proxy target matches its address.</w:t>
+              <w:t>Start the backend and check that the frontend proxy target matches its address.</w:t>
             </w:r>
           </w:p>
         </w:tc>
@@ -13972,7 +14089,7 @@
                 <w:color w:val="000000"/>
                 <w:sz w:val="21"/>
               </w:rPr>
-              <w:t xml:space="preserve">Check sign-in, account role, session host and CSRF token.</w:t>
+              <w:t>Check sign-in, account role, session host and CSRF token.</w:t>
             </w:r>
           </w:p>
         </w:tc>
@@ -14031,7 +14148,7 @@
                 <w:color w:val="000000"/>
                 <w:sz w:val="21"/>
               </w:rPr>
-              <w:t xml:space="preserve">End outstanding viewer transactions. Do not delete the database.</w:t>
+              <w:t>End outstanding viewer transactions. Do not delete the database.</w:t>
             </w:r>
           </w:p>
         </w:tc>
@@ -14090,7 +14207,7 @@
                 <w:color w:val="000000"/>
                 <w:sz w:val="21"/>
               </w:rPr>
-              <w:t xml:space="preserve">Install the vision requirements and verify the bundled weight and manifest. Restart after a failed model load.</w:t>
+              <w:t>Install the vision requirements and verify the bundled weight and manifest. Restart after a failed model load.</w:t>
             </w:r>
           </w:p>
         </w:tc>
@@ -14149,7 +14266,7 @@
                 <w:color w:val="000000"/>
                 <w:sz w:val="21"/>
               </w:rPr>
-              <w:t xml:space="preserve">Refresh the current state, then explicitly replan or retry with the current record version.</w:t>
+              <w:t>Refresh the current state, then explicitly replan or retry with the current record version.</w:t>
             </w:r>
           </w:p>
         </w:tc>
@@ -14208,7 +14325,7 @@
                 <w:color w:val="000000"/>
                 <w:sz w:val="21"/>
               </w:rPr>
-              <w:t xml:space="preserve">Read the reported reasons, such as unavailable crews or shift limits.</w:t>
+              <w:t>Read the reported reasons, such as unavailable crews or shift limits.</w:t>
             </w:r>
           </w:p>
         </w:tc>
@@ -14267,7 +14384,7 @@
                 <w:color w:val="000000"/>
                 <w:sz w:val="21"/>
               </w:rPr>
-              <w:t xml:space="preserve">Install the full backend requirements, verify the configured paths, run the explicit index command and restart. HTTP requests do not repair indexes.</w:t>
+              <w:t>Install the full backend requirements, verify the configured paths, run the explicit index command and restart. HTTP requests do not repair indexes.</w:t>
             </w:r>
           </w:p>
         </w:tc>
@@ -14326,7 +14443,7 @@
                 <w:color w:val="000000"/>
                 <w:sz w:val="21"/>
               </w:rPr>
-              <w:t xml:space="preserve">Use lowercase true/false, a valid model name and the documented limit ranges, then restart.</w:t>
+              <w:t>Use lowercase true/false, a valid model name and the documented limit ranges, then restart.</w:t>
             </w:r>
           </w:p>
         </w:tc>
@@ -14385,7 +14502,7 @@
                 <w:color w:val="000000"/>
                 <w:sz w:val="21"/>
               </w:rPr>
-              <w:t xml:space="preserve">Check private server configuration, account access and the local attempted-call budget. Model identity remains available. Do not repeatedly retry requests whose outcomes are unknown.</w:t>
+              <w:t>Check private server configuration, account access and the local attempted-call budget. Model identity remains available. Do not repeatedly retry requests whose outcomes are unknown.</w:t>
             </w:r>
           </w:p>
         </w:tc>
@@ -14444,7 +14561,7 @@
                 <w:color w:val="000000"/>
                 <w:sz w:val="21"/>
               </w:rPr>
-              <w:t xml:space="preserve">Narrow the question or select a current saved plan. Inspect the explicit error without bypassing citation validation.</w:t>
+              <w:t>Narrow the question or select a current saved plan. Inspect the explicit error without bypassing citation validation.</w:t>
             </w:r>
           </w:p>
         </w:tc>
@@ -14503,7 +14620,7 @@
                 <w:color w:val="000000"/>
                 <w:sz w:val="21"/>
               </w:rPr>
-              <w:t xml:space="preserve">Refresh the task, plan and configuration, then create a new preview before confirming.</w:t>
+              <w:t>Refresh the task, plan and configuration, then create a new preview before confirming.</w:t>
             </w:r>
           </w:p>
         </w:tc>
@@ -14562,7 +14679,7 @@
                 <w:color w:val="000000"/>
                 <w:sz w:val="21"/>
               </w:rPr>
-              <w:t xml:space="preserve">Inspect travel, service and return totals and crew availability, then choose a feasible crew. Other tasks are retained.</w:t>
+              <w:t>Inspect travel, service and return totals and crew availability, then choose a feasible crew. Other tasks are retained.</w:t>
             </w:r>
           </w:p>
         </w:tc>
@@ -14621,7 +14738,7 @@
                 <w:color w:val="000000"/>
                 <w:sz w:val="21"/>
               </w:rPr>
-              <w:t xml:space="preserve">Inspect the locked crew and the reported reason. Later recalculation preserves the constraint rather than silently transferring the work.</w:t>
+              <w:t>Inspect the locked crew and the reported reason. Later recalculation preserves the constraint rather than silently transferring the work.</w:t>
             </w:r>
           </w:p>
         </w:tc>
@@ -14680,7 +14797,7 @@
                 <w:color w:val="000000"/>
                 <w:sz w:val="21"/>
               </w:rPr>
-              <w:t xml:space="preserve">The dispatcher must explicitly recalculate. The target crew can then refresh its latest saved GA route.</w:t>
+              <w:t>The dispatcher must explicitly recalculate. The target crew can then refresh its latest saved GA route.</w:t>
             </w:r>
           </w:p>
         </w:tc>
@@ -14739,7 +14856,7 @@
                 <w:color w:val="000000"/>
                 <w:sz w:val="21"/>
               </w:rPr>
-              <w:t xml:space="preserve">Check server credentials and service access. Provider errors do not silently switch the system to simulation.</w:t>
+              <w:t>Check server credentials and service access. Provider errors do not silently switch the system to simulation.</w:t>
             </w:r>
           </w:p>
         </w:tc>
@@ -14806,7 +14923,7 @@
         <w:rPr>
           <w:color w:val="000000"/>
         </w:rPr>
-        <w:t xml:space="preserve">Usage may incur charges. Keep the key private and out of frontend source. The current provider uses traffic-unaware estimates, and the map remains schematic. Existing plans retain their original travel source.</w:t>
+        <w:t>Usage may incur charges. Keep the key private and out of frontend source. The current provider uses traffic-unaware estimates, and the map remains schematic. Existing plans retain their original travel source.</w:t>
       </w:r>
     </w:p>
     <w:p>
@@ -14828,7 +14945,7 @@
         <w:rPr>
           <w:color w:val="000000"/>
         </w:rPr>
-        <w:t xml:space="preserve">Additional operating details: the pinned vision requirements include PyTorch, torchvision and Ultralytics. The example crew02 account can act only for Crew 02 and may have no assigned work. For the crew workflow, use the crew assigned in the latest saved GA plan.</w:t>
+        <w:t>Additional operating details: the pinned vision requirements include PyTorch, torchvision and Ultralytics. The example crew02 account can act only for Crew 02 and may have no assigned work. For the crew workflow, use the crew assigned in the latest saved GA plan.</w:t>
       </w:r>
     </w:p>
     <w:p>
@@ -14892,7 +15009,7 @@
     </w:p>
     <w:p>
       <w:r>
-        <w:t xml:space="preserve">The submitted proposal is reproduced in full, including its original contents, diagrams and pagination. Its cover retains the former Group 07 identifier; the current group is 37. The proposed two-crew arrangement records the original plan. Sections 1.3 and 5.3 explain subsequent changes to scope and evaluation. Report page numbering continues through the appendix.</w:t>
+        <w:t>The submitted proposal is reproduced in full, including its original contents, diagrams and pagination. Its cover retains the former Group 07 identifier; the current group is 37. The proposed two-crew arrangement records the original plan. Sections 1.3 and 5.3 explain subsequent changes to scope and evaluation. Report page numbering continues through the appendix.</w:t>
       </w:r>
     </w:p>
     <w:p>
@@ -15690,7 +15807,7 @@
     </w:p>
     <w:p>
       <w:r>
-        <w:t xml:space="preserve">Table C1 maps the implemented functions to the MR, RS and CGS course content and the three applicable technique groups in the practice briefing. It points to the design and evaluation evidence in the main report without repeating the experimental results.</w:t>
+        <w:t>Table C1 maps the implemented functions to the MR, RS and CGS course content and the three applicable technique groups in the practice briefing. It points to the design and evaluation evidence in the main report without repeating the experimental results.</w:t>
       </w:r>
     </w:p>
     <w:p>
@@ -15835,7 +15952,7 @@
                 <w:color w:val="000000"/>
                 <w:sz w:val="21"/>
               </w:rPr>
-              <w:t>Verification and limits</w:t>
+              <w:t>Verification evidence</w:t>
             </w:r>
           </w:p>
         </w:tc>
@@ -15938,7 +16055,7 @@
                 <w:color w:val="000000"/>
                 <w:sz w:val="21"/>
               </w:rPr>
-              <w:t xml:space="preserve">Versioned policies, stored rule snapshots and decision traces. Preview validation and durable crew constraints support adjustments. Accepted inspections trigger automatic planning; other changes require explicit replanning.</w:t>
+              <w:t>Versioned policies, stored rule snapshots and decision traces. Preview validation and durable crew constraints support adjustments. Accepted inspections trigger automatic planning; other changes require explicit replanning.</w:t>
             </w:r>
           </w:p>
         </w:tc>
@@ -15959,7 +16076,7 @@
                 <w:color w:val="000000"/>
                 <w:sz w:val="21"/>
               </w:rPr>
-              <w:t xml:space="preserve">Sections 2, 3.2 and 5.3 cover boundary, correction, replay and controlled adjustment checks. Service durations remain assumptions.</w:t>
+              <w:t>Sections 2, 3.2 and 5.3 cover boundary, correction, replay and controlled adjustment checks.</w:t>
             </w:r>
           </w:p>
         </w:tc>
@@ -16041,7 +16158,7 @@
                 <w:color w:val="000000"/>
                 <w:sz w:val="21"/>
               </w:rPr>
-              <w:t xml:space="preserve">Assign tasks and order visits for four crews. Priority-first coverage takes precedence over the weighted completion, travel and workload objective.</w:t>
+              <w:t>Assign tasks and order visits for four crews. Priority-first coverage takes precedence over the weighted completion, travel and workload objective.</w:t>
             </w:r>
           </w:p>
         </w:tc>
@@ -16062,7 +16179,7 @@
                 <w:color w:val="000000"/>
                 <w:sz w:val="21"/>
               </w:rPr>
-              <w:t xml:space="preserve">The group-built GA uses encoding, selection, crossover, mutation and elitism. GA and Greedy share the evaluator, task snapshot and travel matrix.</w:t>
+              <w:t>The group-built GA uses encoding, selection, crossover, mutation and elitism. GA and Greedy share the evaluator, task snapshot and travel matrix.</w:t>
             </w:r>
           </w:p>
         </w:tc>
@@ -16083,7 +16200,7 @@
                 <w:color w:val="000000"/>
                 <w:sz w:val="21"/>
               </w:rPr>
-              <w:t xml:space="preserve">Sections 3.2, 4 and 5.2 cover 10/15/20-task scenarios, multiple seeds, a seeding ablation and analysis of unassigned-task failures. The evaluation does not establish optimality.</w:t>
+              <w:t>Sections 3.2, 4 and 5.2 cover 10/15/20-task scenarios, multiple seeds, a seeding ablation and analysis of unassigned-task failures.</w:t>
             </w:r>
           </w:p>
         </w:tc>
@@ -16165,7 +16282,7 @@
                 <w:color w:val="000000"/>
                 <w:sz w:val="21"/>
               </w:rPr>
-              <w:t xml:space="preserve">YOLO11s predicts eight damage classes and bounding boxes. Primary selection supplies evidence to the rules. Retrieval and optional GPT explain reviewed knowledge and authorised saved plans.</w:t>
+              <w:t>YOLO11s predicts eight damage classes and bounding boxes. Primary selection supplies evidence to the rules. Retrieval and optional GPT explain reviewed knowledge and authorised saved plans.</w:t>
             </w:r>
           </w:p>
         </w:tc>
@@ -16186,7 +16303,7 @@
                 <w:color w:val="000000"/>
                 <w:sz w:val="21"/>
               </w:rPr>
-              <w:t xml:space="preserve">Grouped data, supervised training and local inference support perception. A static Chroma/E5 index, query-v3 exact citations and server-derived rule answers support explanation. Plan facts remain outside the index.</w:t>
+              <w:t>Grouped data, supervised training and local inference support perception. A static Chroma/E5 index, query-v3 exact citations and server-derived rule answers support explanation. Plan facts remain outside the index.</w:t>
             </w:r>
           </w:p>
         </w:tc>
@@ -16207,7 +16324,7 @@
                 <w:color w:val="000000"/>
                 <w:sz w:val="21"/>
               </w:rPr>
-              <w:t xml:space="preserve">Sections 2–5 report recognition metrics and a failure audit, with separate actual-GPT, local-retrieval and controlled-case evaluations. Independent local vision validation and broad answer evaluation remain outstanding.</w:t>
+              <w:t>Sections 2–5 report recognition metrics and a failure audit, with separate actual-GPT, local-retrieval and controlled-case evaluations.</w:t>
             </w:r>
           </w:p>
         </w:tc>
@@ -16221,7 +16338,7 @@
         <w:rPr>
           <w:color w:val="000000"/>
         </w:rPr>
-        <w:t xml:space="preserve">Storage, authorisation and interface display support these three technique groups. The targeted GPT/RAG acceptance tests establish neither universal semantic accuracy nor completion of the full evaluation proposed in Appendix B.</w:t>
+        <w:t>Storage, authorisation and interface display support these three technique groups.</w:t>
       </w:r>
     </w:p>
     <w:sectPr>
@@ -16618,7 +16735,7 @@
     <w:lsdException w:uiPriority="99" w:name="Normal Indent"/>
     <w:lsdException w:uiPriority="99" w:name="footnote text"/>
     <w:lsdException w:uiPriority="99" w:name="annotation text"/>
-    <w:lsdException w:uiPriority="99" w:semiHidden="0" w:name="header"/>
+    <w:lsdException w:qFormat="1" w:uiPriority="99" w:semiHidden="0" w:name="header"/>
     <w:lsdException w:qFormat="1" w:uiPriority="99" w:semiHidden="0" w:name="footer"/>
     <w:lsdException w:uiPriority="99" w:name="index heading"/>
     <w:lsdException w:qFormat="1" w:uiPriority="35" w:name="caption"/>
@@ -16632,32 +16749,32 @@
     <w:lsdException w:uiPriority="99" w:name="endnote reference"/>
     <w:lsdException w:uiPriority="99" w:name="endnote text"/>
     <w:lsdException w:uiPriority="99" w:name="table of authorities"/>
-    <w:lsdException w:uiPriority="99" w:semiHidden="0" w:name="macro"/>
+    <w:lsdException w:qFormat="1" w:uiPriority="99" w:semiHidden="0" w:name="macro"/>
     <w:lsdException w:uiPriority="99" w:name="toa heading"/>
     <w:lsdException w:qFormat="1" w:uiPriority="99" w:semiHidden="0" w:name="List"/>
-    <w:lsdException w:uiPriority="99" w:semiHidden="0" w:name="List Bullet"/>
-    <w:lsdException w:uiPriority="99" w:semiHidden="0" w:name="List Number"/>
+    <w:lsdException w:qFormat="1" w:uiPriority="99" w:semiHidden="0" w:name="List Bullet"/>
+    <w:lsdException w:qFormat="1" w:uiPriority="99" w:semiHidden="0" w:name="List Number"/>
     <w:lsdException w:uiPriority="99" w:semiHidden="0" w:name="List 2"/>
-    <w:lsdException w:uiPriority="99" w:semiHidden="0" w:name="List 3"/>
+    <w:lsdException w:qFormat="1" w:uiPriority="99" w:semiHidden="0" w:name="List 3"/>
     <w:lsdException w:uiPriority="99" w:name="List 4"/>
     <w:lsdException w:uiPriority="99" w:name="List 5"/>
     <w:lsdException w:uiPriority="99" w:semiHidden="0" w:name="List Bullet 2"/>
-    <w:lsdException w:uiPriority="99" w:semiHidden="0" w:name="List Bullet 3"/>
+    <w:lsdException w:qFormat="1" w:uiPriority="99" w:semiHidden="0" w:name="List Bullet 3"/>
     <w:lsdException w:uiPriority="99" w:name="List Bullet 4"/>
     <w:lsdException w:uiPriority="99" w:name="List Bullet 5"/>
     <w:lsdException w:qFormat="1" w:uiPriority="99" w:semiHidden="0" w:name="List Number 2"/>
-    <w:lsdException w:uiPriority="99" w:semiHidden="0" w:name="List Number 3"/>
+    <w:lsdException w:qFormat="1" w:uiPriority="99" w:semiHidden="0" w:name="List Number 3"/>
     <w:lsdException w:uiPriority="99" w:name="List Number 4"/>
     <w:lsdException w:uiPriority="99" w:name="List Number 5"/>
     <w:lsdException w:qFormat="1" w:unhideWhenUsed="0" w:uiPriority="10" w:semiHidden="0" w:name="Title"/>
     <w:lsdException w:uiPriority="99" w:name="Closing"/>
     <w:lsdException w:uiPriority="99" w:name="Signature"/>
-    <w:lsdException w:uiPriority="1" w:name="Default Paragraph Font"/>
+    <w:lsdException w:qFormat="1" w:uiPriority="1" w:name="Default Paragraph Font"/>
     <w:lsdException w:qFormat="1" w:uiPriority="99" w:semiHidden="0" w:name="Body Text"/>
     <w:lsdException w:uiPriority="99" w:name="Body Text Indent"/>
-    <w:lsdException w:uiPriority="99" w:semiHidden="0" w:name="List Continue"/>
-    <w:lsdException w:uiPriority="99" w:semiHidden="0" w:name="List Continue 2"/>
-    <w:lsdException w:uiPriority="99" w:semiHidden="0" w:name="List Continue 3"/>
+    <w:lsdException w:qFormat="1" w:uiPriority="99" w:semiHidden="0" w:name="List Continue"/>
+    <w:lsdException w:qFormat="1" w:uiPriority="99" w:semiHidden="0" w:name="List Continue 2"/>
+    <w:lsdException w:qFormat="1" w:uiPriority="99" w:semiHidden="0" w:name="List Continue 3"/>
     <w:lsdException w:uiPriority="99" w:name="List Continue 4"/>
     <w:lsdException w:uiPriority="99" w:name="List Continue 5"/>
     <w:lsdException w:uiPriority="99" w:name="Message Header"/>
@@ -16667,8 +16784,8 @@
     <w:lsdException w:uiPriority="99" w:name="Body Text First Indent"/>
     <w:lsdException w:uiPriority="99" w:name="Body Text First Indent 2"/>
     <w:lsdException w:uiPriority="99" w:name="Note Heading"/>
-    <w:lsdException w:uiPriority="99" w:semiHidden="0" w:name="Body Text 2"/>
-    <w:lsdException w:uiPriority="99" w:semiHidden="0" w:name="Body Text 3"/>
+    <w:lsdException w:qFormat="1" w:uiPriority="99" w:semiHidden="0" w:name="Body Text 2"/>
+    <w:lsdException w:qFormat="1" w:uiPriority="99" w:semiHidden="0" w:name="Body Text 3"/>
     <w:lsdException w:uiPriority="99" w:name="Body Text Indent 2"/>
     <w:lsdException w:uiPriority="99" w:name="Body Text Indent 3"/>
     <w:lsdException w:uiPriority="99" w:name="Block Text"/>
@@ -17062,6 +17179,7 @@
     <w:name w:val="Default Paragraph Font"/>
     <w:semiHidden/>
     <w:unhideWhenUsed/>
+    <w:qFormat/>
     <w:uiPriority w:val="1"/>
     <w:rPr>
       <w:rFonts w:ascii="Times New Roman" w:hAnsi="Times New Roman"/>
@@ -17091,6 +17209,7 @@
     <w:name w:val="macro"/>
     <w:link w:val="147"/>
     <w:unhideWhenUsed/>
+    <w:qFormat/>
     <w:uiPriority w:val="99"/>
     <w:pPr>
       <w:tabs>
@@ -17116,6 +17235,7 @@
     <w:name w:val="List 3"/>
     <w:basedOn w:val="1"/>
     <w:unhideWhenUsed/>
+    <w:qFormat/>
     <w:uiPriority w:val="99"/>
     <w:pPr>
       <w:ind w:left="1080" w:hanging="360"/>
@@ -17148,6 +17268,7 @@
     <w:name w:val="List Number"/>
     <w:basedOn w:val="1"/>
     <w:unhideWhenUsed/>
+    <w:qFormat/>
     <w:uiPriority w:val="99"/>
     <w:pPr>
       <w:numPr>
@@ -17185,6 +17306,7 @@
     <w:name w:val="List Bullet"/>
     <w:basedOn w:val="1"/>
     <w:unhideWhenUsed/>
+    <w:qFormat/>
     <w:uiPriority w:val="99"/>
     <w:pPr>
       <w:numPr>
@@ -17203,6 +17325,7 @@
     <w:basedOn w:val="1"/>
     <w:link w:val="146"/>
     <w:unhideWhenUsed/>
+    <w:qFormat/>
     <w:uiPriority w:val="99"/>
     <w:pPr>
       <w:spacing w:after="120"/>
@@ -17218,6 +17341,7 @@
     <w:name w:val="List Bullet 3"/>
     <w:basedOn w:val="1"/>
     <w:unhideWhenUsed/>
+    <w:qFormat/>
     <w:uiPriority w:val="99"/>
     <w:pPr>
       <w:numPr>
@@ -17250,6 +17374,7 @@
     <w:name w:val="List Number 3"/>
     <w:basedOn w:val="1"/>
     <w:unhideWhenUsed/>
+    <w:qFormat/>
     <w:uiPriority w:val="99"/>
     <w:pPr>
       <w:numPr>
@@ -17281,6 +17406,7 @@
     <w:name w:val="List Continue"/>
     <w:basedOn w:val="1"/>
     <w:unhideWhenUsed/>
+    <w:qFormat/>
     <w:uiPriority w:val="99"/>
     <w:pPr>
       <w:spacing w:after="120"/>
@@ -17333,6 +17459,7 @@
     <w:basedOn w:val="1"/>
     <w:link w:val="135"/>
     <w:unhideWhenUsed/>
+    <w:qFormat/>
     <w:uiPriority w:val="99"/>
     <w:pPr>
       <w:tabs>
@@ -17383,6 +17510,7 @@
     <w:basedOn w:val="1"/>
     <w:link w:val="145"/>
     <w:unhideWhenUsed/>
+    <w:qFormat/>
     <w:uiPriority w:val="99"/>
     <w:pPr>
       <w:spacing w:after="120" w:line="480" w:lineRule="auto"/>
@@ -17396,6 +17524,7 @@
     <w:name w:val="List Continue 2"/>
     <w:basedOn w:val="1"/>
     <w:unhideWhenUsed/>
+    <w:qFormat/>
     <w:uiPriority w:val="99"/>
     <w:pPr>
       <w:spacing w:after="120"/>
@@ -17411,6 +17540,7 @@
     <w:name w:val="List Continue 3"/>
     <w:basedOn w:val="1"/>
     <w:unhideWhenUsed/>
+    <w:qFormat/>
     <w:uiPriority w:val="99"/>
     <w:pPr>
       <w:spacing w:after="120"/>

</xml_diff>

<commit_message>
docs(report): clarify business problem and value
</commit_message>
<xml_diff>
--- a/ProjectReport/IRS-PM-2026-08-17-AIS08FT-GRP-Group37-RoadGuard-Group-Report.docx
+++ b/ProjectReport/IRS-PM-2026-08-17-AIS08FT-GRP-Group37-RoadGuard-Group-Report.docx
@@ -233,8 +233,8 @@
         <w:pageBreakBefore w:val="0"/>
         <w:jc w:val="center"/>
       </w:pPr>
-      <w:bookmarkStart w:id="0" w:name="RGCurrentHeading0"/>
-      <w:bookmarkStart w:id="1" w:name="_RGI_1"/>
+      <w:bookmarkStart w:id="0" w:name="_RGI_1"/>
+      <w:bookmarkStart w:id="1" w:name="RGCurrentHeading0"/>
       <w:r>
         <w:t>Abstract</w:t>
       </w:r>
@@ -387,7 +387,7 @@
         <w:fldChar w:fldCharType="separate"/>
       </w:r>
       <w:r>
-        <w:t>1.1 Background and Problem Statement</w:t>
+        <w:t>1.1 Business Problem and Value</w:t>
       </w:r>
       <w:r>
         <w:fldChar w:fldCharType="end"/>
@@ -477,7 +477,7 @@
         <w:tab/>
       </w:r>
       <w:r>
-        <w:t>3</w:t>
+        <w:t>4</w:t>
       </w:r>
     </w:p>
     <w:p>
@@ -504,7 +504,7 @@
         <w:tab/>
       </w:r>
       <w:r>
-        <w:t>5</w:t>
+        <w:t>6</w:t>
       </w:r>
     </w:p>
     <w:p>
@@ -531,7 +531,7 @@
         <w:tab/>
       </w:r>
       <w:r>
-        <w:t>5</w:t>
+        <w:t>6</w:t>
       </w:r>
     </w:p>
     <w:p>
@@ -558,7 +558,7 @@
         <w:tab/>
       </w:r>
       <w:r>
-        <w:t>5</w:t>
+        <w:t>6</w:t>
       </w:r>
     </w:p>
     <w:p>
@@ -585,7 +585,7 @@
         <w:tab/>
       </w:r>
       <w:r>
-        <w:t>7</w:t>
+        <w:t>8</w:t>
       </w:r>
     </w:p>
     <w:p>
@@ -612,7 +612,7 @@
         <w:tab/>
       </w:r>
       <w:r>
-        <w:t>10</w:t>
+        <w:t>12</w:t>
       </w:r>
     </w:p>
     <w:p>
@@ -639,7 +639,7 @@
         <w:tab/>
       </w:r>
       <w:r>
-        <w:t>10</w:t>
+        <w:t>12</w:t>
       </w:r>
     </w:p>
     <w:p>
@@ -666,7 +666,7 @@
         <w:tab/>
       </w:r>
       <w:r>
-        <w:t>11</w:t>
+        <w:t>13</w:t>
       </w:r>
     </w:p>
     <w:p>
@@ -693,7 +693,7 @@
         <w:tab/>
       </w:r>
       <w:r>
-        <w:t>13</w:t>
+        <w:t>15</w:t>
       </w:r>
     </w:p>
     <w:p>
@@ -720,7 +720,7 @@
         <w:tab/>
       </w:r>
       <w:r>
-        <w:t>13</w:t>
+        <w:t>15</w:t>
       </w:r>
     </w:p>
     <w:p>
@@ -747,7 +747,7 @@
         <w:tab/>
       </w:r>
       <w:r>
-        <w:t>16</w:t>
+        <w:t>18</w:t>
       </w:r>
     </w:p>
     <w:p>
@@ -774,7 +774,7 @@
         <w:tab/>
       </w:r>
       <w:r>
-        <w:t>17</w:t>
+        <w:t>19</w:t>
       </w:r>
     </w:p>
     <w:p>
@@ -801,7 +801,7 @@
         <w:tab/>
       </w:r>
       <w:r>
-        <w:t>20</w:t>
+        <w:t>22</w:t>
       </w:r>
     </w:p>
     <w:p>
@@ -828,7 +828,7 @@
         <w:tab/>
       </w:r>
       <w:r>
-        <w:t>20</w:t>
+        <w:t>22</w:t>
       </w:r>
     </w:p>
     <w:p>
@@ -855,7 +855,7 @@
         <w:tab/>
       </w:r>
       <w:r>
-        <w:t>21</w:t>
+        <w:t>23</w:t>
       </w:r>
     </w:p>
     <w:p>
@@ -882,7 +882,7 @@
         <w:tab/>
       </w:r>
       <w:r>
-        <w:t>22</w:t>
+        <w:t>24</w:t>
       </w:r>
     </w:p>
     <w:p>
@@ -909,7 +909,7 @@
         <w:tab/>
       </w:r>
       <w:r>
-        <w:t>22</w:t>
+        <w:t>24</w:t>
       </w:r>
     </w:p>
     <w:p>
@@ -936,7 +936,7 @@
         <w:tab/>
       </w:r>
       <w:r>
-        <w:t>22</w:t>
+        <w:t>24</w:t>
       </w:r>
     </w:p>
     <w:p>
@@ -963,7 +963,7 @@
         <w:tab/>
       </w:r>
       <w:r>
-        <w:t>24</w:t>
+        <w:t>26</w:t>
       </w:r>
     </w:p>
     <w:p>
@@ -990,7 +990,7 @@
         <w:tab/>
       </w:r>
       <w:r>
-        <w:t>24</w:t>
+        <w:t>26</w:t>
       </w:r>
     </w:p>
     <w:p>
@@ -1017,7 +1017,7 @@
         <w:tab/>
       </w:r>
       <w:r>
-        <w:t>24</w:t>
+        <w:t>26</w:t>
       </w:r>
     </w:p>
     <w:p>
@@ -1044,7 +1044,7 @@
         <w:tab/>
       </w:r>
       <w:r>
-        <w:t>26</w:t>
+        <w:t>28</w:t>
       </w:r>
     </w:p>
     <w:p>
@@ -1071,7 +1071,7 @@
         <w:tab/>
       </w:r>
       <w:r>
-        <w:t>26</w:t>
+        <w:t>28</w:t>
       </w:r>
     </w:p>
     <w:p>
@@ -1098,7 +1098,7 @@
         <w:tab/>
       </w:r>
       <w:r>
-        <w:t>28</w:t>
+        <w:t>30</w:t>
       </w:r>
     </w:p>
     <w:p>
@@ -1125,7 +1125,7 @@
         <w:tab/>
       </w:r>
       <w:r>
-        <w:t>29</w:t>
+        <w:t>31</w:t>
       </w:r>
     </w:p>
     <w:p>
@@ -1152,7 +1152,7 @@
         <w:tab/>
       </w:r>
       <w:r>
-        <w:t>30</w:t>
+        <w:t>32</w:t>
       </w:r>
     </w:p>
     <w:p>
@@ -1179,7 +1179,7 @@
         <w:tab/>
       </w:r>
       <w:r>
-        <w:t>43</w:t>
+        <w:t>45</w:t>
       </w:r>
     </w:p>
     <w:p>
@@ -1217,11 +1217,33 @@
       <w:bookmarkStart w:id="4" w:name="_RGI_3"/>
       <w:bookmarkStart w:id="5" w:name="RGCurrentHeading2"/>
       <w:r>
-        <w:t>1.1 Background and Problem Statement</w:t>
+        <w:t xml:space="preserve">1.1 </w:t>
+      </w:r>
+      <w:bookmarkStart w:id="55" w:name="_GoBack"/>
+      <w:r>
+        <w:rPr>
+          <w:rFonts w:hint="eastAsia"/>
+          <w:lang w:val="en-US" w:eastAsia="zh-CN"/>
+        </w:rPr>
+        <w:t xml:space="preserve">Background </w:t>
+      </w:r>
+      <w:r>
+        <w:t>Problem and</w:t>
+      </w:r>
+      <w:r>
+        <w:rPr>
+          <w:rFonts w:hint="eastAsia"/>
+          <w:lang w:val="en-US" w:eastAsia="zh-CN"/>
+        </w:rPr>
+        <w:t xml:space="preserve"> Business</w:t>
+      </w:r>
+      <w:r>
+        <w:t xml:space="preserve"> Value</w:t>
       </w:r>
       <w:bookmarkEnd w:id="4"/>
       <w:bookmarkEnd w:id="5"/>
     </w:p>
+    <w:bookmarkEnd w:id="55"/>
     <w:p>
       <w:r>
         <w:t>RoadGuard addresses the handoff between road inspection and maintenance scheduling. A photographic observation must be interpreted, reviewed when uncertain, assigned a repair priority and allocated to an available crew. Detection alone does not establish road eligibility, service time or operational urgency.</w:t>
@@ -1266,7 +1288,7 @@
     </w:p>
     <w:p>
       <w:r>
-        <w:t>The project aims to connect inspectors, dispatchers and crews through one traceable workflow. Inspectors submit evidence, dispatchers correct and prioritise observations, and crews consult assigned work and record completion. The intended value is less repeated data handling and clearer allocation decisions.</w:t>
+        <w:t>RoadGuard aims to reduce repeated data handling by connecting inspectors, dispatchers and crews through one traceable workflow. The same inspection record supports review, repair-task allocation and completion, reducing the need to transfer information between separate tools. Explicit repair rules and comparisons of crew plans give dispatchers a consistent basis for prioritising work and checking available capacity. Crews can view their assigned routes and record completion, while saved evidence and task history help explain decisions and follow up outstanding work. These capabilities are intended to improve coordination and accountability; any savings in staff time or operating costs require evaluation in actual use.</w:t>
       </w:r>
     </w:p>
     <w:p>
@@ -1275,8 +1297,8 @@
         <w:pageBreakBefore w:val="0"/>
         <w:jc w:val="left"/>
       </w:pPr>
-      <w:bookmarkStart w:id="6" w:name="RGCurrentHeading3"/>
-      <w:bookmarkStart w:id="7" w:name="_RGI_4"/>
+      <w:bookmarkStart w:id="6" w:name="_RGI_4"/>
+      <w:bookmarkStart w:id="7" w:name="RGCurrentHeading3"/>
       <w:r>
         <w:t>1.2 Related Work and Contribution</w:t>
       </w:r>
@@ -1299,8 +1321,8 @@
         <w:pageBreakBefore w:val="0"/>
         <w:jc w:val="left"/>
       </w:pPr>
-      <w:bookmarkStart w:id="8" w:name="_RGI_5"/>
-      <w:bookmarkStart w:id="9" w:name="RGCurrentHeading4"/>
+      <w:bookmarkStart w:id="8" w:name="RGCurrentHeading4"/>
+      <w:bookmarkStart w:id="9" w:name="_RGI_5"/>
       <w:r>
         <w:t>1.3 Scope and Project Evolution</w:t>
       </w:r>
@@ -4398,8 +4420,8 @@
         <w:pageBreakBefore/>
         <w:jc w:val="left"/>
       </w:pPr>
-      <w:bookmarkStart w:id="12" w:name="RGCurrentHeading6"/>
-      <w:bookmarkStart w:id="13" w:name="_RGI_7"/>
+      <w:bookmarkStart w:id="12" w:name="_RGI_7"/>
+      <w:bookmarkStart w:id="13" w:name="RGCurrentHeading6"/>
       <w:r>
         <w:t>3 System Design and Implementation</w:t>
       </w:r>
@@ -4412,8 +4434,8 @@
         <w:pageBreakBefore w:val="0"/>
         <w:jc w:val="left"/>
       </w:pPr>
-      <w:bookmarkStart w:id="14" w:name="RGCurrentHeading7"/>
-      <w:bookmarkStart w:id="15" w:name="_RGI_8"/>
+      <w:bookmarkStart w:id="14" w:name="_RGI_8"/>
+      <w:bookmarkStart w:id="15" w:name="RGCurrentHeading7"/>
       <w:r>
         <w:t>3.1 System Architecture</w:t>
       </w:r>
@@ -4515,8 +4537,8 @@
         <w:pageBreakBefore w:val="0"/>
         <w:jc w:val="left"/>
       </w:pPr>
-      <w:bookmarkStart w:id="16" w:name="_RGI_9"/>
-      <w:bookmarkStart w:id="17" w:name="RGCurrentHeading8"/>
+      <w:bookmarkStart w:id="16" w:name="RGCurrentHeading8"/>
+      <w:bookmarkStart w:id="17" w:name="_RGI_9"/>
       <w:r>
         <w:t>3.2 Detection Decisions and Route Scheduling</w:t>
       </w:r>
@@ -4606,8 +4628,8 @@
         <w:pageBreakBefore w:val="0"/>
         <w:jc w:val="left"/>
       </w:pPr>
-      <w:bookmarkStart w:id="18" w:name="_RGI_10"/>
-      <w:bookmarkStart w:id="19" w:name="RGCurrentHeading9"/>
+      <w:bookmarkStart w:id="18" w:name="RGCurrentHeading9"/>
+      <w:bookmarkStart w:id="19" w:name="_RGI_10"/>
       <w:r>
         <w:t>3.3 Implementation and User Workspaces</w:t>
       </w:r>
@@ -5382,12 +5404,6 @@
             <w:insideH w:val="single" w:color="D9D9D9" w:sz="4" w:space="0"/>
             <w:insideV w:val="single" w:color="D9D9D9" w:sz="4" w:space="0"/>
           </w:tblBorders>
-          <w:tblCellMar>
-            <w:top w:w="0" w:type="dxa"/>
-            <w:left w:w="108" w:type="dxa"/>
-            <w:bottom w:w="0" w:type="dxa"/>
-            <w:right w:w="108" w:type="dxa"/>
-          </w:tblCellMar>
         </w:tblPrEx>
         <w:trPr>
           <w:cantSplit/>
@@ -6950,14 +6966,6 @@
         <w:gridCol w:w="1676"/>
       </w:tblGrid>
       <w:tr>
-        <w:tblPrEx>
-          <w:tblCellMar>
-            <w:top w:w="0" w:type="dxa"/>
-            <w:left w:w="108" w:type="dxa"/>
-            <w:bottom w:w="0" w:type="dxa"/>
-            <w:right w:w="108" w:type="dxa"/>
-          </w:tblCellMar>
-        </w:tblPrEx>
         <w:trPr>
           <w:cantSplit/>
           <w:tblHeader/>
@@ -12263,14 +12271,6 @@
         <w:gridCol w:w="7272"/>
       </w:tblGrid>
       <w:tr>
-        <w:tblPrEx>
-          <w:tblCellMar>
-            <w:top w:w="0" w:type="dxa"/>
-            <w:left w:w="108" w:type="dxa"/>
-            <w:bottom w:w="0" w:type="dxa"/>
-            <w:right w:w="108" w:type="dxa"/>
-          </w:tblCellMar>
-        </w:tblPrEx>
         <w:trPr>
           <w:cantSplit/>
           <w:tblHeader/>
@@ -12840,8 +12840,8 @@
         <w:spacing w:before="160" w:after="100"/>
         <w:jc w:val="left"/>
       </w:pPr>
-      <w:bookmarkStart w:id="36" w:name="RGCurrentHeading18"/>
-      <w:bookmarkStart w:id="37" w:name="_RGI_28"/>
+      <w:bookmarkStart w:id="36" w:name="_RGI_28"/>
+      <w:bookmarkStart w:id="37" w:name="RGCurrentHeading18"/>
       <w:r>
         <w:t>6.1 Conclusions and Limitations</w:t>
       </w:r>
@@ -12917,8 +12917,6 @@
         </w:rPr>
         <w:t>Future routing evaluation should use verified access information, measured service durations, travel estimates from varied periods and independent task sets. Comparisons with bounded or exact solutions on small instances would help assess solution quality. Coordinated moves between crews could address cases where direct insertion fails. The assistant and confirmed-adjustment workflows also need broader evaluation of answer quality, citations, multilingual ambiguity and recovery, systematically covering the original question and change cases.</w:t>
       </w:r>
-      <w:bookmarkStart w:id="55" w:name="_GoBack"/>
-      <w:bookmarkEnd w:id="55"/>
     </w:p>
     <w:p>
       <w:pPr>
@@ -15797,8 +15795,8 @@
         <w:pStyle w:val="3"/>
         <w:pageBreakBefore/>
       </w:pPr>
-      <w:bookmarkStart w:id="53" w:name="appendix_c_mapping"/>
-      <w:bookmarkStart w:id="54" w:name="RGCurrentHeading31"/>
+      <w:bookmarkStart w:id="53" w:name="RGCurrentHeading31"/>
+      <w:bookmarkStart w:id="54" w:name="appendix_c_mapping"/>
       <w:r>
         <w:t>Appendix C Course Functionality Mapping</w:t>
       </w:r>
@@ -15856,12 +15854,6 @@
             <w:insideH w:val="single" w:color="D9D9D9" w:sz="4" w:space="0"/>
             <w:insideV w:val="single" w:color="D9D9D9" w:sz="4" w:space="0"/>
           </w:tblBorders>
-          <w:tblCellMar>
-            <w:top w:w="100" w:type="dxa"/>
-            <w:left w:w="100" w:type="dxa"/>
-            <w:bottom w:w="100" w:type="dxa"/>
-            <w:right w:w="100" w:type="dxa"/>
-          </w:tblCellMar>
         </w:tblPrEx>
         <w:trPr>
           <w:cantSplit/>

</xml_diff>

<commit_message>
docs(report): clarify background problem and business value
## Summary
Synchronize the final report with the latest user-edited Assignment copy. Section 1.1 explains the background problem and the intended business value of the inspection, dispatch and crew workflow.

Only the final report document is included. Existing model-training changes, datasets, vector databases and model caches are excluded.

## Validation
- Repository checks passed (475 files).
- git diff --check passed.
- Confirmed the submitted document is byte-identical to the latest Assignment copy.
- Reviewed document changes and rendered layout during preparation.

Ready for automatic merge after the required checks pass.
</commit_message>
<xml_diff>
--- a/ProjectReport/IRS-PM-2026-08-17-AIS08FT-GRP-Group37-RoadGuard-Group-Report.docx
+++ b/ProjectReport/IRS-PM-2026-08-17-AIS08FT-GRP-Group37-RoadGuard-Group-Report.docx
@@ -233,8 +233,8 @@
         <w:pageBreakBefore w:val="0"/>
         <w:jc w:val="center"/>
       </w:pPr>
-      <w:bookmarkStart w:id="0" w:name="RGCurrentHeading0"/>
-      <w:bookmarkStart w:id="1" w:name="_RGI_1"/>
+      <w:bookmarkStart w:id="0" w:name="_RGI_1"/>
+      <w:bookmarkStart w:id="1" w:name="RGCurrentHeading0"/>
       <w:r>
         <w:t>Abstract</w:t>
       </w:r>
@@ -387,7 +387,7 @@
         <w:fldChar w:fldCharType="separate"/>
       </w:r>
       <w:r>
-        <w:t>1.1 Background and Problem Statement</w:t>
+        <w:t>1.1 Business Problem and Value</w:t>
       </w:r>
       <w:r>
         <w:fldChar w:fldCharType="end"/>
@@ -477,7 +477,7 @@
         <w:tab/>
       </w:r>
       <w:r>
-        <w:t>3</w:t>
+        <w:t>4</w:t>
       </w:r>
     </w:p>
     <w:p>
@@ -504,7 +504,7 @@
         <w:tab/>
       </w:r>
       <w:r>
-        <w:t>5</w:t>
+        <w:t>6</w:t>
       </w:r>
     </w:p>
     <w:p>
@@ -531,7 +531,7 @@
         <w:tab/>
       </w:r>
       <w:r>
-        <w:t>5</w:t>
+        <w:t>6</w:t>
       </w:r>
     </w:p>
     <w:p>
@@ -558,7 +558,7 @@
         <w:tab/>
       </w:r>
       <w:r>
-        <w:t>5</w:t>
+        <w:t>6</w:t>
       </w:r>
     </w:p>
     <w:p>
@@ -585,7 +585,7 @@
         <w:tab/>
       </w:r>
       <w:r>
-        <w:t>7</w:t>
+        <w:t>8</w:t>
       </w:r>
     </w:p>
     <w:p>
@@ -612,7 +612,7 @@
         <w:tab/>
       </w:r>
       <w:r>
-        <w:t>10</w:t>
+        <w:t>12</w:t>
       </w:r>
     </w:p>
     <w:p>
@@ -639,7 +639,7 @@
         <w:tab/>
       </w:r>
       <w:r>
-        <w:t>10</w:t>
+        <w:t>12</w:t>
       </w:r>
     </w:p>
     <w:p>
@@ -666,7 +666,7 @@
         <w:tab/>
       </w:r>
       <w:r>
-        <w:t>11</w:t>
+        <w:t>13</w:t>
       </w:r>
     </w:p>
     <w:p>
@@ -693,7 +693,7 @@
         <w:tab/>
       </w:r>
       <w:r>
-        <w:t>13</w:t>
+        <w:t>15</w:t>
       </w:r>
     </w:p>
     <w:p>
@@ -720,7 +720,7 @@
         <w:tab/>
       </w:r>
       <w:r>
-        <w:t>13</w:t>
+        <w:t>15</w:t>
       </w:r>
     </w:p>
     <w:p>
@@ -747,7 +747,7 @@
         <w:tab/>
       </w:r>
       <w:r>
-        <w:t>16</w:t>
+        <w:t>18</w:t>
       </w:r>
     </w:p>
     <w:p>
@@ -774,7 +774,7 @@
         <w:tab/>
       </w:r>
       <w:r>
-        <w:t>17</w:t>
+        <w:t>19</w:t>
       </w:r>
     </w:p>
     <w:p>
@@ -801,7 +801,7 @@
         <w:tab/>
       </w:r>
       <w:r>
-        <w:t>20</w:t>
+        <w:t>22</w:t>
       </w:r>
     </w:p>
     <w:p>
@@ -828,7 +828,7 @@
         <w:tab/>
       </w:r>
       <w:r>
-        <w:t>20</w:t>
+        <w:t>22</w:t>
       </w:r>
     </w:p>
     <w:p>
@@ -855,7 +855,7 @@
         <w:tab/>
       </w:r>
       <w:r>
-        <w:t>21</w:t>
+        <w:t>23</w:t>
       </w:r>
     </w:p>
     <w:p>
@@ -882,7 +882,7 @@
         <w:tab/>
       </w:r>
       <w:r>
-        <w:t>22</w:t>
+        <w:t>24</w:t>
       </w:r>
     </w:p>
     <w:p>
@@ -909,7 +909,7 @@
         <w:tab/>
       </w:r>
       <w:r>
-        <w:t>22</w:t>
+        <w:t>24</w:t>
       </w:r>
     </w:p>
     <w:p>
@@ -936,7 +936,7 @@
         <w:tab/>
       </w:r>
       <w:r>
-        <w:t>22</w:t>
+        <w:t>24</w:t>
       </w:r>
     </w:p>
     <w:p>
@@ -963,7 +963,7 @@
         <w:tab/>
       </w:r>
       <w:r>
-        <w:t>24</w:t>
+        <w:t>26</w:t>
       </w:r>
     </w:p>
     <w:p>
@@ -990,7 +990,7 @@
         <w:tab/>
       </w:r>
       <w:r>
-        <w:t>24</w:t>
+        <w:t>26</w:t>
       </w:r>
     </w:p>
     <w:p>
@@ -1017,7 +1017,7 @@
         <w:tab/>
       </w:r>
       <w:r>
-        <w:t>24</w:t>
+        <w:t>26</w:t>
       </w:r>
     </w:p>
     <w:p>
@@ -1044,7 +1044,7 @@
         <w:tab/>
       </w:r>
       <w:r>
-        <w:t>26</w:t>
+        <w:t>28</w:t>
       </w:r>
     </w:p>
     <w:p>
@@ -1071,7 +1071,7 @@
         <w:tab/>
       </w:r>
       <w:r>
-        <w:t>26</w:t>
+        <w:t>28</w:t>
       </w:r>
     </w:p>
     <w:p>
@@ -1098,7 +1098,7 @@
         <w:tab/>
       </w:r>
       <w:r>
-        <w:t>28</w:t>
+        <w:t>30</w:t>
       </w:r>
     </w:p>
     <w:p>
@@ -1125,7 +1125,7 @@
         <w:tab/>
       </w:r>
       <w:r>
-        <w:t>29</w:t>
+        <w:t>31</w:t>
       </w:r>
     </w:p>
     <w:p>
@@ -1152,7 +1152,7 @@
         <w:tab/>
       </w:r>
       <w:r>
-        <w:t>30</w:t>
+        <w:t>32</w:t>
       </w:r>
     </w:p>
     <w:p>
@@ -1179,7 +1179,7 @@
         <w:tab/>
       </w:r>
       <w:r>
-        <w:t>43</w:t>
+        <w:t>45</w:t>
       </w:r>
     </w:p>
     <w:p>
@@ -1217,11 +1217,33 @@
       <w:bookmarkStart w:id="4" w:name="_RGI_3"/>
       <w:bookmarkStart w:id="5" w:name="RGCurrentHeading2"/>
       <w:r>
-        <w:t>1.1 Background and Problem Statement</w:t>
+        <w:t xml:space="preserve">1.1 </w:t>
+      </w:r>
+      <w:bookmarkStart w:id="55" w:name="_GoBack"/>
+      <w:r>
+        <w:rPr>
+          <w:rFonts w:hint="eastAsia"/>
+          <w:lang w:val="en-US" w:eastAsia="zh-CN"/>
+        </w:rPr>
+        <w:t xml:space="preserve">Background </w:t>
+      </w:r>
+      <w:r>
+        <w:t>Problem and</w:t>
+      </w:r>
+      <w:r>
+        <w:rPr>
+          <w:rFonts w:hint="eastAsia"/>
+          <w:lang w:val="en-US" w:eastAsia="zh-CN"/>
+        </w:rPr>
+        <w:t xml:space="preserve"> Business</w:t>
+      </w:r>
+      <w:r>
+        <w:t xml:space="preserve"> Value</w:t>
       </w:r>
       <w:bookmarkEnd w:id="4"/>
       <w:bookmarkEnd w:id="5"/>
     </w:p>
+    <w:bookmarkEnd w:id="55"/>
     <w:p>
       <w:r>
         <w:t>RoadGuard addresses the handoff between road inspection and maintenance scheduling. A photographic observation must be interpreted, reviewed when uncertain, assigned a repair priority and allocated to an available crew. Detection alone does not establish road eligibility, service time or operational urgency.</w:t>
@@ -1266,7 +1288,7 @@
     </w:p>
     <w:p>
       <w:r>
-        <w:t>The project aims to connect inspectors, dispatchers and crews through one traceable workflow. Inspectors submit evidence, dispatchers correct and prioritise observations, and crews consult assigned work and record completion. The intended value is less repeated data handling and clearer allocation decisions.</w:t>
+        <w:t>RoadGuard aims to reduce repeated data handling by connecting inspectors, dispatchers and crews through one traceable workflow. The same inspection record supports review, repair-task allocation and completion, reducing the need to transfer information between separate tools. Explicit repair rules and comparisons of crew plans give dispatchers a consistent basis for prioritising work and checking available capacity. Crews can view their assigned routes and record completion, while saved evidence and task history help explain decisions and follow up outstanding work. These capabilities are intended to improve coordination and accountability; any savings in staff time or operating costs require evaluation in actual use.</w:t>
       </w:r>
     </w:p>
     <w:p>
@@ -1275,8 +1297,8 @@
         <w:pageBreakBefore w:val="0"/>
         <w:jc w:val="left"/>
       </w:pPr>
-      <w:bookmarkStart w:id="6" w:name="RGCurrentHeading3"/>
-      <w:bookmarkStart w:id="7" w:name="_RGI_4"/>
+      <w:bookmarkStart w:id="6" w:name="_RGI_4"/>
+      <w:bookmarkStart w:id="7" w:name="RGCurrentHeading3"/>
       <w:r>
         <w:t>1.2 Related Work and Contribution</w:t>
       </w:r>
@@ -1299,8 +1321,8 @@
         <w:pageBreakBefore w:val="0"/>
         <w:jc w:val="left"/>
       </w:pPr>
-      <w:bookmarkStart w:id="8" w:name="_RGI_5"/>
-      <w:bookmarkStart w:id="9" w:name="RGCurrentHeading4"/>
+      <w:bookmarkStart w:id="8" w:name="RGCurrentHeading4"/>
+      <w:bookmarkStart w:id="9" w:name="_RGI_5"/>
       <w:r>
         <w:t>1.3 Scope and Project Evolution</w:t>
       </w:r>
@@ -4398,8 +4420,8 @@
         <w:pageBreakBefore/>
         <w:jc w:val="left"/>
       </w:pPr>
-      <w:bookmarkStart w:id="12" w:name="RGCurrentHeading6"/>
-      <w:bookmarkStart w:id="13" w:name="_RGI_7"/>
+      <w:bookmarkStart w:id="12" w:name="_RGI_7"/>
+      <w:bookmarkStart w:id="13" w:name="RGCurrentHeading6"/>
       <w:r>
         <w:t>3 System Design and Implementation</w:t>
       </w:r>
@@ -4412,8 +4434,8 @@
         <w:pageBreakBefore w:val="0"/>
         <w:jc w:val="left"/>
       </w:pPr>
-      <w:bookmarkStart w:id="14" w:name="RGCurrentHeading7"/>
-      <w:bookmarkStart w:id="15" w:name="_RGI_8"/>
+      <w:bookmarkStart w:id="14" w:name="_RGI_8"/>
+      <w:bookmarkStart w:id="15" w:name="RGCurrentHeading7"/>
       <w:r>
         <w:t>3.1 System Architecture</w:t>
       </w:r>
@@ -4515,8 +4537,8 @@
         <w:pageBreakBefore w:val="0"/>
         <w:jc w:val="left"/>
       </w:pPr>
-      <w:bookmarkStart w:id="16" w:name="_RGI_9"/>
-      <w:bookmarkStart w:id="17" w:name="RGCurrentHeading8"/>
+      <w:bookmarkStart w:id="16" w:name="RGCurrentHeading8"/>
+      <w:bookmarkStart w:id="17" w:name="_RGI_9"/>
       <w:r>
         <w:t>3.2 Detection Decisions and Route Scheduling</w:t>
       </w:r>
@@ -4606,8 +4628,8 @@
         <w:pageBreakBefore w:val="0"/>
         <w:jc w:val="left"/>
       </w:pPr>
-      <w:bookmarkStart w:id="18" w:name="_RGI_10"/>
-      <w:bookmarkStart w:id="19" w:name="RGCurrentHeading9"/>
+      <w:bookmarkStart w:id="18" w:name="RGCurrentHeading9"/>
+      <w:bookmarkStart w:id="19" w:name="_RGI_10"/>
       <w:r>
         <w:t>3.3 Implementation and User Workspaces</w:t>
       </w:r>
@@ -5382,12 +5404,6 @@
             <w:insideH w:val="single" w:color="D9D9D9" w:sz="4" w:space="0"/>
             <w:insideV w:val="single" w:color="D9D9D9" w:sz="4" w:space="0"/>
           </w:tblBorders>
-          <w:tblCellMar>
-            <w:top w:w="0" w:type="dxa"/>
-            <w:left w:w="108" w:type="dxa"/>
-            <w:bottom w:w="0" w:type="dxa"/>
-            <w:right w:w="108" w:type="dxa"/>
-          </w:tblCellMar>
         </w:tblPrEx>
         <w:trPr>
           <w:cantSplit/>
@@ -6950,14 +6966,6 @@
         <w:gridCol w:w="1676"/>
       </w:tblGrid>
       <w:tr>
-        <w:tblPrEx>
-          <w:tblCellMar>
-            <w:top w:w="0" w:type="dxa"/>
-            <w:left w:w="108" w:type="dxa"/>
-            <w:bottom w:w="0" w:type="dxa"/>
-            <w:right w:w="108" w:type="dxa"/>
-          </w:tblCellMar>
-        </w:tblPrEx>
         <w:trPr>
           <w:cantSplit/>
           <w:tblHeader/>
@@ -12263,14 +12271,6 @@
         <w:gridCol w:w="7272"/>
       </w:tblGrid>
       <w:tr>
-        <w:tblPrEx>
-          <w:tblCellMar>
-            <w:top w:w="0" w:type="dxa"/>
-            <w:left w:w="108" w:type="dxa"/>
-            <w:bottom w:w="0" w:type="dxa"/>
-            <w:right w:w="108" w:type="dxa"/>
-          </w:tblCellMar>
-        </w:tblPrEx>
         <w:trPr>
           <w:cantSplit/>
           <w:tblHeader/>
@@ -12840,8 +12840,8 @@
         <w:spacing w:before="160" w:after="100"/>
         <w:jc w:val="left"/>
       </w:pPr>
-      <w:bookmarkStart w:id="36" w:name="RGCurrentHeading18"/>
-      <w:bookmarkStart w:id="37" w:name="_RGI_28"/>
+      <w:bookmarkStart w:id="36" w:name="_RGI_28"/>
+      <w:bookmarkStart w:id="37" w:name="RGCurrentHeading18"/>
       <w:r>
         <w:t>6.1 Conclusions and Limitations</w:t>
       </w:r>
@@ -12917,8 +12917,6 @@
         </w:rPr>
         <w:t>Future routing evaluation should use verified access information, measured service durations, travel estimates from varied periods and independent task sets. Comparisons with bounded or exact solutions on small instances would help assess solution quality. Coordinated moves between crews could address cases where direct insertion fails. The assistant and confirmed-adjustment workflows also need broader evaluation of answer quality, citations, multilingual ambiguity and recovery, systematically covering the original question and change cases.</w:t>
       </w:r>
-      <w:bookmarkStart w:id="55" w:name="_GoBack"/>
-      <w:bookmarkEnd w:id="55"/>
     </w:p>
     <w:p>
       <w:pPr>
@@ -15797,8 +15795,8 @@
         <w:pStyle w:val="3"/>
         <w:pageBreakBefore/>
       </w:pPr>
-      <w:bookmarkStart w:id="53" w:name="appendix_c_mapping"/>
-      <w:bookmarkStart w:id="54" w:name="RGCurrentHeading31"/>
+      <w:bookmarkStart w:id="53" w:name="RGCurrentHeading31"/>
+      <w:bookmarkStart w:id="54" w:name="appendix_c_mapping"/>
       <w:r>
         <w:t>Appendix C Course Functionality Mapping</w:t>
       </w:r>
@@ -15856,12 +15854,6 @@
             <w:insideH w:val="single" w:color="D9D9D9" w:sz="4" w:space="0"/>
             <w:insideV w:val="single" w:color="D9D9D9" w:sz="4" w:space="0"/>
           </w:tblBorders>
-          <w:tblCellMar>
-            <w:top w:w="100" w:type="dxa"/>
-            <w:left w:w="100" w:type="dxa"/>
-            <w:bottom w:w="100" w:type="dxa"/>
-            <w:right w:w="100" w:type="dxa"/>
-          </w:tblCellMar>
         </w:tblPrEx>
         <w:trPr>
           <w:cantSplit/>

</xml_diff>